<commit_message>
Agregación del diagrama de transición de estados de un Retiro
</commit_message>
<xml_diff>
--- a/TPI Análisis de sistemas.docx
+++ b/TPI Análisis de sistemas.docx
@@ -1,6 +1,6 @@
 
 <file path=word/document.xml><?xml version="1.0" encoding="utf-8"?>
-<w:document xmlns:wpc="http://schemas.microsoft.com/office/word/2010/wordprocessingCanvas" xmlns:mc="http://schemas.openxmlformats.org/markup-compatibility/2006" xmlns:o="urn:schemas-microsoft-com:office:office" xmlns:r="http://schemas.openxmlformats.org/officeDocument/2006/relationships" xmlns:m="http://schemas.openxmlformats.org/officeDocument/2006/math" xmlns:v="urn:schemas-microsoft-com:vml" xmlns:wp14="http://schemas.microsoft.com/office/word/2010/wordprocessingDrawing" xmlns:wp="http://schemas.openxmlformats.org/drawingml/2006/wordprocessingDrawing" xmlns:w10="urn:schemas-microsoft-com:office:word" xmlns:w="http://schemas.openxmlformats.org/wordprocessingml/2006/main" xmlns:w14="http://schemas.microsoft.com/office/word/2010/wordml" xmlns:wpg="http://schemas.microsoft.com/office/word/2010/wordprocessingGroup" xmlns:wpi="http://schemas.microsoft.com/office/word/2010/wordprocessingInk" xmlns:wne="http://schemas.microsoft.com/office/word/2006/wordml" xmlns:wps="http://schemas.microsoft.com/office/word/2010/wordprocessingShape" mc:Ignorable="w14 wp14">
+<w:document xmlns:wpc="http://schemas.microsoft.com/office/word/2010/wordprocessingCanvas" xmlns:mc="http://schemas.openxmlformats.org/markup-compatibility/2006" xmlns:o="urn:schemas-microsoft-com:office:office" xmlns:r="http://schemas.openxmlformats.org/officeDocument/2006/relationships" xmlns:m="http://schemas.openxmlformats.org/officeDocument/2006/math" xmlns:v="urn:schemas-microsoft-com:vml" xmlns:wp14="http://schemas.microsoft.com/office/word/2010/wordprocessingDrawing" xmlns:wp="http://schemas.openxmlformats.org/drawingml/2006/wordprocessingDrawing" xmlns:w10="urn:schemas-microsoft-com:office:word" xmlns:w="http://schemas.openxmlformats.org/wordprocessingml/2006/main" xmlns:w14="http://schemas.microsoft.com/office/word/2010/wordml" xmlns:w15="http://schemas.microsoft.com/office/word/2012/wordml" xmlns:wpg="http://schemas.microsoft.com/office/word/2010/wordprocessingGroup" xmlns:wpi="http://schemas.microsoft.com/office/word/2010/wordprocessingInk" xmlns:wne="http://schemas.microsoft.com/office/word/2006/wordml" xmlns:wps="http://schemas.microsoft.com/office/word/2010/wordprocessingShape" mc:Ignorable="w14 w15 wp14">
   <w:body>
     <w:p>
       <w:pPr>
@@ -41,7 +41,7 @@
                     </pic:cNvPicPr>
                   </pic:nvPicPr>
                   <pic:blipFill>
-                    <a:blip r:embed="rId8" cstate="print">
+                    <a:blip r:embed="rId7" cstate="print">
                       <a:extLst>
                         <a:ext uri="{28A0092B-C50C-407E-A947-70E740481C1C}">
                           <a14:useLocalDpi xmlns:a14="http://schemas.microsoft.com/office/drawing/2010/main" val="0"/>
@@ -249,8 +249,261 @@
     <w:p>
       <w:pPr>
         <w:pStyle w:val="Ttulo2"/>
+        <w:spacing w:before="240" w:after="200"/>
+        <w:ind w:left="-283" w:right="-278"/>
+      </w:pPr>
+      <w:r>
+        <w:t>CONSIGNAS SEGUNDA ENTREGA</w:t>
+      </w:r>
+    </w:p>
+    <w:p>
+      <w:pPr>
+        <w:pStyle w:val="NormalWeb"/>
+        <w:numPr>
+          <w:ilvl w:val="0"/>
+          <w:numId w:val="3"/>
+        </w:numPr>
+        <w:spacing w:before="0" w:beforeAutospacing="0" w:after="200" w:afterAutospacing="0"/>
+        <w:ind w:left="77" w:right="-531"/>
+        <w:jc w:val="both"/>
+        <w:textAlignment w:val="baseline"/>
+        <w:rPr>
+          <w:rFonts w:ascii="Arial" w:hAnsi="Arial" w:cs="Arial"/>
+          <w:color w:val="FFAA00"/>
+        </w:rPr>
+      </w:pPr>
+      <w:r>
+        <w:rPr>
+          <w:rFonts w:ascii="Arial" w:hAnsi="Arial" w:cs="Arial"/>
+          <w:color w:val="000000"/>
+        </w:rPr>
+        <w:t>Modelo de objetos del dominio del problema: Diagrama de clases “inicial” identificando atributos, métodos, navegabilidad y multiplicidad.</w:t>
+      </w:r>
+    </w:p>
+    <w:p>
+      <w:pPr>
+        <w:pStyle w:val="Ttulo2"/>
+        <w:spacing w:after="200"/>
+        <w:ind w:left="-283" w:right="-278"/>
+        <w:rPr>
+          <w:color w:val="auto"/>
+        </w:rPr>
+      </w:pPr>
+      <w:r>
+        <w:t>CONSIGNAS TERCERA</w:t>
+      </w:r>
+      <w:r>
+        <w:t> ENTREGA</w:t>
+      </w:r>
+    </w:p>
+    <w:p>
+      <w:pPr>
+        <w:pStyle w:val="NormalWeb"/>
+        <w:numPr>
+          <w:ilvl w:val="0"/>
+          <w:numId w:val="4"/>
+        </w:numPr>
+        <w:spacing w:before="0" w:beforeAutospacing="0" w:after="0" w:afterAutospacing="0"/>
+        <w:ind w:left="77" w:right="-531"/>
+        <w:jc w:val="both"/>
+        <w:textAlignment w:val="baseline"/>
+        <w:rPr>
+          <w:rFonts w:ascii="Arial" w:hAnsi="Arial" w:cs="Arial"/>
+          <w:color w:val="FFAA00"/>
+        </w:rPr>
+      </w:pPr>
+      <w:r>
+        <w:rPr>
+          <w:rFonts w:ascii="Arial" w:hAnsi="Arial" w:cs="Arial"/>
+          <w:color w:val="000000"/>
+        </w:rPr>
+        <w:t>Modelo de Caso de Uso: completo, incluyendo la lista de Casos de Uso y sus objetivos. </w:t>
+      </w:r>
+    </w:p>
+    <w:p>
+      <w:pPr>
+        <w:pStyle w:val="NormalWeb"/>
+        <w:numPr>
+          <w:ilvl w:val="0"/>
+          <w:numId w:val="4"/>
+        </w:numPr>
+        <w:spacing w:before="0" w:beforeAutospacing="0" w:after="0" w:afterAutospacing="0"/>
+        <w:ind w:left="77" w:right="-531"/>
+        <w:jc w:val="both"/>
+        <w:textAlignment w:val="baseline"/>
+        <w:rPr>
+          <w:rFonts w:ascii="Arial" w:hAnsi="Arial" w:cs="Arial"/>
+          <w:color w:val="FFAA00"/>
+        </w:rPr>
+      </w:pPr>
+      <w:r>
+        <w:rPr>
+          <w:rFonts w:ascii="Arial" w:hAnsi="Arial" w:cs="Arial"/>
+          <w:color w:val="000000"/>
+        </w:rPr>
+        <w:t>Presentar los tres Casos de Uso esenciales con sus objetivos, la descripción y sus respectivos prototipos.</w:t>
+      </w:r>
+    </w:p>
+    <w:p>
+      <w:pPr>
+        <w:pStyle w:val="NormalWeb"/>
+        <w:numPr>
+          <w:ilvl w:val="0"/>
+          <w:numId w:val="7"/>
+        </w:numPr>
+        <w:spacing w:before="0" w:beforeAutospacing="0" w:after="0" w:afterAutospacing="0"/>
+        <w:ind w:right="-531"/>
+        <w:jc w:val="both"/>
+        <w:textAlignment w:val="baseline"/>
+        <w:rPr>
+          <w:rFonts w:ascii="Arial" w:hAnsi="Arial" w:cs="Arial"/>
+          <w:color w:val="000000"/>
+        </w:rPr>
+      </w:pPr>
+      <w:r>
+        <w:rPr>
+          <w:rFonts w:ascii="Arial" w:hAnsi="Arial" w:cs="Arial"/>
+          <w:color w:val="000000"/>
+        </w:rPr>
+        <w:t>Registrar un nuevo retiro</w:t>
+      </w:r>
+    </w:p>
+    <w:p>
+      <w:pPr>
+        <w:pStyle w:val="NormalWeb"/>
+        <w:numPr>
+          <w:ilvl w:val="0"/>
+          <w:numId w:val="7"/>
+        </w:numPr>
+        <w:spacing w:before="0" w:beforeAutospacing="0" w:after="0" w:afterAutospacing="0"/>
+        <w:ind w:right="-531"/>
+        <w:jc w:val="both"/>
+        <w:textAlignment w:val="baseline"/>
+        <w:rPr>
+          <w:rFonts w:ascii="Arial" w:hAnsi="Arial" w:cs="Arial"/>
+          <w:color w:val="000000"/>
+        </w:rPr>
+      </w:pPr>
+      <w:r>
+        <w:rPr>
+          <w:rFonts w:ascii="Arial" w:hAnsi="Arial" w:cs="Arial"/>
+          <w:color w:val="000000"/>
+        </w:rPr>
+        <w:t>Consultar los datos de un retiro</w:t>
+      </w:r>
+    </w:p>
+    <w:p>
+      <w:pPr>
+        <w:pStyle w:val="NormalWeb"/>
+        <w:numPr>
+          <w:ilvl w:val="0"/>
+          <w:numId w:val="7"/>
+        </w:numPr>
+        <w:spacing w:before="0" w:beforeAutospacing="0" w:after="200" w:afterAutospacing="0"/>
+        <w:ind w:right="-531"/>
+        <w:jc w:val="both"/>
+        <w:textAlignment w:val="baseline"/>
+        <w:rPr>
+          <w:rFonts w:ascii="Arial" w:hAnsi="Arial" w:cs="Arial"/>
+          <w:color w:val="000000"/>
+        </w:rPr>
+      </w:pPr>
+      <w:r>
+        <w:rPr>
+          <w:rFonts w:ascii="Arial" w:hAnsi="Arial" w:cs="Arial"/>
+          <w:color w:val="000000"/>
+        </w:rPr>
+        <w:t>CU a elección del grupo</w:t>
+      </w:r>
+    </w:p>
+    <w:p>
+      <w:pPr>
+        <w:pStyle w:val="NormalWeb"/>
+        <w:spacing w:before="0" w:beforeAutospacing="0" w:after="0" w:afterAutospacing="0"/>
+        <w:ind w:left="77" w:right="-531"/>
+        <w:jc w:val="both"/>
+        <w:textAlignment w:val="baseline"/>
+        <w:rPr>
+          <w:rFonts w:ascii="Arial" w:hAnsi="Arial" w:cs="Arial"/>
+          <w:color w:val="FFAA00"/>
+        </w:rPr>
+      </w:pPr>
+    </w:p>
+    <w:p>
+      <w:pPr>
+        <w:pStyle w:val="NormalWeb"/>
+        <w:numPr>
+          <w:ilvl w:val="0"/>
+          <w:numId w:val="4"/>
+        </w:numPr>
+        <w:spacing w:before="0" w:beforeAutospacing="0" w:after="0" w:afterAutospacing="0"/>
+        <w:ind w:left="77" w:right="-531"/>
+        <w:jc w:val="both"/>
+        <w:textAlignment w:val="baseline"/>
+        <w:rPr>
+          <w:rFonts w:ascii="Arial" w:hAnsi="Arial" w:cs="Arial"/>
+          <w:color w:val="FFAA00"/>
+        </w:rPr>
+      </w:pPr>
+      <w:r>
+        <w:rPr>
+          <w:rFonts w:ascii="Arial" w:hAnsi="Arial" w:cs="Arial"/>
+          <w:color w:val="000000"/>
+        </w:rPr>
+        <w:t>Un diagrama de transición de estados</w:t>
+      </w:r>
+    </w:p>
+    <w:p>
+      <w:pPr>
+        <w:pStyle w:val="NormalWeb"/>
+        <w:spacing w:before="0" w:beforeAutospacing="0" w:after="200" w:afterAutospacing="0"/>
+        <w:ind w:left="1440" w:right="-531"/>
+        <w:jc w:val="both"/>
+        <w:textAlignment w:val="baseline"/>
+        <w:rPr>
+          <w:rFonts w:ascii="Arial" w:hAnsi="Arial" w:cs="Arial"/>
+          <w:color w:val="000000"/>
+        </w:rPr>
+      </w:pPr>
+    </w:p>
+    <w:p>
+      <w:pPr>
+        <w:pStyle w:val="NormalWeb"/>
+        <w:spacing w:before="0" w:beforeAutospacing="0" w:after="200" w:afterAutospacing="0"/>
+        <w:ind w:left="1440" w:right="-531"/>
+        <w:jc w:val="both"/>
+        <w:textAlignment w:val="baseline"/>
+        <w:rPr>
+          <w:rFonts w:ascii="Arial" w:hAnsi="Arial" w:cs="Arial"/>
+          <w:color w:val="000000"/>
+        </w:rPr>
+      </w:pPr>
+      <w:r>
+        <w:rPr>
+          <w:rFonts w:ascii="Arial" w:hAnsi="Arial" w:cs="Arial"/>
+          <w:color w:val="000000"/>
+        </w:rPr>
+        <w:t>.</w:t>
+      </w:r>
+    </w:p>
+    <w:p>
+      <w:pPr>
+        <w:spacing w:before="240"/>
         <w:ind w:left="0"/>
         <w:rPr>
+          <w:rFonts w:ascii="Open Sans ExtraBold" w:eastAsia="Open Sans ExtraBold" w:hAnsi="Open Sans ExtraBold" w:cs="Open Sans ExtraBold"/>
+          <w:color w:val="FFAA00"/>
+          <w:sz w:val="20"/>
+          <w:szCs w:val="20"/>
+          <w:lang w:val="es-AR"/>
+        </w:rPr>
+      </w:pPr>
+    </w:p>
+    <w:p>
+      <w:pPr>
+        <w:pStyle w:val="Ttulo2"/>
+        <w:ind w:left="0"/>
+        <w:rPr>
           <w:lang w:val="es-ES"/>
         </w:rPr>
       </w:pPr>
@@ -258,6 +511,7 @@
         <w:rPr>
           <w:lang w:val="es-ES"/>
         </w:rPr>
+        <w:lastRenderedPageBreak/>
         <w:t>PRESENTACION DEL EQUIPO DE TRABAJO</w:t>
       </w:r>
     </w:p>
@@ -373,11 +627,19 @@
           <w:lang w:val="es-ES"/>
         </w:rPr>
       </w:pPr>
+      <w:proofErr w:type="spellStart"/>
       <w:r>
         <w:rPr>
           <w:lang w:val="es-ES"/>
         </w:rPr>
-        <w:t>Ludueña, Sofía Milagros</w:t>
+        <w:t>Ludueña</w:t>
+      </w:r>
+      <w:proofErr w:type="spellEnd"/>
+      <w:r>
+        <w:rPr>
+          <w:lang w:val="es-ES"/>
+        </w:rPr>
+        <w:t>, Sofía Milagros</w:t>
       </w:r>
     </w:p>
     <w:p>
@@ -413,19 +675,11 @@
           <w:lang w:val="es-ES"/>
         </w:rPr>
       </w:pPr>
-      <w:proofErr w:type="spellStart"/>
       <w:r>
         <w:rPr>
           <w:lang w:val="es-ES"/>
         </w:rPr>
-        <w:t>Rovera</w:t>
-      </w:r>
-      <w:proofErr w:type="spellEnd"/>
-      <w:r>
-        <w:rPr>
-          <w:lang w:val="es-ES"/>
-        </w:rPr>
-        <w:t xml:space="preserve"> </w:t>
+        <w:t xml:space="preserve">Rovera </w:t>
       </w:r>
       <w:proofErr w:type="spellStart"/>
       <w:r>
@@ -455,84 +709,20 @@
           <w:lang w:val="es-ES"/>
         </w:rPr>
       </w:pPr>
-      <w:proofErr w:type="spellStart"/>
-      <w:r>
-        <w:rPr>
-          <w:lang w:val="es-ES"/>
-        </w:rPr>
-        <w:t>Sanchez</w:t>
-      </w:r>
-      <w:proofErr w:type="spellEnd"/>
-      <w:r>
-        <w:rPr>
-          <w:lang w:val="es-ES"/>
-        </w:rPr>
-        <w:t xml:space="preserve"> </w:t>
-      </w:r>
-      <w:proofErr w:type="spellStart"/>
-      <w:r>
-        <w:rPr>
-          <w:lang w:val="es-ES"/>
-        </w:rPr>
-        <w:t>Toranzo</w:t>
-      </w:r>
-      <w:proofErr w:type="spellEnd"/>
-      <w:r>
-        <w:rPr>
-          <w:lang w:val="es-ES"/>
-        </w:rPr>
-        <w:t>, Lisandro </w:t>
-      </w:r>
-    </w:p>
-    <w:p>
-      <w:pPr>
-        <w:pStyle w:val="Ttulo2"/>
-        <w:shd w:val="clear" w:color="auto" w:fill="FFFFFF"/>
-        <w:spacing w:before="60" w:after="0"/>
-        <w:ind w:left="360" w:right="-278"/>
-        <w:rPr>
-          <w:rFonts w:ascii="Arial" w:hAnsi="Arial" w:cs="Arial"/>
-          <w:color w:val="000000"/>
-          <w:sz w:val="24"/>
-          <w:szCs w:val="24"/>
-          <w:lang w:val="es-ES"/>
-        </w:rPr>
-      </w:pPr>
-      <w:r>
-        <w:rPr>
-          <w:rFonts w:ascii="Arial" w:hAnsi="Arial" w:cs="Arial"/>
-          <w:b/>
-          <w:bCs/>
-          <w:color w:val="000000"/>
-          <w:lang w:val="es-ES"/>
-        </w:rPr>
-        <w:lastRenderedPageBreak/>
-        <w:t xml:space="preserve">¿QUIENES SOMOS?  </w:t>
-      </w:r>
-      <w:r>
-        <w:rPr>
-          <w:rFonts w:ascii="Arial" w:hAnsi="Arial" w:cs="Arial"/>
+      <w:r>
+        <w:rPr>
           <w:noProof/>
           <w:bdr w:val="none" w:sz="0" w:space="0" w:color="auto" w:frame="1"/>
-          <w:lang w:val="es-ES"/>
-        </w:rPr>
-        <w:t xml:space="preserve"> </w:t>
-      </w:r>
-      <w:r>
-        <w:rPr>
-          <w:rFonts w:ascii="Arial" w:hAnsi="Arial" w:cs="Arial"/>
-          <w:noProof/>
-          <w:bdr w:val="none" w:sz="0" w:space="0" w:color="auto" w:frame="1"/>
           <w:lang w:val="es-AR"/>
         </w:rPr>
         <w:drawing>
-          <wp:anchor distT="0" distB="0" distL="114300" distR="114300" simplePos="0" relativeHeight="251654656" behindDoc="0" locked="0" layoutInCell="1" allowOverlap="1" wp14:anchorId="7C86037C" wp14:editId="3C40AB6D">
-            <wp:simplePos x="914400" y="2087880"/>
-            <wp:positionH relativeFrom="margin">
-              <wp:align>left</wp:align>
+          <wp:anchor distT="0" distB="0" distL="114300" distR="114300" simplePos="0" relativeHeight="251670016" behindDoc="0" locked="0" layoutInCell="1" allowOverlap="1" wp14:anchorId="162C5705" wp14:editId="6191761C">
+            <wp:simplePos x="0" y="0"/>
+            <wp:positionH relativeFrom="column">
+              <wp:posOffset>-95250</wp:posOffset>
             </wp:positionH>
-            <wp:positionV relativeFrom="margin">
-              <wp:align>top</wp:align>
+            <wp:positionV relativeFrom="paragraph">
+              <wp:posOffset>541020</wp:posOffset>
             </wp:positionV>
             <wp:extent cx="2781300" cy="1569720"/>
             <wp:effectExtent l="0" t="0" r="0" b="0"/>
@@ -551,7 +741,7 @@
                     </pic:cNvPicPr>
                   </pic:nvPicPr>
                   <pic:blipFill>
-                    <a:blip r:embed="rId9" cstate="print">
+                    <a:blip r:embed="rId8" cstate="print">
                       <a:extLst>
                         <a:ext uri="{28A0092B-C50C-407E-A947-70E740481C1C}">
                           <a14:useLocalDpi xmlns:a14="http://schemas.microsoft.com/office/drawing/2010/main" val="0"/>
@@ -585,45 +775,98 @@
       <w:proofErr w:type="spellStart"/>
       <w:r>
         <w:rPr>
-          <w:rFonts w:ascii="Arial" w:hAnsi="Arial" w:cs="Arial"/>
+          <w:lang w:val="es-ES"/>
+        </w:rPr>
+        <w:t>Sanchez</w:t>
+      </w:r>
+      <w:proofErr w:type="spellEnd"/>
+      <w:r>
+        <w:rPr>
+          <w:lang w:val="es-ES"/>
+        </w:rPr>
+        <w:t xml:space="preserve"> </w:t>
+      </w:r>
+      <w:proofErr w:type="spellStart"/>
+      <w:r>
+        <w:rPr>
+          <w:lang w:val="es-ES"/>
+        </w:rPr>
+        <w:t>Toranzo</w:t>
+      </w:r>
+      <w:proofErr w:type="spellEnd"/>
+      <w:r>
+        <w:rPr>
+          <w:lang w:val="es-ES"/>
+        </w:rPr>
+        <w:t>, Lisandro </w:t>
+      </w:r>
+    </w:p>
+    <w:p>
+      <w:pPr>
+        <w:spacing w:after="200"/>
+        <w:rPr>
+          <w:noProof/>
+          <w:bdr w:val="none" w:sz="0" w:space="0" w:color="auto" w:frame="1"/>
+          <w:lang w:val="es-ES"/>
+        </w:rPr>
+      </w:pPr>
+      <w:r>
+        <w:rPr>
           <w:b/>
           <w:bCs/>
           <w:color w:val="000000"/>
-          <w:sz w:val="24"/>
-          <w:szCs w:val="24"/>
           <w:lang w:val="es-ES"/>
         </w:rPr>
-        <w:t>Nexura</w:t>
-      </w:r>
-      <w:proofErr w:type="spellEnd"/>
-      <w:r>
-        <w:rPr>
-          <w:rFonts w:ascii="Arial" w:hAnsi="Arial" w:cs="Arial"/>
-          <w:color w:val="000000"/>
-          <w:sz w:val="24"/>
-          <w:szCs w:val="24"/>
+        <w:t xml:space="preserve">¿QUIENES SOMOS?  </w:t>
+      </w:r>
+      <w:r>
+        <w:rPr>
+          <w:noProof/>
+          <w:bdr w:val="none" w:sz="0" w:space="0" w:color="auto" w:frame="1"/>
           <w:lang w:val="es-ES"/>
         </w:rPr>
-        <w:t xml:space="preserve"> es una consultora tecnológica conformada por un equipo de seis estudiantes avanzados de Ingeniería en Sistemas, unidos por la pasión de transformar dinámicas organizacionales complejas en soluciones de software eficientes, escalables y centradas en el usuario.  Nuestro nombre nace del concepto de "</w:t>
-      </w:r>
-      <w:r>
-        <w:rPr>
-          <w:rFonts w:ascii="Arial" w:hAnsi="Arial" w:cs="Arial"/>
+        <w:t xml:space="preserve"> </w:t>
+      </w:r>
+    </w:p>
+    <w:p>
+      <w:pPr>
+        <w:spacing w:after="200"/>
+        <w:rPr>
+          <w:b/>
+          <w:bCs/>
+          <w:lang w:val="es-ES"/>
+        </w:rPr>
+      </w:pPr>
+      <w:proofErr w:type="spellStart"/>
+      <w:r>
+        <w:rPr>
           <w:b/>
           <w:bCs/>
           <w:color w:val="000000"/>
-          <w:sz w:val="24"/>
-          <w:szCs w:val="24"/>
           <w:lang w:val="es-ES"/>
         </w:rPr>
+        <w:t>Nexura</w:t>
+      </w:r>
+      <w:proofErr w:type="spellEnd"/>
+      <w:r>
+        <w:rPr>
+          <w:color w:val="000000"/>
+          <w:lang w:val="es-ES"/>
+        </w:rPr>
+        <w:t xml:space="preserve"> es una consultora tecnológica conformada por un equipo de seis estudiantes avanzados de Ingeniería en Sistemas, unidos por la pasión de transformar dinámicas organizacionales complejas en soluciones de software eficientes, escalables y centradas en el usuario.  Nuestro nombre nace del concepto de "</w:t>
+      </w:r>
+      <w:r>
+        <w:rPr>
+          <w:b/>
+          <w:bCs/>
+          <w:color w:val="000000"/>
+          <w:lang w:val="es-ES"/>
+        </w:rPr>
         <w:t>nexo</w:t>
       </w:r>
       <w:r>
         <w:rPr>
-          <w:rFonts w:ascii="Arial" w:hAnsi="Arial" w:cs="Arial"/>
           <w:color w:val="000000"/>
-          <w:sz w:val="24"/>
-          <w:szCs w:val="24"/>
           <w:lang w:val="es-ES"/>
         </w:rPr>
         <w:t>", representando nuestra misión principal dentro del Análisis de Sistemas: actuar como el puente conector fundamental entre las necesidades reales del negocio, los usuarios y el desarrollo técnico de infraestructura tecnológica. Con una identidad impulsada por la energía de la innovación (naranja) y la claridad metodológica (blanco y amarillo), nos especializamos en desglosar problemas complejos para diseñar estructuras de información lógicas, sólidas y preparadas para el futuro.</w:t>
@@ -650,13 +893,14 @@
         <w:rPr>
           <w:lang w:val="es-ES"/>
         </w:rPr>
+        <w:lastRenderedPageBreak/>
         <w:t>ENUNCIADO DEL CASO DE ESTUDIO</w:t>
       </w:r>
     </w:p>
     <w:p>
       <w:pPr>
         <w:pStyle w:val="NormalWeb"/>
-        <w:spacing w:before="0" w:beforeAutospacing="0" w:after="200" w:afterAutospacing="0"/>
+        <w:spacing w:before="0" w:beforeAutospacing="0" w:after="200" w:afterAutospacing="0" w:line="360" w:lineRule="auto"/>
         <w:ind w:right="-531"/>
         <w:jc w:val="both"/>
       </w:pPr>
@@ -707,7 +951,7 @@
     <w:p>
       <w:pPr>
         <w:pStyle w:val="NormalWeb"/>
-        <w:spacing w:before="0" w:beforeAutospacing="0" w:after="200" w:afterAutospacing="0"/>
+        <w:spacing w:before="0" w:beforeAutospacing="0" w:after="200" w:afterAutospacing="0" w:line="360" w:lineRule="auto"/>
         <w:ind w:right="-531"/>
         <w:jc w:val="both"/>
       </w:pPr>
@@ -722,7 +966,7 @@
     <w:p>
       <w:pPr>
         <w:pStyle w:val="NormalWeb"/>
-        <w:spacing w:before="0" w:beforeAutospacing="0" w:after="200" w:afterAutospacing="0"/>
+        <w:spacing w:before="0" w:beforeAutospacing="0" w:after="200" w:afterAutospacing="0" w:line="360" w:lineRule="auto"/>
         <w:ind w:right="-531"/>
         <w:jc w:val="both"/>
       </w:pPr>
@@ -731,15 +975,20 @@
           <w:rFonts w:ascii="Arial" w:hAnsi="Arial" w:cs="Arial"/>
           <w:color w:val="000000"/>
         </w:rPr>
-        <w:t xml:space="preserve">Por esto, los usuarios necesitan una aplicación móvil de uso personal que les permita organizarse, simplificando la elección y el seguimiento de sus retiros. Agendándolos, descartando los retiros que no son de su agrado, filtros y búsqueda de los retiros agendados, planificación de pagos, registrar acompañantes y dejar valoraciones/opiniones, multimedia de sus experiencias. Además, buscan poder compartir las características de un </w:t>
-      </w:r>
-      <w:r>
-        <w:rPr>
-          <w:rFonts w:ascii="Arial" w:hAnsi="Arial" w:cs="Arial"/>
-          <w:color w:val="000000"/>
-        </w:rPr>
-        <w:lastRenderedPageBreak/>
-        <w:t>retiro con otros usuarios para invitarlos a sumarse y que la aplicación les envíe alertas cuando se encuentra cerca la fecha de un retiro o de la fecha de pago.</w:t>
+        <w:t>Por esto, los usuarios necesitan una aplicación móvil de uso personal que les permita organizarse, simplificando la elección y el seguimiento de sus retiros. Agendándolos, descartando los retiros que no son de su agrado, filtros y búsqueda de los retiros agendados, planificación de pagos, registrar acompañantes y dejar valoraciones/opiniones, multimedia de sus experiencias. Además, buscan poder compartir las características de un retiro con otros usuarios para invitarlos a sumarse y que la aplicación les envíe alertas cuando se encuentra cerca la fecha de un retiro o de la fecha de pago.</w:t>
+      </w:r>
+    </w:p>
+    <w:p>
+      <w:pPr>
+        <w:rPr>
+          <w:lang w:val="es-ES"/>
+        </w:rPr>
+      </w:pPr>
+      <w:r>
+        <w:rPr>
+          <w:lang w:val="es-ES"/>
+        </w:rPr>
+        <w:br w:type="page"/>
       </w:r>
     </w:p>
     <w:p>
@@ -1828,19 +2077,103 @@
     </w:p>
     <w:p>
       <w:pPr>
+        <w:rPr>
+          <w:rFonts w:ascii="Open Sans" w:eastAsia="Open Sans ExtraBold" w:hAnsi="Open Sans" w:cs="Open Sans"/>
+          <w:color w:val="FFAA00"/>
+          <w:sz w:val="20"/>
+          <w:szCs w:val="20"/>
+          <w:lang w:val="es-AR"/>
+        </w:rPr>
+      </w:pPr>
+      <w:r>
+        <w:rPr>
+          <w:rFonts w:ascii="Open Sans" w:hAnsi="Open Sans" w:cs="Open Sans"/>
+          <w:lang w:val="es-AR"/>
+        </w:rPr>
+        <w:br w:type="page"/>
+      </w:r>
+    </w:p>
+    <w:p>
+      <w:pPr>
         <w:pStyle w:val="Ttulo2"/>
         <w:spacing w:after="200"/>
         <w:ind w:left="-283"/>
         <w:jc w:val="left"/>
         <w:rPr>
           <w:rFonts w:ascii="Open Sans" w:hAnsi="Open Sans" w:cs="Open Sans"/>
-        </w:rPr>
-      </w:pPr>
+          <w:lang w:val="es-AR"/>
+        </w:rPr>
+      </w:pPr>
+      <w:r>
+        <w:rPr>
+          <w:lang w:val="es-AR"/>
+        </w:rPr>
+        <w:lastRenderedPageBreak/>
+        <w:t>MODELO DE OBJETOS DE DOMINIO DEL PROBLEMA: DIAGRAMA DE CLASES</w:t>
+      </w:r>
       <w:r>
         <w:rPr>
           <w:rFonts w:ascii="Open Sans" w:hAnsi="Open Sans" w:cs="Open Sans"/>
-        </w:rPr>
-        <w:t>MODELO DE OBJETOS DE DOMINIO DEL PROBLEMA: DIAGRAMA DE CLASES</w:t>
+          <w:noProof/>
+          <w:lang w:val="es-AR"/>
+        </w:rPr>
+        <w:drawing>
+          <wp:inline distT="0" distB="0" distL="0" distR="0" wp14:anchorId="242026C4" wp14:editId="6130DF43">
+            <wp:extent cx="6379534" cy="7282900"/>
+            <wp:effectExtent l="0" t="0" r="2540" b="0"/>
+            <wp:docPr id="3" name="Imagen 3" descr="C:\Users\PC - FELIPE\AppData\Local\Microsoft\Windows\INetCache\Content.Word\Diagrama de clases.jpeg"/>
+            <wp:cNvGraphicFramePr>
+              <a:graphicFrameLocks xmlns:a="http://schemas.openxmlformats.org/drawingml/2006/main" noChangeAspect="1"/>
+            </wp:cNvGraphicFramePr>
+            <a:graphic xmlns:a="http://schemas.openxmlformats.org/drawingml/2006/main">
+              <a:graphicData uri="http://schemas.openxmlformats.org/drawingml/2006/picture">
+                <pic:pic xmlns:pic="http://schemas.openxmlformats.org/drawingml/2006/picture">
+                  <pic:nvPicPr>
+                    <pic:cNvPr id="0" name="Picture 6" descr="C:\Users\PC - FELIPE\AppData\Local\Microsoft\Windows\INetCache\Content.Word\Diagrama de clases.jpeg"/>
+                    <pic:cNvPicPr>
+                      <a:picLocks noChangeAspect="1" noChangeArrowheads="1"/>
+                    </pic:cNvPicPr>
+                  </pic:nvPicPr>
+                  <pic:blipFill>
+                    <a:blip r:embed="rId9">
+                      <a:extLst>
+                        <a:ext uri="{28A0092B-C50C-407E-A947-70E740481C1C}">
+                          <a14:useLocalDpi xmlns:a14="http://schemas.microsoft.com/office/drawing/2010/main" val="0"/>
+                        </a:ext>
+                      </a:extLst>
+                    </a:blip>
+                    <a:srcRect/>
+                    <a:stretch>
+                      <a:fillRect/>
+                    </a:stretch>
+                  </pic:blipFill>
+                  <pic:spPr bwMode="auto">
+                    <a:xfrm>
+                      <a:off x="0" y="0"/>
+                      <a:ext cx="6415827" cy="7324332"/>
+                    </a:xfrm>
+                    <a:prstGeom prst="rect">
+                      <a:avLst/>
+                    </a:prstGeom>
+                    <a:noFill/>
+                    <a:ln>
+                      <a:noFill/>
+                    </a:ln>
+                  </pic:spPr>
+                </pic:pic>
+              </a:graphicData>
+            </a:graphic>
+          </wp:inline>
+        </w:drawing>
+      </w:r>
+      <w:r>
+        <w:rPr>
+          <w:rFonts w:ascii="Open Sans" w:hAnsi="Open Sans" w:cs="Open Sans"/>
+          <w:b/>
+          <w:bCs/>
+          <w:lang w:val="es-AR"/>
+        </w:rPr>
+        <w:br w:type="page"/>
       </w:r>
     </w:p>
     <w:p>
@@ -1853,6 +2186,7 @@
           <w:rFonts w:ascii="Open Sans" w:hAnsi="Open Sans" w:cs="Open Sans"/>
           <w:b/>
           <w:bCs/>
+          <w:lang w:val="es-AR"/>
         </w:rPr>
       </w:pPr>
       <w:r>
@@ -1860,7 +2194,9 @@
           <w:rFonts w:ascii="Open Sans" w:hAnsi="Open Sans" w:cs="Open Sans"/>
           <w:b/>
           <w:bCs/>
-        </w:rPr>
+          <w:lang w:val="es-AR"/>
+        </w:rPr>
+        <w:lastRenderedPageBreak/>
         <w:t>MODELO DE CASO DE USO: DIAGRAMA DE CASOS DE USO</w:t>
       </w:r>
     </w:p>
@@ -1901,19 +2237,354 @@
             <v:path o:extrusionok="f" gradientshapeok="t" o:connecttype="rect"/>
             <o:lock v:ext="edit" aspectratio="t"/>
           </v:shapetype>
-          <v:shape id="_x0000_i1025" type="#_x0000_t75" style="width:468pt;height:496pt">
-            <v:imagedata r:id="rId10" o:title="Retiros.drawio"/>
+          <v:shape id="_x0000_i1025" type="#_x0000_t75" style="width:468pt;height:495.75pt">
+            <v:imagedata r:id="rId10" o:title="Retiros"/>
           </v:shape>
         </w:pict>
       </w:r>
-      <w:bookmarkStart w:id="4" w:name="_GoBack"/>
-      <w:bookmarkEnd w:id="4"/>
+    </w:p>
+    <w:p>
+      <w:pPr>
+        <w:rPr>
+          <w:rFonts w:ascii="Open Sans ExtraBold" w:eastAsia="Open Sans ExtraBold" w:hAnsi="Open Sans ExtraBold" w:cs="Open Sans ExtraBold"/>
+          <w:b/>
+          <w:bCs/>
+          <w:color w:val="000000"/>
+          <w:sz w:val="20"/>
+          <w:szCs w:val="20"/>
+        </w:rPr>
+      </w:pPr>
+      <w:r>
+        <w:rPr>
+          <w:b/>
+          <w:bCs/>
+          <w:color w:val="000000"/>
+        </w:rPr>
+        <w:br w:type="page"/>
+      </w:r>
     </w:p>
     <w:p>
       <w:pPr>
         <w:pStyle w:val="Ttulo2"/>
         <w:spacing w:after="200"/>
         <w:ind w:left="-283"/>
+        <w:rPr>
+          <w:rFonts w:ascii="Open Sans" w:hAnsi="Open Sans" w:cs="Open Sans"/>
+          <w:b/>
+          <w:bCs/>
+          <w:lang w:val="es-AR"/>
+        </w:rPr>
+      </w:pPr>
+      <w:r>
+        <w:rPr>
+          <w:rFonts w:ascii="Open Sans" w:hAnsi="Open Sans" w:cs="Open Sans"/>
+          <w:b/>
+          <w:bCs/>
+          <w:lang w:val="es-AR"/>
+        </w:rPr>
+        <w:lastRenderedPageBreak/>
+        <w:t>LISTA DE CASOS DE USO Y OBJETIVOS</w:t>
+      </w:r>
+    </w:p>
+    <w:p>
+      <w:pPr>
+        <w:pStyle w:val="Ttulo2"/>
+        <w:spacing w:after="200"/>
+        <w:ind w:left="-283"/>
+        <w:rPr>
+          <w:rFonts w:ascii="Open Sans" w:hAnsi="Open Sans" w:cs="Open Sans"/>
+          <w:b/>
+          <w:bCs/>
+          <w:lang w:val="es-AR"/>
+        </w:rPr>
+      </w:pPr>
+      <w:r>
+        <w:rPr>
+          <w:rFonts w:ascii="Open Sans" w:hAnsi="Open Sans" w:cs="Open Sans"/>
+          <w:b/>
+          <w:bCs/>
+          <w:lang w:val="es-AR"/>
+        </w:rPr>
+        <w:t>PLANTILLA PARA DESCRIPCIÓN DE CASO DE USO: REGISTRAR RETIRO</w:t>
+      </w:r>
+    </w:p>
+    <w:p>
+      <w:pPr>
+        <w:pStyle w:val="Ttulo2"/>
+        <w:spacing w:after="200"/>
+        <w:ind w:left="-283"/>
+        <w:rPr>
+          <w:rFonts w:ascii="Open Sans" w:hAnsi="Open Sans" w:cs="Open Sans"/>
+          <w:b/>
+          <w:bCs/>
+        </w:rPr>
+      </w:pPr>
+      <w:r>
+        <w:rPr>
+          <w:rFonts w:ascii="Open Sans" w:hAnsi="Open Sans" w:cs="Open Sans"/>
+          <w:b/>
+          <w:bCs/>
+        </w:rPr>
+        <w:t>PROTOTIPO: REGISTRAR RETIRO</w:t>
+      </w:r>
+    </w:p>
+    <w:p>
+      <w:pPr>
+        <w:pStyle w:val="Ttulo2"/>
+        <w:spacing w:after="200"/>
+        <w:ind w:left="-283"/>
+        <w:rPr>
+          <w:rFonts w:ascii="Open Sans" w:hAnsi="Open Sans" w:cs="Open Sans"/>
+          <w:b/>
+          <w:bCs/>
+          <w:lang w:val="es-AR"/>
+        </w:rPr>
+      </w:pPr>
+      <w:r>
+        <w:rPr>
+          <w:rFonts w:ascii="Open Sans" w:hAnsi="Open Sans" w:cs="Open Sans"/>
+          <w:b/>
+          <w:bCs/>
+          <w:lang w:val="es-AR"/>
+        </w:rPr>
+        <w:t>PLANTILLA PARA DESCRIPCIÓN DE CASO DE USO: CONSULTAR RETIRO</w:t>
+      </w:r>
+    </w:p>
+    <w:p>
+      <w:pPr>
+        <w:pStyle w:val="Ttulo2"/>
+        <w:spacing w:after="200"/>
+        <w:ind w:left="-283"/>
+        <w:rPr>
+          <w:rFonts w:ascii="Open Sans" w:hAnsi="Open Sans" w:cs="Open Sans"/>
+          <w:b/>
+          <w:bCs/>
+        </w:rPr>
+      </w:pPr>
+      <w:r>
+        <w:rPr>
+          <w:rFonts w:ascii="Open Sans" w:hAnsi="Open Sans" w:cs="Open Sans"/>
+          <w:b/>
+          <w:bCs/>
+        </w:rPr>
+        <w:t>PROTOTIPO: CONSULTAR RETIRO</w:t>
+      </w:r>
+    </w:p>
+    <w:p>
+      <w:pPr>
+        <w:pStyle w:val="Ttulo2"/>
+        <w:spacing w:after="200"/>
+        <w:ind w:left="-283"/>
+        <w:rPr>
+          <w:rFonts w:ascii="Open Sans" w:hAnsi="Open Sans" w:cs="Open Sans"/>
+          <w:b/>
+          <w:bCs/>
+          <w:lang w:val="es-AR"/>
+        </w:rPr>
+      </w:pPr>
+      <w:r>
+        <w:rPr>
+          <w:rFonts w:ascii="Open Sans" w:hAnsi="Open Sans" w:cs="Open Sans"/>
+          <w:b/>
+          <w:bCs/>
+          <w:lang w:val="es-AR"/>
+        </w:rPr>
+        <w:t>PLANTILLA PARA DESCRIPCIÓN DE CASO DE USO: REGISTRAR VALORACIÓN</w:t>
+      </w:r>
+    </w:p>
+    <w:p>
+      <w:pPr>
+        <w:pStyle w:val="Ttulo2"/>
+        <w:spacing w:after="200"/>
+        <w:ind w:left="-283"/>
+        <w:rPr>
+          <w:rFonts w:ascii="Open Sans" w:hAnsi="Open Sans" w:cs="Open Sans"/>
+          <w:b/>
+          <w:bCs/>
+        </w:rPr>
+      </w:pPr>
+      <w:r>
+        <w:rPr>
+          <w:rFonts w:ascii="Open Sans" w:hAnsi="Open Sans" w:cs="Open Sans"/>
+          <w:b/>
+          <w:bCs/>
+        </w:rPr>
+        <w:t>PROTOTIPO: REGISTRAR VALORACIÓN</w:t>
+      </w:r>
+    </w:p>
+    <w:p>
+      <w:pPr>
+        <w:pStyle w:val="Ttulo2"/>
+        <w:spacing w:after="200"/>
+        <w:ind w:left="-283"/>
+        <w:rPr>
+          <w:rFonts w:ascii="Open Sans" w:hAnsi="Open Sans" w:cs="Open Sans"/>
+          <w:b/>
+          <w:bCs/>
+          <w:lang w:val="es-AR"/>
+        </w:rPr>
+      </w:pPr>
+      <w:r>
+        <w:rPr>
+          <w:rFonts w:ascii="Open Sans" w:hAnsi="Open Sans" w:cs="Open Sans"/>
+          <w:b/>
+          <w:bCs/>
+          <w:lang w:val="es-AR"/>
+        </w:rPr>
+        <w:t>LINK PROTOTIPO (SOLO DE LOS TRES CASOS DE USO DESCRITOS ANTERIORMENTE):</w:t>
+      </w:r>
+    </w:p>
+    <w:p>
+      <w:pPr>
+        <w:ind w:left="0"/>
+        <w:rPr>
+          <w:rFonts w:ascii="Open Sans" w:hAnsi="Open Sans" w:cs="Open Sans"/>
+          <w:b/>
+          <w:bCs/>
+          <w:lang w:val="es-AR"/>
+        </w:rPr>
+        <w:sectPr>
+          <w:headerReference w:type="default" r:id="rId11"/>
+          <w:headerReference w:type="first" r:id="rId12"/>
+          <w:pgSz w:w="12240" w:h="15840"/>
+          <w:pgMar w:top="1440" w:right="1440" w:bottom="1440" w:left="1440" w:header="720" w:footer="720" w:gutter="0"/>
+          <w:pgNumType w:start="1"/>
+          <w:cols w:space="720"/>
+          <w:titlePg/>
+          <w:docGrid w:linePitch="326"/>
+        </w:sectPr>
+      </w:pPr>
+    </w:p>
+    <w:p>
+      <w:pPr>
+        <w:pStyle w:val="Ttulo2"/>
+        <w:spacing w:after="200"/>
+        <w:ind w:left="0"/>
+        <w:rPr>
+          <w:rFonts w:ascii="Open Sans" w:hAnsi="Open Sans" w:cs="Open Sans"/>
+          <w:b/>
+          <w:bCs/>
+          <w:lang w:val="es-AR"/>
+        </w:rPr>
+      </w:pPr>
+    </w:p>
+    <w:p>
+      <w:pPr>
+        <w:pStyle w:val="Ttulo2"/>
+        <w:spacing w:after="200"/>
+        <w:ind w:left="0"/>
+        <w:rPr>
+          <w:b/>
+          <w:bCs/>
+          <w:noProof/>
+          <w:color w:val="000000"/>
+          <w:lang w:val="es-AR"/>
+        </w:rPr>
+      </w:pPr>
+      <w:bookmarkStart w:id="4" w:name="_GoBack"/>
+      <w:bookmarkEnd w:id="4"/>
+      <w:r>
+        <w:rPr>
+          <w:rFonts w:ascii="Open Sans" w:hAnsi="Open Sans" w:cs="Open Sans"/>
+          <w:b/>
+          <w:bCs/>
+          <w:lang w:val="es-AR"/>
+        </w:rPr>
+        <w:t>DIAGRAMA DE TRANSICIÓN DE ESTADOS: RETIRO (las transiciones se encuentran del lado derecho a su correspondiente flecha)</w:t>
+      </w:r>
+      <w:r>
+        <w:rPr>
+          <w:rFonts w:ascii="Open Sans" w:hAnsi="Open Sans" w:cs="Open Sans"/>
+          <w:b/>
+          <w:bCs/>
+          <w:lang w:val="es-AR"/>
+        </w:rPr>
+        <w:br/>
+      </w:r>
+    </w:p>
+    <w:p>
+      <w:pPr>
+        <w:pStyle w:val="Ttulo2"/>
+        <w:spacing w:after="200"/>
+        <w:ind w:left="-283"/>
+        <w:rPr>
+          <w:rFonts w:ascii="Open Sans" w:hAnsi="Open Sans" w:cs="Open Sans"/>
+          <w:b/>
+          <w:bCs/>
+          <w:lang w:val="es-AR"/>
+        </w:rPr>
+        <w:sectPr>
+          <w:pgSz w:w="15840" w:h="12240" w:orient="landscape"/>
+          <w:pgMar w:top="1440" w:right="1440" w:bottom="1440" w:left="1440" w:header="720" w:footer="720" w:gutter="0"/>
+          <w:pgNumType w:start="1"/>
+          <w:cols w:space="720"/>
+          <w:titlePg/>
+          <w:docGrid w:linePitch="326"/>
+        </w:sectPr>
+      </w:pPr>
+      <w:r>
+        <w:rPr>
+          <w:b/>
+          <w:bCs/>
+          <w:noProof/>
+          <w:color w:val="000000"/>
+          <w:lang w:val="es-AR"/>
+        </w:rPr>
+        <w:drawing>
+          <wp:inline distT="0" distB="0" distL="0" distR="0" wp14:anchorId="3F2354AF" wp14:editId="01445BE6">
+            <wp:extent cx="8782050" cy="4331526"/>
+            <wp:effectExtent l="0" t="0" r="0" b="0"/>
+            <wp:docPr id="4" name="Imagen 4" descr="C:\Users\PC - FELIPE\AppData\Local\Microsoft\Windows\INetCache\Content.Word\Diagrama de transición de estados.png"/>
+            <wp:cNvGraphicFramePr>
+              <a:graphicFrameLocks xmlns:a="http://schemas.openxmlformats.org/drawingml/2006/main" noChangeAspect="1"/>
+            </wp:cNvGraphicFramePr>
+            <a:graphic xmlns:a="http://schemas.openxmlformats.org/drawingml/2006/main">
+              <a:graphicData uri="http://schemas.openxmlformats.org/drawingml/2006/picture">
+                <pic:pic xmlns:pic="http://schemas.openxmlformats.org/drawingml/2006/picture">
+                  <pic:nvPicPr>
+                    <pic:cNvPr id="0" name="Picture 12" descr="C:\Users\PC - FELIPE\AppData\Local\Microsoft\Windows\INetCache\Content.Word\Diagrama de transición de estados.png"/>
+                    <pic:cNvPicPr>
+                      <a:picLocks noChangeAspect="1" noChangeArrowheads="1"/>
+                    </pic:cNvPicPr>
+                  </pic:nvPicPr>
+                  <pic:blipFill>
+                    <a:blip r:embed="rId13">
+                      <a:extLst>
+                        <a:ext uri="{28A0092B-C50C-407E-A947-70E740481C1C}">
+                          <a14:useLocalDpi xmlns:a14="http://schemas.microsoft.com/office/drawing/2010/main" val="0"/>
+                        </a:ext>
+                      </a:extLst>
+                    </a:blip>
+                    <a:srcRect/>
+                    <a:stretch>
+                      <a:fillRect/>
+                    </a:stretch>
+                  </pic:blipFill>
+                  <pic:spPr bwMode="auto">
+                    <a:xfrm>
+                      <a:off x="0" y="0"/>
+                      <a:ext cx="8816756" cy="4348644"/>
+                    </a:xfrm>
+                    <a:prstGeom prst="rect">
+                      <a:avLst/>
+                    </a:prstGeom>
+                    <a:noFill/>
+                    <a:ln>
+                      <a:noFill/>
+                    </a:ln>
+                  </pic:spPr>
+                </pic:pic>
+              </a:graphicData>
+            </a:graphic>
+          </wp:inline>
+        </w:drawing>
+      </w:r>
+    </w:p>
+    <w:p>
+      <w:pPr>
+        <w:pStyle w:val="Ttulo2"/>
+        <w:spacing w:after="200"/>
+        <w:ind w:left="0"/>
         <w:rPr>
           <w:lang w:val="es-AR"/>
         </w:rPr>
@@ -1994,7 +2665,7 @@
                     </pic:cNvPicPr>
                   </pic:nvPicPr>
                   <pic:blipFill>
-                    <a:blip r:embed="rId11">
+                    <a:blip r:embed="rId14">
                       <a:extLst>
                         <a:ext uri="{28A0092B-C50C-407E-A947-70E740481C1C}">
                           <a14:useLocalDpi xmlns:a14="http://schemas.microsoft.com/office/drawing/2010/main" val="0"/>
@@ -2044,7 +2715,7 @@
         </w:rPr>
         <w:t xml:space="preserve"> </w:t>
       </w:r>
-      <w:hyperlink r:id="rId12" w:history="1">
+      <w:hyperlink r:id="rId15" w:history="1">
         <w:r>
           <w:rPr>
             <w:rStyle w:val="Hipervnculo"/>
@@ -2092,7 +2763,7 @@
                     </pic:cNvPicPr>
                   </pic:nvPicPr>
                   <pic:blipFill>
-                    <a:blip r:embed="rId13">
+                    <a:blip r:embed="rId16">
                       <a:extLst>
                         <a:ext uri="{28A0092B-C50C-407E-A947-70E740481C1C}">
                           <a14:useLocalDpi xmlns:a14="http://schemas.microsoft.com/office/drawing/2010/main" val="0"/>
@@ -2150,7 +2821,7 @@
           <w:lang w:val="en"/>
         </w:rPr>
       </w:pPr>
-      <w:hyperlink r:id="rId14" w:history="1">
+      <w:hyperlink r:id="rId17" w:history="1">
         <w:r>
           <w:rPr>
             <w:rStyle w:val="Hipervnculo"/>
@@ -2182,7 +2853,6 @@
           <w:color w:val="FFAA00"/>
           <w:sz w:val="20"/>
           <w:szCs w:val="20"/>
-          <w:lang w:val="es-ES"/>
         </w:rPr>
       </w:pPr>
       <w:r>
@@ -2191,8 +2861,8 @@
           <w:color w:val="FFAA00"/>
           <w:sz w:val="20"/>
           <w:szCs w:val="20"/>
-          <w:lang w:val="es-ES"/>
-        </w:rPr>
+        </w:rPr>
+        <w:lastRenderedPageBreak/>
         <w:t>ELICITACION</w:t>
       </w:r>
     </w:p>
@@ -2291,14 +2961,14 @@
         <w:rPr>
           <w:lang w:val="es-AR"/>
         </w:rPr>
-        <w:t xml:space="preserve">Le gustaría tener eso en una app para que le simplifique la elección de los retiros. PONER FILTROS, ALERTAS PARA QUE LLEGUEN POR CORREO (alertas que se acerca uno que le interesa, que tiene que pagar el saldo) LA NECESIDAD BÁSICA es organizarse. Un plus sería buscar los retiros que quiere. Le gustaría TENER LOS RETIROS que le interesan, tenerlos organizados, si tiene que buscar un retiro en un lugar, con determinadas actividades, fechas. Que lo pueda buscar. Si tiene que contestar algo que le mandaron, si </w:t>
+        <w:t xml:space="preserve">Le gustaría tener eso en una app para que le simplifique la elección de los retiros. PONER FILTROS, ALERTAS PARA QUE LLEGUEN POR CORREO (alertas que se acerca uno que le interesa, que tiene que pagar el saldo) LA NECESIDAD BÁSICA es organizarse. Un plus sería buscar los retiros que quiere. Le gustaría TENER LOS RETIROS que le interesan, tenerlos organizados, si tiene que buscar un retiro en un lugar, con determinadas actividades, fechas. Que lo pueda buscar. Si tiene que contestar algo que le mandaron, si tiene que pagar. TAMBIÉN SACAR Los retiros que no le interesan. Transferencia o efectivo </w:t>
       </w:r>
       <w:r>
         <w:rPr>
           <w:lang w:val="es-AR"/>
         </w:rPr>
         <w:lastRenderedPageBreak/>
-        <w:t>tiene que pagar. TAMBIÉN SACAR Los retiros que no le interesan. Transferencia o efectivo en el lugar. Otro dato puede ser el acompañante con el que va a cada retiro. TENER FOTOS DEL LUGAR. Para que se fije PUEDE TENER VALORACIÓN PERSONAL. Porque suele repetir retiros porque le gustaron Estaría bueno que pueda enviar características del retiro a un amigo, para invitar y que vea si se suma o no a ella. MANDAR RECORDATORIOS (fecha de inicio, pagos) NO HAY CONTRATO NO PONE COMENTARIOS DE OTRAS PERSONAS DE LOS RETIROS Se ve si es real o no el retiro por reseñas anteriores SABER CUANTO GASTO mensual o anual en retiros, REGISTRO DE GASTOS</w:t>
+        <w:t>en el lugar. Otro dato puede ser el acompañante con el que va a cada retiro. TENER FOTOS DEL LUGAR. Para que se fije PUEDE TENER VALORACIÓN PERSONAL. Porque suele repetir retiros porque le gustaron Estaría bueno que pueda enviar características del retiro a un amigo, para invitar y que vea si se suma o no a ella. MANDAR RECORDATORIOS (fecha de inicio, pagos) NO HAY CONTRATO NO PONE COMENTARIOS DE OTRAS PERSONAS DE LOS RETIROS Se ve si es real o no el retiro por reseñas anteriores SABER CUANTO GASTO mensual o anual en retiros, REGISTRO DE GASTOS</w:t>
       </w:r>
       <w:r>
         <w:rPr>
@@ -2308,7 +2978,6 @@
       </w:r>
     </w:p>
     <w:sectPr>
-      <w:headerReference w:type="default" r:id="rId15"/>
       <w:pgSz w:w="12240" w:h="15840"/>
       <w:pgMar w:top="1440" w:right="1440" w:bottom="1440" w:left="1440" w:header="720" w:footer="720" w:gutter="0"/>
       <w:pgNumType w:start="1"/>
@@ -2321,7 +2990,7 @@
 </file>
 
 <file path=word/endnotes.xml><?xml version="1.0" encoding="utf-8"?>
-<w:endnotes xmlns:wpc="http://schemas.microsoft.com/office/word/2010/wordprocessingCanvas" xmlns:mc="http://schemas.openxmlformats.org/markup-compatibility/2006" xmlns:o="urn:schemas-microsoft-com:office:office" xmlns:r="http://schemas.openxmlformats.org/officeDocument/2006/relationships" xmlns:m="http://schemas.openxmlformats.org/officeDocument/2006/math" xmlns:v="urn:schemas-microsoft-com:vml" xmlns:wp14="http://schemas.microsoft.com/office/word/2010/wordprocessingDrawing" xmlns:wp="http://schemas.openxmlformats.org/drawingml/2006/wordprocessingDrawing" xmlns:w10="urn:schemas-microsoft-com:office:word" xmlns:w="http://schemas.openxmlformats.org/wordprocessingml/2006/main" xmlns:w14="http://schemas.microsoft.com/office/word/2010/wordml" xmlns:wpg="http://schemas.microsoft.com/office/word/2010/wordprocessingGroup" xmlns:wpi="http://schemas.microsoft.com/office/word/2010/wordprocessingInk" xmlns:wne="http://schemas.microsoft.com/office/word/2006/wordml" xmlns:wps="http://schemas.microsoft.com/office/word/2010/wordprocessingShape" mc:Ignorable="w14 wp14">
+<w:endnotes xmlns:wpc="http://schemas.microsoft.com/office/word/2010/wordprocessingCanvas" xmlns:mc="http://schemas.openxmlformats.org/markup-compatibility/2006" xmlns:o="urn:schemas-microsoft-com:office:office" xmlns:r="http://schemas.openxmlformats.org/officeDocument/2006/relationships" xmlns:m="http://schemas.openxmlformats.org/officeDocument/2006/math" xmlns:v="urn:schemas-microsoft-com:vml" xmlns:wp14="http://schemas.microsoft.com/office/word/2010/wordprocessingDrawing" xmlns:wp="http://schemas.openxmlformats.org/drawingml/2006/wordprocessingDrawing" xmlns:w10="urn:schemas-microsoft-com:office:word" xmlns:w="http://schemas.openxmlformats.org/wordprocessingml/2006/main" xmlns:w14="http://schemas.microsoft.com/office/word/2010/wordml" xmlns:w15="http://schemas.microsoft.com/office/word/2012/wordml" xmlns:wpg="http://schemas.microsoft.com/office/word/2010/wordprocessingGroup" xmlns:wpi="http://schemas.microsoft.com/office/word/2010/wordprocessingInk" xmlns:wne="http://schemas.microsoft.com/office/word/2006/wordml" xmlns:wps="http://schemas.microsoft.com/office/word/2010/wordprocessingShape" mc:Ignorable="w14 w15 wp14">
   <w:endnote w:type="separator" w:id="-1">
     <w:p>
       <w:pPr>
@@ -2346,7 +3015,7 @@
 </file>
 
 <file path=word/footnotes.xml><?xml version="1.0" encoding="utf-8"?>
-<w:footnotes xmlns:wpc="http://schemas.microsoft.com/office/word/2010/wordprocessingCanvas" xmlns:mc="http://schemas.openxmlformats.org/markup-compatibility/2006" xmlns:o="urn:schemas-microsoft-com:office:office" xmlns:r="http://schemas.openxmlformats.org/officeDocument/2006/relationships" xmlns:m="http://schemas.openxmlformats.org/officeDocument/2006/math" xmlns:v="urn:schemas-microsoft-com:vml" xmlns:wp14="http://schemas.microsoft.com/office/word/2010/wordprocessingDrawing" xmlns:wp="http://schemas.openxmlformats.org/drawingml/2006/wordprocessingDrawing" xmlns:w10="urn:schemas-microsoft-com:office:word" xmlns:w="http://schemas.openxmlformats.org/wordprocessingml/2006/main" xmlns:w14="http://schemas.microsoft.com/office/word/2010/wordml" xmlns:wpg="http://schemas.microsoft.com/office/word/2010/wordprocessingGroup" xmlns:wpi="http://schemas.microsoft.com/office/word/2010/wordprocessingInk" xmlns:wne="http://schemas.microsoft.com/office/word/2006/wordml" xmlns:wps="http://schemas.microsoft.com/office/word/2010/wordprocessingShape" mc:Ignorable="w14 wp14">
+<w:footnotes xmlns:wpc="http://schemas.microsoft.com/office/word/2010/wordprocessingCanvas" xmlns:mc="http://schemas.openxmlformats.org/markup-compatibility/2006" xmlns:o="urn:schemas-microsoft-com:office:office" xmlns:r="http://schemas.openxmlformats.org/officeDocument/2006/relationships" xmlns:m="http://schemas.openxmlformats.org/officeDocument/2006/math" xmlns:v="urn:schemas-microsoft-com:vml" xmlns:wp14="http://schemas.microsoft.com/office/word/2010/wordprocessingDrawing" xmlns:wp="http://schemas.openxmlformats.org/drawingml/2006/wordprocessingDrawing" xmlns:w10="urn:schemas-microsoft-com:office:word" xmlns:w="http://schemas.openxmlformats.org/wordprocessingml/2006/main" xmlns:w14="http://schemas.microsoft.com/office/word/2010/wordml" xmlns:w15="http://schemas.microsoft.com/office/word/2012/wordml" xmlns:wpg="http://schemas.microsoft.com/office/word/2010/wordprocessingGroup" xmlns:wpi="http://schemas.microsoft.com/office/word/2010/wordprocessingInk" xmlns:wne="http://schemas.microsoft.com/office/word/2006/wordml" xmlns:wps="http://schemas.microsoft.com/office/word/2010/wordprocessingShape" mc:Ignorable="w14 w15 wp14">
   <w:footnote w:type="separator" w:id="-1">
     <w:p>
       <w:pPr>
@@ -2371,7 +3040,7 @@
 </file>
 
 <file path=word/header1.xml><?xml version="1.0" encoding="utf-8"?>
-<w:hdr xmlns:wpc="http://schemas.microsoft.com/office/word/2010/wordprocessingCanvas" xmlns:mc="http://schemas.openxmlformats.org/markup-compatibility/2006" xmlns:o="urn:schemas-microsoft-com:office:office" xmlns:r="http://schemas.openxmlformats.org/officeDocument/2006/relationships" xmlns:m="http://schemas.openxmlformats.org/officeDocument/2006/math" xmlns:v="urn:schemas-microsoft-com:vml" xmlns:wp14="http://schemas.microsoft.com/office/word/2010/wordprocessingDrawing" xmlns:wp="http://schemas.openxmlformats.org/drawingml/2006/wordprocessingDrawing" xmlns:w10="urn:schemas-microsoft-com:office:word" xmlns:w="http://schemas.openxmlformats.org/wordprocessingml/2006/main" xmlns:w14="http://schemas.microsoft.com/office/word/2010/wordml" xmlns:wpg="http://schemas.microsoft.com/office/word/2010/wordprocessingGroup" xmlns:wpi="http://schemas.microsoft.com/office/word/2010/wordprocessingInk" xmlns:wne="http://schemas.microsoft.com/office/word/2006/wordml" xmlns:wps="http://schemas.microsoft.com/office/word/2010/wordprocessingShape" mc:Ignorable="w14 wp14">
+<w:hdr xmlns:wpc="http://schemas.microsoft.com/office/word/2010/wordprocessingCanvas" xmlns:mc="http://schemas.openxmlformats.org/markup-compatibility/2006" xmlns:o="urn:schemas-microsoft-com:office:office" xmlns:r="http://schemas.openxmlformats.org/officeDocument/2006/relationships" xmlns:m="http://schemas.openxmlformats.org/officeDocument/2006/math" xmlns:v="urn:schemas-microsoft-com:vml" xmlns:wp14="http://schemas.microsoft.com/office/word/2010/wordprocessingDrawing" xmlns:wp="http://schemas.openxmlformats.org/drawingml/2006/wordprocessingDrawing" xmlns:w10="urn:schemas-microsoft-com:office:word" xmlns:w="http://schemas.openxmlformats.org/wordprocessingml/2006/main" xmlns:w14="http://schemas.microsoft.com/office/word/2010/wordml" xmlns:w15="http://schemas.microsoft.com/office/word/2012/wordml" xmlns:wpg="http://schemas.microsoft.com/office/word/2010/wordprocessingGroup" xmlns:wpi="http://schemas.microsoft.com/office/word/2010/wordprocessingInk" xmlns:wne="http://schemas.microsoft.com/office/word/2006/wordml" xmlns:wps="http://schemas.microsoft.com/office/word/2010/wordprocessingShape" mc:Ignorable="w14 w15 wp14">
   <w:p>
     <w:pPr>
       <w:spacing w:before="200" w:after="0"/>
@@ -2398,7 +3067,7 @@
         <wp:inline distT="114300" distB="114300" distL="114300" distR="114300" wp14:anchorId="32622BED" wp14:editId="7B3BEE66">
           <wp:extent cx="1803809" cy="542925"/>
           <wp:effectExtent l="0" t="0" r="0" b="0"/>
-          <wp:docPr id="2" name="image3.png"/>
+          <wp:docPr id="7" name="image3.png"/>
           <wp:cNvGraphicFramePr/>
           <a:graphic xmlns:a="http://schemas.openxmlformats.org/drawingml/2006/main">
             <a:graphicData uri="http://schemas.openxmlformats.org/drawingml/2006/picture">
@@ -2450,7 +3119,7 @@
         <wp:inline distT="114300" distB="114300" distL="114300" distR="114300" wp14:anchorId="4535ADF3" wp14:editId="375F1686">
           <wp:extent cx="2390180" cy="436563"/>
           <wp:effectExtent l="0" t="0" r="0" b="0"/>
-          <wp:docPr id="1" name="image2.png"/>
+          <wp:docPr id="8" name="image2.png"/>
           <wp:cNvGraphicFramePr/>
           <a:graphic xmlns:a="http://schemas.openxmlformats.org/drawingml/2006/main">
             <a:graphicData uri="http://schemas.openxmlformats.org/drawingml/2006/picture">
@@ -2500,7 +3169,165 @@
         <wp:inline distT="114300" distB="114300" distL="114300" distR="114300" wp14:anchorId="55EFE4F3" wp14:editId="6F2F290C">
           <wp:extent cx="5731200" cy="38100"/>
           <wp:effectExtent l="0" t="0" r="0" b="0"/>
-          <wp:docPr id="5" name="image1.png" descr="línea horizontal"/>
+          <wp:docPr id="9" name="image1.png" descr="línea horizontal"/>
+          <wp:cNvGraphicFramePr/>
+          <a:graphic xmlns:a="http://schemas.openxmlformats.org/drawingml/2006/main">
+            <a:graphicData uri="http://schemas.openxmlformats.org/drawingml/2006/picture">
+              <pic:pic xmlns:pic="http://schemas.openxmlformats.org/drawingml/2006/picture">
+                <pic:nvPicPr>
+                  <pic:cNvPr id="0" name="image1.png" descr="línea horizontal"/>
+                  <pic:cNvPicPr preferRelativeResize="0"/>
+                </pic:nvPicPr>
+                <pic:blipFill>
+                  <a:blip r:embed="rId3"/>
+                  <a:srcRect/>
+                  <a:stretch>
+                    <a:fillRect/>
+                  </a:stretch>
+                </pic:blipFill>
+                <pic:spPr>
+                  <a:xfrm>
+                    <a:off x="0" y="0"/>
+                    <a:ext cx="5731200" cy="38100"/>
+                  </a:xfrm>
+                  <a:prstGeom prst="rect">
+                    <a:avLst/>
+                  </a:prstGeom>
+                  <a:ln/>
+                </pic:spPr>
+              </pic:pic>
+            </a:graphicData>
+          </a:graphic>
+        </wp:inline>
+      </w:drawing>
+    </w:r>
+  </w:p>
+</w:hdr>
+</file>
+
+<file path=word/header2.xml><?xml version="1.0" encoding="utf-8"?>
+<w:hdr xmlns:wpc="http://schemas.microsoft.com/office/word/2010/wordprocessingCanvas" xmlns:mc="http://schemas.openxmlformats.org/markup-compatibility/2006" xmlns:o="urn:schemas-microsoft-com:office:office" xmlns:r="http://schemas.openxmlformats.org/officeDocument/2006/relationships" xmlns:m="http://schemas.openxmlformats.org/officeDocument/2006/math" xmlns:v="urn:schemas-microsoft-com:vml" xmlns:wp14="http://schemas.microsoft.com/office/word/2010/wordprocessingDrawing" xmlns:wp="http://schemas.openxmlformats.org/drawingml/2006/wordprocessingDrawing" xmlns:w10="urn:schemas-microsoft-com:office:word" xmlns:w="http://schemas.openxmlformats.org/wordprocessingml/2006/main" xmlns:w14="http://schemas.microsoft.com/office/word/2010/wordml" xmlns:w15="http://schemas.microsoft.com/office/word/2012/wordml" xmlns:wpg="http://schemas.microsoft.com/office/word/2010/wordprocessingGroup" xmlns:wpi="http://schemas.microsoft.com/office/word/2010/wordprocessingInk" xmlns:wne="http://schemas.microsoft.com/office/word/2006/wordml" xmlns:wps="http://schemas.microsoft.com/office/word/2010/wordprocessingShape" mc:Ignorable="w14 w15 wp14">
+  <w:p>
+    <w:pPr>
+      <w:pStyle w:val="Encabezado"/>
+      <w:rPr>
+        <w:rFonts w:ascii="Open Sans" w:eastAsia="Open Sans" w:hAnsi="Open Sans" w:cs="Open Sans"/>
+        <w:sz w:val="22"/>
+        <w:szCs w:val="22"/>
+      </w:rPr>
+    </w:pPr>
+    <w:r>
+      <w:rPr>
+        <w:rFonts w:ascii="Open Sans" w:eastAsia="Open Sans" w:hAnsi="Open Sans" w:cs="Open Sans"/>
+        <w:noProof/>
+        <w:sz w:val="22"/>
+        <w:szCs w:val="22"/>
+        <w:lang w:val="es-AR"/>
+      </w:rPr>
+      <w:drawing>
+        <wp:inline distT="114300" distB="114300" distL="114300" distR="114300" wp14:anchorId="58476A9B" wp14:editId="46D19A58">
+          <wp:extent cx="1803809" cy="542925"/>
+          <wp:effectExtent l="0" t="0" r="0" b="0"/>
+          <wp:docPr id="10" name="image3.png"/>
+          <wp:cNvGraphicFramePr/>
+          <a:graphic xmlns:a="http://schemas.openxmlformats.org/drawingml/2006/main">
+            <a:graphicData uri="http://schemas.openxmlformats.org/drawingml/2006/picture">
+              <pic:pic xmlns:pic="http://schemas.openxmlformats.org/drawingml/2006/picture">
+                <pic:nvPicPr>
+                  <pic:cNvPr id="0" name="image3.png"/>
+                  <pic:cNvPicPr preferRelativeResize="0"/>
+                </pic:nvPicPr>
+                <pic:blipFill>
+                  <a:blip r:embed="rId1"/>
+                  <a:srcRect/>
+                  <a:stretch>
+                    <a:fillRect/>
+                  </a:stretch>
+                </pic:blipFill>
+                <pic:spPr>
+                  <a:xfrm>
+                    <a:off x="0" y="0"/>
+                    <a:ext cx="1803809" cy="542925"/>
+                  </a:xfrm>
+                  <a:prstGeom prst="rect">
+                    <a:avLst/>
+                  </a:prstGeom>
+                  <a:ln/>
+                </pic:spPr>
+              </pic:pic>
+            </a:graphicData>
+          </a:graphic>
+        </wp:inline>
+      </w:drawing>
+    </w:r>
+    <w:r>
+      <w:rPr>
+        <w:rFonts w:ascii="Open Sans" w:eastAsia="Open Sans" w:hAnsi="Open Sans" w:cs="Open Sans"/>
+        <w:sz w:val="22"/>
+        <w:szCs w:val="22"/>
+      </w:rPr>
+      <w:t xml:space="preserve">                                        </w:t>
+    </w:r>
+    <w:r>
+      <w:rPr>
+        <w:rFonts w:ascii="Open Sans" w:eastAsia="Open Sans" w:hAnsi="Open Sans" w:cs="Open Sans"/>
+        <w:noProof/>
+        <w:sz w:val="22"/>
+        <w:szCs w:val="22"/>
+        <w:lang w:val="es-AR"/>
+      </w:rPr>
+      <w:drawing>
+        <wp:inline distT="114300" distB="114300" distL="114300" distR="114300" wp14:anchorId="721AFA3B" wp14:editId="0FFEA897">
+          <wp:extent cx="2390180" cy="436563"/>
+          <wp:effectExtent l="0" t="0" r="0" b="0"/>
+          <wp:docPr id="11" name="image2.png"/>
+          <wp:cNvGraphicFramePr/>
+          <a:graphic xmlns:a="http://schemas.openxmlformats.org/drawingml/2006/main">
+            <a:graphicData uri="http://schemas.openxmlformats.org/drawingml/2006/picture">
+              <pic:pic xmlns:pic="http://schemas.openxmlformats.org/drawingml/2006/picture">
+                <pic:nvPicPr>
+                  <pic:cNvPr id="0" name="image2.png"/>
+                  <pic:cNvPicPr preferRelativeResize="0"/>
+                </pic:nvPicPr>
+                <pic:blipFill>
+                  <a:blip r:embed="rId2"/>
+                  <a:srcRect/>
+                  <a:stretch>
+                    <a:fillRect/>
+                  </a:stretch>
+                </pic:blipFill>
+                <pic:spPr>
+                  <a:xfrm>
+                    <a:off x="0" y="0"/>
+                    <a:ext cx="2390180" cy="436563"/>
+                  </a:xfrm>
+                  <a:prstGeom prst="rect">
+                    <a:avLst/>
+                  </a:prstGeom>
+                  <a:ln/>
+                </pic:spPr>
+              </pic:pic>
+            </a:graphicData>
+          </a:graphic>
+        </wp:inline>
+      </w:drawing>
+    </w:r>
+  </w:p>
+  <w:p>
+    <w:pPr>
+      <w:pStyle w:val="Encabezado"/>
+    </w:pPr>
+    <w:r>
+      <w:rPr>
+        <w:rFonts w:ascii="Open Sans" w:eastAsia="Open Sans" w:hAnsi="Open Sans" w:cs="Open Sans"/>
+        <w:noProof/>
+        <w:lang w:val="es-AR"/>
+      </w:rPr>
+      <w:drawing>
+        <wp:inline distT="114300" distB="114300" distL="114300" distR="114300" wp14:anchorId="63F18614" wp14:editId="43B1A779">
+          <wp:extent cx="5731200" cy="38100"/>
+          <wp:effectExtent l="0" t="0" r="0" b="0"/>
+          <wp:docPr id="12" name="image1.png" descr="línea horizontal"/>
           <wp:cNvGraphicFramePr/>
           <a:graphic xmlns:a="http://schemas.openxmlformats.org/drawingml/2006/main">
             <a:graphicData uri="http://schemas.openxmlformats.org/drawingml/2006/picture">
@@ -2537,8 +3364,121 @@
 </file>
 
 <file path=word/numbering.xml><?xml version="1.0" encoding="utf-8"?>
-<w:numbering xmlns:wpc="http://schemas.microsoft.com/office/word/2010/wordprocessingCanvas" xmlns:mc="http://schemas.openxmlformats.org/markup-compatibility/2006" xmlns:o="urn:schemas-microsoft-com:office:office" xmlns:r="http://schemas.openxmlformats.org/officeDocument/2006/relationships" xmlns:m="http://schemas.openxmlformats.org/officeDocument/2006/math" xmlns:v="urn:schemas-microsoft-com:vml" xmlns:wp14="http://schemas.microsoft.com/office/word/2010/wordprocessingDrawing" xmlns:wp="http://schemas.openxmlformats.org/drawingml/2006/wordprocessingDrawing" xmlns:w10="urn:schemas-microsoft-com:office:word" xmlns:w="http://schemas.openxmlformats.org/wordprocessingml/2006/main" xmlns:w14="http://schemas.microsoft.com/office/word/2010/wordml" xmlns:wpg="http://schemas.microsoft.com/office/word/2010/wordprocessingGroup" xmlns:wpi="http://schemas.microsoft.com/office/word/2010/wordprocessingInk" xmlns:wne="http://schemas.microsoft.com/office/word/2006/wordml" xmlns:wps="http://schemas.microsoft.com/office/word/2010/wordprocessingShape" mc:Ignorable="w14 wp14">
-  <w:abstractNum w:abstractNumId="0">
+<w:numbering xmlns:wpc="http://schemas.microsoft.com/office/word/2010/wordprocessingCanvas" xmlns:mc="http://schemas.openxmlformats.org/markup-compatibility/2006" xmlns:o="urn:schemas-microsoft-com:office:office" xmlns:r="http://schemas.openxmlformats.org/officeDocument/2006/relationships" xmlns:m="http://schemas.openxmlformats.org/officeDocument/2006/math" xmlns:v="urn:schemas-microsoft-com:vml" xmlns:wp14="http://schemas.microsoft.com/office/word/2010/wordprocessingDrawing" xmlns:wp="http://schemas.openxmlformats.org/drawingml/2006/wordprocessingDrawing" xmlns:w10="urn:schemas-microsoft-com:office:word" xmlns:w="http://schemas.openxmlformats.org/wordprocessingml/2006/main" xmlns:w14="http://schemas.microsoft.com/office/word/2010/wordml" xmlns:w15="http://schemas.microsoft.com/office/word/2012/wordml" xmlns:wpg="http://schemas.microsoft.com/office/word/2010/wordprocessingGroup" xmlns:wpi="http://schemas.microsoft.com/office/word/2010/wordprocessingInk" xmlns:wne="http://schemas.microsoft.com/office/word/2006/wordml" xmlns:wps="http://schemas.microsoft.com/office/word/2010/wordprocessingShape" mc:Ignorable="w14 w15 wp14">
+  <w:abstractNum w:abstractNumId="0" w15:restartNumberingAfterBreak="0">
+    <w:nsid w:val="0ACC6B28"/>
+    <w:multiLevelType w:val="multilevel"/>
+    <w:tmpl w:val="730C14D8"/>
+    <w:lvl w:ilvl="0">
+      <w:start w:val="1"/>
+      <w:numFmt w:val="decimal"/>
+      <w:lvlText w:val="%1."/>
+      <w:lvlJc w:val="left"/>
+      <w:pPr>
+        <w:tabs>
+          <w:tab w:val="num" w:pos="720"/>
+        </w:tabs>
+        <w:ind w:left="720" w:hanging="360"/>
+      </w:pPr>
+    </w:lvl>
+    <w:lvl w:ilvl="1" w:tentative="1">
+      <w:start w:val="1"/>
+      <w:numFmt w:val="decimal"/>
+      <w:lvlText w:val="%2."/>
+      <w:lvlJc w:val="left"/>
+      <w:pPr>
+        <w:tabs>
+          <w:tab w:val="num" w:pos="1440"/>
+        </w:tabs>
+        <w:ind w:left="1440" w:hanging="360"/>
+      </w:pPr>
+    </w:lvl>
+    <w:lvl w:ilvl="2" w:tentative="1">
+      <w:start w:val="1"/>
+      <w:numFmt w:val="decimal"/>
+      <w:lvlText w:val="%3."/>
+      <w:lvlJc w:val="left"/>
+      <w:pPr>
+        <w:tabs>
+          <w:tab w:val="num" w:pos="2160"/>
+        </w:tabs>
+        <w:ind w:left="2160" w:hanging="360"/>
+      </w:pPr>
+    </w:lvl>
+    <w:lvl w:ilvl="3" w:tentative="1">
+      <w:start w:val="1"/>
+      <w:numFmt w:val="decimal"/>
+      <w:lvlText w:val="%4."/>
+      <w:lvlJc w:val="left"/>
+      <w:pPr>
+        <w:tabs>
+          <w:tab w:val="num" w:pos="2880"/>
+        </w:tabs>
+        <w:ind w:left="2880" w:hanging="360"/>
+      </w:pPr>
+    </w:lvl>
+    <w:lvl w:ilvl="4" w:tentative="1">
+      <w:start w:val="1"/>
+      <w:numFmt w:val="decimal"/>
+      <w:lvlText w:val="%5."/>
+      <w:lvlJc w:val="left"/>
+      <w:pPr>
+        <w:tabs>
+          <w:tab w:val="num" w:pos="3600"/>
+        </w:tabs>
+        <w:ind w:left="3600" w:hanging="360"/>
+      </w:pPr>
+    </w:lvl>
+    <w:lvl w:ilvl="5" w:tentative="1">
+      <w:start w:val="1"/>
+      <w:numFmt w:val="decimal"/>
+      <w:lvlText w:val="%6."/>
+      <w:lvlJc w:val="left"/>
+      <w:pPr>
+        <w:tabs>
+          <w:tab w:val="num" w:pos="4320"/>
+        </w:tabs>
+        <w:ind w:left="4320" w:hanging="360"/>
+      </w:pPr>
+    </w:lvl>
+    <w:lvl w:ilvl="6" w:tentative="1">
+      <w:start w:val="1"/>
+      <w:numFmt w:val="decimal"/>
+      <w:lvlText w:val="%7."/>
+      <w:lvlJc w:val="left"/>
+      <w:pPr>
+        <w:tabs>
+          <w:tab w:val="num" w:pos="5040"/>
+        </w:tabs>
+        <w:ind w:left="5040" w:hanging="360"/>
+      </w:pPr>
+    </w:lvl>
+    <w:lvl w:ilvl="7" w:tentative="1">
+      <w:start w:val="1"/>
+      <w:numFmt w:val="decimal"/>
+      <w:lvlText w:val="%8."/>
+      <w:lvlJc w:val="left"/>
+      <w:pPr>
+        <w:tabs>
+          <w:tab w:val="num" w:pos="5760"/>
+        </w:tabs>
+        <w:ind w:left="5760" w:hanging="360"/>
+      </w:pPr>
+    </w:lvl>
+    <w:lvl w:ilvl="8" w:tentative="1">
+      <w:start w:val="1"/>
+      <w:numFmt w:val="decimal"/>
+      <w:lvlText w:val="%9."/>
+      <w:lvlJc w:val="left"/>
+      <w:pPr>
+        <w:tabs>
+          <w:tab w:val="num" w:pos="6480"/>
+        </w:tabs>
+        <w:ind w:left="6480" w:hanging="360"/>
+      </w:pPr>
+    </w:lvl>
+  </w:abstractNum>
+  <w:abstractNum w:abstractNumId="1" w15:restartNumberingAfterBreak="0">
     <w:nsid w:val="0ED06403"/>
     <w:multiLevelType w:val="multilevel"/>
     <w:tmpl w:val="42A2A5C6"/>
@@ -2651,7 +3591,7 @@
       </w:rPr>
     </w:lvl>
   </w:abstractNum>
-  <w:abstractNum w:abstractNumId="1">
+  <w:abstractNum w:abstractNumId="2" w15:restartNumberingAfterBreak="0">
     <w:nsid w:val="3FBB2A00"/>
     <w:multiLevelType w:val="multilevel"/>
     <w:tmpl w:val="E3641A00"/>
@@ -2800,17 +3740,520 @@
       </w:rPr>
     </w:lvl>
   </w:abstractNum>
+  <w:abstractNum w:abstractNumId="3" w15:restartNumberingAfterBreak="0">
+    <w:nsid w:val="49201C71"/>
+    <w:multiLevelType w:val="multilevel"/>
+    <w:tmpl w:val="AADEB004"/>
+    <w:lvl w:ilvl="0">
+      <w:start w:val="1"/>
+      <w:numFmt w:val="decimal"/>
+      <w:lvlText w:val="%1."/>
+      <w:lvlJc w:val="left"/>
+      <w:pPr>
+        <w:tabs>
+          <w:tab w:val="num" w:pos="720"/>
+        </w:tabs>
+        <w:ind w:left="720" w:hanging="360"/>
+      </w:pPr>
+    </w:lvl>
+    <w:lvl w:ilvl="1" w:tentative="1">
+      <w:start w:val="1"/>
+      <w:numFmt w:val="decimal"/>
+      <w:lvlText w:val="%2."/>
+      <w:lvlJc w:val="left"/>
+      <w:pPr>
+        <w:tabs>
+          <w:tab w:val="num" w:pos="1440"/>
+        </w:tabs>
+        <w:ind w:left="1440" w:hanging="360"/>
+      </w:pPr>
+    </w:lvl>
+    <w:lvl w:ilvl="2" w:tentative="1">
+      <w:start w:val="1"/>
+      <w:numFmt w:val="decimal"/>
+      <w:lvlText w:val="%3."/>
+      <w:lvlJc w:val="left"/>
+      <w:pPr>
+        <w:tabs>
+          <w:tab w:val="num" w:pos="2160"/>
+        </w:tabs>
+        <w:ind w:left="2160" w:hanging="360"/>
+      </w:pPr>
+    </w:lvl>
+    <w:lvl w:ilvl="3" w:tentative="1">
+      <w:start w:val="1"/>
+      <w:numFmt w:val="decimal"/>
+      <w:lvlText w:val="%4."/>
+      <w:lvlJc w:val="left"/>
+      <w:pPr>
+        <w:tabs>
+          <w:tab w:val="num" w:pos="2880"/>
+        </w:tabs>
+        <w:ind w:left="2880" w:hanging="360"/>
+      </w:pPr>
+    </w:lvl>
+    <w:lvl w:ilvl="4" w:tentative="1">
+      <w:start w:val="1"/>
+      <w:numFmt w:val="decimal"/>
+      <w:lvlText w:val="%5."/>
+      <w:lvlJc w:val="left"/>
+      <w:pPr>
+        <w:tabs>
+          <w:tab w:val="num" w:pos="3600"/>
+        </w:tabs>
+        <w:ind w:left="3600" w:hanging="360"/>
+      </w:pPr>
+    </w:lvl>
+    <w:lvl w:ilvl="5" w:tentative="1">
+      <w:start w:val="1"/>
+      <w:numFmt w:val="decimal"/>
+      <w:lvlText w:val="%6."/>
+      <w:lvlJc w:val="left"/>
+      <w:pPr>
+        <w:tabs>
+          <w:tab w:val="num" w:pos="4320"/>
+        </w:tabs>
+        <w:ind w:left="4320" w:hanging="360"/>
+      </w:pPr>
+    </w:lvl>
+    <w:lvl w:ilvl="6" w:tentative="1">
+      <w:start w:val="1"/>
+      <w:numFmt w:val="decimal"/>
+      <w:lvlText w:val="%7."/>
+      <w:lvlJc w:val="left"/>
+      <w:pPr>
+        <w:tabs>
+          <w:tab w:val="num" w:pos="5040"/>
+        </w:tabs>
+        <w:ind w:left="5040" w:hanging="360"/>
+      </w:pPr>
+    </w:lvl>
+    <w:lvl w:ilvl="7" w:tentative="1">
+      <w:start w:val="1"/>
+      <w:numFmt w:val="decimal"/>
+      <w:lvlText w:val="%8."/>
+      <w:lvlJc w:val="left"/>
+      <w:pPr>
+        <w:tabs>
+          <w:tab w:val="num" w:pos="5760"/>
+        </w:tabs>
+        <w:ind w:left="5760" w:hanging="360"/>
+      </w:pPr>
+    </w:lvl>
+    <w:lvl w:ilvl="8" w:tentative="1">
+      <w:start w:val="1"/>
+      <w:numFmt w:val="decimal"/>
+      <w:lvlText w:val="%9."/>
+      <w:lvlJc w:val="left"/>
+      <w:pPr>
+        <w:tabs>
+          <w:tab w:val="num" w:pos="6480"/>
+        </w:tabs>
+        <w:ind w:left="6480" w:hanging="360"/>
+      </w:pPr>
+    </w:lvl>
+  </w:abstractNum>
+  <w:abstractNum w:abstractNumId="4" w15:restartNumberingAfterBreak="0">
+    <w:nsid w:val="650C4B69"/>
+    <w:multiLevelType w:val="hybridMultilevel"/>
+    <w:tmpl w:val="96D84FF0"/>
+    <w:lvl w:ilvl="0" w:tplc="2C0A0001">
+      <w:start w:val="1"/>
+      <w:numFmt w:val="bullet"/>
+      <w:lvlText w:val=""/>
+      <w:lvlJc w:val="left"/>
+      <w:pPr>
+        <w:ind w:left="720" w:hanging="360"/>
+      </w:pPr>
+      <w:rPr>
+        <w:rFonts w:ascii="Symbol" w:hAnsi="Symbol" w:hint="default"/>
+      </w:rPr>
+    </w:lvl>
+    <w:lvl w:ilvl="1" w:tplc="2C0A0003" w:tentative="1">
+      <w:start w:val="1"/>
+      <w:numFmt w:val="bullet"/>
+      <w:lvlText w:val="o"/>
+      <w:lvlJc w:val="left"/>
+      <w:pPr>
+        <w:ind w:left="1440" w:hanging="360"/>
+      </w:pPr>
+      <w:rPr>
+        <w:rFonts w:ascii="Courier New" w:hAnsi="Courier New" w:cs="Courier New" w:hint="default"/>
+      </w:rPr>
+    </w:lvl>
+    <w:lvl w:ilvl="2" w:tplc="2C0A0005" w:tentative="1">
+      <w:start w:val="1"/>
+      <w:numFmt w:val="bullet"/>
+      <w:lvlText w:val=""/>
+      <w:lvlJc w:val="left"/>
+      <w:pPr>
+        <w:ind w:left="2160" w:hanging="360"/>
+      </w:pPr>
+      <w:rPr>
+        <w:rFonts w:ascii="Wingdings" w:hAnsi="Wingdings" w:hint="default"/>
+      </w:rPr>
+    </w:lvl>
+    <w:lvl w:ilvl="3" w:tplc="2C0A0001" w:tentative="1">
+      <w:start w:val="1"/>
+      <w:numFmt w:val="bullet"/>
+      <w:lvlText w:val=""/>
+      <w:lvlJc w:val="left"/>
+      <w:pPr>
+        <w:ind w:left="2880" w:hanging="360"/>
+      </w:pPr>
+      <w:rPr>
+        <w:rFonts w:ascii="Symbol" w:hAnsi="Symbol" w:hint="default"/>
+      </w:rPr>
+    </w:lvl>
+    <w:lvl w:ilvl="4" w:tplc="2C0A0003" w:tentative="1">
+      <w:start w:val="1"/>
+      <w:numFmt w:val="bullet"/>
+      <w:lvlText w:val="o"/>
+      <w:lvlJc w:val="left"/>
+      <w:pPr>
+        <w:ind w:left="3600" w:hanging="360"/>
+      </w:pPr>
+      <w:rPr>
+        <w:rFonts w:ascii="Courier New" w:hAnsi="Courier New" w:cs="Courier New" w:hint="default"/>
+      </w:rPr>
+    </w:lvl>
+    <w:lvl w:ilvl="5" w:tplc="2C0A0005" w:tentative="1">
+      <w:start w:val="1"/>
+      <w:numFmt w:val="bullet"/>
+      <w:lvlText w:val=""/>
+      <w:lvlJc w:val="left"/>
+      <w:pPr>
+        <w:ind w:left="4320" w:hanging="360"/>
+      </w:pPr>
+      <w:rPr>
+        <w:rFonts w:ascii="Wingdings" w:hAnsi="Wingdings" w:hint="default"/>
+      </w:rPr>
+    </w:lvl>
+    <w:lvl w:ilvl="6" w:tplc="2C0A0001" w:tentative="1">
+      <w:start w:val="1"/>
+      <w:numFmt w:val="bullet"/>
+      <w:lvlText w:val=""/>
+      <w:lvlJc w:val="left"/>
+      <w:pPr>
+        <w:ind w:left="5040" w:hanging="360"/>
+      </w:pPr>
+      <w:rPr>
+        <w:rFonts w:ascii="Symbol" w:hAnsi="Symbol" w:hint="default"/>
+      </w:rPr>
+    </w:lvl>
+    <w:lvl w:ilvl="7" w:tplc="2C0A0003" w:tentative="1">
+      <w:start w:val="1"/>
+      <w:numFmt w:val="bullet"/>
+      <w:lvlText w:val="o"/>
+      <w:lvlJc w:val="left"/>
+      <w:pPr>
+        <w:ind w:left="5760" w:hanging="360"/>
+      </w:pPr>
+      <w:rPr>
+        <w:rFonts w:ascii="Courier New" w:hAnsi="Courier New" w:cs="Courier New" w:hint="default"/>
+      </w:rPr>
+    </w:lvl>
+    <w:lvl w:ilvl="8" w:tplc="2C0A0005" w:tentative="1">
+      <w:start w:val="1"/>
+      <w:numFmt w:val="bullet"/>
+      <w:lvlText w:val=""/>
+      <w:lvlJc w:val="left"/>
+      <w:pPr>
+        <w:ind w:left="6480" w:hanging="360"/>
+      </w:pPr>
+      <w:rPr>
+        <w:rFonts w:ascii="Wingdings" w:hAnsi="Wingdings" w:hint="default"/>
+      </w:rPr>
+    </w:lvl>
+  </w:abstractNum>
+  <w:abstractNum w:abstractNumId="5" w15:restartNumberingAfterBreak="0">
+    <w:nsid w:val="69AA6375"/>
+    <w:multiLevelType w:val="multilevel"/>
+    <w:tmpl w:val="B4E085BC"/>
+    <w:lvl w:ilvl="0">
+      <w:start w:val="1"/>
+      <w:numFmt w:val="decimal"/>
+      <w:lvlText w:val="%1."/>
+      <w:lvlJc w:val="left"/>
+      <w:pPr>
+        <w:tabs>
+          <w:tab w:val="num" w:pos="720"/>
+        </w:tabs>
+        <w:ind w:left="720" w:hanging="360"/>
+      </w:pPr>
+    </w:lvl>
+    <w:lvl w:ilvl="1" w:tentative="1">
+      <w:start w:val="1"/>
+      <w:numFmt w:val="decimal"/>
+      <w:lvlText w:val="%2."/>
+      <w:lvlJc w:val="left"/>
+      <w:pPr>
+        <w:tabs>
+          <w:tab w:val="num" w:pos="1440"/>
+        </w:tabs>
+        <w:ind w:left="1440" w:hanging="360"/>
+      </w:pPr>
+    </w:lvl>
+    <w:lvl w:ilvl="2" w:tentative="1">
+      <w:start w:val="1"/>
+      <w:numFmt w:val="decimal"/>
+      <w:lvlText w:val="%3."/>
+      <w:lvlJc w:val="left"/>
+      <w:pPr>
+        <w:tabs>
+          <w:tab w:val="num" w:pos="2160"/>
+        </w:tabs>
+        <w:ind w:left="2160" w:hanging="360"/>
+      </w:pPr>
+    </w:lvl>
+    <w:lvl w:ilvl="3" w:tentative="1">
+      <w:start w:val="1"/>
+      <w:numFmt w:val="decimal"/>
+      <w:lvlText w:val="%4."/>
+      <w:lvlJc w:val="left"/>
+      <w:pPr>
+        <w:tabs>
+          <w:tab w:val="num" w:pos="2880"/>
+        </w:tabs>
+        <w:ind w:left="2880" w:hanging="360"/>
+      </w:pPr>
+    </w:lvl>
+    <w:lvl w:ilvl="4" w:tentative="1">
+      <w:start w:val="1"/>
+      <w:numFmt w:val="decimal"/>
+      <w:lvlText w:val="%5."/>
+      <w:lvlJc w:val="left"/>
+      <w:pPr>
+        <w:tabs>
+          <w:tab w:val="num" w:pos="3600"/>
+        </w:tabs>
+        <w:ind w:left="3600" w:hanging="360"/>
+      </w:pPr>
+    </w:lvl>
+    <w:lvl w:ilvl="5" w:tentative="1">
+      <w:start w:val="1"/>
+      <w:numFmt w:val="decimal"/>
+      <w:lvlText w:val="%6."/>
+      <w:lvlJc w:val="left"/>
+      <w:pPr>
+        <w:tabs>
+          <w:tab w:val="num" w:pos="4320"/>
+        </w:tabs>
+        <w:ind w:left="4320" w:hanging="360"/>
+      </w:pPr>
+    </w:lvl>
+    <w:lvl w:ilvl="6" w:tentative="1">
+      <w:start w:val="1"/>
+      <w:numFmt w:val="decimal"/>
+      <w:lvlText w:val="%7."/>
+      <w:lvlJc w:val="left"/>
+      <w:pPr>
+        <w:tabs>
+          <w:tab w:val="num" w:pos="5040"/>
+        </w:tabs>
+        <w:ind w:left="5040" w:hanging="360"/>
+      </w:pPr>
+    </w:lvl>
+    <w:lvl w:ilvl="7" w:tentative="1">
+      <w:start w:val="1"/>
+      <w:numFmt w:val="decimal"/>
+      <w:lvlText w:val="%8."/>
+      <w:lvlJc w:val="left"/>
+      <w:pPr>
+        <w:tabs>
+          <w:tab w:val="num" w:pos="5760"/>
+        </w:tabs>
+        <w:ind w:left="5760" w:hanging="360"/>
+      </w:pPr>
+    </w:lvl>
+    <w:lvl w:ilvl="8" w:tentative="1">
+      <w:start w:val="1"/>
+      <w:numFmt w:val="decimal"/>
+      <w:lvlText w:val="%9."/>
+      <w:lvlJc w:val="left"/>
+      <w:pPr>
+        <w:tabs>
+          <w:tab w:val="num" w:pos="6480"/>
+        </w:tabs>
+        <w:ind w:left="6480" w:hanging="360"/>
+      </w:pPr>
+    </w:lvl>
+  </w:abstractNum>
+  <w:abstractNum w:abstractNumId="6" w15:restartNumberingAfterBreak="0">
+    <w:nsid w:val="7A7E1596"/>
+    <w:multiLevelType w:val="multilevel"/>
+    <w:tmpl w:val="9BD242F2"/>
+    <w:lvl w:ilvl="0">
+      <w:start w:val="1"/>
+      <w:numFmt w:val="bullet"/>
+      <w:lvlText w:val=""/>
+      <w:lvlJc w:val="left"/>
+      <w:pPr>
+        <w:tabs>
+          <w:tab w:val="num" w:pos="720"/>
+        </w:tabs>
+        <w:ind w:left="720" w:hanging="360"/>
+      </w:pPr>
+      <w:rPr>
+        <w:rFonts w:ascii="Symbol" w:hAnsi="Symbol" w:hint="default"/>
+        <w:sz w:val="20"/>
+      </w:rPr>
+    </w:lvl>
+    <w:lvl w:ilvl="1" w:tentative="1">
+      <w:start w:val="1"/>
+      <w:numFmt w:val="bullet"/>
+      <w:lvlText w:val="o"/>
+      <w:lvlJc w:val="left"/>
+      <w:pPr>
+        <w:tabs>
+          <w:tab w:val="num" w:pos="1440"/>
+        </w:tabs>
+        <w:ind w:left="1440" w:hanging="360"/>
+      </w:pPr>
+      <w:rPr>
+        <w:rFonts w:ascii="Courier New" w:hAnsi="Courier New" w:hint="default"/>
+        <w:sz w:val="20"/>
+      </w:rPr>
+    </w:lvl>
+    <w:lvl w:ilvl="2" w:tentative="1">
+      <w:start w:val="1"/>
+      <w:numFmt w:val="bullet"/>
+      <w:lvlText w:val=""/>
+      <w:lvlJc w:val="left"/>
+      <w:pPr>
+        <w:tabs>
+          <w:tab w:val="num" w:pos="2160"/>
+        </w:tabs>
+        <w:ind w:left="2160" w:hanging="360"/>
+      </w:pPr>
+      <w:rPr>
+        <w:rFonts w:ascii="Wingdings" w:hAnsi="Wingdings" w:hint="default"/>
+        <w:sz w:val="20"/>
+      </w:rPr>
+    </w:lvl>
+    <w:lvl w:ilvl="3" w:tentative="1">
+      <w:start w:val="1"/>
+      <w:numFmt w:val="bullet"/>
+      <w:lvlText w:val=""/>
+      <w:lvlJc w:val="left"/>
+      <w:pPr>
+        <w:tabs>
+          <w:tab w:val="num" w:pos="2880"/>
+        </w:tabs>
+        <w:ind w:left="2880" w:hanging="360"/>
+      </w:pPr>
+      <w:rPr>
+        <w:rFonts w:ascii="Wingdings" w:hAnsi="Wingdings" w:hint="default"/>
+        <w:sz w:val="20"/>
+      </w:rPr>
+    </w:lvl>
+    <w:lvl w:ilvl="4" w:tentative="1">
+      <w:start w:val="1"/>
+      <w:numFmt w:val="bullet"/>
+      <w:lvlText w:val=""/>
+      <w:lvlJc w:val="left"/>
+      <w:pPr>
+        <w:tabs>
+          <w:tab w:val="num" w:pos="3600"/>
+        </w:tabs>
+        <w:ind w:left="3600" w:hanging="360"/>
+      </w:pPr>
+      <w:rPr>
+        <w:rFonts w:ascii="Wingdings" w:hAnsi="Wingdings" w:hint="default"/>
+        <w:sz w:val="20"/>
+      </w:rPr>
+    </w:lvl>
+    <w:lvl w:ilvl="5" w:tentative="1">
+      <w:start w:val="1"/>
+      <w:numFmt w:val="bullet"/>
+      <w:lvlText w:val=""/>
+      <w:lvlJc w:val="left"/>
+      <w:pPr>
+        <w:tabs>
+          <w:tab w:val="num" w:pos="4320"/>
+        </w:tabs>
+        <w:ind w:left="4320" w:hanging="360"/>
+      </w:pPr>
+      <w:rPr>
+        <w:rFonts w:ascii="Wingdings" w:hAnsi="Wingdings" w:hint="default"/>
+        <w:sz w:val="20"/>
+      </w:rPr>
+    </w:lvl>
+    <w:lvl w:ilvl="6" w:tentative="1">
+      <w:start w:val="1"/>
+      <w:numFmt w:val="bullet"/>
+      <w:lvlText w:val=""/>
+      <w:lvlJc w:val="left"/>
+      <w:pPr>
+        <w:tabs>
+          <w:tab w:val="num" w:pos="5040"/>
+        </w:tabs>
+        <w:ind w:left="5040" w:hanging="360"/>
+      </w:pPr>
+      <w:rPr>
+        <w:rFonts w:ascii="Wingdings" w:hAnsi="Wingdings" w:hint="default"/>
+        <w:sz w:val="20"/>
+      </w:rPr>
+    </w:lvl>
+    <w:lvl w:ilvl="7" w:tentative="1">
+      <w:start w:val="1"/>
+      <w:numFmt w:val="bullet"/>
+      <w:lvlText w:val=""/>
+      <w:lvlJc w:val="left"/>
+      <w:pPr>
+        <w:tabs>
+          <w:tab w:val="num" w:pos="5760"/>
+        </w:tabs>
+        <w:ind w:left="5760" w:hanging="360"/>
+      </w:pPr>
+      <w:rPr>
+        <w:rFonts w:ascii="Wingdings" w:hAnsi="Wingdings" w:hint="default"/>
+        <w:sz w:val="20"/>
+      </w:rPr>
+    </w:lvl>
+    <w:lvl w:ilvl="8" w:tentative="1">
+      <w:start w:val="1"/>
+      <w:numFmt w:val="bullet"/>
+      <w:lvlText w:val=""/>
+      <w:lvlJc w:val="left"/>
+      <w:pPr>
+        <w:tabs>
+          <w:tab w:val="num" w:pos="6480"/>
+        </w:tabs>
+        <w:ind w:left="6480" w:hanging="360"/>
+      </w:pPr>
+      <w:rPr>
+        <w:rFonts w:ascii="Wingdings" w:hAnsi="Wingdings" w:hint="default"/>
+        <w:sz w:val="20"/>
+      </w:rPr>
+    </w:lvl>
+  </w:abstractNum>
   <w:num w:numId="1">
+    <w:abstractNumId w:val="1"/>
+  </w:num>
+  <w:num w:numId="2">
+    <w:abstractNumId w:val="2"/>
+  </w:num>
+  <w:num w:numId="3">
+    <w:abstractNumId w:val="5"/>
+  </w:num>
+  <w:num w:numId="4">
     <w:abstractNumId w:val="0"/>
   </w:num>
-  <w:num w:numId="2">
-    <w:abstractNumId w:val="1"/>
+  <w:num w:numId="5">
+    <w:abstractNumId w:val="6"/>
+  </w:num>
+  <w:num w:numId="6">
+    <w:abstractNumId w:val="3"/>
+  </w:num>
+  <w:num w:numId="7">
+    <w:abstractNumId w:val="4"/>
   </w:num>
 </w:numbering>
 </file>
 
 <file path=word/styles.xml><?xml version="1.0" encoding="utf-8"?>
-<w:styles xmlns:mc="http://schemas.openxmlformats.org/markup-compatibility/2006" xmlns:r="http://schemas.openxmlformats.org/officeDocument/2006/relationships" xmlns:w="http://schemas.openxmlformats.org/wordprocessingml/2006/main" xmlns:w14="http://schemas.microsoft.com/office/word/2010/wordml" mc:Ignorable="w14">
+<w:styles xmlns:mc="http://schemas.openxmlformats.org/markup-compatibility/2006" xmlns:r="http://schemas.openxmlformats.org/officeDocument/2006/relationships" xmlns:w="http://schemas.openxmlformats.org/wordprocessingml/2006/main" xmlns:w14="http://schemas.microsoft.com/office/word/2010/wordml" xmlns:w15="http://schemas.microsoft.com/office/word/2012/wordml" mc:Ignorable="w14 w15">
   <w:docDefaults>
     <w:rPrDefault>
       <w:rPr>
@@ -2828,144 +4271,378 @@
       </w:pPr>
     </w:pPrDefault>
   </w:docDefaults>
-  <w:latentStyles w:defLockedState="0" w:defUIPriority="99" w:defSemiHidden="1" w:defUnhideWhenUsed="1" w:defQFormat="0" w:count="267">
-    <w:lsdException w:name="Normal" w:semiHidden="0" w:uiPriority="0" w:unhideWhenUsed="0" w:qFormat="1"/>
-    <w:lsdException w:name="heading 1" w:semiHidden="0" w:uiPriority="9" w:unhideWhenUsed="0" w:qFormat="1"/>
-    <w:lsdException w:name="heading 2" w:uiPriority="0" w:qFormat="1"/>
-    <w:lsdException w:name="heading 3" w:uiPriority="9" w:qFormat="1"/>
-    <w:lsdException w:name="heading 4" w:uiPriority="9" w:qFormat="1"/>
-    <w:lsdException w:name="heading 5" w:uiPriority="9" w:qFormat="1"/>
-    <w:lsdException w:name="heading 6" w:uiPriority="9" w:qFormat="1"/>
-    <w:lsdException w:name="heading 7" w:uiPriority="9" w:qFormat="1"/>
-    <w:lsdException w:name="heading 8" w:uiPriority="9" w:qFormat="1"/>
-    <w:lsdException w:name="heading 9" w:uiPriority="9" w:qFormat="1"/>
-    <w:lsdException w:name="toc 1" w:uiPriority="39"/>
-    <w:lsdException w:name="toc 2" w:uiPriority="39"/>
-    <w:lsdException w:name="toc 3" w:uiPriority="39"/>
-    <w:lsdException w:name="toc 4" w:uiPriority="39"/>
-    <w:lsdException w:name="toc 5" w:uiPriority="39"/>
-    <w:lsdException w:name="toc 6" w:uiPriority="39"/>
-    <w:lsdException w:name="toc 7" w:uiPriority="39"/>
-    <w:lsdException w:name="toc 8" w:uiPriority="39"/>
-    <w:lsdException w:name="toc 9" w:uiPriority="39"/>
-    <w:lsdException w:name="caption" w:uiPriority="35" w:qFormat="1"/>
-    <w:lsdException w:name="Title" w:semiHidden="0" w:uiPriority="10" w:unhideWhenUsed="0" w:qFormat="1"/>
-    <w:lsdException w:name="Default Paragraph Font" w:uiPriority="1"/>
-    <w:lsdException w:name="Subtitle" w:semiHidden="0" w:uiPriority="11" w:unhideWhenUsed="0" w:qFormat="1"/>
-    <w:lsdException w:name="Strong" w:semiHidden="0" w:uiPriority="22" w:unhideWhenUsed="0" w:qFormat="1"/>
-    <w:lsdException w:name="Emphasis" w:semiHidden="0" w:uiPriority="20" w:unhideWhenUsed="0" w:qFormat="1"/>
-    <w:lsdException w:name="Table Grid" w:semiHidden="0" w:uiPriority="59" w:unhideWhenUsed="0"/>
-    <w:lsdException w:name="Placeholder Text" w:unhideWhenUsed="0"/>
-    <w:lsdException w:name="No Spacing" w:semiHidden="0" w:uiPriority="1" w:unhideWhenUsed="0" w:qFormat="1"/>
-    <w:lsdException w:name="Light Shading" w:semiHidden="0" w:uiPriority="60" w:unhideWhenUsed="0"/>
-    <w:lsdException w:name="Light List" w:semiHidden="0" w:uiPriority="61" w:unhideWhenUsed="0"/>
-    <w:lsdException w:name="Light Grid" w:semiHidden="0" w:uiPriority="62" w:unhideWhenUsed="0"/>
-    <w:lsdException w:name="Medium Shading 1" w:semiHidden="0" w:uiPriority="63" w:unhideWhenUsed="0"/>
-    <w:lsdException w:name="Medium Shading 2" w:semiHidden="0" w:uiPriority="64" w:unhideWhenUsed="0"/>
-    <w:lsdException w:name="Medium List 1" w:semiHidden="0" w:uiPriority="65" w:unhideWhenUsed="0"/>
-    <w:lsdException w:name="Medium List 2" w:semiHidden="0" w:uiPriority="66" w:unhideWhenUsed="0"/>
-    <w:lsdException w:name="Medium Grid 1" w:semiHidden="0" w:uiPriority="67" w:unhideWhenUsed="0"/>
-    <w:lsdException w:name="Medium Grid 2" w:semiHidden="0" w:uiPriority="68" w:unhideWhenUsed="0"/>
-    <w:lsdException w:name="Medium Grid 3" w:semiHidden="0" w:uiPriority="69" w:unhideWhenUsed="0"/>
-    <w:lsdException w:name="Dark List" w:semiHidden="0" w:uiPriority="70" w:unhideWhenUsed="0"/>
-    <w:lsdException w:name="Colorful Shading" w:semiHidden="0" w:uiPriority="71" w:unhideWhenUsed="0"/>
-    <w:lsdException w:name="Colorful List" w:semiHidden="0" w:uiPriority="72" w:unhideWhenUsed="0"/>
-    <w:lsdException w:name="Colorful Grid" w:semiHidden="0" w:uiPriority="73" w:unhideWhenUsed="0"/>
-    <w:lsdException w:name="Light Shading Accent 1" w:semiHidden="0" w:uiPriority="60" w:unhideWhenUsed="0"/>
-    <w:lsdException w:name="Light List Accent 1" w:semiHidden="0" w:uiPriority="61" w:unhideWhenUsed="0"/>
-    <w:lsdException w:name="Light Grid Accent 1" w:semiHidden="0" w:uiPriority="62" w:unhideWhenUsed="0"/>
-    <w:lsdException w:name="Medium Shading 1 Accent 1" w:semiHidden="0" w:uiPriority="63" w:unhideWhenUsed="0"/>
-    <w:lsdException w:name="Medium Shading 2 Accent 1" w:semiHidden="0" w:uiPriority="64" w:unhideWhenUsed="0"/>
-    <w:lsdException w:name="Medium List 1 Accent 1" w:semiHidden="0" w:uiPriority="65" w:unhideWhenUsed="0"/>
-    <w:lsdException w:name="Revision" w:unhideWhenUsed="0"/>
-    <w:lsdException w:name="List Paragraph" w:semiHidden="0" w:uiPriority="34" w:unhideWhenUsed="0" w:qFormat="1"/>
-    <w:lsdException w:name="Quote" w:semiHidden="0" w:uiPriority="29" w:unhideWhenUsed="0" w:qFormat="1"/>
-    <w:lsdException w:name="Intense Quote" w:semiHidden="0" w:uiPriority="30" w:unhideWhenUsed="0" w:qFormat="1"/>
-    <w:lsdException w:name="Medium List 2 Accent 1" w:semiHidden="0" w:uiPriority="66" w:unhideWhenUsed="0"/>
-    <w:lsdException w:name="Medium Grid 1 Accent 1" w:semiHidden="0" w:uiPriority="67" w:unhideWhenUsed="0"/>
-    <w:lsdException w:name="Medium Grid 2 Accent 1" w:semiHidden="0" w:uiPriority="68" w:unhideWhenUsed="0"/>
-    <w:lsdException w:name="Medium Grid 3 Accent 1" w:semiHidden="0" w:uiPriority="69" w:unhideWhenUsed="0"/>
-    <w:lsdException w:name="Dark List Accent 1" w:semiHidden="0" w:uiPriority="70" w:unhideWhenUsed="0"/>
-    <w:lsdException w:name="Colorful Shading Accent 1" w:semiHidden="0" w:uiPriority="71" w:unhideWhenUsed="0"/>
-    <w:lsdException w:name="Colorful List Accent 1" w:semiHidden="0" w:uiPriority="72" w:unhideWhenUsed="0"/>
-    <w:lsdException w:name="Colorful Grid Accent 1" w:semiHidden="0" w:uiPriority="73" w:unhideWhenUsed="0"/>
-    <w:lsdException w:name="Light Shading Accent 2" w:semiHidden="0" w:uiPriority="60" w:unhideWhenUsed="0"/>
-    <w:lsdException w:name="Light List Accent 2" w:semiHidden="0" w:uiPriority="61" w:unhideWhenUsed="0"/>
-    <w:lsdException w:name="Light Grid Accent 2" w:semiHidden="0" w:uiPriority="62" w:unhideWhenUsed="0"/>
-    <w:lsdException w:name="Medium Shading 1 Accent 2" w:semiHidden="0" w:uiPriority="63" w:unhideWhenUsed="0"/>
-    <w:lsdException w:name="Medium Shading 2 Accent 2" w:semiHidden="0" w:uiPriority="64" w:unhideWhenUsed="0"/>
-    <w:lsdException w:name="Medium List 1 Accent 2" w:semiHidden="0" w:uiPriority="65" w:unhideWhenUsed="0"/>
-    <w:lsdException w:name="Medium List 2 Accent 2" w:semiHidden="0" w:uiPriority="66" w:unhideWhenUsed="0"/>
-    <w:lsdException w:name="Medium Grid 1 Accent 2" w:semiHidden="0" w:uiPriority="67" w:unhideWhenUsed="0"/>
-    <w:lsdException w:name="Medium Grid 2 Accent 2" w:semiHidden="0" w:uiPriority="68" w:unhideWhenUsed="0"/>
-    <w:lsdException w:name="Medium Grid 3 Accent 2" w:semiHidden="0" w:uiPriority="69" w:unhideWhenUsed="0"/>
-    <w:lsdException w:name="Dark List Accent 2" w:semiHidden="0" w:uiPriority="70" w:unhideWhenUsed="0"/>
-    <w:lsdException w:name="Colorful Shading Accent 2" w:semiHidden="0" w:uiPriority="71" w:unhideWhenUsed="0"/>
-    <w:lsdException w:name="Colorful List Accent 2" w:semiHidden="0" w:uiPriority="72" w:unhideWhenUsed="0"/>
-    <w:lsdException w:name="Colorful Grid Accent 2" w:semiHidden="0" w:uiPriority="73" w:unhideWhenUsed="0"/>
-    <w:lsdException w:name="Light Shading Accent 3" w:semiHidden="0" w:uiPriority="60" w:unhideWhenUsed="0"/>
-    <w:lsdException w:name="Light List Accent 3" w:semiHidden="0" w:uiPriority="61" w:unhideWhenUsed="0"/>
-    <w:lsdException w:name="Light Grid Accent 3" w:semiHidden="0" w:uiPriority="62" w:unhideWhenUsed="0"/>
-    <w:lsdException w:name="Medium Shading 1 Accent 3" w:semiHidden="0" w:uiPriority="63" w:unhideWhenUsed="0"/>
-    <w:lsdException w:name="Medium Shading 2 Accent 3" w:semiHidden="0" w:uiPriority="64" w:unhideWhenUsed="0"/>
-    <w:lsdException w:name="Medium List 1 Accent 3" w:semiHidden="0" w:uiPriority="65" w:unhideWhenUsed="0"/>
-    <w:lsdException w:name="Medium List 2 Accent 3" w:semiHidden="0" w:uiPriority="66" w:unhideWhenUsed="0"/>
-    <w:lsdException w:name="Medium Grid 1 Accent 3" w:semiHidden="0" w:uiPriority="67" w:unhideWhenUsed="0"/>
-    <w:lsdException w:name="Medium Grid 2 Accent 3" w:semiHidden="0" w:uiPriority="68" w:unhideWhenUsed="0"/>
-    <w:lsdException w:name="Medium Grid 3 Accent 3" w:semiHidden="0" w:uiPriority="69" w:unhideWhenUsed="0"/>
-    <w:lsdException w:name="Dark List Accent 3" w:semiHidden="0" w:uiPriority="70" w:unhideWhenUsed="0"/>
-    <w:lsdException w:name="Colorful Shading Accent 3" w:semiHidden="0" w:uiPriority="71" w:unhideWhenUsed="0"/>
-    <w:lsdException w:name="Colorful List Accent 3" w:semiHidden="0" w:uiPriority="72" w:unhideWhenUsed="0"/>
-    <w:lsdException w:name="Colorful Grid Accent 3" w:semiHidden="0" w:uiPriority="73" w:unhideWhenUsed="0"/>
-    <w:lsdException w:name="Light Shading Accent 4" w:semiHidden="0" w:uiPriority="60" w:unhideWhenUsed="0"/>
-    <w:lsdException w:name="Light List Accent 4" w:semiHidden="0" w:uiPriority="61" w:unhideWhenUsed="0"/>
-    <w:lsdException w:name="Light Grid Accent 4" w:semiHidden="0" w:uiPriority="62" w:unhideWhenUsed="0"/>
-    <w:lsdException w:name="Medium Shading 1 Accent 4" w:semiHidden="0" w:uiPriority="63" w:unhideWhenUsed="0"/>
-    <w:lsdException w:name="Medium Shading 2 Accent 4" w:semiHidden="0" w:uiPriority="64" w:unhideWhenUsed="0"/>
-    <w:lsdException w:name="Medium List 1 Accent 4" w:semiHidden="0" w:uiPriority="65" w:unhideWhenUsed="0"/>
-    <w:lsdException w:name="Medium List 2 Accent 4" w:semiHidden="0" w:uiPriority="66" w:unhideWhenUsed="0"/>
-    <w:lsdException w:name="Medium Grid 1 Accent 4" w:semiHidden="0" w:uiPriority="67" w:unhideWhenUsed="0"/>
-    <w:lsdException w:name="Medium Grid 2 Accent 4" w:semiHidden="0" w:uiPriority="68" w:unhideWhenUsed="0"/>
-    <w:lsdException w:name="Medium Grid 3 Accent 4" w:semiHidden="0" w:uiPriority="69" w:unhideWhenUsed="0"/>
-    <w:lsdException w:name="Dark List Accent 4" w:semiHidden="0" w:uiPriority="70" w:unhideWhenUsed="0"/>
-    <w:lsdException w:name="Colorful Shading Accent 4" w:semiHidden="0" w:uiPriority="71" w:unhideWhenUsed="0"/>
-    <w:lsdException w:name="Colorful List Accent 4" w:semiHidden="0" w:uiPriority="72" w:unhideWhenUsed="0"/>
-    <w:lsdException w:name="Colorful Grid Accent 4" w:semiHidden="0" w:uiPriority="73" w:unhideWhenUsed="0"/>
-    <w:lsdException w:name="Light Shading Accent 5" w:semiHidden="0" w:uiPriority="60" w:unhideWhenUsed="0"/>
-    <w:lsdException w:name="Light List Accent 5" w:semiHidden="0" w:uiPriority="61" w:unhideWhenUsed="0"/>
-    <w:lsdException w:name="Light Grid Accent 5" w:semiHidden="0" w:uiPriority="62" w:unhideWhenUsed="0"/>
-    <w:lsdException w:name="Medium Shading 1 Accent 5" w:semiHidden="0" w:uiPriority="63" w:unhideWhenUsed="0"/>
-    <w:lsdException w:name="Medium Shading 2 Accent 5" w:semiHidden="0" w:uiPriority="64" w:unhideWhenUsed="0"/>
-    <w:lsdException w:name="Medium List 1 Accent 5" w:semiHidden="0" w:uiPriority="65" w:unhideWhenUsed="0"/>
-    <w:lsdException w:name="Medium List 2 Accent 5" w:semiHidden="0" w:uiPriority="66" w:unhideWhenUsed="0"/>
-    <w:lsdException w:name="Medium Grid 1 Accent 5" w:semiHidden="0" w:uiPriority="67" w:unhideWhenUsed="0"/>
-    <w:lsdException w:name="Medium Grid 2 Accent 5" w:semiHidden="0" w:uiPriority="68" w:unhideWhenUsed="0"/>
-    <w:lsdException w:name="Medium Grid 3 Accent 5" w:semiHidden="0" w:uiPriority="69" w:unhideWhenUsed="0"/>
-    <w:lsdException w:name="Dark List Accent 5" w:semiHidden="0" w:uiPriority="70" w:unhideWhenUsed="0"/>
-    <w:lsdException w:name="Colorful Shading Accent 5" w:semiHidden="0" w:uiPriority="71" w:unhideWhenUsed="0"/>
-    <w:lsdException w:name="Colorful List Accent 5" w:semiHidden="0" w:uiPriority="72" w:unhideWhenUsed="0"/>
-    <w:lsdException w:name="Colorful Grid Accent 5" w:semiHidden="0" w:uiPriority="73" w:unhideWhenUsed="0"/>
-    <w:lsdException w:name="Light Shading Accent 6" w:semiHidden="0" w:uiPriority="60" w:unhideWhenUsed="0"/>
-    <w:lsdException w:name="Light List Accent 6" w:semiHidden="0" w:uiPriority="61" w:unhideWhenUsed="0"/>
-    <w:lsdException w:name="Light Grid Accent 6" w:semiHidden="0" w:uiPriority="62" w:unhideWhenUsed="0"/>
-    <w:lsdException w:name="Medium Shading 1 Accent 6" w:semiHidden="0" w:uiPriority="63" w:unhideWhenUsed="0"/>
-    <w:lsdException w:name="Medium Shading 2 Accent 6" w:semiHidden="0" w:uiPriority="64" w:unhideWhenUsed="0"/>
-    <w:lsdException w:name="Medium List 1 Accent 6" w:semiHidden="0" w:uiPriority="65" w:unhideWhenUsed="0"/>
-    <w:lsdException w:name="Medium List 2 Accent 6" w:semiHidden="0" w:uiPriority="66" w:unhideWhenUsed="0"/>
-    <w:lsdException w:name="Medium Grid 1 Accent 6" w:semiHidden="0" w:uiPriority="67" w:unhideWhenUsed="0"/>
-    <w:lsdException w:name="Medium Grid 2 Accent 6" w:semiHidden="0" w:uiPriority="68" w:unhideWhenUsed="0"/>
-    <w:lsdException w:name="Medium Grid 3 Accent 6" w:semiHidden="0" w:uiPriority="69" w:unhideWhenUsed="0"/>
-    <w:lsdException w:name="Dark List Accent 6" w:semiHidden="0" w:uiPriority="70" w:unhideWhenUsed="0"/>
-    <w:lsdException w:name="Colorful Shading Accent 6" w:semiHidden="0" w:uiPriority="71" w:unhideWhenUsed="0"/>
-    <w:lsdException w:name="Colorful List Accent 6" w:semiHidden="0" w:uiPriority="72" w:unhideWhenUsed="0"/>
-    <w:lsdException w:name="Colorful Grid Accent 6" w:semiHidden="0" w:uiPriority="73" w:unhideWhenUsed="0"/>
-    <w:lsdException w:name="Subtle Emphasis" w:semiHidden="0" w:uiPriority="19" w:unhideWhenUsed="0" w:qFormat="1"/>
-    <w:lsdException w:name="Intense Emphasis" w:semiHidden="0" w:uiPriority="21" w:unhideWhenUsed="0" w:qFormat="1"/>
-    <w:lsdException w:name="Subtle Reference" w:semiHidden="0" w:uiPriority="31" w:unhideWhenUsed="0" w:qFormat="1"/>
-    <w:lsdException w:name="Intense Reference" w:semiHidden="0" w:uiPriority="32" w:unhideWhenUsed="0" w:qFormat="1"/>
-    <w:lsdException w:name="Book Title" w:semiHidden="0" w:uiPriority="33" w:unhideWhenUsed="0" w:qFormat="1"/>
-    <w:lsdException w:name="Bibliography" w:uiPriority="37"/>
-    <w:lsdException w:name="TOC Heading" w:uiPriority="39" w:qFormat="1"/>
+  <w:latentStyles w:defLockedState="0" w:defUIPriority="99" w:defSemiHidden="0" w:defUnhideWhenUsed="0" w:defQFormat="0" w:count="371">
+    <w:lsdException w:name="Normal" w:uiPriority="0" w:qFormat="1"/>
+    <w:lsdException w:name="heading 1" w:uiPriority="9" w:qFormat="1"/>
+    <w:lsdException w:name="heading 2" w:semiHidden="1" w:uiPriority="0" w:unhideWhenUsed="1" w:qFormat="1"/>
+    <w:lsdException w:name="heading 3" w:semiHidden="1" w:uiPriority="9" w:unhideWhenUsed="1" w:qFormat="1"/>
+    <w:lsdException w:name="heading 4" w:semiHidden="1" w:uiPriority="9" w:unhideWhenUsed="1" w:qFormat="1"/>
+    <w:lsdException w:name="heading 5" w:semiHidden="1" w:uiPriority="9" w:unhideWhenUsed="1" w:qFormat="1"/>
+    <w:lsdException w:name="heading 6" w:semiHidden="1" w:uiPriority="9" w:unhideWhenUsed="1" w:qFormat="1"/>
+    <w:lsdException w:name="heading 7" w:semiHidden="1" w:uiPriority="9" w:unhideWhenUsed="1" w:qFormat="1"/>
+    <w:lsdException w:name="heading 8" w:semiHidden="1" w:uiPriority="9" w:unhideWhenUsed="1" w:qFormat="1"/>
+    <w:lsdException w:name="heading 9" w:semiHidden="1" w:uiPriority="9" w:unhideWhenUsed="1" w:qFormat="1"/>
+    <w:lsdException w:name="index 1" w:semiHidden="1" w:unhideWhenUsed="1"/>
+    <w:lsdException w:name="index 2" w:semiHidden="1" w:unhideWhenUsed="1"/>
+    <w:lsdException w:name="index 3" w:semiHidden="1" w:unhideWhenUsed="1"/>
+    <w:lsdException w:name="index 4" w:semiHidden="1" w:unhideWhenUsed="1"/>
+    <w:lsdException w:name="index 5" w:semiHidden="1" w:unhideWhenUsed="1"/>
+    <w:lsdException w:name="index 6" w:semiHidden="1" w:unhideWhenUsed="1"/>
+    <w:lsdException w:name="index 7" w:semiHidden="1" w:unhideWhenUsed="1"/>
+    <w:lsdException w:name="index 8" w:semiHidden="1" w:unhideWhenUsed="1"/>
+    <w:lsdException w:name="index 9" w:semiHidden="1" w:unhideWhenUsed="1"/>
+    <w:lsdException w:name="toc 1" w:semiHidden="1" w:uiPriority="39" w:unhideWhenUsed="1"/>
+    <w:lsdException w:name="toc 2" w:semiHidden="1" w:uiPriority="39" w:unhideWhenUsed="1"/>
+    <w:lsdException w:name="toc 3" w:semiHidden="1" w:uiPriority="39" w:unhideWhenUsed="1"/>
+    <w:lsdException w:name="toc 4" w:semiHidden="1" w:uiPriority="39" w:unhideWhenUsed="1"/>
+    <w:lsdException w:name="toc 5" w:semiHidden="1" w:uiPriority="39" w:unhideWhenUsed="1"/>
+    <w:lsdException w:name="toc 6" w:semiHidden="1" w:uiPriority="39" w:unhideWhenUsed="1"/>
+    <w:lsdException w:name="toc 7" w:semiHidden="1" w:uiPriority="39" w:unhideWhenUsed="1"/>
+    <w:lsdException w:name="toc 8" w:semiHidden="1" w:uiPriority="39" w:unhideWhenUsed="1"/>
+    <w:lsdException w:name="toc 9" w:semiHidden="1" w:uiPriority="39" w:unhideWhenUsed="1"/>
+    <w:lsdException w:name="Normal Indent" w:semiHidden="1" w:unhideWhenUsed="1"/>
+    <w:lsdException w:name="footnote text" w:semiHidden="1" w:unhideWhenUsed="1"/>
+    <w:lsdException w:name="annotation text" w:semiHidden="1" w:unhideWhenUsed="1"/>
+    <w:lsdException w:name="header" w:semiHidden="1" w:unhideWhenUsed="1"/>
+    <w:lsdException w:name="footer" w:semiHidden="1" w:unhideWhenUsed="1"/>
+    <w:lsdException w:name="index heading" w:semiHidden="1" w:unhideWhenUsed="1"/>
+    <w:lsdException w:name="caption" w:semiHidden="1" w:uiPriority="35" w:unhideWhenUsed="1" w:qFormat="1"/>
+    <w:lsdException w:name="table of figures" w:semiHidden="1" w:unhideWhenUsed="1"/>
+    <w:lsdException w:name="envelope address" w:semiHidden="1" w:unhideWhenUsed="1"/>
+    <w:lsdException w:name="envelope return" w:semiHidden="1" w:unhideWhenUsed="1"/>
+    <w:lsdException w:name="footnote reference" w:semiHidden="1" w:unhideWhenUsed="1"/>
+    <w:lsdException w:name="annotation reference" w:semiHidden="1" w:unhideWhenUsed="1"/>
+    <w:lsdException w:name="line number" w:semiHidden="1" w:unhideWhenUsed="1"/>
+    <w:lsdException w:name="page number" w:semiHidden="1" w:unhideWhenUsed="1"/>
+    <w:lsdException w:name="endnote reference" w:semiHidden="1" w:unhideWhenUsed="1"/>
+    <w:lsdException w:name="endnote text" w:semiHidden="1" w:unhideWhenUsed="1"/>
+    <w:lsdException w:name="table of authorities" w:semiHidden="1" w:unhideWhenUsed="1"/>
+    <w:lsdException w:name="macro" w:semiHidden="1" w:unhideWhenUsed="1"/>
+    <w:lsdException w:name="toa heading" w:semiHidden="1" w:unhideWhenUsed="1"/>
+    <w:lsdException w:name="List" w:semiHidden="1" w:unhideWhenUsed="1"/>
+    <w:lsdException w:name="List Bullet" w:semiHidden="1" w:unhideWhenUsed="1"/>
+    <w:lsdException w:name="List Number" w:semiHidden="1" w:unhideWhenUsed="1"/>
+    <w:lsdException w:name="List 2" w:semiHidden="1" w:unhideWhenUsed="1"/>
+    <w:lsdException w:name="List 3" w:semiHidden="1" w:unhideWhenUsed="1"/>
+    <w:lsdException w:name="List 4" w:semiHidden="1" w:unhideWhenUsed="1"/>
+    <w:lsdException w:name="List 5" w:semiHidden="1" w:unhideWhenUsed="1"/>
+    <w:lsdException w:name="List Bullet 2" w:semiHidden="1" w:unhideWhenUsed="1"/>
+    <w:lsdException w:name="List Bullet 3" w:semiHidden="1" w:unhideWhenUsed="1"/>
+    <w:lsdException w:name="List Bullet 4" w:semiHidden="1" w:unhideWhenUsed="1"/>
+    <w:lsdException w:name="List Bullet 5" w:semiHidden="1" w:unhideWhenUsed="1"/>
+    <w:lsdException w:name="List Number 2" w:semiHidden="1" w:unhideWhenUsed="1"/>
+    <w:lsdException w:name="List Number 3" w:semiHidden="1" w:unhideWhenUsed="1"/>
+    <w:lsdException w:name="List Number 4" w:semiHidden="1" w:unhideWhenUsed="1"/>
+    <w:lsdException w:name="List Number 5" w:semiHidden="1" w:unhideWhenUsed="1"/>
+    <w:lsdException w:name="Title" w:uiPriority="10" w:qFormat="1"/>
+    <w:lsdException w:name="Closing" w:semiHidden="1" w:unhideWhenUsed="1"/>
+    <w:lsdException w:name="Signature" w:semiHidden="1" w:unhideWhenUsed="1"/>
+    <w:lsdException w:name="Default Paragraph Font" w:semiHidden="1" w:uiPriority="1" w:unhideWhenUsed="1"/>
+    <w:lsdException w:name="Body Text" w:semiHidden="1" w:unhideWhenUsed="1"/>
+    <w:lsdException w:name="Body Text Indent" w:semiHidden="1" w:unhideWhenUsed="1"/>
+    <w:lsdException w:name="List Continue" w:semiHidden="1" w:unhideWhenUsed="1"/>
+    <w:lsdException w:name="List Continue 2" w:semiHidden="1" w:unhideWhenUsed="1"/>
+    <w:lsdException w:name="List Continue 3" w:semiHidden="1" w:unhideWhenUsed="1"/>
+    <w:lsdException w:name="List Continue 4" w:semiHidden="1" w:unhideWhenUsed="1"/>
+    <w:lsdException w:name="List Continue 5" w:semiHidden="1" w:unhideWhenUsed="1"/>
+    <w:lsdException w:name="Message Header" w:semiHidden="1" w:unhideWhenUsed="1"/>
+    <w:lsdException w:name="Subtitle" w:uiPriority="11" w:qFormat="1"/>
+    <w:lsdException w:name="Salutation" w:semiHidden="1" w:unhideWhenUsed="1"/>
+    <w:lsdException w:name="Date" w:semiHidden="1" w:unhideWhenUsed="1"/>
+    <w:lsdException w:name="Body Text First Indent" w:semiHidden="1" w:unhideWhenUsed="1"/>
+    <w:lsdException w:name="Body Text First Indent 2" w:semiHidden="1" w:unhideWhenUsed="1"/>
+    <w:lsdException w:name="Note Heading" w:semiHidden="1" w:unhideWhenUsed="1"/>
+    <w:lsdException w:name="Body Text 2" w:semiHidden="1" w:unhideWhenUsed="1"/>
+    <w:lsdException w:name="Body Text 3" w:semiHidden="1" w:unhideWhenUsed="1"/>
+    <w:lsdException w:name="Body Text Indent 2" w:semiHidden="1" w:unhideWhenUsed="1"/>
+    <w:lsdException w:name="Body Text Indent 3" w:semiHidden="1" w:unhideWhenUsed="1"/>
+    <w:lsdException w:name="Block Text" w:semiHidden="1" w:unhideWhenUsed="1"/>
+    <w:lsdException w:name="Hyperlink" w:semiHidden="1" w:unhideWhenUsed="1"/>
+    <w:lsdException w:name="FollowedHyperlink" w:semiHidden="1" w:unhideWhenUsed="1"/>
+    <w:lsdException w:name="Strong" w:uiPriority="22" w:qFormat="1"/>
+    <w:lsdException w:name="Emphasis" w:uiPriority="20" w:qFormat="1"/>
+    <w:lsdException w:name="Document Map" w:semiHidden="1" w:unhideWhenUsed="1"/>
+    <w:lsdException w:name="Plain Text" w:semiHidden="1" w:unhideWhenUsed="1"/>
+    <w:lsdException w:name="E-mail Signature" w:semiHidden="1" w:unhideWhenUsed="1"/>
+    <w:lsdException w:name="HTML Top of Form" w:semiHidden="1" w:unhideWhenUsed="1"/>
+    <w:lsdException w:name="HTML Bottom of Form" w:semiHidden="1" w:unhideWhenUsed="1"/>
+    <w:lsdException w:name="Normal (Web)" w:semiHidden="1" w:unhideWhenUsed="1"/>
+    <w:lsdException w:name="HTML Acronym" w:semiHidden="1" w:unhideWhenUsed="1"/>
+    <w:lsdException w:name="HTML Address" w:semiHidden="1" w:unhideWhenUsed="1"/>
+    <w:lsdException w:name="HTML Cite" w:semiHidden="1" w:unhideWhenUsed="1"/>
+    <w:lsdException w:name="HTML Code" w:semiHidden="1" w:unhideWhenUsed="1"/>
+    <w:lsdException w:name="HTML Definition" w:semiHidden="1" w:unhideWhenUsed="1"/>
+    <w:lsdException w:name="HTML Keyboard" w:semiHidden="1" w:unhideWhenUsed="1"/>
+    <w:lsdException w:name="HTML Preformatted" w:semiHidden="1" w:unhideWhenUsed="1"/>
+    <w:lsdException w:name="HTML Sample" w:semiHidden="1" w:unhideWhenUsed="1"/>
+    <w:lsdException w:name="HTML Typewriter" w:semiHidden="1" w:unhideWhenUsed="1"/>
+    <w:lsdException w:name="HTML Variable" w:semiHidden="1" w:unhideWhenUsed="1"/>
+    <w:lsdException w:name="Normal Table" w:semiHidden="1" w:unhideWhenUsed="1"/>
+    <w:lsdException w:name="annotation subject" w:semiHidden="1" w:unhideWhenUsed="1"/>
+    <w:lsdException w:name="No List" w:semiHidden="1" w:unhideWhenUsed="1"/>
+    <w:lsdException w:name="Outline List 1" w:semiHidden="1" w:unhideWhenUsed="1"/>
+    <w:lsdException w:name="Outline List 2" w:semiHidden="1" w:unhideWhenUsed="1"/>
+    <w:lsdException w:name="Outline List 3" w:semiHidden="1" w:unhideWhenUsed="1"/>
+    <w:lsdException w:name="Table Simple 1" w:semiHidden="1" w:unhideWhenUsed="1"/>
+    <w:lsdException w:name="Table Simple 2" w:semiHidden="1" w:unhideWhenUsed="1"/>
+    <w:lsdException w:name="Table Simple 3" w:semiHidden="1" w:unhideWhenUsed="1"/>
+    <w:lsdException w:name="Table Classic 1" w:semiHidden="1" w:unhideWhenUsed="1"/>
+    <w:lsdException w:name="Table Classic 2" w:semiHidden="1" w:unhideWhenUsed="1"/>
+    <w:lsdException w:name="Table Classic 3" w:semiHidden="1" w:unhideWhenUsed="1"/>
+    <w:lsdException w:name="Table Classic 4" w:semiHidden="1" w:unhideWhenUsed="1"/>
+    <w:lsdException w:name="Table Colorful 1" w:semiHidden="1" w:unhideWhenUsed="1"/>
+    <w:lsdException w:name="Table Colorful 2" w:semiHidden="1" w:unhideWhenUsed="1"/>
+    <w:lsdException w:name="Table Colorful 3" w:semiHidden="1" w:unhideWhenUsed="1"/>
+    <w:lsdException w:name="Table Columns 1" w:semiHidden="1" w:unhideWhenUsed="1"/>
+    <w:lsdException w:name="Table Columns 2" w:semiHidden="1" w:unhideWhenUsed="1"/>
+    <w:lsdException w:name="Table Columns 3" w:semiHidden="1" w:unhideWhenUsed="1"/>
+    <w:lsdException w:name="Table Columns 4" w:semiHidden="1" w:unhideWhenUsed="1"/>
+    <w:lsdException w:name="Table Columns 5" w:semiHidden="1" w:unhideWhenUsed="1"/>
+    <w:lsdException w:name="Table Grid 1" w:semiHidden="1" w:unhideWhenUsed="1"/>
+    <w:lsdException w:name="Table Grid 2" w:semiHidden="1" w:unhideWhenUsed="1"/>
+    <w:lsdException w:name="Table Grid 3" w:semiHidden="1" w:unhideWhenUsed="1"/>
+    <w:lsdException w:name="Table Grid 4" w:semiHidden="1" w:unhideWhenUsed="1"/>
+    <w:lsdException w:name="Table Grid 5" w:semiHidden="1" w:unhideWhenUsed="1"/>
+    <w:lsdException w:name="Table Grid 6" w:semiHidden="1" w:unhideWhenUsed="1"/>
+    <w:lsdException w:name="Table Grid 7" w:semiHidden="1" w:unhideWhenUsed="1"/>
+    <w:lsdException w:name="Table Grid 8" w:semiHidden="1" w:unhideWhenUsed="1"/>
+    <w:lsdException w:name="Table List 1" w:semiHidden="1" w:unhideWhenUsed="1"/>
+    <w:lsdException w:name="Table List 2" w:semiHidden="1" w:unhideWhenUsed="1"/>
+    <w:lsdException w:name="Table List 3" w:semiHidden="1" w:unhideWhenUsed="1"/>
+    <w:lsdException w:name="Table List 4" w:semiHidden="1" w:unhideWhenUsed="1"/>
+    <w:lsdException w:name="Table List 5" w:semiHidden="1" w:unhideWhenUsed="1"/>
+    <w:lsdException w:name="Table List 6" w:semiHidden="1" w:unhideWhenUsed="1"/>
+    <w:lsdException w:name="Table List 7" w:semiHidden="1" w:unhideWhenUsed="1"/>
+    <w:lsdException w:name="Table List 8" w:semiHidden="1" w:unhideWhenUsed="1"/>
+    <w:lsdException w:name="Table 3D effects 1" w:semiHidden="1" w:unhideWhenUsed="1"/>
+    <w:lsdException w:name="Table 3D effects 2" w:semiHidden="1" w:unhideWhenUsed="1"/>
+    <w:lsdException w:name="Table 3D effects 3" w:semiHidden="1" w:unhideWhenUsed="1"/>
+    <w:lsdException w:name="Table Contemporary" w:semiHidden="1" w:unhideWhenUsed="1"/>
+    <w:lsdException w:name="Table Elegant" w:semiHidden="1" w:unhideWhenUsed="1"/>
+    <w:lsdException w:name="Table Professional" w:semiHidden="1" w:unhideWhenUsed="1"/>
+    <w:lsdException w:name="Table Subtle 1" w:semiHidden="1" w:unhideWhenUsed="1"/>
+    <w:lsdException w:name="Table Subtle 2" w:semiHidden="1" w:unhideWhenUsed="1"/>
+    <w:lsdException w:name="Table Web 1" w:semiHidden="1" w:unhideWhenUsed="1"/>
+    <w:lsdException w:name="Table Web 2" w:semiHidden="1" w:unhideWhenUsed="1"/>
+    <w:lsdException w:name="Table Web 3" w:semiHidden="1" w:unhideWhenUsed="1"/>
+    <w:lsdException w:name="Balloon Text" w:semiHidden="1" w:unhideWhenUsed="1"/>
+    <w:lsdException w:name="Table Grid" w:uiPriority="59"/>
+    <w:lsdException w:name="Table Theme" w:semiHidden="1" w:unhideWhenUsed="1"/>
+    <w:lsdException w:name="Placeholder Text" w:semiHidden="1"/>
+    <w:lsdException w:name="No Spacing" w:uiPriority="1" w:qFormat="1"/>
+    <w:lsdException w:name="Light Shading" w:uiPriority="60"/>
+    <w:lsdException w:name="Light List" w:uiPriority="61"/>
+    <w:lsdException w:name="Light Grid" w:uiPriority="62"/>
+    <w:lsdException w:name="Medium Shading 1" w:uiPriority="63"/>
+    <w:lsdException w:name="Medium Shading 2" w:uiPriority="64"/>
+    <w:lsdException w:name="Medium List 1" w:uiPriority="65"/>
+    <w:lsdException w:name="Medium List 2" w:uiPriority="66"/>
+    <w:lsdException w:name="Medium Grid 1" w:uiPriority="67"/>
+    <w:lsdException w:name="Medium Grid 2" w:uiPriority="68"/>
+    <w:lsdException w:name="Medium Grid 3" w:uiPriority="69"/>
+    <w:lsdException w:name="Dark List" w:uiPriority="70"/>
+    <w:lsdException w:name="Colorful Shading" w:uiPriority="71"/>
+    <w:lsdException w:name="Colorful List" w:uiPriority="72"/>
+    <w:lsdException w:name="Colorful Grid" w:uiPriority="73"/>
+    <w:lsdException w:name="Light Shading Accent 1" w:uiPriority="60"/>
+    <w:lsdException w:name="Light List Accent 1" w:uiPriority="61"/>
+    <w:lsdException w:name="Light Grid Accent 1" w:uiPriority="62"/>
+    <w:lsdException w:name="Medium Shading 1 Accent 1" w:uiPriority="63"/>
+    <w:lsdException w:name="Medium Shading 2 Accent 1" w:uiPriority="64"/>
+    <w:lsdException w:name="Medium List 1 Accent 1" w:uiPriority="65"/>
+    <w:lsdException w:name="Revision" w:semiHidden="1"/>
+    <w:lsdException w:name="List Paragraph" w:uiPriority="34" w:qFormat="1"/>
+    <w:lsdException w:name="Quote" w:uiPriority="29" w:qFormat="1"/>
+    <w:lsdException w:name="Intense Quote" w:uiPriority="30" w:qFormat="1"/>
+    <w:lsdException w:name="Medium List 2 Accent 1" w:uiPriority="66"/>
+    <w:lsdException w:name="Medium Grid 1 Accent 1" w:uiPriority="67"/>
+    <w:lsdException w:name="Medium Grid 2 Accent 1" w:uiPriority="68"/>
+    <w:lsdException w:name="Medium Grid 3 Accent 1" w:uiPriority="69"/>
+    <w:lsdException w:name="Dark List Accent 1" w:uiPriority="70"/>
+    <w:lsdException w:name="Colorful Shading Accent 1" w:uiPriority="71"/>
+    <w:lsdException w:name="Colorful List Accent 1" w:uiPriority="72"/>
+    <w:lsdException w:name="Colorful Grid Accent 1" w:uiPriority="73"/>
+    <w:lsdException w:name="Light Shading Accent 2" w:uiPriority="60"/>
+    <w:lsdException w:name="Light List Accent 2" w:uiPriority="61"/>
+    <w:lsdException w:name="Light Grid Accent 2" w:uiPriority="62"/>
+    <w:lsdException w:name="Medium Shading 1 Accent 2" w:uiPriority="63"/>
+    <w:lsdException w:name="Medium Shading 2 Accent 2" w:uiPriority="64"/>
+    <w:lsdException w:name="Medium List 1 Accent 2" w:uiPriority="65"/>
+    <w:lsdException w:name="Medium List 2 Accent 2" w:uiPriority="66"/>
+    <w:lsdException w:name="Medium Grid 1 Accent 2" w:uiPriority="67"/>
+    <w:lsdException w:name="Medium Grid 2 Accent 2" w:uiPriority="68"/>
+    <w:lsdException w:name="Medium Grid 3 Accent 2" w:uiPriority="69"/>
+    <w:lsdException w:name="Dark List Accent 2" w:uiPriority="70"/>
+    <w:lsdException w:name="Colorful Shading Accent 2" w:uiPriority="71"/>
+    <w:lsdException w:name="Colorful List Accent 2" w:uiPriority="72"/>
+    <w:lsdException w:name="Colorful Grid Accent 2" w:uiPriority="73"/>
+    <w:lsdException w:name="Light Shading Accent 3" w:uiPriority="60"/>
+    <w:lsdException w:name="Light List Accent 3" w:uiPriority="61"/>
+    <w:lsdException w:name="Light Grid Accent 3" w:uiPriority="62"/>
+    <w:lsdException w:name="Medium Shading 1 Accent 3" w:uiPriority="63"/>
+    <w:lsdException w:name="Medium Shading 2 Accent 3" w:uiPriority="64"/>
+    <w:lsdException w:name="Medium List 1 Accent 3" w:uiPriority="65"/>
+    <w:lsdException w:name="Medium List 2 Accent 3" w:uiPriority="66"/>
+    <w:lsdException w:name="Medium Grid 1 Accent 3" w:uiPriority="67"/>
+    <w:lsdException w:name="Medium Grid 2 Accent 3" w:uiPriority="68"/>
+    <w:lsdException w:name="Medium Grid 3 Accent 3" w:uiPriority="69"/>
+    <w:lsdException w:name="Dark List Accent 3" w:uiPriority="70"/>
+    <w:lsdException w:name="Colorful Shading Accent 3" w:uiPriority="71"/>
+    <w:lsdException w:name="Colorful List Accent 3" w:uiPriority="72"/>
+    <w:lsdException w:name="Colorful Grid Accent 3" w:uiPriority="73"/>
+    <w:lsdException w:name="Light Shading Accent 4" w:uiPriority="60"/>
+    <w:lsdException w:name="Light List Accent 4" w:uiPriority="61"/>
+    <w:lsdException w:name="Light Grid Accent 4" w:uiPriority="62"/>
+    <w:lsdException w:name="Medium Shading 1 Accent 4" w:uiPriority="63"/>
+    <w:lsdException w:name="Medium Shading 2 Accent 4" w:uiPriority="64"/>
+    <w:lsdException w:name="Medium List 1 Accent 4" w:uiPriority="65"/>
+    <w:lsdException w:name="Medium List 2 Accent 4" w:uiPriority="66"/>
+    <w:lsdException w:name="Medium Grid 1 Accent 4" w:uiPriority="67"/>
+    <w:lsdException w:name="Medium Grid 2 Accent 4" w:uiPriority="68"/>
+    <w:lsdException w:name="Medium Grid 3 Accent 4" w:uiPriority="69"/>
+    <w:lsdException w:name="Dark List Accent 4" w:uiPriority="70"/>
+    <w:lsdException w:name="Colorful Shading Accent 4" w:uiPriority="71"/>
+    <w:lsdException w:name="Colorful List Accent 4" w:uiPriority="72"/>
+    <w:lsdException w:name="Colorful Grid Accent 4" w:uiPriority="73"/>
+    <w:lsdException w:name="Light Shading Accent 5" w:uiPriority="60"/>
+    <w:lsdException w:name="Light List Accent 5" w:uiPriority="61"/>
+    <w:lsdException w:name="Light Grid Accent 5" w:uiPriority="62"/>
+    <w:lsdException w:name="Medium Shading 1 Accent 5" w:uiPriority="63"/>
+    <w:lsdException w:name="Medium Shading 2 Accent 5" w:uiPriority="64"/>
+    <w:lsdException w:name="Medium List 1 Accent 5" w:uiPriority="65"/>
+    <w:lsdException w:name="Medium List 2 Accent 5" w:uiPriority="66"/>
+    <w:lsdException w:name="Medium Grid 1 Accent 5" w:uiPriority="67"/>
+    <w:lsdException w:name="Medium Grid 2 Accent 5" w:uiPriority="68"/>
+    <w:lsdException w:name="Medium Grid 3 Accent 5" w:uiPriority="69"/>
+    <w:lsdException w:name="Dark List Accent 5" w:uiPriority="70"/>
+    <w:lsdException w:name="Colorful Shading Accent 5" w:uiPriority="71"/>
+    <w:lsdException w:name="Colorful List Accent 5" w:uiPriority="72"/>
+    <w:lsdException w:name="Colorful Grid Accent 5" w:uiPriority="73"/>
+    <w:lsdException w:name="Light Shading Accent 6" w:uiPriority="60"/>
+    <w:lsdException w:name="Light List Accent 6" w:uiPriority="61"/>
+    <w:lsdException w:name="Light Grid Accent 6" w:uiPriority="62"/>
+    <w:lsdException w:name="Medium Shading 1 Accent 6" w:uiPriority="63"/>
+    <w:lsdException w:name="Medium Shading 2 Accent 6" w:uiPriority="64"/>
+    <w:lsdException w:name="Medium List 1 Accent 6" w:uiPriority="65"/>
+    <w:lsdException w:name="Medium List 2 Accent 6" w:uiPriority="66"/>
+    <w:lsdException w:name="Medium Grid 1 Accent 6" w:uiPriority="67"/>
+    <w:lsdException w:name="Medium Grid 2 Accent 6" w:uiPriority="68"/>
+    <w:lsdException w:name="Medium Grid 3 Accent 6" w:uiPriority="69"/>
+    <w:lsdException w:name="Dark List Accent 6" w:uiPriority="70"/>
+    <w:lsdException w:name="Colorful Shading Accent 6" w:uiPriority="71"/>
+    <w:lsdException w:name="Colorful List Accent 6" w:uiPriority="72"/>
+    <w:lsdException w:name="Colorful Grid Accent 6" w:uiPriority="73"/>
+    <w:lsdException w:name="Subtle Emphasis" w:uiPriority="19" w:qFormat="1"/>
+    <w:lsdException w:name="Intense Emphasis" w:uiPriority="21" w:qFormat="1"/>
+    <w:lsdException w:name="Subtle Reference" w:uiPriority="31" w:qFormat="1"/>
+    <w:lsdException w:name="Intense Reference" w:uiPriority="32" w:qFormat="1"/>
+    <w:lsdException w:name="Book Title" w:uiPriority="33" w:qFormat="1"/>
+    <w:lsdException w:name="Bibliography" w:semiHidden="1" w:uiPriority="37" w:unhideWhenUsed="1"/>
+    <w:lsdException w:name="TOC Heading" w:semiHidden="1" w:uiPriority="39" w:unhideWhenUsed="1" w:qFormat="1"/>
+    <w:lsdException w:name="Plain Table 1" w:uiPriority="41"/>
+    <w:lsdException w:name="Plain Table 2" w:uiPriority="42"/>
+    <w:lsdException w:name="Plain Table 3" w:uiPriority="43"/>
+    <w:lsdException w:name="Plain Table 4" w:uiPriority="44"/>
+    <w:lsdException w:name="Plain Table 5" w:uiPriority="45"/>
+    <w:lsdException w:name="Grid Table Light" w:uiPriority="40"/>
+    <w:lsdException w:name="Grid Table 1 Light" w:uiPriority="46"/>
+    <w:lsdException w:name="Grid Table 2" w:uiPriority="47"/>
+    <w:lsdException w:name="Grid Table 3" w:uiPriority="48"/>
+    <w:lsdException w:name="Grid Table 4" w:uiPriority="49"/>
+    <w:lsdException w:name="Grid Table 5 Dark" w:uiPriority="50"/>
+    <w:lsdException w:name="Grid Table 6 Colorful" w:uiPriority="51"/>
+    <w:lsdException w:name="Grid Table 7 Colorful" w:uiPriority="52"/>
+    <w:lsdException w:name="Grid Table 1 Light Accent 1" w:uiPriority="46"/>
+    <w:lsdException w:name="Grid Table 2 Accent 1" w:uiPriority="47"/>
+    <w:lsdException w:name="Grid Table 3 Accent 1" w:uiPriority="48"/>
+    <w:lsdException w:name="Grid Table 4 Accent 1" w:uiPriority="49"/>
+    <w:lsdException w:name="Grid Table 5 Dark Accent 1" w:uiPriority="50"/>
+    <w:lsdException w:name="Grid Table 6 Colorful Accent 1" w:uiPriority="51"/>
+    <w:lsdException w:name="Grid Table 7 Colorful Accent 1" w:uiPriority="52"/>
+    <w:lsdException w:name="Grid Table 1 Light Accent 2" w:uiPriority="46"/>
+    <w:lsdException w:name="Grid Table 2 Accent 2" w:uiPriority="47"/>
+    <w:lsdException w:name="Grid Table 3 Accent 2" w:uiPriority="48"/>
+    <w:lsdException w:name="Grid Table 4 Accent 2" w:uiPriority="49"/>
+    <w:lsdException w:name="Grid Table 5 Dark Accent 2" w:uiPriority="50"/>
+    <w:lsdException w:name="Grid Table 6 Colorful Accent 2" w:uiPriority="51"/>
+    <w:lsdException w:name="Grid Table 7 Colorful Accent 2" w:uiPriority="52"/>
+    <w:lsdException w:name="Grid Table 1 Light Accent 3" w:uiPriority="46"/>
+    <w:lsdException w:name="Grid Table 2 Accent 3" w:uiPriority="47"/>
+    <w:lsdException w:name="Grid Table 3 Accent 3" w:uiPriority="48"/>
+    <w:lsdException w:name="Grid Table 4 Accent 3" w:uiPriority="49"/>
+    <w:lsdException w:name="Grid Table 5 Dark Accent 3" w:uiPriority="50"/>
+    <w:lsdException w:name="Grid Table 6 Colorful Accent 3" w:uiPriority="51"/>
+    <w:lsdException w:name="Grid Table 7 Colorful Accent 3" w:uiPriority="52"/>
+    <w:lsdException w:name="Grid Table 1 Light Accent 4" w:uiPriority="46"/>
+    <w:lsdException w:name="Grid Table 2 Accent 4" w:uiPriority="47"/>
+    <w:lsdException w:name="Grid Table 3 Accent 4" w:uiPriority="48"/>
+    <w:lsdException w:name="Grid Table 4 Accent 4" w:uiPriority="49"/>
+    <w:lsdException w:name="Grid Table 5 Dark Accent 4" w:uiPriority="50"/>
+    <w:lsdException w:name="Grid Table 6 Colorful Accent 4" w:uiPriority="51"/>
+    <w:lsdException w:name="Grid Table 7 Colorful Accent 4" w:uiPriority="52"/>
+    <w:lsdException w:name="Grid Table 1 Light Accent 5" w:uiPriority="46"/>
+    <w:lsdException w:name="Grid Table 2 Accent 5" w:uiPriority="47"/>
+    <w:lsdException w:name="Grid Table 3 Accent 5" w:uiPriority="48"/>
+    <w:lsdException w:name="Grid Table 4 Accent 5" w:uiPriority="49"/>
+    <w:lsdException w:name="Grid Table 5 Dark Accent 5" w:uiPriority="50"/>
+    <w:lsdException w:name="Grid Table 6 Colorful Accent 5" w:uiPriority="51"/>
+    <w:lsdException w:name="Grid Table 7 Colorful Accent 5" w:uiPriority="52"/>
+    <w:lsdException w:name="Grid Table 1 Light Accent 6" w:uiPriority="46"/>
+    <w:lsdException w:name="Grid Table 2 Accent 6" w:uiPriority="47"/>
+    <w:lsdException w:name="Grid Table 3 Accent 6" w:uiPriority="48"/>
+    <w:lsdException w:name="Grid Table 4 Accent 6" w:uiPriority="49"/>
+    <w:lsdException w:name="Grid Table 5 Dark Accent 6" w:uiPriority="50"/>
+    <w:lsdException w:name="Grid Table 6 Colorful Accent 6" w:uiPriority="51"/>
+    <w:lsdException w:name="Grid Table 7 Colorful Accent 6" w:uiPriority="52"/>
+    <w:lsdException w:name="List Table 1 Light" w:uiPriority="46"/>
+    <w:lsdException w:name="List Table 2" w:uiPriority="47"/>
+    <w:lsdException w:name="List Table 3" w:uiPriority="48"/>
+    <w:lsdException w:name="List Table 4" w:uiPriority="49"/>
+    <w:lsdException w:name="List Table 5 Dark" w:uiPriority="50"/>
+    <w:lsdException w:name="List Table 6 Colorful" w:uiPriority="51"/>
+    <w:lsdException w:name="List Table 7 Colorful" w:uiPriority="52"/>
+    <w:lsdException w:name="List Table 1 Light Accent 1" w:uiPriority="46"/>
+    <w:lsdException w:name="List Table 2 Accent 1" w:uiPriority="47"/>
+    <w:lsdException w:name="List Table 3 Accent 1" w:uiPriority="48"/>
+    <w:lsdException w:name="List Table 4 Accent 1" w:uiPriority="49"/>
+    <w:lsdException w:name="List Table 5 Dark Accent 1" w:uiPriority="50"/>
+    <w:lsdException w:name="List Table 6 Colorful Accent 1" w:uiPriority="51"/>
+    <w:lsdException w:name="List Table 7 Colorful Accent 1" w:uiPriority="52"/>
+    <w:lsdException w:name="List Table 1 Light Accent 2" w:uiPriority="46"/>
+    <w:lsdException w:name="List Table 2 Accent 2" w:uiPriority="47"/>
+    <w:lsdException w:name="List Table 3 Accent 2" w:uiPriority="48"/>
+    <w:lsdException w:name="List Table 4 Accent 2" w:uiPriority="49"/>
+    <w:lsdException w:name="List Table 5 Dark Accent 2" w:uiPriority="50"/>
+    <w:lsdException w:name="List Table 6 Colorful Accent 2" w:uiPriority="51"/>
+    <w:lsdException w:name="List Table 7 Colorful Accent 2" w:uiPriority="52"/>
+    <w:lsdException w:name="List Table 1 Light Accent 3" w:uiPriority="46"/>
+    <w:lsdException w:name="List Table 2 Accent 3" w:uiPriority="47"/>
+    <w:lsdException w:name="List Table 3 Accent 3" w:uiPriority="48"/>
+    <w:lsdException w:name="List Table 4 Accent 3" w:uiPriority="49"/>
+    <w:lsdException w:name="List Table 5 Dark Accent 3" w:uiPriority="50"/>
+    <w:lsdException w:name="List Table 6 Colorful Accent 3" w:uiPriority="51"/>
+    <w:lsdException w:name="List Table 7 Colorful Accent 3" w:uiPriority="52"/>
+    <w:lsdException w:name="List Table 1 Light Accent 4" w:uiPriority="46"/>
+    <w:lsdException w:name="List Table 2 Accent 4" w:uiPriority="47"/>
+    <w:lsdException w:name="List Table 3 Accent 4" w:uiPriority="48"/>
+    <w:lsdException w:name="List Table 4 Accent 4" w:uiPriority="49"/>
+    <w:lsdException w:name="List Table 5 Dark Accent 4" w:uiPriority="50"/>
+    <w:lsdException w:name="List Table 6 Colorful Accent 4" w:uiPriority="51"/>
+    <w:lsdException w:name="List Table 7 Colorful Accent 4" w:uiPriority="52"/>
+    <w:lsdException w:name="List Table 1 Light Accent 5" w:uiPriority="46"/>
+    <w:lsdException w:name="List Table 2 Accent 5" w:uiPriority="47"/>
+    <w:lsdException w:name="List Table 3 Accent 5" w:uiPriority="48"/>
+    <w:lsdException w:name="List Table 4 Accent 5" w:uiPriority="49"/>
+    <w:lsdException w:name="List Table 5 Dark Accent 5" w:uiPriority="50"/>
+    <w:lsdException w:name="List Table 6 Colorful Accent 5" w:uiPriority="51"/>
+    <w:lsdException w:name="List Table 7 Colorful Accent 5" w:uiPriority="52"/>
+    <w:lsdException w:name="List Table 1 Light Accent 6" w:uiPriority="46"/>
+    <w:lsdException w:name="List Table 2 Accent 6" w:uiPriority="47"/>
+    <w:lsdException w:name="List Table 3 Accent 6" w:uiPriority="48"/>
+    <w:lsdException w:name="List Table 4 Accent 6" w:uiPriority="49"/>
+    <w:lsdException w:name="List Table 5 Dark Accent 6" w:uiPriority="50"/>
+    <w:lsdException w:name="List Table 6 Colorful Accent 6" w:uiPriority="51"/>
+    <w:lsdException w:name="List Table 7 Colorful Accent 6" w:uiPriority="52"/>
   </w:latentStyles>
   <w:style w:type="paragraph" w:default="1" w:styleId="Normal">
     <w:name w:val="Normal"/>
@@ -3105,467 +4782,7 @@
       </w:tblCellMar>
     </w:tblPr>
   </w:style>
-  <w:style w:type="paragraph" w:styleId="Ttulo">
-    <w:name w:val="Title"/>
-    <w:basedOn w:val="Normal"/>
-    <w:next w:val="Normal"/>
-    <w:pPr>
-      <w:keepNext/>
-      <w:keepLines/>
-      <w:spacing w:after="60"/>
-    </w:pPr>
-    <w:rPr>
-      <w:sz w:val="52"/>
-      <w:szCs w:val="52"/>
-    </w:rPr>
-  </w:style>
-  <w:style w:type="paragraph" w:styleId="Subttulo">
-    <w:name w:val="Subtitle"/>
-    <w:basedOn w:val="Normal"/>
-    <w:next w:val="Normal"/>
-    <w:pPr>
-      <w:keepNext/>
-      <w:keepLines/>
-      <w:spacing w:after="320"/>
-    </w:pPr>
-    <w:rPr>
-      <w:color w:val="666666"/>
-      <w:sz w:val="30"/>
-      <w:szCs w:val="30"/>
-    </w:rPr>
-  </w:style>
-  <w:style w:type="table" w:customStyle="1" w:styleId="a">
-    <w:basedOn w:val="TableNormal"/>
-    <w:tblPr>
-      <w:tblStyleRowBandSize w:val="1"/>
-      <w:tblStyleColBandSize w:val="1"/>
-    </w:tblPr>
-  </w:style>
-  <w:style w:type="paragraph" w:styleId="Textodeglobo">
-    <w:name w:val="Balloon Text"/>
-    <w:basedOn w:val="Normal"/>
-    <w:link w:val="TextodegloboCar"/>
-    <w:uiPriority w:val="99"/>
-    <w:semiHidden/>
-    <w:unhideWhenUsed/>
-    <w:rsid w:val="00241754"/>
-    <w:pPr>
-      <w:spacing w:after="0" w:line="240" w:lineRule="auto"/>
-    </w:pPr>
-    <w:rPr>
-      <w:rFonts w:ascii="Tahoma" w:hAnsi="Tahoma" w:cs="Tahoma"/>
-      <w:sz w:val="16"/>
-      <w:szCs w:val="16"/>
-    </w:rPr>
-  </w:style>
-  <w:style w:type="character" w:customStyle="1" w:styleId="TextodegloboCar">
-    <w:name w:val="Texto de globo Car"/>
-    <w:basedOn w:val="Fuentedeprrafopredeter"/>
-    <w:link w:val="Textodeglobo"/>
-    <w:uiPriority w:val="99"/>
-    <w:semiHidden/>
-    <w:rsid w:val="00241754"/>
-    <w:rPr>
-      <w:rFonts w:ascii="Tahoma" w:hAnsi="Tahoma" w:cs="Tahoma"/>
-      <w:sz w:val="16"/>
-      <w:szCs w:val="16"/>
-    </w:rPr>
-  </w:style>
-  <w:style w:type="paragraph" w:styleId="Encabezado">
-    <w:name w:val="header"/>
-    <w:basedOn w:val="Normal"/>
-    <w:link w:val="EncabezadoCar"/>
-    <w:uiPriority w:val="99"/>
-    <w:unhideWhenUsed/>
-    <w:rsid w:val="00241754"/>
-    <w:pPr>
-      <w:tabs>
-        <w:tab w:val="center" w:pos="4252"/>
-        <w:tab w:val="right" w:pos="8504"/>
-      </w:tabs>
-      <w:spacing w:after="0" w:line="240" w:lineRule="auto"/>
-    </w:pPr>
-  </w:style>
-  <w:style w:type="character" w:customStyle="1" w:styleId="EncabezadoCar">
-    <w:name w:val="Encabezado Car"/>
-    <w:basedOn w:val="Fuentedeprrafopredeter"/>
-    <w:link w:val="Encabezado"/>
-    <w:uiPriority w:val="99"/>
-    <w:rsid w:val="00241754"/>
-  </w:style>
-  <w:style w:type="paragraph" w:styleId="Piedepgina">
-    <w:name w:val="footer"/>
-    <w:basedOn w:val="Normal"/>
-    <w:link w:val="PiedepginaCar"/>
-    <w:uiPriority w:val="99"/>
-    <w:unhideWhenUsed/>
-    <w:rsid w:val="00241754"/>
-    <w:pPr>
-      <w:tabs>
-        <w:tab w:val="center" w:pos="4252"/>
-        <w:tab w:val="right" w:pos="8504"/>
-      </w:tabs>
-      <w:spacing w:after="0" w:line="240" w:lineRule="auto"/>
-    </w:pPr>
-  </w:style>
-  <w:style w:type="character" w:customStyle="1" w:styleId="PiedepginaCar">
-    <w:name w:val="Pie de página Car"/>
-    <w:basedOn w:val="Fuentedeprrafopredeter"/>
-    <w:link w:val="Piedepgina"/>
-    <w:uiPriority w:val="99"/>
-    <w:rsid w:val="00241754"/>
-  </w:style>
-  <w:style w:type="paragraph" w:styleId="NormalWeb">
-    <w:name w:val="Normal (Web)"/>
-    <w:basedOn w:val="Normal"/>
-    <w:uiPriority w:val="99"/>
-    <w:unhideWhenUsed/>
-    <w:rsid w:val="005D35FC"/>
-    <w:pPr>
-      <w:spacing w:before="100" w:beforeAutospacing="1" w:after="100" w:afterAutospacing="1" w:line="240" w:lineRule="auto"/>
-      <w:ind w:left="0" w:right="0"/>
-      <w:jc w:val="left"/>
-    </w:pPr>
-    <w:rPr>
-      <w:rFonts w:ascii="Times New Roman" w:eastAsia="Times New Roman" w:hAnsi="Times New Roman" w:cs="Times New Roman"/>
-      <w:lang w:val="es-AR"/>
-    </w:rPr>
-  </w:style>
-  <w:style w:type="character" w:styleId="Hipervnculo">
-    <w:name w:val="Hyperlink"/>
-    <w:basedOn w:val="Fuentedeprrafopredeter"/>
-    <w:uiPriority w:val="99"/>
-    <w:unhideWhenUsed/>
-    <w:rsid w:val="009E5E11"/>
-    <w:rPr>
-      <w:color w:val="0000FF"/>
-      <w:u w:val="single"/>
-    </w:rPr>
-  </w:style>
-  <w:style w:type="character" w:customStyle="1" w:styleId="UnresolvedMention">
-    <w:name w:val="Unresolved Mention"/>
-    <w:basedOn w:val="Fuentedeprrafopredeter"/>
-    <w:uiPriority w:val="99"/>
-    <w:semiHidden/>
-    <w:unhideWhenUsed/>
-    <w:rsid w:val="00465D85"/>
-    <w:rPr>
-      <w:color w:val="605E5C"/>
-      <w:shd w:val="clear" w:color="auto" w:fill="E1DFDD"/>
-    </w:rPr>
-  </w:style>
-  <w:style w:type="character" w:customStyle="1" w:styleId="Ttulo2Car">
-    <w:name w:val="Título 2 Car"/>
-    <w:basedOn w:val="Fuentedeprrafopredeter"/>
-    <w:link w:val="Ttulo2"/>
-    <w:rsid w:val="00C71B96"/>
-    <w:rPr>
-      <w:rFonts w:ascii="Open Sans ExtraBold" w:eastAsia="Open Sans ExtraBold" w:hAnsi="Open Sans ExtraBold" w:cs="Open Sans ExtraBold"/>
-      <w:color w:val="FFAA00"/>
-      <w:sz w:val="20"/>
-      <w:szCs w:val="20"/>
-    </w:rPr>
-  </w:style>
-</w:styles>
-</file>
-
-<file path=word/stylesWithEffects.xml><?xml version="1.0" encoding="utf-8"?>
-<w:styles xmlns:wpc="http://schemas.microsoft.com/office/word/2010/wordprocessingCanvas" xmlns:mc="http://schemas.openxmlformats.org/markup-compatibility/2006" xmlns:o="urn:schemas-microsoft-com:office:office" xmlns:r="http://schemas.openxmlformats.org/officeDocument/2006/relationships" xmlns:m="http://schemas.openxmlformats.org/officeDocument/2006/math" xmlns:v="urn:schemas-microsoft-com:vml" xmlns:wp14="http://schemas.microsoft.com/office/word/2010/wordprocessingDrawing" xmlns:wp="http://schemas.openxmlformats.org/drawingml/2006/wordprocessingDrawing" xmlns:w10="urn:schemas-microsoft-com:office:word" xmlns:w="http://schemas.openxmlformats.org/wordprocessingml/2006/main" xmlns:w14="http://schemas.microsoft.com/office/word/2010/wordml" xmlns:wpg="http://schemas.microsoft.com/office/word/2010/wordprocessingGroup" xmlns:wpi="http://schemas.microsoft.com/office/word/2010/wordprocessingInk" xmlns:wne="http://schemas.microsoft.com/office/word/2006/wordml" xmlns:wps="http://schemas.microsoft.com/office/word/2010/wordprocessingShape" mc:Ignorable="w14 wp14">
-  <w:docDefaults>
-    <w:rPrDefault>
-      <w:rPr>
-        <w:rFonts w:ascii="Arial" w:eastAsia="Arial" w:hAnsi="Arial" w:cs="Arial"/>
-        <w:sz w:val="24"/>
-        <w:szCs w:val="24"/>
-        <w:lang w:val="en" w:eastAsia="es-AR" w:bidi="ar-SA"/>
-      </w:rPr>
-    </w:rPrDefault>
-    <w:pPrDefault>
-      <w:pPr>
-        <w:spacing w:after="120" w:line="360" w:lineRule="auto"/>
-        <w:ind w:left="720" w:right="-531"/>
-        <w:jc w:val="both"/>
-      </w:pPr>
-    </w:pPrDefault>
-  </w:docDefaults>
-  <w:latentStyles w:defLockedState="0" w:defUIPriority="99" w:defSemiHidden="1" w:defUnhideWhenUsed="1" w:defQFormat="0" w:count="267">
-    <w:lsdException w:name="Normal" w:semiHidden="0" w:uiPriority="0" w:unhideWhenUsed="0" w:qFormat="1"/>
-    <w:lsdException w:name="heading 1" w:semiHidden="0" w:uiPriority="9" w:unhideWhenUsed="0" w:qFormat="1"/>
-    <w:lsdException w:name="heading 2" w:uiPriority="0" w:qFormat="1"/>
-    <w:lsdException w:name="heading 3" w:uiPriority="9" w:qFormat="1"/>
-    <w:lsdException w:name="heading 4" w:uiPriority="9" w:qFormat="1"/>
-    <w:lsdException w:name="heading 5" w:uiPriority="9" w:qFormat="1"/>
-    <w:lsdException w:name="heading 6" w:uiPriority="9" w:qFormat="1"/>
-    <w:lsdException w:name="heading 7" w:uiPriority="9" w:qFormat="1"/>
-    <w:lsdException w:name="heading 8" w:uiPriority="9" w:qFormat="1"/>
-    <w:lsdException w:name="heading 9" w:uiPriority="9" w:qFormat="1"/>
-    <w:lsdException w:name="toc 1" w:uiPriority="39"/>
-    <w:lsdException w:name="toc 2" w:uiPriority="39"/>
-    <w:lsdException w:name="toc 3" w:uiPriority="39"/>
-    <w:lsdException w:name="toc 4" w:uiPriority="39"/>
-    <w:lsdException w:name="toc 5" w:uiPriority="39"/>
-    <w:lsdException w:name="toc 6" w:uiPriority="39"/>
-    <w:lsdException w:name="toc 7" w:uiPriority="39"/>
-    <w:lsdException w:name="toc 8" w:uiPriority="39"/>
-    <w:lsdException w:name="toc 9" w:uiPriority="39"/>
-    <w:lsdException w:name="caption" w:uiPriority="35" w:qFormat="1"/>
-    <w:lsdException w:name="Title" w:semiHidden="0" w:uiPriority="10" w:unhideWhenUsed="0" w:qFormat="1"/>
-    <w:lsdException w:name="Default Paragraph Font" w:uiPriority="1"/>
-    <w:lsdException w:name="Subtitle" w:semiHidden="0" w:uiPriority="11" w:unhideWhenUsed="0" w:qFormat="1"/>
-    <w:lsdException w:name="Strong" w:semiHidden="0" w:uiPriority="22" w:unhideWhenUsed="0" w:qFormat="1"/>
-    <w:lsdException w:name="Emphasis" w:semiHidden="0" w:uiPriority="20" w:unhideWhenUsed="0" w:qFormat="1"/>
-    <w:lsdException w:name="Table Grid" w:semiHidden="0" w:uiPriority="59" w:unhideWhenUsed="0"/>
-    <w:lsdException w:name="Placeholder Text" w:unhideWhenUsed="0"/>
-    <w:lsdException w:name="No Spacing" w:semiHidden="0" w:uiPriority="1" w:unhideWhenUsed="0" w:qFormat="1"/>
-    <w:lsdException w:name="Light Shading" w:semiHidden="0" w:uiPriority="60" w:unhideWhenUsed="0"/>
-    <w:lsdException w:name="Light List" w:semiHidden="0" w:uiPriority="61" w:unhideWhenUsed="0"/>
-    <w:lsdException w:name="Light Grid" w:semiHidden="0" w:uiPriority="62" w:unhideWhenUsed="0"/>
-    <w:lsdException w:name="Medium Shading 1" w:semiHidden="0" w:uiPriority="63" w:unhideWhenUsed="0"/>
-    <w:lsdException w:name="Medium Shading 2" w:semiHidden="0" w:uiPriority="64" w:unhideWhenUsed="0"/>
-    <w:lsdException w:name="Medium List 1" w:semiHidden="0" w:uiPriority="65" w:unhideWhenUsed="0"/>
-    <w:lsdException w:name="Medium List 2" w:semiHidden="0" w:uiPriority="66" w:unhideWhenUsed="0"/>
-    <w:lsdException w:name="Medium Grid 1" w:semiHidden="0" w:uiPriority="67" w:unhideWhenUsed="0"/>
-    <w:lsdException w:name="Medium Grid 2" w:semiHidden="0" w:uiPriority="68" w:unhideWhenUsed="0"/>
-    <w:lsdException w:name="Medium Grid 3" w:semiHidden="0" w:uiPriority="69" w:unhideWhenUsed="0"/>
-    <w:lsdException w:name="Dark List" w:semiHidden="0" w:uiPriority="70" w:unhideWhenUsed="0"/>
-    <w:lsdException w:name="Colorful Shading" w:semiHidden="0" w:uiPriority="71" w:unhideWhenUsed="0"/>
-    <w:lsdException w:name="Colorful List" w:semiHidden="0" w:uiPriority="72" w:unhideWhenUsed="0"/>
-    <w:lsdException w:name="Colorful Grid" w:semiHidden="0" w:uiPriority="73" w:unhideWhenUsed="0"/>
-    <w:lsdException w:name="Light Shading Accent 1" w:semiHidden="0" w:uiPriority="60" w:unhideWhenUsed="0"/>
-    <w:lsdException w:name="Light List Accent 1" w:semiHidden="0" w:uiPriority="61" w:unhideWhenUsed="0"/>
-    <w:lsdException w:name="Light Grid Accent 1" w:semiHidden="0" w:uiPriority="62" w:unhideWhenUsed="0"/>
-    <w:lsdException w:name="Medium Shading 1 Accent 1" w:semiHidden="0" w:uiPriority="63" w:unhideWhenUsed="0"/>
-    <w:lsdException w:name="Medium Shading 2 Accent 1" w:semiHidden="0" w:uiPriority="64" w:unhideWhenUsed="0"/>
-    <w:lsdException w:name="Medium List 1 Accent 1" w:semiHidden="0" w:uiPriority="65" w:unhideWhenUsed="0"/>
-    <w:lsdException w:name="Revision" w:unhideWhenUsed="0"/>
-    <w:lsdException w:name="List Paragraph" w:semiHidden="0" w:uiPriority="34" w:unhideWhenUsed="0" w:qFormat="1"/>
-    <w:lsdException w:name="Quote" w:semiHidden="0" w:uiPriority="29" w:unhideWhenUsed="0" w:qFormat="1"/>
-    <w:lsdException w:name="Intense Quote" w:semiHidden="0" w:uiPriority="30" w:unhideWhenUsed="0" w:qFormat="1"/>
-    <w:lsdException w:name="Medium List 2 Accent 1" w:semiHidden="0" w:uiPriority="66" w:unhideWhenUsed="0"/>
-    <w:lsdException w:name="Medium Grid 1 Accent 1" w:semiHidden="0" w:uiPriority="67" w:unhideWhenUsed="0"/>
-    <w:lsdException w:name="Medium Grid 2 Accent 1" w:semiHidden="0" w:uiPriority="68" w:unhideWhenUsed="0"/>
-    <w:lsdException w:name="Medium Grid 3 Accent 1" w:semiHidden="0" w:uiPriority="69" w:unhideWhenUsed="0"/>
-    <w:lsdException w:name="Dark List Accent 1" w:semiHidden="0" w:uiPriority="70" w:unhideWhenUsed="0"/>
-    <w:lsdException w:name="Colorful Shading Accent 1" w:semiHidden="0" w:uiPriority="71" w:unhideWhenUsed="0"/>
-    <w:lsdException w:name="Colorful List Accent 1" w:semiHidden="0" w:uiPriority="72" w:unhideWhenUsed="0"/>
-    <w:lsdException w:name="Colorful Grid Accent 1" w:semiHidden="0" w:uiPriority="73" w:unhideWhenUsed="0"/>
-    <w:lsdException w:name="Light Shading Accent 2" w:semiHidden="0" w:uiPriority="60" w:unhideWhenUsed="0"/>
-    <w:lsdException w:name="Light List Accent 2" w:semiHidden="0" w:uiPriority="61" w:unhideWhenUsed="0"/>
-    <w:lsdException w:name="Light Grid Accent 2" w:semiHidden="0" w:uiPriority="62" w:unhideWhenUsed="0"/>
-    <w:lsdException w:name="Medium Shading 1 Accent 2" w:semiHidden="0" w:uiPriority="63" w:unhideWhenUsed="0"/>
-    <w:lsdException w:name="Medium Shading 2 Accent 2" w:semiHidden="0" w:uiPriority="64" w:unhideWhenUsed="0"/>
-    <w:lsdException w:name="Medium List 1 Accent 2" w:semiHidden="0" w:uiPriority="65" w:unhideWhenUsed="0"/>
-    <w:lsdException w:name="Medium List 2 Accent 2" w:semiHidden="0" w:uiPriority="66" w:unhideWhenUsed="0"/>
-    <w:lsdException w:name="Medium Grid 1 Accent 2" w:semiHidden="0" w:uiPriority="67" w:unhideWhenUsed="0"/>
-    <w:lsdException w:name="Medium Grid 2 Accent 2" w:semiHidden="0" w:uiPriority="68" w:unhideWhenUsed="0"/>
-    <w:lsdException w:name="Medium Grid 3 Accent 2" w:semiHidden="0" w:uiPriority="69" w:unhideWhenUsed="0"/>
-    <w:lsdException w:name="Dark List Accent 2" w:semiHidden="0" w:uiPriority="70" w:unhideWhenUsed="0"/>
-    <w:lsdException w:name="Colorful Shading Accent 2" w:semiHidden="0" w:uiPriority="71" w:unhideWhenUsed="0"/>
-    <w:lsdException w:name="Colorful List Accent 2" w:semiHidden="0" w:uiPriority="72" w:unhideWhenUsed="0"/>
-    <w:lsdException w:name="Colorful Grid Accent 2" w:semiHidden="0" w:uiPriority="73" w:unhideWhenUsed="0"/>
-    <w:lsdException w:name="Light Shading Accent 3" w:semiHidden="0" w:uiPriority="60" w:unhideWhenUsed="0"/>
-    <w:lsdException w:name="Light List Accent 3" w:semiHidden="0" w:uiPriority="61" w:unhideWhenUsed="0"/>
-    <w:lsdException w:name="Light Grid Accent 3" w:semiHidden="0" w:uiPriority="62" w:unhideWhenUsed="0"/>
-    <w:lsdException w:name="Medium Shading 1 Accent 3" w:semiHidden="0" w:uiPriority="63" w:unhideWhenUsed="0"/>
-    <w:lsdException w:name="Medium Shading 2 Accent 3" w:semiHidden="0" w:uiPriority="64" w:unhideWhenUsed="0"/>
-    <w:lsdException w:name="Medium List 1 Accent 3" w:semiHidden="0" w:uiPriority="65" w:unhideWhenUsed="0"/>
-    <w:lsdException w:name="Medium List 2 Accent 3" w:semiHidden="0" w:uiPriority="66" w:unhideWhenUsed="0"/>
-    <w:lsdException w:name="Medium Grid 1 Accent 3" w:semiHidden="0" w:uiPriority="67" w:unhideWhenUsed="0"/>
-    <w:lsdException w:name="Medium Grid 2 Accent 3" w:semiHidden="0" w:uiPriority="68" w:unhideWhenUsed="0"/>
-    <w:lsdException w:name="Medium Grid 3 Accent 3" w:semiHidden="0" w:uiPriority="69" w:unhideWhenUsed="0"/>
-    <w:lsdException w:name="Dark List Accent 3" w:semiHidden="0" w:uiPriority="70" w:unhideWhenUsed="0"/>
-    <w:lsdException w:name="Colorful Shading Accent 3" w:semiHidden="0" w:uiPriority="71" w:unhideWhenUsed="0"/>
-    <w:lsdException w:name="Colorful List Accent 3" w:semiHidden="0" w:uiPriority="72" w:unhideWhenUsed="0"/>
-    <w:lsdException w:name="Colorful Grid Accent 3" w:semiHidden="0" w:uiPriority="73" w:unhideWhenUsed="0"/>
-    <w:lsdException w:name="Light Shading Accent 4" w:semiHidden="0" w:uiPriority="60" w:unhideWhenUsed="0"/>
-    <w:lsdException w:name="Light List Accent 4" w:semiHidden="0" w:uiPriority="61" w:unhideWhenUsed="0"/>
-    <w:lsdException w:name="Light Grid Accent 4" w:semiHidden="0" w:uiPriority="62" w:unhideWhenUsed="0"/>
-    <w:lsdException w:name="Medium Shading 1 Accent 4" w:semiHidden="0" w:uiPriority="63" w:unhideWhenUsed="0"/>
-    <w:lsdException w:name="Medium Shading 2 Accent 4" w:semiHidden="0" w:uiPriority="64" w:unhideWhenUsed="0"/>
-    <w:lsdException w:name="Medium List 1 Accent 4" w:semiHidden="0" w:uiPriority="65" w:unhideWhenUsed="0"/>
-    <w:lsdException w:name="Medium List 2 Accent 4" w:semiHidden="0" w:uiPriority="66" w:unhideWhenUsed="0"/>
-    <w:lsdException w:name="Medium Grid 1 Accent 4" w:semiHidden="0" w:uiPriority="67" w:unhideWhenUsed="0"/>
-    <w:lsdException w:name="Medium Grid 2 Accent 4" w:semiHidden="0" w:uiPriority="68" w:unhideWhenUsed="0"/>
-    <w:lsdException w:name="Medium Grid 3 Accent 4" w:semiHidden="0" w:uiPriority="69" w:unhideWhenUsed="0"/>
-    <w:lsdException w:name="Dark List Accent 4" w:semiHidden="0" w:uiPriority="70" w:unhideWhenUsed="0"/>
-    <w:lsdException w:name="Colorful Shading Accent 4" w:semiHidden="0" w:uiPriority="71" w:unhideWhenUsed="0"/>
-    <w:lsdException w:name="Colorful List Accent 4" w:semiHidden="0" w:uiPriority="72" w:unhideWhenUsed="0"/>
-    <w:lsdException w:name="Colorful Grid Accent 4" w:semiHidden="0" w:uiPriority="73" w:unhideWhenUsed="0"/>
-    <w:lsdException w:name="Light Shading Accent 5" w:semiHidden="0" w:uiPriority="60" w:unhideWhenUsed="0"/>
-    <w:lsdException w:name="Light List Accent 5" w:semiHidden="0" w:uiPriority="61" w:unhideWhenUsed="0"/>
-    <w:lsdException w:name="Light Grid Accent 5" w:semiHidden="0" w:uiPriority="62" w:unhideWhenUsed="0"/>
-    <w:lsdException w:name="Medium Shading 1 Accent 5" w:semiHidden="0" w:uiPriority="63" w:unhideWhenUsed="0"/>
-    <w:lsdException w:name="Medium Shading 2 Accent 5" w:semiHidden="0" w:uiPriority="64" w:unhideWhenUsed="0"/>
-    <w:lsdException w:name="Medium List 1 Accent 5" w:semiHidden="0" w:uiPriority="65" w:unhideWhenUsed="0"/>
-    <w:lsdException w:name="Medium List 2 Accent 5" w:semiHidden="0" w:uiPriority="66" w:unhideWhenUsed="0"/>
-    <w:lsdException w:name="Medium Grid 1 Accent 5" w:semiHidden="0" w:uiPriority="67" w:unhideWhenUsed="0"/>
-    <w:lsdException w:name="Medium Grid 2 Accent 5" w:semiHidden="0" w:uiPriority="68" w:unhideWhenUsed="0"/>
-    <w:lsdException w:name="Medium Grid 3 Accent 5" w:semiHidden="0" w:uiPriority="69" w:unhideWhenUsed="0"/>
-    <w:lsdException w:name="Dark List Accent 5" w:semiHidden="0" w:uiPriority="70" w:unhideWhenUsed="0"/>
-    <w:lsdException w:name="Colorful Shading Accent 5" w:semiHidden="0" w:uiPriority="71" w:unhideWhenUsed="0"/>
-    <w:lsdException w:name="Colorful List Accent 5" w:semiHidden="0" w:uiPriority="72" w:unhideWhenUsed="0"/>
-    <w:lsdException w:name="Colorful Grid Accent 5" w:semiHidden="0" w:uiPriority="73" w:unhideWhenUsed="0"/>
-    <w:lsdException w:name="Light Shading Accent 6" w:semiHidden="0" w:uiPriority="60" w:unhideWhenUsed="0"/>
-    <w:lsdException w:name="Light List Accent 6" w:semiHidden="0" w:uiPriority="61" w:unhideWhenUsed="0"/>
-    <w:lsdException w:name="Light Grid Accent 6" w:semiHidden="0" w:uiPriority="62" w:unhideWhenUsed="0"/>
-    <w:lsdException w:name="Medium Shading 1 Accent 6" w:semiHidden="0" w:uiPriority="63" w:unhideWhenUsed="0"/>
-    <w:lsdException w:name="Medium Shading 2 Accent 6" w:semiHidden="0" w:uiPriority="64" w:unhideWhenUsed="0"/>
-    <w:lsdException w:name="Medium List 1 Accent 6" w:semiHidden="0" w:uiPriority="65" w:unhideWhenUsed="0"/>
-    <w:lsdException w:name="Medium List 2 Accent 6" w:semiHidden="0" w:uiPriority="66" w:unhideWhenUsed="0"/>
-    <w:lsdException w:name="Medium Grid 1 Accent 6" w:semiHidden="0" w:uiPriority="67" w:unhideWhenUsed="0"/>
-    <w:lsdException w:name="Medium Grid 2 Accent 6" w:semiHidden="0" w:uiPriority="68" w:unhideWhenUsed="0"/>
-    <w:lsdException w:name="Medium Grid 3 Accent 6" w:semiHidden="0" w:uiPriority="69" w:unhideWhenUsed="0"/>
-    <w:lsdException w:name="Dark List Accent 6" w:semiHidden="0" w:uiPriority="70" w:unhideWhenUsed="0"/>
-    <w:lsdException w:name="Colorful Shading Accent 6" w:semiHidden="0" w:uiPriority="71" w:unhideWhenUsed="0"/>
-    <w:lsdException w:name="Colorful List Accent 6" w:semiHidden="0" w:uiPriority="72" w:unhideWhenUsed="0"/>
-    <w:lsdException w:name="Colorful Grid Accent 6" w:semiHidden="0" w:uiPriority="73" w:unhideWhenUsed="0"/>
-    <w:lsdException w:name="Subtle Emphasis" w:semiHidden="0" w:uiPriority="19" w:unhideWhenUsed="0" w:qFormat="1"/>
-    <w:lsdException w:name="Intense Emphasis" w:semiHidden="0" w:uiPriority="21" w:unhideWhenUsed="0" w:qFormat="1"/>
-    <w:lsdException w:name="Subtle Reference" w:semiHidden="0" w:uiPriority="31" w:unhideWhenUsed="0" w:qFormat="1"/>
-    <w:lsdException w:name="Intense Reference" w:semiHidden="0" w:uiPriority="32" w:unhideWhenUsed="0" w:qFormat="1"/>
-    <w:lsdException w:name="Book Title" w:semiHidden="0" w:uiPriority="33" w:unhideWhenUsed="0" w:qFormat="1"/>
-    <w:lsdException w:name="Bibliography" w:uiPriority="37"/>
-    <w:lsdException w:name="TOC Heading" w:uiPriority="39" w:qFormat="1"/>
-  </w:latentStyles>
-  <w:style w:type="paragraph" w:default="1" w:styleId="Normal">
-    <w:name w:val="Normal"/>
-  </w:style>
-  <w:style w:type="paragraph" w:styleId="Ttulo1">
-    <w:name w:val="heading 1"/>
-    <w:basedOn w:val="Normal"/>
-    <w:next w:val="Normal"/>
-    <w:pPr>
-      <w:keepNext/>
-      <w:keepLines/>
-      <w:ind w:right="-607"/>
-      <w:outlineLvl w:val="0"/>
-    </w:pPr>
-    <w:rPr>
-      <w:rFonts w:ascii="Economica" w:eastAsia="Economica" w:hAnsi="Economica" w:cs="Economica"/>
-      <w:sz w:val="28"/>
-      <w:szCs w:val="28"/>
-    </w:rPr>
-  </w:style>
-  <w:style w:type="paragraph" w:styleId="Ttulo2">
-    <w:name w:val="heading 2"/>
-    <w:basedOn w:val="Normal"/>
-    <w:next w:val="Normal"/>
-    <w:link w:val="Ttulo2Car"/>
-    <w:pPr>
-      <w:keepNext/>
-      <w:keepLines/>
-      <w:outlineLvl w:val="1"/>
-    </w:pPr>
-    <w:rPr>
-      <w:rFonts w:ascii="Open Sans ExtraBold" w:eastAsia="Open Sans ExtraBold" w:hAnsi="Open Sans ExtraBold" w:cs="Open Sans ExtraBold"/>
-      <w:color w:val="FFAA00"/>
-      <w:sz w:val="20"/>
-      <w:szCs w:val="20"/>
-    </w:rPr>
-  </w:style>
-  <w:style w:type="paragraph" w:styleId="Ttulo3">
-    <w:name w:val="heading 3"/>
-    <w:basedOn w:val="Normal"/>
-    <w:next w:val="Normal"/>
-    <w:pPr>
-      <w:keepNext/>
-      <w:keepLines/>
-      <w:spacing w:before="320" w:after="80"/>
-      <w:outlineLvl w:val="2"/>
-    </w:pPr>
-    <w:rPr>
-      <w:color w:val="434343"/>
-      <w:sz w:val="28"/>
-      <w:szCs w:val="28"/>
-    </w:rPr>
-  </w:style>
-  <w:style w:type="paragraph" w:styleId="Ttulo4">
-    <w:name w:val="heading 4"/>
-    <w:basedOn w:val="Normal"/>
-    <w:next w:val="Normal"/>
-    <w:pPr>
-      <w:keepNext/>
-      <w:keepLines/>
-      <w:spacing w:before="280" w:after="80"/>
-      <w:outlineLvl w:val="3"/>
-    </w:pPr>
-    <w:rPr>
-      <w:color w:val="666666"/>
-    </w:rPr>
-  </w:style>
-  <w:style w:type="paragraph" w:styleId="Ttulo5">
-    <w:name w:val="heading 5"/>
-    <w:basedOn w:val="Normal"/>
-    <w:next w:val="Normal"/>
-    <w:pPr>
-      <w:keepNext/>
-      <w:keepLines/>
-      <w:spacing w:before="240" w:after="80"/>
-      <w:outlineLvl w:val="4"/>
-    </w:pPr>
-    <w:rPr>
-      <w:color w:val="666666"/>
-      <w:sz w:val="22"/>
-      <w:szCs w:val="22"/>
-    </w:rPr>
-  </w:style>
-  <w:style w:type="paragraph" w:styleId="Ttulo6">
-    <w:name w:val="heading 6"/>
-    <w:basedOn w:val="Normal"/>
-    <w:next w:val="Normal"/>
-    <w:pPr>
-      <w:keepNext/>
-      <w:keepLines/>
-      <w:spacing w:before="240" w:after="80"/>
-      <w:outlineLvl w:val="5"/>
-    </w:pPr>
-    <w:rPr>
-      <w:i/>
-      <w:iCs/>
-      <w:color w:val="666666"/>
-      <w:sz w:val="22"/>
-      <w:szCs w:val="22"/>
-    </w:rPr>
-  </w:style>
-  <w:style w:type="character" w:default="1" w:styleId="Fuentedeprrafopredeter">
-    <w:name w:val="Default Paragraph Font"/>
-    <w:uiPriority w:val="1"/>
-    <w:semiHidden/>
-    <w:unhideWhenUsed/>
-  </w:style>
-  <w:style w:type="table" w:default="1" w:styleId="Tablanormal">
-    <w:name w:val="Normal Table"/>
-    <w:uiPriority w:val="99"/>
-    <w:semiHidden/>
-    <w:unhideWhenUsed/>
-    <w:tblPr>
-      <w:tblInd w:w="0" w:type="dxa"/>
-      <w:tblCellMar>
-        <w:top w:w="0" w:type="dxa"/>
-        <w:left w:w="108" w:type="dxa"/>
-        <w:bottom w:w="0" w:type="dxa"/>
-        <w:right w:w="108" w:type="dxa"/>
-      </w:tblCellMar>
-    </w:tblPr>
-  </w:style>
-  <w:style w:type="numbering" w:default="1" w:styleId="Sinlista">
-    <w:name w:val="No List"/>
-    <w:uiPriority w:val="99"/>
-    <w:semiHidden/>
-    <w:unhideWhenUsed/>
-  </w:style>
-  <w:style w:type="table" w:customStyle="1" w:styleId="TableNormal">
-    <w:name w:val="TableNormal"/>
-    <w:tblPr>
-      <w:tblCellMar>
-        <w:top w:w="100" w:type="dxa"/>
-        <w:left w:w="100" w:type="dxa"/>
-        <w:bottom w:w="100" w:type="dxa"/>
-        <w:right w:w="100" w:type="dxa"/>
-      </w:tblCellMar>
-    </w:tblPr>
-  </w:style>
-  <w:style w:type="paragraph" w:styleId="Ttulo">
+  <w:style w:type="paragraph" w:styleId="Puesto">
     <w:name w:val="Title"/>
     <w:basedOn w:val="Normal"/>
     <w:next w:val="Normal"/>

</xml_diff>

<commit_message>
Agregación de la lista de casos de uso del sistema y definición de sus objetivos
</commit_message>
<xml_diff>
--- a/TPI Análisis de sistemas.docx
+++ b/TPI Análisis de sistemas.docx
@@ -1,6 +1,6 @@
 
 <file path=word/document.xml><?xml version="1.0" encoding="utf-8"?>
-<w:document xmlns:wpc="http://schemas.microsoft.com/office/word/2010/wordprocessingCanvas" xmlns:mc="http://schemas.openxmlformats.org/markup-compatibility/2006" xmlns:o="urn:schemas-microsoft-com:office:office" xmlns:r="http://schemas.openxmlformats.org/officeDocument/2006/relationships" xmlns:m="http://schemas.openxmlformats.org/officeDocument/2006/math" xmlns:v="urn:schemas-microsoft-com:vml" xmlns:wp14="http://schemas.microsoft.com/office/word/2010/wordprocessingDrawing" xmlns:wp="http://schemas.openxmlformats.org/drawingml/2006/wordprocessingDrawing" xmlns:w10="urn:schemas-microsoft-com:office:word" xmlns:w="http://schemas.openxmlformats.org/wordprocessingml/2006/main" xmlns:w14="http://schemas.microsoft.com/office/word/2010/wordml" xmlns:w15="http://schemas.microsoft.com/office/word/2012/wordml" xmlns:wpg="http://schemas.microsoft.com/office/word/2010/wordprocessingGroup" xmlns:wpi="http://schemas.microsoft.com/office/word/2010/wordprocessingInk" xmlns:wne="http://schemas.microsoft.com/office/word/2006/wordml" xmlns:wps="http://schemas.microsoft.com/office/word/2010/wordprocessingShape" mc:Ignorable="w14 w15 wp14">
+<w:document xmlns:wpc="http://schemas.microsoft.com/office/word/2010/wordprocessingCanvas" xmlns:cx="http://schemas.microsoft.com/office/drawing/2014/chartex" xmlns:cx1="http://schemas.microsoft.com/office/drawing/2015/9/8/chartex" xmlns:cx2="http://schemas.microsoft.com/office/drawing/2015/10/21/chartex" xmlns:cx3="http://schemas.microsoft.com/office/drawing/2016/5/9/chartex" xmlns:cx4="http://schemas.microsoft.com/office/drawing/2016/5/10/chartex" xmlns:cx5="http://schemas.microsoft.com/office/drawing/2016/5/11/chartex" xmlns:cx6="http://schemas.microsoft.com/office/drawing/2016/5/12/chartex" xmlns:cx7="http://schemas.microsoft.com/office/drawing/2016/5/13/chartex" xmlns:cx8="http://schemas.microsoft.com/office/drawing/2016/5/14/chartex" xmlns:mc="http://schemas.openxmlformats.org/markup-compatibility/2006" xmlns:aink="http://schemas.microsoft.com/office/drawing/2016/ink" xmlns:am3d="http://schemas.microsoft.com/office/drawing/2017/model3d" xmlns:o="urn:schemas-microsoft-com:office:office" xmlns:oel="http://schemas.microsoft.com/office/2019/extlst" xmlns:r="http://schemas.openxmlformats.org/officeDocument/2006/relationships" xmlns:m="http://schemas.openxmlformats.org/officeDocument/2006/math" xmlns:v="urn:schemas-microsoft-com:vml" xmlns:wp14="http://schemas.microsoft.com/office/word/2010/wordprocessingDrawing" xmlns:wp="http://schemas.openxmlformats.org/drawingml/2006/wordprocessingDrawing" xmlns:w10="urn:schemas-microsoft-com:office:word" xmlns:w="http://schemas.openxmlformats.org/wordprocessingml/2006/main" xmlns:w14="http://schemas.microsoft.com/office/word/2010/wordml" xmlns:w15="http://schemas.microsoft.com/office/word/2012/wordml" xmlns:w16cex="http://schemas.microsoft.com/office/word/2018/wordml/cex" xmlns:w16cid="http://schemas.microsoft.com/office/word/2016/wordml/cid" xmlns:w16="http://schemas.microsoft.com/office/word/2018/wordml" xmlns:w16du="http://schemas.microsoft.com/office/word/2023/wordml/word16du" xmlns:w16sdtdh="http://schemas.microsoft.com/office/word/2020/wordml/sdtdatahash" xmlns:w16sdtfl="http://schemas.microsoft.com/office/word/2024/wordml/sdtformatlock" xmlns:w16se="http://schemas.microsoft.com/office/word/2015/wordml/symex" xmlns:wpg="http://schemas.microsoft.com/office/word/2010/wordprocessingGroup" xmlns:wpi="http://schemas.microsoft.com/office/word/2010/wordprocessingInk" xmlns:wne="http://schemas.microsoft.com/office/word/2006/wordml" xmlns:wps="http://schemas.microsoft.com/office/word/2010/wordprocessingShape" mc:Ignorable="w14 w15 w16se w16cid w16 w16cex w16sdtdh w16sdtfl w16du wp14">
   <w:body>
     <w:p>
       <w:pPr>
@@ -167,15 +167,31 @@
       </w:r>
       <w:proofErr w:type="spellEnd"/>
       <w:r>
-        <w:t xml:space="preserve"> que agenda un </w:t>
+        <w:t xml:space="preserve"> </w:t>
       </w:r>
       <w:proofErr w:type="spellStart"/>
       <w:r>
+        <w:t>que</w:t>
+      </w:r>
+      <w:proofErr w:type="spellEnd"/>
+      <w:r>
+        <w:t xml:space="preserve"> agenda un </w:t>
+      </w:r>
+      <w:proofErr w:type="spellStart"/>
+      <w:r>
         <w:t>retiro</w:t>
       </w:r>
       <w:proofErr w:type="spellEnd"/>
       <w:r>
-        <w:t xml:space="preserve"> hasta que lo </w:t>
+        <w:t xml:space="preserve"> hasta </w:t>
+      </w:r>
+      <w:proofErr w:type="spellStart"/>
+      <w:r>
+        <w:t>que</w:t>
+      </w:r>
+      <w:proofErr w:type="spellEnd"/>
+      <w:r>
+        <w:t xml:space="preserve"> lo </w:t>
       </w:r>
       <w:proofErr w:type="spellStart"/>
       <w:r>
@@ -199,13 +215,8 @@
           <w:szCs w:val="20"/>
         </w:rPr>
       </w:pPr>
-      <w:proofErr w:type="spellStart"/>
-      <w:r>
-        <w:t>Lista</w:t>
-      </w:r>
-      <w:proofErr w:type="spellEnd"/>
-      <w:r>
-        <w:t xml:space="preserve"> de </w:t>
+      <w:r>
+        <w:t xml:space="preserve">Lista de </w:t>
       </w:r>
       <w:proofErr w:type="spellStart"/>
       <w:r>
@@ -290,10 +301,7 @@
         </w:rPr>
       </w:pPr>
       <w:r>
-        <w:t>CONSIGNAS TERCERA</w:t>
-      </w:r>
-      <w:r>
-        <w:t> ENTREGA</w:t>
+        <w:t>CONSIGNAS TERCERA ENTREGA</w:t>
       </w:r>
     </w:p>
     <w:p>
@@ -627,19 +635,11 @@
           <w:lang w:val="es-ES"/>
         </w:rPr>
       </w:pPr>
-      <w:proofErr w:type="spellStart"/>
       <w:r>
         <w:rPr>
           <w:lang w:val="es-ES"/>
         </w:rPr>
-        <w:t>Ludueña</w:t>
-      </w:r>
-      <w:proofErr w:type="spellEnd"/>
-      <w:r>
-        <w:rPr>
-          <w:lang w:val="es-ES"/>
-        </w:rPr>
-        <w:t>, Sofía Milagros</w:t>
+        <w:t>Ludueña, Sofía Milagros</w:t>
       </w:r>
     </w:p>
     <w:p>
@@ -784,21 +784,7 @@
         <w:rPr>
           <w:lang w:val="es-ES"/>
         </w:rPr>
-        <w:t xml:space="preserve"> </w:t>
-      </w:r>
-      <w:proofErr w:type="spellStart"/>
-      <w:r>
-        <w:rPr>
-          <w:lang w:val="es-ES"/>
-        </w:rPr>
-        <w:t>Toranzo</w:t>
-      </w:r>
-      <w:proofErr w:type="spellEnd"/>
-      <w:r>
-        <w:rPr>
-          <w:lang w:val="es-ES"/>
-        </w:rPr>
-        <w:t>, Lisandro </w:t>
+        <w:t xml:space="preserve"> Toranzo, Lisandro </w:t>
       </w:r>
     </w:p>
     <w:p>
@@ -2237,7 +2223,7 @@
             <v:path o:extrusionok="f" gradientshapeok="t" o:connecttype="rect"/>
             <o:lock v:ext="edit" aspectratio="t"/>
           </v:shapetype>
-          <v:shape id="_x0000_i1025" type="#_x0000_t75" style="width:468pt;height:495.75pt">
+          <v:shape id="_x0000_i1025" type="#_x0000_t75" style="width:468pt;height:496.2pt">
             <v:imagedata r:id="rId10" o:title="Retiros"/>
           </v:shape>
         </w:pict>
@@ -2286,6 +2272,1858 @@
         <w:t>LISTA DE CASOS DE USO Y OBJETIVOS</w:t>
       </w:r>
     </w:p>
+    <w:tbl>
+      <w:tblPr>
+        <w:tblW w:w="10490" w:type="dxa"/>
+        <w:tblInd w:w="-467" w:type="dxa"/>
+        <w:tblCellMar>
+          <w:top w:w="15" w:type="dxa"/>
+          <w:left w:w="15" w:type="dxa"/>
+          <w:bottom w:w="15" w:type="dxa"/>
+          <w:right w:w="15" w:type="dxa"/>
+        </w:tblCellMar>
+        <w:tblLook w:val="04A0" w:firstRow="1" w:lastRow="0" w:firstColumn="1" w:lastColumn="0" w:noHBand="0" w:noVBand="1"/>
+      </w:tblPr>
+      <w:tblGrid>
+        <w:gridCol w:w="993"/>
+        <w:gridCol w:w="2693"/>
+        <w:gridCol w:w="6804"/>
+      </w:tblGrid>
+      <w:tr>
+        <w:tc>
+          <w:tcPr>
+            <w:tcW w:w="993" w:type="dxa"/>
+            <w:tcBorders>
+              <w:top w:val="single" w:sz="8" w:space="0" w:color="000000"/>
+              <w:left w:val="single" w:sz="8" w:space="0" w:color="000000"/>
+              <w:bottom w:val="single" w:sz="8" w:space="0" w:color="000000"/>
+              <w:right w:val="single" w:sz="8" w:space="0" w:color="000000"/>
+            </w:tcBorders>
+            <w:tcMar>
+              <w:top w:w="100" w:type="dxa"/>
+              <w:left w:w="100" w:type="dxa"/>
+              <w:bottom w:w="100" w:type="dxa"/>
+              <w:right w:w="100" w:type="dxa"/>
+            </w:tcMar>
+            <w:hideMark/>
+          </w:tcPr>
+          <w:p>
+            <w:pPr>
+              <w:ind w:left="0"/>
+              <w:rPr>
+                <w:lang w:val="es-ES"/>
+              </w:rPr>
+            </w:pPr>
+            <w:r>
+              <w:rPr>
+                <w:b/>
+                <w:bCs/>
+                <w:lang w:val="es-ES"/>
+              </w:rPr>
+              <w:t>CU</w:t>
+            </w:r>
+          </w:p>
+        </w:tc>
+        <w:tc>
+          <w:tcPr>
+            <w:tcW w:w="2693" w:type="dxa"/>
+            <w:tcBorders>
+              <w:top w:val="single" w:sz="8" w:space="0" w:color="000000"/>
+              <w:left w:val="single" w:sz="8" w:space="0" w:color="000000"/>
+              <w:bottom w:val="single" w:sz="8" w:space="0" w:color="000000"/>
+              <w:right w:val="single" w:sz="8" w:space="0" w:color="000000"/>
+            </w:tcBorders>
+            <w:tcMar>
+              <w:top w:w="100" w:type="dxa"/>
+              <w:left w:w="100" w:type="dxa"/>
+              <w:bottom w:w="100" w:type="dxa"/>
+              <w:right w:w="100" w:type="dxa"/>
+            </w:tcMar>
+            <w:hideMark/>
+          </w:tcPr>
+          <w:p>
+            <w:pPr>
+              <w:ind w:left="0"/>
+              <w:rPr>
+                <w:lang w:val="es-ES"/>
+              </w:rPr>
+            </w:pPr>
+            <w:r>
+              <w:rPr>
+                <w:b/>
+                <w:bCs/>
+                <w:lang w:val="es-ES"/>
+              </w:rPr>
+              <w:t>CASO DE USO </w:t>
+            </w:r>
+          </w:p>
+        </w:tc>
+        <w:tc>
+          <w:tcPr>
+            <w:tcW w:w="6804" w:type="dxa"/>
+            <w:tcBorders>
+              <w:top w:val="single" w:sz="8" w:space="0" w:color="000000"/>
+              <w:left w:val="single" w:sz="8" w:space="0" w:color="000000"/>
+              <w:bottom w:val="single" w:sz="8" w:space="0" w:color="000000"/>
+              <w:right w:val="single" w:sz="8" w:space="0" w:color="000000"/>
+            </w:tcBorders>
+            <w:tcMar>
+              <w:top w:w="100" w:type="dxa"/>
+              <w:left w:w="100" w:type="dxa"/>
+              <w:bottom w:w="100" w:type="dxa"/>
+              <w:right w:w="100" w:type="dxa"/>
+            </w:tcMar>
+            <w:hideMark/>
+          </w:tcPr>
+          <w:p>
+            <w:pPr>
+              <w:ind w:left="0"/>
+              <w:rPr>
+                <w:lang w:val="es-ES"/>
+              </w:rPr>
+            </w:pPr>
+            <w:r>
+              <w:rPr>
+                <w:b/>
+                <w:bCs/>
+                <w:lang w:val="es-ES"/>
+              </w:rPr>
+              <w:t>OBJETIVO</w:t>
+            </w:r>
+          </w:p>
+        </w:tc>
+      </w:tr>
+      <w:tr>
+        <w:tc>
+          <w:tcPr>
+            <w:tcW w:w="993" w:type="dxa"/>
+            <w:tcBorders>
+              <w:top w:val="single" w:sz="8" w:space="0" w:color="000000"/>
+              <w:left w:val="single" w:sz="8" w:space="0" w:color="000000"/>
+              <w:bottom w:val="single" w:sz="8" w:space="0" w:color="000000"/>
+              <w:right w:val="single" w:sz="8" w:space="0" w:color="000000"/>
+            </w:tcBorders>
+            <w:tcMar>
+              <w:top w:w="100" w:type="dxa"/>
+              <w:left w:w="100" w:type="dxa"/>
+              <w:bottom w:w="100" w:type="dxa"/>
+              <w:right w:w="100" w:type="dxa"/>
+            </w:tcMar>
+            <w:hideMark/>
+          </w:tcPr>
+          <w:p>
+            <w:pPr>
+              <w:ind w:left="0"/>
+              <w:rPr>
+                <w:lang w:val="es-ES"/>
+              </w:rPr>
+            </w:pPr>
+            <w:r>
+              <w:rPr>
+                <w:lang w:val="es-ES"/>
+              </w:rPr>
+              <w:t>CU1</w:t>
+            </w:r>
+          </w:p>
+        </w:tc>
+        <w:tc>
+          <w:tcPr>
+            <w:tcW w:w="2693" w:type="dxa"/>
+            <w:tcBorders>
+              <w:top w:val="single" w:sz="8" w:space="0" w:color="000000"/>
+              <w:left w:val="single" w:sz="8" w:space="0" w:color="000000"/>
+              <w:bottom w:val="single" w:sz="8" w:space="0" w:color="000000"/>
+              <w:right w:val="single" w:sz="8" w:space="0" w:color="000000"/>
+            </w:tcBorders>
+            <w:tcMar>
+              <w:top w:w="100" w:type="dxa"/>
+              <w:left w:w="100" w:type="dxa"/>
+              <w:bottom w:w="100" w:type="dxa"/>
+              <w:right w:w="100" w:type="dxa"/>
+            </w:tcMar>
+            <w:hideMark/>
+          </w:tcPr>
+          <w:p>
+            <w:pPr>
+              <w:ind w:left="0"/>
+              <w:rPr>
+                <w:lang w:val="es-ES"/>
+              </w:rPr>
+            </w:pPr>
+            <w:r>
+              <w:rPr>
+                <w:lang w:val="es-ES"/>
+              </w:rPr>
+              <w:t>Registrar Retiro</w:t>
+            </w:r>
+          </w:p>
+        </w:tc>
+        <w:tc>
+          <w:tcPr>
+            <w:tcW w:w="6804" w:type="dxa"/>
+            <w:tcBorders>
+              <w:top w:val="single" w:sz="8" w:space="0" w:color="000000"/>
+              <w:left w:val="single" w:sz="8" w:space="0" w:color="000000"/>
+              <w:bottom w:val="single" w:sz="8" w:space="0" w:color="000000"/>
+              <w:right w:val="single" w:sz="8" w:space="0" w:color="000000"/>
+            </w:tcBorders>
+            <w:tcMar>
+              <w:top w:w="100" w:type="dxa"/>
+              <w:left w:w="100" w:type="dxa"/>
+              <w:bottom w:w="100" w:type="dxa"/>
+              <w:right w:w="100" w:type="dxa"/>
+            </w:tcMar>
+            <w:hideMark/>
+          </w:tcPr>
+          <w:p>
+            <w:pPr>
+              <w:ind w:left="0"/>
+              <w:rPr>
+                <w:lang w:val="es-ES"/>
+              </w:rPr>
+            </w:pPr>
+            <w:r>
+              <w:rPr>
+                <w:lang w:val="es-ES"/>
+              </w:rPr>
+              <w:t xml:space="preserve">Registrar un retiro de interés para un </w:t>
+            </w:r>
+            <w:proofErr w:type="spellStart"/>
+            <w:proofErr w:type="gramStart"/>
+            <w:r>
+              <w:rPr>
+                <w:lang w:val="es-ES"/>
+              </w:rPr>
+              <w:t>usuario,para</w:t>
+            </w:r>
+            <w:proofErr w:type="spellEnd"/>
+            <w:proofErr w:type="gramEnd"/>
+            <w:r>
+              <w:rPr>
+                <w:lang w:val="es-ES"/>
+              </w:rPr>
+              <w:t xml:space="preserve"> </w:t>
+            </w:r>
+          </w:p>
+          <w:p>
+            <w:pPr>
+              <w:ind w:left="0"/>
+              <w:rPr>
+                <w:lang w:val="es-ES"/>
+              </w:rPr>
+            </w:pPr>
+            <w:r>
+              <w:rPr>
+                <w:lang w:val="es-ES"/>
+              </w:rPr>
+              <w:t>posibilitar su organización y seguimiento.</w:t>
+            </w:r>
+          </w:p>
+        </w:tc>
+      </w:tr>
+      <w:tr>
+        <w:tc>
+          <w:tcPr>
+            <w:tcW w:w="993" w:type="dxa"/>
+            <w:tcBorders>
+              <w:top w:val="single" w:sz="8" w:space="0" w:color="000000"/>
+              <w:left w:val="single" w:sz="8" w:space="0" w:color="000000"/>
+              <w:bottom w:val="single" w:sz="8" w:space="0" w:color="000000"/>
+              <w:right w:val="single" w:sz="8" w:space="0" w:color="000000"/>
+            </w:tcBorders>
+            <w:tcMar>
+              <w:top w:w="100" w:type="dxa"/>
+              <w:left w:w="100" w:type="dxa"/>
+              <w:bottom w:w="100" w:type="dxa"/>
+              <w:right w:w="100" w:type="dxa"/>
+            </w:tcMar>
+            <w:hideMark/>
+          </w:tcPr>
+          <w:p>
+            <w:pPr>
+              <w:ind w:left="0"/>
+              <w:rPr>
+                <w:lang w:val="es-ES"/>
+              </w:rPr>
+            </w:pPr>
+            <w:r>
+              <w:rPr>
+                <w:lang w:val="es-ES"/>
+              </w:rPr>
+              <w:t>CU2</w:t>
+            </w:r>
+          </w:p>
+        </w:tc>
+        <w:tc>
+          <w:tcPr>
+            <w:tcW w:w="2693" w:type="dxa"/>
+            <w:tcBorders>
+              <w:top w:val="single" w:sz="8" w:space="0" w:color="000000"/>
+              <w:left w:val="single" w:sz="8" w:space="0" w:color="000000"/>
+              <w:bottom w:val="single" w:sz="8" w:space="0" w:color="000000"/>
+              <w:right w:val="single" w:sz="8" w:space="0" w:color="000000"/>
+            </w:tcBorders>
+            <w:tcMar>
+              <w:top w:w="100" w:type="dxa"/>
+              <w:left w:w="100" w:type="dxa"/>
+              <w:bottom w:w="100" w:type="dxa"/>
+              <w:right w:w="100" w:type="dxa"/>
+            </w:tcMar>
+            <w:hideMark/>
+          </w:tcPr>
+          <w:p>
+            <w:pPr>
+              <w:ind w:left="0"/>
+              <w:rPr>
+                <w:lang w:val="es-ES"/>
+              </w:rPr>
+            </w:pPr>
+            <w:r>
+              <w:rPr>
+                <w:lang w:val="es-ES"/>
+              </w:rPr>
+              <w:t>Registrar Acompañante</w:t>
+            </w:r>
+          </w:p>
+        </w:tc>
+        <w:tc>
+          <w:tcPr>
+            <w:tcW w:w="6804" w:type="dxa"/>
+            <w:tcBorders>
+              <w:top w:val="single" w:sz="8" w:space="0" w:color="000000"/>
+              <w:left w:val="single" w:sz="8" w:space="0" w:color="000000"/>
+              <w:bottom w:val="single" w:sz="8" w:space="0" w:color="000000"/>
+              <w:right w:val="single" w:sz="8" w:space="0" w:color="000000"/>
+            </w:tcBorders>
+            <w:tcMar>
+              <w:top w:w="100" w:type="dxa"/>
+              <w:left w:w="100" w:type="dxa"/>
+              <w:bottom w:w="100" w:type="dxa"/>
+              <w:right w:w="100" w:type="dxa"/>
+            </w:tcMar>
+            <w:hideMark/>
+          </w:tcPr>
+          <w:p>
+            <w:pPr>
+              <w:ind w:left="0"/>
+              <w:rPr>
+                <w:lang w:val="es-ES"/>
+              </w:rPr>
+            </w:pPr>
+            <w:proofErr w:type="gramStart"/>
+            <w:r>
+              <w:rPr>
+                <w:lang w:val="es-ES"/>
+              </w:rPr>
+              <w:t>Registrar  la</w:t>
+            </w:r>
+            <w:proofErr w:type="gramEnd"/>
+            <w:r>
+              <w:rPr>
+                <w:lang w:val="es-ES"/>
+              </w:rPr>
+              <w:t xml:space="preserve"> persona que asistirá con el usuario a un retiro.</w:t>
+            </w:r>
+          </w:p>
+        </w:tc>
+      </w:tr>
+      <w:tr>
+        <w:tc>
+          <w:tcPr>
+            <w:tcW w:w="993" w:type="dxa"/>
+            <w:tcBorders>
+              <w:top w:val="single" w:sz="8" w:space="0" w:color="000000"/>
+              <w:left w:val="single" w:sz="8" w:space="0" w:color="000000"/>
+              <w:bottom w:val="single" w:sz="8" w:space="0" w:color="000000"/>
+              <w:right w:val="single" w:sz="8" w:space="0" w:color="000000"/>
+            </w:tcBorders>
+            <w:tcMar>
+              <w:top w:w="100" w:type="dxa"/>
+              <w:left w:w="100" w:type="dxa"/>
+              <w:bottom w:w="100" w:type="dxa"/>
+              <w:right w:w="100" w:type="dxa"/>
+            </w:tcMar>
+            <w:hideMark/>
+          </w:tcPr>
+          <w:p>
+            <w:pPr>
+              <w:ind w:left="0"/>
+              <w:rPr>
+                <w:lang w:val="es-ES"/>
+              </w:rPr>
+            </w:pPr>
+            <w:r>
+              <w:rPr>
+                <w:lang w:val="es-ES"/>
+              </w:rPr>
+              <w:t>CU3</w:t>
+            </w:r>
+          </w:p>
+        </w:tc>
+        <w:tc>
+          <w:tcPr>
+            <w:tcW w:w="2693" w:type="dxa"/>
+            <w:tcBorders>
+              <w:top w:val="single" w:sz="8" w:space="0" w:color="000000"/>
+              <w:left w:val="single" w:sz="8" w:space="0" w:color="000000"/>
+              <w:bottom w:val="single" w:sz="8" w:space="0" w:color="000000"/>
+              <w:right w:val="single" w:sz="8" w:space="0" w:color="000000"/>
+            </w:tcBorders>
+            <w:tcMar>
+              <w:top w:w="100" w:type="dxa"/>
+              <w:left w:w="100" w:type="dxa"/>
+              <w:bottom w:w="100" w:type="dxa"/>
+              <w:right w:w="100" w:type="dxa"/>
+            </w:tcMar>
+            <w:hideMark/>
+          </w:tcPr>
+          <w:p>
+            <w:pPr>
+              <w:ind w:left="0"/>
+              <w:rPr>
+                <w:lang w:val="es-ES"/>
+              </w:rPr>
+            </w:pPr>
+            <w:r>
+              <w:rPr>
+                <w:lang w:val="es-ES"/>
+              </w:rPr>
+              <w:t>Registrar Organizador </w:t>
+            </w:r>
+          </w:p>
+        </w:tc>
+        <w:tc>
+          <w:tcPr>
+            <w:tcW w:w="6804" w:type="dxa"/>
+            <w:tcBorders>
+              <w:top w:val="single" w:sz="8" w:space="0" w:color="000000"/>
+              <w:left w:val="single" w:sz="8" w:space="0" w:color="000000"/>
+              <w:bottom w:val="single" w:sz="8" w:space="0" w:color="000000"/>
+              <w:right w:val="single" w:sz="8" w:space="0" w:color="000000"/>
+            </w:tcBorders>
+            <w:tcMar>
+              <w:top w:w="100" w:type="dxa"/>
+              <w:left w:w="100" w:type="dxa"/>
+              <w:bottom w:w="100" w:type="dxa"/>
+              <w:right w:w="100" w:type="dxa"/>
+            </w:tcMar>
+            <w:hideMark/>
+          </w:tcPr>
+          <w:p>
+            <w:pPr>
+              <w:ind w:left="0"/>
+              <w:rPr>
+                <w:lang w:val="es-ES"/>
+              </w:rPr>
+            </w:pPr>
+            <w:r>
+              <w:rPr>
+                <w:lang w:val="es-ES"/>
+              </w:rPr>
+              <w:t xml:space="preserve">registrar el organizador con quién el usuario se contactó </w:t>
+            </w:r>
+          </w:p>
+          <w:p>
+            <w:pPr>
+              <w:ind w:left="0"/>
+              <w:rPr>
+                <w:lang w:val="es-ES"/>
+              </w:rPr>
+            </w:pPr>
+            <w:r>
+              <w:rPr>
+                <w:lang w:val="es-ES"/>
+              </w:rPr>
+              <w:t>por un retiro para identificar a quién consultar o responder.</w:t>
+            </w:r>
+          </w:p>
+        </w:tc>
+      </w:tr>
+      <w:tr>
+        <w:tc>
+          <w:tcPr>
+            <w:tcW w:w="993" w:type="dxa"/>
+            <w:tcBorders>
+              <w:top w:val="single" w:sz="8" w:space="0" w:color="000000"/>
+              <w:left w:val="single" w:sz="8" w:space="0" w:color="000000"/>
+              <w:bottom w:val="single" w:sz="8" w:space="0" w:color="000000"/>
+              <w:right w:val="single" w:sz="8" w:space="0" w:color="000000"/>
+            </w:tcBorders>
+            <w:tcMar>
+              <w:top w:w="100" w:type="dxa"/>
+              <w:left w:w="100" w:type="dxa"/>
+              <w:bottom w:w="100" w:type="dxa"/>
+              <w:right w:w="100" w:type="dxa"/>
+            </w:tcMar>
+            <w:hideMark/>
+          </w:tcPr>
+          <w:p>
+            <w:pPr>
+              <w:ind w:left="0"/>
+              <w:rPr>
+                <w:lang w:val="es-ES"/>
+              </w:rPr>
+            </w:pPr>
+            <w:r>
+              <w:rPr>
+                <w:lang w:val="es-ES"/>
+              </w:rPr>
+              <w:t>CU4</w:t>
+            </w:r>
+          </w:p>
+        </w:tc>
+        <w:tc>
+          <w:tcPr>
+            <w:tcW w:w="2693" w:type="dxa"/>
+            <w:tcBorders>
+              <w:top w:val="single" w:sz="8" w:space="0" w:color="000000"/>
+              <w:left w:val="single" w:sz="8" w:space="0" w:color="000000"/>
+              <w:bottom w:val="single" w:sz="8" w:space="0" w:color="000000"/>
+              <w:right w:val="single" w:sz="8" w:space="0" w:color="000000"/>
+            </w:tcBorders>
+            <w:tcMar>
+              <w:top w:w="100" w:type="dxa"/>
+              <w:left w:w="100" w:type="dxa"/>
+              <w:bottom w:w="100" w:type="dxa"/>
+              <w:right w:w="100" w:type="dxa"/>
+            </w:tcMar>
+            <w:hideMark/>
+          </w:tcPr>
+          <w:p>
+            <w:pPr>
+              <w:ind w:left="0"/>
+              <w:rPr>
+                <w:lang w:val="es-ES"/>
+              </w:rPr>
+            </w:pPr>
+            <w:r>
+              <w:rPr>
+                <w:lang w:val="es-ES"/>
+              </w:rPr>
+              <w:t>Registrar Temática </w:t>
+            </w:r>
+          </w:p>
+        </w:tc>
+        <w:tc>
+          <w:tcPr>
+            <w:tcW w:w="6804" w:type="dxa"/>
+            <w:tcBorders>
+              <w:top w:val="single" w:sz="8" w:space="0" w:color="000000"/>
+              <w:left w:val="single" w:sz="8" w:space="0" w:color="000000"/>
+              <w:bottom w:val="single" w:sz="8" w:space="0" w:color="000000"/>
+              <w:right w:val="single" w:sz="8" w:space="0" w:color="000000"/>
+            </w:tcBorders>
+            <w:tcMar>
+              <w:top w:w="100" w:type="dxa"/>
+              <w:left w:w="100" w:type="dxa"/>
+              <w:bottom w:w="100" w:type="dxa"/>
+              <w:right w:w="100" w:type="dxa"/>
+            </w:tcMar>
+            <w:hideMark/>
+          </w:tcPr>
+          <w:p>
+            <w:pPr>
+              <w:ind w:left="0"/>
+              <w:rPr>
+                <w:lang w:val="es-ES"/>
+              </w:rPr>
+            </w:pPr>
+            <w:r>
+              <w:rPr>
+                <w:lang w:val="es-ES"/>
+              </w:rPr>
+              <w:t>Registrar la temática de un retiro para posibilitar</w:t>
+            </w:r>
+          </w:p>
+          <w:p>
+            <w:pPr>
+              <w:ind w:left="0"/>
+              <w:rPr>
+                <w:lang w:val="es-ES"/>
+              </w:rPr>
+            </w:pPr>
+            <w:r>
+              <w:rPr>
+                <w:lang w:val="es-ES"/>
+              </w:rPr>
+              <w:t xml:space="preserve"> su clasificación y búsqueda.</w:t>
+            </w:r>
+          </w:p>
+        </w:tc>
+      </w:tr>
+      <w:tr>
+        <w:tc>
+          <w:tcPr>
+            <w:tcW w:w="993" w:type="dxa"/>
+            <w:tcBorders>
+              <w:top w:val="single" w:sz="8" w:space="0" w:color="000000"/>
+              <w:left w:val="single" w:sz="8" w:space="0" w:color="000000"/>
+              <w:bottom w:val="single" w:sz="8" w:space="0" w:color="000000"/>
+              <w:right w:val="single" w:sz="8" w:space="0" w:color="000000"/>
+            </w:tcBorders>
+            <w:tcMar>
+              <w:top w:w="100" w:type="dxa"/>
+              <w:left w:w="100" w:type="dxa"/>
+              <w:bottom w:w="100" w:type="dxa"/>
+              <w:right w:w="100" w:type="dxa"/>
+            </w:tcMar>
+            <w:hideMark/>
+          </w:tcPr>
+          <w:p>
+            <w:pPr>
+              <w:ind w:left="0"/>
+              <w:rPr>
+                <w:lang w:val="es-ES"/>
+              </w:rPr>
+            </w:pPr>
+            <w:r>
+              <w:rPr>
+                <w:lang w:val="es-ES"/>
+              </w:rPr>
+              <w:t>CU5</w:t>
+            </w:r>
+          </w:p>
+        </w:tc>
+        <w:tc>
+          <w:tcPr>
+            <w:tcW w:w="2693" w:type="dxa"/>
+            <w:tcBorders>
+              <w:top w:val="single" w:sz="8" w:space="0" w:color="000000"/>
+              <w:left w:val="single" w:sz="8" w:space="0" w:color="000000"/>
+              <w:bottom w:val="single" w:sz="8" w:space="0" w:color="000000"/>
+              <w:right w:val="single" w:sz="8" w:space="0" w:color="000000"/>
+            </w:tcBorders>
+            <w:tcMar>
+              <w:top w:w="100" w:type="dxa"/>
+              <w:left w:w="100" w:type="dxa"/>
+              <w:bottom w:w="100" w:type="dxa"/>
+              <w:right w:w="100" w:type="dxa"/>
+            </w:tcMar>
+            <w:hideMark/>
+          </w:tcPr>
+          <w:p>
+            <w:pPr>
+              <w:ind w:left="0"/>
+              <w:rPr>
+                <w:lang w:val="es-ES"/>
+              </w:rPr>
+            </w:pPr>
+            <w:r>
+              <w:rPr>
+                <w:lang w:val="es-ES"/>
+              </w:rPr>
+              <w:t>Registrar Actividad</w:t>
+            </w:r>
+          </w:p>
+        </w:tc>
+        <w:tc>
+          <w:tcPr>
+            <w:tcW w:w="6804" w:type="dxa"/>
+            <w:tcBorders>
+              <w:top w:val="single" w:sz="8" w:space="0" w:color="000000"/>
+              <w:left w:val="single" w:sz="8" w:space="0" w:color="000000"/>
+              <w:bottom w:val="single" w:sz="8" w:space="0" w:color="000000"/>
+              <w:right w:val="single" w:sz="8" w:space="0" w:color="000000"/>
+            </w:tcBorders>
+            <w:tcMar>
+              <w:top w:w="100" w:type="dxa"/>
+              <w:left w:w="100" w:type="dxa"/>
+              <w:bottom w:w="100" w:type="dxa"/>
+              <w:right w:w="100" w:type="dxa"/>
+            </w:tcMar>
+            <w:hideMark/>
+          </w:tcPr>
+          <w:p>
+            <w:pPr>
+              <w:ind w:left="0"/>
+              <w:rPr>
+                <w:lang w:val="es-ES"/>
+              </w:rPr>
+            </w:pPr>
+            <w:r>
+              <w:rPr>
+                <w:lang w:val="es-ES"/>
+              </w:rPr>
+              <w:t xml:space="preserve">Registrar las actividades de un retiro para conocer su </w:t>
+            </w:r>
+          </w:p>
+          <w:p>
+            <w:pPr>
+              <w:ind w:left="0"/>
+              <w:rPr>
+                <w:lang w:val="es-ES"/>
+              </w:rPr>
+            </w:pPr>
+            <w:r>
+              <w:rPr>
+                <w:lang w:val="es-ES"/>
+              </w:rPr>
+              <w:t>programa.</w:t>
+            </w:r>
+          </w:p>
+        </w:tc>
+      </w:tr>
+      <w:tr>
+        <w:tc>
+          <w:tcPr>
+            <w:tcW w:w="993" w:type="dxa"/>
+            <w:tcBorders>
+              <w:top w:val="single" w:sz="8" w:space="0" w:color="000000"/>
+              <w:left w:val="single" w:sz="8" w:space="0" w:color="000000"/>
+              <w:bottom w:val="single" w:sz="8" w:space="0" w:color="000000"/>
+              <w:right w:val="single" w:sz="8" w:space="0" w:color="000000"/>
+            </w:tcBorders>
+            <w:tcMar>
+              <w:top w:w="100" w:type="dxa"/>
+              <w:left w:w="100" w:type="dxa"/>
+              <w:bottom w:w="100" w:type="dxa"/>
+              <w:right w:w="100" w:type="dxa"/>
+            </w:tcMar>
+            <w:hideMark/>
+          </w:tcPr>
+          <w:p>
+            <w:pPr>
+              <w:ind w:left="0"/>
+              <w:rPr>
+                <w:lang w:val="es-ES"/>
+              </w:rPr>
+            </w:pPr>
+            <w:r>
+              <w:rPr>
+                <w:lang w:val="es-ES"/>
+              </w:rPr>
+              <w:t>CU6</w:t>
+            </w:r>
+          </w:p>
+        </w:tc>
+        <w:tc>
+          <w:tcPr>
+            <w:tcW w:w="2693" w:type="dxa"/>
+            <w:tcBorders>
+              <w:top w:val="single" w:sz="8" w:space="0" w:color="000000"/>
+              <w:left w:val="single" w:sz="8" w:space="0" w:color="000000"/>
+              <w:bottom w:val="single" w:sz="8" w:space="0" w:color="000000"/>
+              <w:right w:val="single" w:sz="8" w:space="0" w:color="000000"/>
+            </w:tcBorders>
+            <w:tcMar>
+              <w:top w:w="100" w:type="dxa"/>
+              <w:left w:w="100" w:type="dxa"/>
+              <w:bottom w:w="100" w:type="dxa"/>
+              <w:right w:w="100" w:type="dxa"/>
+            </w:tcMar>
+            <w:hideMark/>
+          </w:tcPr>
+          <w:p>
+            <w:pPr>
+              <w:ind w:left="0"/>
+              <w:rPr>
+                <w:lang w:val="es-ES"/>
+              </w:rPr>
+            </w:pPr>
+            <w:r>
+              <w:rPr>
+                <w:lang w:val="es-ES"/>
+              </w:rPr>
+              <w:t>Consultar Retiro</w:t>
+            </w:r>
+          </w:p>
+        </w:tc>
+        <w:tc>
+          <w:tcPr>
+            <w:tcW w:w="6804" w:type="dxa"/>
+            <w:tcBorders>
+              <w:top w:val="single" w:sz="8" w:space="0" w:color="000000"/>
+              <w:left w:val="single" w:sz="8" w:space="0" w:color="000000"/>
+              <w:bottom w:val="single" w:sz="8" w:space="0" w:color="000000"/>
+              <w:right w:val="single" w:sz="8" w:space="0" w:color="000000"/>
+            </w:tcBorders>
+            <w:tcMar>
+              <w:top w:w="100" w:type="dxa"/>
+              <w:left w:w="100" w:type="dxa"/>
+              <w:bottom w:w="100" w:type="dxa"/>
+              <w:right w:w="100" w:type="dxa"/>
+            </w:tcMar>
+            <w:hideMark/>
+          </w:tcPr>
+          <w:p>
+            <w:pPr>
+              <w:ind w:left="0"/>
+              <w:rPr>
+                <w:lang w:val="es-ES"/>
+              </w:rPr>
+            </w:pPr>
+            <w:r>
+              <w:rPr>
+                <w:lang w:val="es-ES"/>
+              </w:rPr>
+              <w:t xml:space="preserve">Consultar los datos de un retiro </w:t>
+            </w:r>
+            <w:proofErr w:type="spellStart"/>
+            <w:proofErr w:type="gramStart"/>
+            <w:r>
+              <w:rPr>
+                <w:lang w:val="es-ES"/>
+              </w:rPr>
+              <w:t>agendado,según</w:t>
+            </w:r>
+            <w:proofErr w:type="spellEnd"/>
+            <w:proofErr w:type="gramEnd"/>
+            <w:r>
+              <w:rPr>
+                <w:lang w:val="es-ES"/>
+              </w:rPr>
+              <w:t xml:space="preserve"> </w:t>
+            </w:r>
+          </w:p>
+          <w:p>
+            <w:pPr>
+              <w:ind w:left="0"/>
+              <w:rPr>
+                <w:lang w:val="es-ES"/>
+              </w:rPr>
+            </w:pPr>
+            <w:r>
+              <w:rPr>
+                <w:lang w:val="es-ES"/>
+              </w:rPr>
+              <w:t>distintos criterios para facilitar su seguimiento.</w:t>
+            </w:r>
+          </w:p>
+        </w:tc>
+      </w:tr>
+      <w:tr>
+        <w:tc>
+          <w:tcPr>
+            <w:tcW w:w="993" w:type="dxa"/>
+            <w:tcBorders>
+              <w:top w:val="single" w:sz="8" w:space="0" w:color="000000"/>
+              <w:left w:val="single" w:sz="8" w:space="0" w:color="000000"/>
+              <w:bottom w:val="single" w:sz="8" w:space="0" w:color="000000"/>
+              <w:right w:val="single" w:sz="8" w:space="0" w:color="000000"/>
+            </w:tcBorders>
+            <w:tcMar>
+              <w:top w:w="100" w:type="dxa"/>
+              <w:left w:w="100" w:type="dxa"/>
+              <w:bottom w:w="100" w:type="dxa"/>
+              <w:right w:w="100" w:type="dxa"/>
+            </w:tcMar>
+            <w:hideMark/>
+          </w:tcPr>
+          <w:p>
+            <w:pPr>
+              <w:ind w:left="0"/>
+              <w:rPr>
+                <w:lang w:val="es-ES"/>
+              </w:rPr>
+            </w:pPr>
+            <w:r>
+              <w:rPr>
+                <w:lang w:val="es-ES"/>
+              </w:rPr>
+              <w:t>CU7</w:t>
+            </w:r>
+          </w:p>
+        </w:tc>
+        <w:tc>
+          <w:tcPr>
+            <w:tcW w:w="2693" w:type="dxa"/>
+            <w:tcBorders>
+              <w:top w:val="single" w:sz="8" w:space="0" w:color="000000"/>
+              <w:left w:val="single" w:sz="8" w:space="0" w:color="000000"/>
+              <w:bottom w:val="single" w:sz="8" w:space="0" w:color="000000"/>
+              <w:right w:val="single" w:sz="8" w:space="0" w:color="000000"/>
+            </w:tcBorders>
+            <w:tcMar>
+              <w:top w:w="100" w:type="dxa"/>
+              <w:left w:w="100" w:type="dxa"/>
+              <w:bottom w:w="100" w:type="dxa"/>
+              <w:right w:w="100" w:type="dxa"/>
+            </w:tcMar>
+            <w:hideMark/>
+          </w:tcPr>
+          <w:p>
+            <w:pPr>
+              <w:ind w:left="0"/>
+              <w:rPr>
+                <w:lang w:val="es-ES"/>
+              </w:rPr>
+            </w:pPr>
+            <w:r>
+              <w:rPr>
+                <w:lang w:val="es-ES"/>
+              </w:rPr>
+              <w:t>Dar Retiro de Baja </w:t>
+            </w:r>
+          </w:p>
+        </w:tc>
+        <w:tc>
+          <w:tcPr>
+            <w:tcW w:w="6804" w:type="dxa"/>
+            <w:tcBorders>
+              <w:top w:val="single" w:sz="8" w:space="0" w:color="000000"/>
+              <w:left w:val="single" w:sz="8" w:space="0" w:color="000000"/>
+              <w:bottom w:val="single" w:sz="8" w:space="0" w:color="000000"/>
+              <w:right w:val="single" w:sz="8" w:space="0" w:color="000000"/>
+            </w:tcBorders>
+            <w:tcMar>
+              <w:top w:w="100" w:type="dxa"/>
+              <w:left w:w="100" w:type="dxa"/>
+              <w:bottom w:w="100" w:type="dxa"/>
+              <w:right w:w="100" w:type="dxa"/>
+            </w:tcMar>
+            <w:hideMark/>
+          </w:tcPr>
+          <w:p>
+            <w:pPr>
+              <w:ind w:left="0"/>
+              <w:rPr>
+                <w:lang w:val="es-ES"/>
+              </w:rPr>
+            </w:pPr>
+            <w:r>
+              <w:rPr>
+                <w:lang w:val="es-ES"/>
+              </w:rPr>
+              <w:t>Dar de baja un retiro que ya no es de interés del usuario o al que no asistirá.</w:t>
+            </w:r>
+          </w:p>
+        </w:tc>
+      </w:tr>
+      <w:tr>
+        <w:tc>
+          <w:tcPr>
+            <w:tcW w:w="993" w:type="dxa"/>
+            <w:tcBorders>
+              <w:top w:val="single" w:sz="8" w:space="0" w:color="000000"/>
+              <w:left w:val="single" w:sz="8" w:space="0" w:color="000000"/>
+              <w:bottom w:val="single" w:sz="8" w:space="0" w:color="000000"/>
+              <w:right w:val="single" w:sz="8" w:space="0" w:color="000000"/>
+            </w:tcBorders>
+            <w:tcMar>
+              <w:top w:w="100" w:type="dxa"/>
+              <w:left w:w="100" w:type="dxa"/>
+              <w:bottom w:w="100" w:type="dxa"/>
+              <w:right w:w="100" w:type="dxa"/>
+            </w:tcMar>
+            <w:hideMark/>
+          </w:tcPr>
+          <w:p>
+            <w:pPr>
+              <w:ind w:left="0"/>
+              <w:rPr>
+                <w:lang w:val="es-ES"/>
+              </w:rPr>
+            </w:pPr>
+            <w:r>
+              <w:rPr>
+                <w:lang w:val="es-ES"/>
+              </w:rPr>
+              <w:t>CU8</w:t>
+            </w:r>
+          </w:p>
+        </w:tc>
+        <w:tc>
+          <w:tcPr>
+            <w:tcW w:w="2693" w:type="dxa"/>
+            <w:tcBorders>
+              <w:top w:val="single" w:sz="8" w:space="0" w:color="000000"/>
+              <w:left w:val="single" w:sz="8" w:space="0" w:color="000000"/>
+              <w:bottom w:val="single" w:sz="8" w:space="0" w:color="000000"/>
+              <w:right w:val="single" w:sz="8" w:space="0" w:color="000000"/>
+            </w:tcBorders>
+            <w:tcMar>
+              <w:top w:w="100" w:type="dxa"/>
+              <w:left w:w="100" w:type="dxa"/>
+              <w:bottom w:w="100" w:type="dxa"/>
+              <w:right w:w="100" w:type="dxa"/>
+            </w:tcMar>
+            <w:hideMark/>
+          </w:tcPr>
+          <w:p>
+            <w:pPr>
+              <w:ind w:left="0"/>
+              <w:rPr>
+                <w:lang w:val="es-ES"/>
+              </w:rPr>
+            </w:pPr>
+            <w:r>
+              <w:rPr>
+                <w:lang w:val="es-ES"/>
+              </w:rPr>
+              <w:t>Registrar Alerta </w:t>
+            </w:r>
+          </w:p>
+        </w:tc>
+        <w:tc>
+          <w:tcPr>
+            <w:tcW w:w="6804" w:type="dxa"/>
+            <w:tcBorders>
+              <w:top w:val="single" w:sz="8" w:space="0" w:color="000000"/>
+              <w:left w:val="single" w:sz="8" w:space="0" w:color="000000"/>
+              <w:bottom w:val="single" w:sz="8" w:space="0" w:color="000000"/>
+              <w:right w:val="single" w:sz="8" w:space="0" w:color="000000"/>
+            </w:tcBorders>
+            <w:tcMar>
+              <w:top w:w="100" w:type="dxa"/>
+              <w:left w:w="100" w:type="dxa"/>
+              <w:bottom w:w="100" w:type="dxa"/>
+              <w:right w:w="100" w:type="dxa"/>
+            </w:tcMar>
+            <w:hideMark/>
+          </w:tcPr>
+          <w:p>
+            <w:pPr>
+              <w:ind w:left="0"/>
+              <w:rPr>
+                <w:lang w:val="es-ES"/>
+              </w:rPr>
+            </w:pPr>
+            <w:r>
+              <w:rPr>
+                <w:lang w:val="es-ES"/>
+              </w:rPr>
+              <w:t>Registrar la configuración de una alerta de un retiro</w:t>
+            </w:r>
+          </w:p>
+          <w:p>
+            <w:pPr>
+              <w:ind w:left="0"/>
+              <w:rPr>
+                <w:lang w:val="es-ES"/>
+              </w:rPr>
+            </w:pPr>
+            <w:r>
+              <w:rPr>
+                <w:lang w:val="es-ES"/>
+              </w:rPr>
+              <w:t xml:space="preserve"> para definir cuándo desea el usuario ser notificado.</w:t>
+            </w:r>
+          </w:p>
+        </w:tc>
+      </w:tr>
+      <w:tr>
+        <w:tc>
+          <w:tcPr>
+            <w:tcW w:w="993" w:type="dxa"/>
+            <w:tcBorders>
+              <w:top w:val="single" w:sz="8" w:space="0" w:color="000000"/>
+              <w:left w:val="single" w:sz="8" w:space="0" w:color="000000"/>
+              <w:bottom w:val="single" w:sz="8" w:space="0" w:color="000000"/>
+              <w:right w:val="single" w:sz="8" w:space="0" w:color="000000"/>
+            </w:tcBorders>
+            <w:tcMar>
+              <w:top w:w="100" w:type="dxa"/>
+              <w:left w:w="100" w:type="dxa"/>
+              <w:bottom w:w="100" w:type="dxa"/>
+              <w:right w:w="100" w:type="dxa"/>
+            </w:tcMar>
+            <w:hideMark/>
+          </w:tcPr>
+          <w:p>
+            <w:pPr>
+              <w:ind w:left="0"/>
+              <w:rPr>
+                <w:lang w:val="es-ES"/>
+              </w:rPr>
+            </w:pPr>
+            <w:r>
+              <w:rPr>
+                <w:lang w:val="es-ES"/>
+              </w:rPr>
+              <w:t>CU9</w:t>
+            </w:r>
+          </w:p>
+        </w:tc>
+        <w:tc>
+          <w:tcPr>
+            <w:tcW w:w="2693" w:type="dxa"/>
+            <w:tcBorders>
+              <w:top w:val="single" w:sz="8" w:space="0" w:color="000000"/>
+              <w:left w:val="single" w:sz="8" w:space="0" w:color="000000"/>
+              <w:bottom w:val="single" w:sz="8" w:space="0" w:color="000000"/>
+              <w:right w:val="single" w:sz="8" w:space="0" w:color="000000"/>
+            </w:tcBorders>
+            <w:tcMar>
+              <w:top w:w="100" w:type="dxa"/>
+              <w:left w:w="100" w:type="dxa"/>
+              <w:bottom w:w="100" w:type="dxa"/>
+              <w:right w:w="100" w:type="dxa"/>
+            </w:tcMar>
+            <w:hideMark/>
+          </w:tcPr>
+          <w:p>
+            <w:pPr>
+              <w:ind w:left="0"/>
+              <w:rPr>
+                <w:lang w:val="es-ES"/>
+              </w:rPr>
+            </w:pPr>
+            <w:r>
+              <w:rPr>
+                <w:lang w:val="es-ES"/>
+              </w:rPr>
+              <w:t>Registrar Valoración</w:t>
+            </w:r>
+          </w:p>
+        </w:tc>
+        <w:tc>
+          <w:tcPr>
+            <w:tcW w:w="6804" w:type="dxa"/>
+            <w:tcBorders>
+              <w:top w:val="single" w:sz="8" w:space="0" w:color="000000"/>
+              <w:left w:val="single" w:sz="8" w:space="0" w:color="000000"/>
+              <w:bottom w:val="single" w:sz="8" w:space="0" w:color="000000"/>
+              <w:right w:val="single" w:sz="8" w:space="0" w:color="000000"/>
+            </w:tcBorders>
+            <w:tcMar>
+              <w:top w:w="100" w:type="dxa"/>
+              <w:left w:w="100" w:type="dxa"/>
+              <w:bottom w:w="100" w:type="dxa"/>
+              <w:right w:w="100" w:type="dxa"/>
+            </w:tcMar>
+            <w:hideMark/>
+          </w:tcPr>
+          <w:p>
+            <w:pPr>
+              <w:ind w:left="0"/>
+              <w:rPr>
+                <w:lang w:val="es-ES"/>
+              </w:rPr>
+            </w:pPr>
+            <w:r>
+              <w:rPr>
+                <w:lang w:val="es-ES"/>
+              </w:rPr>
+              <w:t>Registrar la puntuación y/o reseña de un retiro al</w:t>
+            </w:r>
+          </w:p>
+          <w:p>
+            <w:pPr>
+              <w:ind w:left="0"/>
+              <w:rPr>
+                <w:lang w:val="es-ES"/>
+              </w:rPr>
+            </w:pPr>
+            <w:r>
+              <w:rPr>
+                <w:lang w:val="es-ES"/>
+              </w:rPr>
+              <w:lastRenderedPageBreak/>
+              <w:t xml:space="preserve"> que se asistió para contar con una referencia personal. </w:t>
+            </w:r>
+          </w:p>
+        </w:tc>
+      </w:tr>
+      <w:tr>
+        <w:tc>
+          <w:tcPr>
+            <w:tcW w:w="993" w:type="dxa"/>
+            <w:tcBorders>
+              <w:top w:val="single" w:sz="8" w:space="0" w:color="000000"/>
+              <w:left w:val="single" w:sz="8" w:space="0" w:color="000000"/>
+              <w:bottom w:val="single" w:sz="8" w:space="0" w:color="000000"/>
+              <w:right w:val="single" w:sz="8" w:space="0" w:color="000000"/>
+            </w:tcBorders>
+            <w:tcMar>
+              <w:top w:w="100" w:type="dxa"/>
+              <w:left w:w="100" w:type="dxa"/>
+              <w:bottom w:w="100" w:type="dxa"/>
+              <w:right w:w="100" w:type="dxa"/>
+            </w:tcMar>
+            <w:hideMark/>
+          </w:tcPr>
+          <w:p>
+            <w:pPr>
+              <w:ind w:left="0"/>
+              <w:rPr>
+                <w:lang w:val="es-ES"/>
+              </w:rPr>
+            </w:pPr>
+            <w:r>
+              <w:rPr>
+                <w:lang w:val="es-ES"/>
+              </w:rPr>
+              <w:lastRenderedPageBreak/>
+              <w:t>CU10</w:t>
+            </w:r>
+          </w:p>
+        </w:tc>
+        <w:tc>
+          <w:tcPr>
+            <w:tcW w:w="2693" w:type="dxa"/>
+            <w:tcBorders>
+              <w:top w:val="single" w:sz="8" w:space="0" w:color="000000"/>
+              <w:left w:val="single" w:sz="8" w:space="0" w:color="000000"/>
+              <w:bottom w:val="single" w:sz="8" w:space="0" w:color="000000"/>
+              <w:right w:val="single" w:sz="8" w:space="0" w:color="000000"/>
+            </w:tcBorders>
+            <w:tcMar>
+              <w:top w:w="100" w:type="dxa"/>
+              <w:left w:w="100" w:type="dxa"/>
+              <w:bottom w:w="100" w:type="dxa"/>
+              <w:right w:w="100" w:type="dxa"/>
+            </w:tcMar>
+            <w:hideMark/>
+          </w:tcPr>
+          <w:p>
+            <w:pPr>
+              <w:ind w:left="0"/>
+              <w:rPr>
+                <w:lang w:val="es-ES"/>
+              </w:rPr>
+            </w:pPr>
+            <w:r>
+              <w:rPr>
+                <w:lang w:val="es-ES"/>
+              </w:rPr>
+              <w:t>Registrar Pago </w:t>
+            </w:r>
+          </w:p>
+        </w:tc>
+        <w:tc>
+          <w:tcPr>
+            <w:tcW w:w="6804" w:type="dxa"/>
+            <w:tcBorders>
+              <w:top w:val="single" w:sz="8" w:space="0" w:color="000000"/>
+              <w:left w:val="single" w:sz="8" w:space="0" w:color="000000"/>
+              <w:bottom w:val="single" w:sz="8" w:space="0" w:color="000000"/>
+              <w:right w:val="single" w:sz="8" w:space="0" w:color="000000"/>
+            </w:tcBorders>
+            <w:tcMar>
+              <w:top w:w="100" w:type="dxa"/>
+              <w:left w:w="100" w:type="dxa"/>
+              <w:bottom w:w="100" w:type="dxa"/>
+              <w:right w:w="100" w:type="dxa"/>
+            </w:tcMar>
+            <w:hideMark/>
+          </w:tcPr>
+          <w:p>
+            <w:pPr>
+              <w:ind w:left="0"/>
+              <w:rPr>
+                <w:lang w:val="es-ES"/>
+              </w:rPr>
+            </w:pPr>
+            <w:r>
+              <w:rPr>
+                <w:lang w:val="es-ES"/>
+              </w:rPr>
+              <w:t xml:space="preserve">Registrar el pago total o parcial de un retiro para </w:t>
+            </w:r>
+          </w:p>
+          <w:p>
+            <w:pPr>
+              <w:ind w:left="0"/>
+              <w:rPr>
+                <w:lang w:val="es-ES"/>
+              </w:rPr>
+            </w:pPr>
+            <w:r>
+              <w:rPr>
+                <w:lang w:val="es-ES"/>
+              </w:rPr>
+              <w:t>controlar el saldo pendiente.</w:t>
+            </w:r>
+          </w:p>
+        </w:tc>
+      </w:tr>
+      <w:tr>
+        <w:tc>
+          <w:tcPr>
+            <w:tcW w:w="993" w:type="dxa"/>
+            <w:tcBorders>
+              <w:top w:val="single" w:sz="8" w:space="0" w:color="000000"/>
+              <w:left w:val="single" w:sz="8" w:space="0" w:color="000000"/>
+              <w:bottom w:val="single" w:sz="8" w:space="0" w:color="000000"/>
+              <w:right w:val="single" w:sz="8" w:space="0" w:color="000000"/>
+            </w:tcBorders>
+            <w:tcMar>
+              <w:top w:w="100" w:type="dxa"/>
+              <w:left w:w="100" w:type="dxa"/>
+              <w:bottom w:w="100" w:type="dxa"/>
+              <w:right w:w="100" w:type="dxa"/>
+            </w:tcMar>
+            <w:hideMark/>
+          </w:tcPr>
+          <w:p>
+            <w:pPr>
+              <w:ind w:left="0"/>
+              <w:rPr>
+                <w:lang w:val="es-ES"/>
+              </w:rPr>
+            </w:pPr>
+            <w:r>
+              <w:rPr>
+                <w:lang w:val="es-ES"/>
+              </w:rPr>
+              <w:t>CU11</w:t>
+            </w:r>
+          </w:p>
+        </w:tc>
+        <w:tc>
+          <w:tcPr>
+            <w:tcW w:w="2693" w:type="dxa"/>
+            <w:tcBorders>
+              <w:top w:val="single" w:sz="8" w:space="0" w:color="000000"/>
+              <w:left w:val="single" w:sz="8" w:space="0" w:color="000000"/>
+              <w:bottom w:val="single" w:sz="8" w:space="0" w:color="000000"/>
+              <w:right w:val="single" w:sz="8" w:space="0" w:color="000000"/>
+            </w:tcBorders>
+            <w:tcMar>
+              <w:top w:w="100" w:type="dxa"/>
+              <w:left w:w="100" w:type="dxa"/>
+              <w:bottom w:w="100" w:type="dxa"/>
+              <w:right w:w="100" w:type="dxa"/>
+            </w:tcMar>
+            <w:hideMark/>
+          </w:tcPr>
+          <w:p>
+            <w:pPr>
+              <w:ind w:left="0"/>
+              <w:rPr>
+                <w:lang w:val="es-ES"/>
+              </w:rPr>
+            </w:pPr>
+            <w:r>
+              <w:rPr>
+                <w:lang w:val="es-ES"/>
+              </w:rPr>
+              <w:t>Registrar Cuota</w:t>
+            </w:r>
+          </w:p>
+        </w:tc>
+        <w:tc>
+          <w:tcPr>
+            <w:tcW w:w="6804" w:type="dxa"/>
+            <w:tcBorders>
+              <w:top w:val="single" w:sz="8" w:space="0" w:color="000000"/>
+              <w:left w:val="single" w:sz="8" w:space="0" w:color="000000"/>
+              <w:bottom w:val="single" w:sz="8" w:space="0" w:color="000000"/>
+              <w:right w:val="single" w:sz="8" w:space="0" w:color="000000"/>
+            </w:tcBorders>
+            <w:tcMar>
+              <w:top w:w="100" w:type="dxa"/>
+              <w:left w:w="100" w:type="dxa"/>
+              <w:bottom w:w="100" w:type="dxa"/>
+              <w:right w:w="100" w:type="dxa"/>
+            </w:tcMar>
+            <w:hideMark/>
+          </w:tcPr>
+          <w:p>
+            <w:pPr>
+              <w:ind w:left="0"/>
+              <w:rPr>
+                <w:lang w:val="es-ES"/>
+              </w:rPr>
+            </w:pPr>
+            <w:r>
+              <w:rPr>
+                <w:lang w:val="es-ES"/>
+              </w:rPr>
+              <w:t>Registrar cada cuota de un pago fraccionado de un retiro</w:t>
+            </w:r>
+          </w:p>
+          <w:p>
+            <w:pPr>
+              <w:ind w:left="0"/>
+              <w:rPr>
+                <w:lang w:val="es-ES"/>
+              </w:rPr>
+            </w:pPr>
+            <w:r>
+              <w:rPr>
+                <w:lang w:val="es-ES"/>
+              </w:rPr>
+              <w:t xml:space="preserve"> para planificar los pagos. </w:t>
+            </w:r>
+          </w:p>
+        </w:tc>
+      </w:tr>
+      <w:tr>
+        <w:tc>
+          <w:tcPr>
+            <w:tcW w:w="993" w:type="dxa"/>
+            <w:tcBorders>
+              <w:top w:val="single" w:sz="8" w:space="0" w:color="000000"/>
+              <w:left w:val="single" w:sz="8" w:space="0" w:color="000000"/>
+              <w:bottom w:val="single" w:sz="8" w:space="0" w:color="000000"/>
+              <w:right w:val="single" w:sz="8" w:space="0" w:color="000000"/>
+            </w:tcBorders>
+            <w:tcMar>
+              <w:top w:w="100" w:type="dxa"/>
+              <w:left w:w="100" w:type="dxa"/>
+              <w:bottom w:w="100" w:type="dxa"/>
+              <w:right w:w="100" w:type="dxa"/>
+            </w:tcMar>
+            <w:hideMark/>
+          </w:tcPr>
+          <w:p>
+            <w:pPr>
+              <w:ind w:left="0"/>
+              <w:rPr>
+                <w:lang w:val="es-ES"/>
+              </w:rPr>
+            </w:pPr>
+            <w:r>
+              <w:rPr>
+                <w:lang w:val="es-ES"/>
+              </w:rPr>
+              <w:t>CU12</w:t>
+            </w:r>
+          </w:p>
+        </w:tc>
+        <w:tc>
+          <w:tcPr>
+            <w:tcW w:w="2693" w:type="dxa"/>
+            <w:tcBorders>
+              <w:top w:val="single" w:sz="8" w:space="0" w:color="000000"/>
+              <w:left w:val="single" w:sz="8" w:space="0" w:color="000000"/>
+              <w:bottom w:val="single" w:sz="8" w:space="0" w:color="000000"/>
+              <w:right w:val="single" w:sz="8" w:space="0" w:color="000000"/>
+            </w:tcBorders>
+            <w:tcMar>
+              <w:top w:w="100" w:type="dxa"/>
+              <w:left w:w="100" w:type="dxa"/>
+              <w:bottom w:w="100" w:type="dxa"/>
+              <w:right w:w="100" w:type="dxa"/>
+            </w:tcMar>
+            <w:hideMark/>
+          </w:tcPr>
+          <w:p>
+            <w:pPr>
+              <w:ind w:left="0"/>
+              <w:rPr>
+                <w:lang w:val="es-ES"/>
+              </w:rPr>
+            </w:pPr>
+            <w:r>
+              <w:rPr>
+                <w:lang w:val="es-ES"/>
+              </w:rPr>
+              <w:t>Modificar Retiro</w:t>
+            </w:r>
+          </w:p>
+        </w:tc>
+        <w:tc>
+          <w:tcPr>
+            <w:tcW w:w="6804" w:type="dxa"/>
+            <w:tcBorders>
+              <w:top w:val="single" w:sz="8" w:space="0" w:color="000000"/>
+              <w:left w:val="single" w:sz="8" w:space="0" w:color="000000"/>
+              <w:bottom w:val="single" w:sz="8" w:space="0" w:color="000000"/>
+              <w:right w:val="single" w:sz="8" w:space="0" w:color="000000"/>
+            </w:tcBorders>
+            <w:tcMar>
+              <w:top w:w="100" w:type="dxa"/>
+              <w:left w:w="100" w:type="dxa"/>
+              <w:bottom w:w="100" w:type="dxa"/>
+              <w:right w:w="100" w:type="dxa"/>
+            </w:tcMar>
+            <w:hideMark/>
+          </w:tcPr>
+          <w:p>
+            <w:pPr>
+              <w:ind w:left="0"/>
+              <w:rPr>
+                <w:lang w:val="es-ES"/>
+              </w:rPr>
+            </w:pPr>
+            <w:r>
+              <w:rPr>
+                <w:lang w:val="es-ES"/>
+              </w:rPr>
+              <w:t xml:space="preserve">Modificar los datos de un retiro agendado para </w:t>
+            </w:r>
+          </w:p>
+          <w:p>
+            <w:pPr>
+              <w:ind w:left="0"/>
+              <w:rPr>
+                <w:lang w:val="es-ES"/>
+              </w:rPr>
+            </w:pPr>
+            <w:r>
+              <w:rPr>
+                <w:lang w:val="es-ES"/>
+              </w:rPr>
+              <w:t>mantener su información actualizada.</w:t>
+            </w:r>
+          </w:p>
+        </w:tc>
+      </w:tr>
+      <w:tr>
+        <w:tc>
+          <w:tcPr>
+            <w:tcW w:w="993" w:type="dxa"/>
+            <w:tcBorders>
+              <w:top w:val="single" w:sz="8" w:space="0" w:color="000000"/>
+              <w:left w:val="single" w:sz="8" w:space="0" w:color="000000"/>
+              <w:bottom w:val="single" w:sz="8" w:space="0" w:color="000000"/>
+              <w:right w:val="single" w:sz="8" w:space="0" w:color="000000"/>
+            </w:tcBorders>
+            <w:tcMar>
+              <w:top w:w="100" w:type="dxa"/>
+              <w:left w:w="100" w:type="dxa"/>
+              <w:bottom w:w="100" w:type="dxa"/>
+              <w:right w:w="100" w:type="dxa"/>
+            </w:tcMar>
+            <w:hideMark/>
+          </w:tcPr>
+          <w:p>
+            <w:pPr>
+              <w:ind w:left="0"/>
+              <w:rPr>
+                <w:lang w:val="es-ES"/>
+              </w:rPr>
+            </w:pPr>
+            <w:r>
+              <w:rPr>
+                <w:lang w:val="es-ES"/>
+              </w:rPr>
+              <w:t>CU13</w:t>
+            </w:r>
+          </w:p>
+        </w:tc>
+        <w:tc>
+          <w:tcPr>
+            <w:tcW w:w="2693" w:type="dxa"/>
+            <w:tcBorders>
+              <w:top w:val="single" w:sz="8" w:space="0" w:color="000000"/>
+              <w:left w:val="single" w:sz="8" w:space="0" w:color="000000"/>
+              <w:bottom w:val="single" w:sz="8" w:space="0" w:color="000000"/>
+              <w:right w:val="single" w:sz="8" w:space="0" w:color="000000"/>
+            </w:tcBorders>
+            <w:tcMar>
+              <w:top w:w="100" w:type="dxa"/>
+              <w:left w:w="100" w:type="dxa"/>
+              <w:bottom w:w="100" w:type="dxa"/>
+              <w:right w:w="100" w:type="dxa"/>
+            </w:tcMar>
+            <w:hideMark/>
+          </w:tcPr>
+          <w:p>
+            <w:pPr>
+              <w:ind w:left="0"/>
+              <w:rPr>
+                <w:lang w:val="es-ES"/>
+              </w:rPr>
+            </w:pPr>
+            <w:r>
+              <w:rPr>
+                <w:lang w:val="es-ES"/>
+              </w:rPr>
+              <w:t>Registrar Asistencia </w:t>
+            </w:r>
+          </w:p>
+        </w:tc>
+        <w:tc>
+          <w:tcPr>
+            <w:tcW w:w="6804" w:type="dxa"/>
+            <w:tcBorders>
+              <w:top w:val="single" w:sz="8" w:space="0" w:color="000000"/>
+              <w:left w:val="single" w:sz="8" w:space="0" w:color="000000"/>
+              <w:bottom w:val="single" w:sz="8" w:space="0" w:color="000000"/>
+              <w:right w:val="single" w:sz="8" w:space="0" w:color="000000"/>
+            </w:tcBorders>
+            <w:tcMar>
+              <w:top w:w="100" w:type="dxa"/>
+              <w:left w:w="100" w:type="dxa"/>
+              <w:bottom w:w="100" w:type="dxa"/>
+              <w:right w:w="100" w:type="dxa"/>
+            </w:tcMar>
+            <w:hideMark/>
+          </w:tcPr>
+          <w:p>
+            <w:pPr>
+              <w:ind w:left="0"/>
+              <w:rPr>
+                <w:lang w:val="es-ES"/>
+              </w:rPr>
+            </w:pPr>
+            <w:r>
+              <w:rPr>
+                <w:lang w:val="es-ES"/>
+              </w:rPr>
+              <w:t>Registrar si el usuario asistió o no a un retiro para</w:t>
+            </w:r>
+          </w:p>
+          <w:p>
+            <w:pPr>
+              <w:ind w:left="0"/>
+              <w:rPr>
+                <w:lang w:val="es-ES"/>
+              </w:rPr>
+            </w:pPr>
+            <w:r>
+              <w:rPr>
+                <w:lang w:val="es-ES"/>
+              </w:rPr>
+              <w:t xml:space="preserve"> posibilitar su valoración. </w:t>
+            </w:r>
+          </w:p>
+        </w:tc>
+      </w:tr>
+      <w:tr>
+        <w:tc>
+          <w:tcPr>
+            <w:tcW w:w="993" w:type="dxa"/>
+            <w:tcBorders>
+              <w:top w:val="single" w:sz="8" w:space="0" w:color="000000"/>
+              <w:left w:val="single" w:sz="8" w:space="0" w:color="000000"/>
+              <w:bottom w:val="single" w:sz="8" w:space="0" w:color="000000"/>
+              <w:right w:val="single" w:sz="8" w:space="0" w:color="000000"/>
+            </w:tcBorders>
+            <w:tcMar>
+              <w:top w:w="100" w:type="dxa"/>
+              <w:left w:w="100" w:type="dxa"/>
+              <w:bottom w:w="100" w:type="dxa"/>
+              <w:right w:w="100" w:type="dxa"/>
+            </w:tcMar>
+            <w:hideMark/>
+          </w:tcPr>
+          <w:p>
+            <w:pPr>
+              <w:ind w:left="0"/>
+              <w:rPr>
+                <w:lang w:val="es-ES"/>
+              </w:rPr>
+            </w:pPr>
+            <w:r>
+              <w:rPr>
+                <w:lang w:val="es-ES"/>
+              </w:rPr>
+              <w:t>CU14</w:t>
+            </w:r>
+          </w:p>
+        </w:tc>
+        <w:tc>
+          <w:tcPr>
+            <w:tcW w:w="2693" w:type="dxa"/>
+            <w:tcBorders>
+              <w:top w:val="single" w:sz="8" w:space="0" w:color="000000"/>
+              <w:left w:val="single" w:sz="8" w:space="0" w:color="000000"/>
+              <w:bottom w:val="single" w:sz="8" w:space="0" w:color="000000"/>
+              <w:right w:val="single" w:sz="8" w:space="0" w:color="000000"/>
+            </w:tcBorders>
+            <w:tcMar>
+              <w:top w:w="100" w:type="dxa"/>
+              <w:left w:w="100" w:type="dxa"/>
+              <w:bottom w:w="100" w:type="dxa"/>
+              <w:right w:w="100" w:type="dxa"/>
+            </w:tcMar>
+            <w:hideMark/>
+          </w:tcPr>
+          <w:p>
+            <w:pPr>
+              <w:ind w:left="0"/>
+              <w:rPr>
+                <w:lang w:val="es-ES"/>
+              </w:rPr>
+            </w:pPr>
+            <w:r>
+              <w:rPr>
+                <w:lang w:val="es-ES"/>
+              </w:rPr>
+              <w:t>Enviar Alerta </w:t>
+            </w:r>
+          </w:p>
+        </w:tc>
+        <w:tc>
+          <w:tcPr>
+            <w:tcW w:w="6804" w:type="dxa"/>
+            <w:tcBorders>
+              <w:top w:val="single" w:sz="8" w:space="0" w:color="000000"/>
+              <w:left w:val="single" w:sz="8" w:space="0" w:color="000000"/>
+              <w:bottom w:val="single" w:sz="8" w:space="0" w:color="000000"/>
+              <w:right w:val="single" w:sz="8" w:space="0" w:color="000000"/>
+            </w:tcBorders>
+            <w:tcMar>
+              <w:top w:w="100" w:type="dxa"/>
+              <w:left w:w="100" w:type="dxa"/>
+              <w:bottom w:w="100" w:type="dxa"/>
+              <w:right w:w="100" w:type="dxa"/>
+            </w:tcMar>
+            <w:hideMark/>
+          </w:tcPr>
+          <w:p>
+            <w:pPr>
+              <w:ind w:left="0"/>
+              <w:rPr>
+                <w:lang w:val="es-ES"/>
+              </w:rPr>
+            </w:pPr>
+            <w:r>
+              <w:rPr>
+                <w:lang w:val="es-ES"/>
+              </w:rPr>
+              <w:t xml:space="preserve">Enviar una notificación al usuario cuando se aproxima una </w:t>
+            </w:r>
+          </w:p>
+          <w:p>
+            <w:pPr>
+              <w:ind w:left="0"/>
+              <w:rPr>
+                <w:lang w:val="es-ES"/>
+              </w:rPr>
+            </w:pPr>
+            <w:r>
+              <w:rPr>
+                <w:lang w:val="es-ES"/>
+              </w:rPr>
+              <w:t>fecha relevante de un retiro, según lo configurado.</w:t>
+            </w:r>
+          </w:p>
+        </w:tc>
+      </w:tr>
+      <w:tr>
+        <w:tc>
+          <w:tcPr>
+            <w:tcW w:w="993" w:type="dxa"/>
+            <w:tcBorders>
+              <w:top w:val="single" w:sz="8" w:space="0" w:color="000000"/>
+              <w:left w:val="single" w:sz="8" w:space="0" w:color="000000"/>
+              <w:bottom w:val="single" w:sz="8" w:space="0" w:color="000000"/>
+              <w:right w:val="single" w:sz="8" w:space="0" w:color="000000"/>
+            </w:tcBorders>
+            <w:tcMar>
+              <w:top w:w="100" w:type="dxa"/>
+              <w:left w:w="100" w:type="dxa"/>
+              <w:bottom w:w="100" w:type="dxa"/>
+              <w:right w:w="100" w:type="dxa"/>
+            </w:tcMar>
+            <w:hideMark/>
+          </w:tcPr>
+          <w:p>
+            <w:pPr>
+              <w:ind w:left="0"/>
+              <w:rPr>
+                <w:lang w:val="es-ES"/>
+              </w:rPr>
+            </w:pPr>
+            <w:r>
+              <w:rPr>
+                <w:lang w:val="es-ES"/>
+              </w:rPr>
+              <w:t>CU15</w:t>
+            </w:r>
+          </w:p>
+        </w:tc>
+        <w:tc>
+          <w:tcPr>
+            <w:tcW w:w="2693" w:type="dxa"/>
+            <w:tcBorders>
+              <w:top w:val="single" w:sz="8" w:space="0" w:color="000000"/>
+              <w:left w:val="single" w:sz="8" w:space="0" w:color="000000"/>
+              <w:bottom w:val="single" w:sz="8" w:space="0" w:color="000000"/>
+              <w:right w:val="single" w:sz="8" w:space="0" w:color="000000"/>
+            </w:tcBorders>
+            <w:tcMar>
+              <w:top w:w="100" w:type="dxa"/>
+              <w:left w:w="100" w:type="dxa"/>
+              <w:bottom w:w="100" w:type="dxa"/>
+              <w:right w:w="100" w:type="dxa"/>
+            </w:tcMar>
+            <w:hideMark/>
+          </w:tcPr>
+          <w:p>
+            <w:pPr>
+              <w:ind w:left="0"/>
+              <w:rPr>
+                <w:lang w:val="es-ES"/>
+              </w:rPr>
+            </w:pPr>
+            <w:r>
+              <w:rPr>
+                <w:lang w:val="es-ES"/>
+              </w:rPr>
+              <w:t>Dar de baja retiro por vencimiento </w:t>
+            </w:r>
+          </w:p>
+        </w:tc>
+        <w:tc>
+          <w:tcPr>
+            <w:tcW w:w="6804" w:type="dxa"/>
+            <w:tcBorders>
+              <w:top w:val="single" w:sz="8" w:space="0" w:color="000000"/>
+              <w:left w:val="single" w:sz="8" w:space="0" w:color="000000"/>
+              <w:bottom w:val="single" w:sz="8" w:space="0" w:color="000000"/>
+              <w:right w:val="single" w:sz="8" w:space="0" w:color="000000"/>
+            </w:tcBorders>
+            <w:tcMar>
+              <w:top w:w="100" w:type="dxa"/>
+              <w:left w:w="100" w:type="dxa"/>
+              <w:bottom w:w="100" w:type="dxa"/>
+              <w:right w:w="100" w:type="dxa"/>
+            </w:tcMar>
+            <w:hideMark/>
+          </w:tcPr>
+          <w:p>
+            <w:pPr>
+              <w:ind w:left="0"/>
+              <w:rPr>
+                <w:lang w:val="es-ES"/>
+              </w:rPr>
+            </w:pPr>
+            <w:r>
+              <w:rPr>
+                <w:lang w:val="es-ES"/>
+              </w:rPr>
+              <w:t xml:space="preserve">Dar de baja un retiro agendado cuya fecha de </w:t>
+            </w:r>
+          </w:p>
+          <w:p>
+            <w:pPr>
+              <w:ind w:left="0"/>
+              <w:rPr>
+                <w:lang w:val="es-ES"/>
+              </w:rPr>
+            </w:pPr>
+            <w:r>
+              <w:rPr>
+                <w:lang w:val="es-ES"/>
+              </w:rPr>
+              <w:t>finalización ya transcurrió, para mantener actualizado</w:t>
+            </w:r>
+          </w:p>
+          <w:p>
+            <w:pPr>
+              <w:ind w:left="0"/>
+              <w:rPr>
+                <w:lang w:val="es-ES"/>
+              </w:rPr>
+            </w:pPr>
+            <w:r>
+              <w:rPr>
+                <w:lang w:val="es-ES"/>
+              </w:rPr>
+              <w:t xml:space="preserve"> el listado de retiros registrados. </w:t>
+            </w:r>
+          </w:p>
+        </w:tc>
+      </w:tr>
+    </w:tbl>
+    <w:p>
+      <w:pPr>
+        <w:ind w:left="0"/>
+        <w:rPr>
+          <w:lang w:val="es-ES"/>
+        </w:rPr>
+      </w:pPr>
+    </w:p>
+    <w:p>
+      <w:pPr>
+        <w:rPr>
+          <w:lang w:val="es-AR"/>
+        </w:rPr>
+      </w:pPr>
+    </w:p>
+    <w:p>
+      <w:pPr>
+        <w:rPr>
+          <w:lang w:val="es-ES"/>
+        </w:rPr>
+      </w:pPr>
+    </w:p>
     <w:p>
       <w:pPr>
         <w:pStyle w:val="Ttulo2"/>
@@ -2305,6 +4143,7 @@
           <w:bCs/>
           <w:lang w:val="es-AR"/>
         </w:rPr>
+        <w:lastRenderedPageBreak/>
         <w:t>PLANTILLA PARA DESCRIPCIÓN DE CASO DE USO: REGISTRAR RETIRO</w:t>
       </w:r>
     </w:p>
@@ -2317,6 +4156,7 @@
           <w:rFonts w:ascii="Open Sans" w:hAnsi="Open Sans" w:cs="Open Sans"/>
           <w:b/>
           <w:bCs/>
+          <w:lang w:val="es-ES"/>
         </w:rPr>
       </w:pPr>
       <w:r>
@@ -2324,6 +4164,7 @@
           <w:rFonts w:ascii="Open Sans" w:hAnsi="Open Sans" w:cs="Open Sans"/>
           <w:b/>
           <w:bCs/>
+          <w:lang w:val="es-ES"/>
         </w:rPr>
         <w:t>PROTOTIPO: REGISTRAR RETIRO</w:t>
       </w:r>
@@ -2359,6 +4200,7 @@
           <w:rFonts w:ascii="Open Sans" w:hAnsi="Open Sans" w:cs="Open Sans"/>
           <w:b/>
           <w:bCs/>
+          <w:lang w:val="es-ES"/>
         </w:rPr>
       </w:pPr>
       <w:r>
@@ -2366,6 +4208,7 @@
           <w:rFonts w:ascii="Open Sans" w:hAnsi="Open Sans" w:cs="Open Sans"/>
           <w:b/>
           <w:bCs/>
+          <w:lang w:val="es-ES"/>
         </w:rPr>
         <w:t>PROTOTIPO: CONSULTAR RETIRO</w:t>
       </w:r>
@@ -2401,6 +4244,7 @@
           <w:rFonts w:ascii="Open Sans" w:hAnsi="Open Sans" w:cs="Open Sans"/>
           <w:b/>
           <w:bCs/>
+          <w:lang w:val="es-ES"/>
         </w:rPr>
       </w:pPr>
       <w:r>
@@ -2408,6 +4252,7 @@
           <w:rFonts w:ascii="Open Sans" w:hAnsi="Open Sans" w:cs="Open Sans"/>
           <w:b/>
           <w:bCs/>
+          <w:lang w:val="es-ES"/>
         </w:rPr>
         <w:t>PROTOTIPO: REGISTRAR VALORACIÓN</w:t>
       </w:r>
@@ -2481,8 +4326,6 @@
           <w:lang w:val="es-AR"/>
         </w:rPr>
       </w:pPr>
-      <w:bookmarkStart w:id="4" w:name="_GoBack"/>
-      <w:bookmarkEnd w:id="4"/>
       <w:r>
         <w:rPr>
           <w:rFonts w:ascii="Open Sans" w:hAnsi="Open Sans" w:cs="Open Sans"/>
@@ -2990,7 +4833,7 @@
 </file>
 
 <file path=word/endnotes.xml><?xml version="1.0" encoding="utf-8"?>
-<w:endnotes xmlns:wpc="http://schemas.microsoft.com/office/word/2010/wordprocessingCanvas" xmlns:mc="http://schemas.openxmlformats.org/markup-compatibility/2006" xmlns:o="urn:schemas-microsoft-com:office:office" xmlns:r="http://schemas.openxmlformats.org/officeDocument/2006/relationships" xmlns:m="http://schemas.openxmlformats.org/officeDocument/2006/math" xmlns:v="urn:schemas-microsoft-com:vml" xmlns:wp14="http://schemas.microsoft.com/office/word/2010/wordprocessingDrawing" xmlns:wp="http://schemas.openxmlformats.org/drawingml/2006/wordprocessingDrawing" xmlns:w10="urn:schemas-microsoft-com:office:word" xmlns:w="http://schemas.openxmlformats.org/wordprocessingml/2006/main" xmlns:w14="http://schemas.microsoft.com/office/word/2010/wordml" xmlns:w15="http://schemas.microsoft.com/office/word/2012/wordml" xmlns:wpg="http://schemas.microsoft.com/office/word/2010/wordprocessingGroup" xmlns:wpi="http://schemas.microsoft.com/office/word/2010/wordprocessingInk" xmlns:wne="http://schemas.microsoft.com/office/word/2006/wordml" xmlns:wps="http://schemas.microsoft.com/office/word/2010/wordprocessingShape" mc:Ignorable="w14 w15 wp14">
+<w:endnotes xmlns:wpc="http://schemas.microsoft.com/office/word/2010/wordprocessingCanvas" xmlns:cx="http://schemas.microsoft.com/office/drawing/2014/chartex" xmlns:cx1="http://schemas.microsoft.com/office/drawing/2015/9/8/chartex" xmlns:cx2="http://schemas.microsoft.com/office/drawing/2015/10/21/chartex" xmlns:cx3="http://schemas.microsoft.com/office/drawing/2016/5/9/chartex" xmlns:cx4="http://schemas.microsoft.com/office/drawing/2016/5/10/chartex" xmlns:cx5="http://schemas.microsoft.com/office/drawing/2016/5/11/chartex" xmlns:cx6="http://schemas.microsoft.com/office/drawing/2016/5/12/chartex" xmlns:cx7="http://schemas.microsoft.com/office/drawing/2016/5/13/chartex" xmlns:cx8="http://schemas.microsoft.com/office/drawing/2016/5/14/chartex" xmlns:mc="http://schemas.openxmlformats.org/markup-compatibility/2006" xmlns:aink="http://schemas.microsoft.com/office/drawing/2016/ink" xmlns:am3d="http://schemas.microsoft.com/office/drawing/2017/model3d" xmlns:o="urn:schemas-microsoft-com:office:office" xmlns:oel="http://schemas.microsoft.com/office/2019/extlst" xmlns:r="http://schemas.openxmlformats.org/officeDocument/2006/relationships" xmlns:m="http://schemas.openxmlformats.org/officeDocument/2006/math" xmlns:v="urn:schemas-microsoft-com:vml" xmlns:wp14="http://schemas.microsoft.com/office/word/2010/wordprocessingDrawing" xmlns:wp="http://schemas.openxmlformats.org/drawingml/2006/wordprocessingDrawing" xmlns:w10="urn:schemas-microsoft-com:office:word" xmlns:w="http://schemas.openxmlformats.org/wordprocessingml/2006/main" xmlns:w14="http://schemas.microsoft.com/office/word/2010/wordml" xmlns:w15="http://schemas.microsoft.com/office/word/2012/wordml" xmlns:w16cex="http://schemas.microsoft.com/office/word/2018/wordml/cex" xmlns:w16cid="http://schemas.microsoft.com/office/word/2016/wordml/cid" xmlns:w16="http://schemas.microsoft.com/office/word/2018/wordml" xmlns:w16du="http://schemas.microsoft.com/office/word/2023/wordml/word16du" xmlns:w16sdtdh="http://schemas.microsoft.com/office/word/2020/wordml/sdtdatahash" xmlns:w16sdtfl="http://schemas.microsoft.com/office/word/2024/wordml/sdtformatlock" xmlns:w16se="http://schemas.microsoft.com/office/word/2015/wordml/symex" xmlns:wpg="http://schemas.microsoft.com/office/word/2010/wordprocessingGroup" xmlns:wpi="http://schemas.microsoft.com/office/word/2010/wordprocessingInk" xmlns:wne="http://schemas.microsoft.com/office/word/2006/wordml" xmlns:wps="http://schemas.microsoft.com/office/word/2010/wordprocessingShape" mc:Ignorable="w14 w15 w16se w16cid w16 w16cex w16sdtdh w16sdtfl w16du wp14">
   <w:endnote w:type="separator" w:id="-1">
     <w:p>
       <w:pPr>
@@ -3015,7 +4858,7 @@
 </file>
 
 <file path=word/footnotes.xml><?xml version="1.0" encoding="utf-8"?>
-<w:footnotes xmlns:wpc="http://schemas.microsoft.com/office/word/2010/wordprocessingCanvas" xmlns:mc="http://schemas.openxmlformats.org/markup-compatibility/2006" xmlns:o="urn:schemas-microsoft-com:office:office" xmlns:r="http://schemas.openxmlformats.org/officeDocument/2006/relationships" xmlns:m="http://schemas.openxmlformats.org/officeDocument/2006/math" xmlns:v="urn:schemas-microsoft-com:vml" xmlns:wp14="http://schemas.microsoft.com/office/word/2010/wordprocessingDrawing" xmlns:wp="http://schemas.openxmlformats.org/drawingml/2006/wordprocessingDrawing" xmlns:w10="urn:schemas-microsoft-com:office:word" xmlns:w="http://schemas.openxmlformats.org/wordprocessingml/2006/main" xmlns:w14="http://schemas.microsoft.com/office/word/2010/wordml" xmlns:w15="http://schemas.microsoft.com/office/word/2012/wordml" xmlns:wpg="http://schemas.microsoft.com/office/word/2010/wordprocessingGroup" xmlns:wpi="http://schemas.microsoft.com/office/word/2010/wordprocessingInk" xmlns:wne="http://schemas.microsoft.com/office/word/2006/wordml" xmlns:wps="http://schemas.microsoft.com/office/word/2010/wordprocessingShape" mc:Ignorable="w14 w15 wp14">
+<w:footnotes xmlns:wpc="http://schemas.microsoft.com/office/word/2010/wordprocessingCanvas" xmlns:cx="http://schemas.microsoft.com/office/drawing/2014/chartex" xmlns:cx1="http://schemas.microsoft.com/office/drawing/2015/9/8/chartex" xmlns:cx2="http://schemas.microsoft.com/office/drawing/2015/10/21/chartex" xmlns:cx3="http://schemas.microsoft.com/office/drawing/2016/5/9/chartex" xmlns:cx4="http://schemas.microsoft.com/office/drawing/2016/5/10/chartex" xmlns:cx5="http://schemas.microsoft.com/office/drawing/2016/5/11/chartex" xmlns:cx6="http://schemas.microsoft.com/office/drawing/2016/5/12/chartex" xmlns:cx7="http://schemas.microsoft.com/office/drawing/2016/5/13/chartex" xmlns:cx8="http://schemas.microsoft.com/office/drawing/2016/5/14/chartex" xmlns:mc="http://schemas.openxmlformats.org/markup-compatibility/2006" xmlns:aink="http://schemas.microsoft.com/office/drawing/2016/ink" xmlns:am3d="http://schemas.microsoft.com/office/drawing/2017/model3d" xmlns:o="urn:schemas-microsoft-com:office:office" xmlns:oel="http://schemas.microsoft.com/office/2019/extlst" xmlns:r="http://schemas.openxmlformats.org/officeDocument/2006/relationships" xmlns:m="http://schemas.openxmlformats.org/officeDocument/2006/math" xmlns:v="urn:schemas-microsoft-com:vml" xmlns:wp14="http://schemas.microsoft.com/office/word/2010/wordprocessingDrawing" xmlns:wp="http://schemas.openxmlformats.org/drawingml/2006/wordprocessingDrawing" xmlns:w10="urn:schemas-microsoft-com:office:word" xmlns:w="http://schemas.openxmlformats.org/wordprocessingml/2006/main" xmlns:w14="http://schemas.microsoft.com/office/word/2010/wordml" xmlns:w15="http://schemas.microsoft.com/office/word/2012/wordml" xmlns:w16cex="http://schemas.microsoft.com/office/word/2018/wordml/cex" xmlns:w16cid="http://schemas.microsoft.com/office/word/2016/wordml/cid" xmlns:w16="http://schemas.microsoft.com/office/word/2018/wordml" xmlns:w16du="http://schemas.microsoft.com/office/word/2023/wordml/word16du" xmlns:w16sdtdh="http://schemas.microsoft.com/office/word/2020/wordml/sdtdatahash" xmlns:w16sdtfl="http://schemas.microsoft.com/office/word/2024/wordml/sdtformatlock" xmlns:w16se="http://schemas.microsoft.com/office/word/2015/wordml/symex" xmlns:wpg="http://schemas.microsoft.com/office/word/2010/wordprocessingGroup" xmlns:wpi="http://schemas.microsoft.com/office/word/2010/wordprocessingInk" xmlns:wne="http://schemas.microsoft.com/office/word/2006/wordml" xmlns:wps="http://schemas.microsoft.com/office/word/2010/wordprocessingShape" mc:Ignorable="w14 w15 w16se w16cid w16 w16cex w16sdtdh w16sdtfl w16du wp14">
   <w:footnote w:type="separator" w:id="-1">
     <w:p>
       <w:pPr>
@@ -3040,7 +4883,7 @@
 </file>
 
 <file path=word/header1.xml><?xml version="1.0" encoding="utf-8"?>
-<w:hdr xmlns:wpc="http://schemas.microsoft.com/office/word/2010/wordprocessingCanvas" xmlns:mc="http://schemas.openxmlformats.org/markup-compatibility/2006" xmlns:o="urn:schemas-microsoft-com:office:office" xmlns:r="http://schemas.openxmlformats.org/officeDocument/2006/relationships" xmlns:m="http://schemas.openxmlformats.org/officeDocument/2006/math" xmlns:v="urn:schemas-microsoft-com:vml" xmlns:wp14="http://schemas.microsoft.com/office/word/2010/wordprocessingDrawing" xmlns:wp="http://schemas.openxmlformats.org/drawingml/2006/wordprocessingDrawing" xmlns:w10="urn:schemas-microsoft-com:office:word" xmlns:w="http://schemas.openxmlformats.org/wordprocessingml/2006/main" xmlns:w14="http://schemas.microsoft.com/office/word/2010/wordml" xmlns:w15="http://schemas.microsoft.com/office/word/2012/wordml" xmlns:wpg="http://schemas.microsoft.com/office/word/2010/wordprocessingGroup" xmlns:wpi="http://schemas.microsoft.com/office/word/2010/wordprocessingInk" xmlns:wne="http://schemas.microsoft.com/office/word/2006/wordml" xmlns:wps="http://schemas.microsoft.com/office/word/2010/wordprocessingShape" mc:Ignorable="w14 w15 wp14">
+<w:hdr xmlns:wpc="http://schemas.microsoft.com/office/word/2010/wordprocessingCanvas" xmlns:cx="http://schemas.microsoft.com/office/drawing/2014/chartex" xmlns:cx1="http://schemas.microsoft.com/office/drawing/2015/9/8/chartex" xmlns:cx2="http://schemas.microsoft.com/office/drawing/2015/10/21/chartex" xmlns:cx3="http://schemas.microsoft.com/office/drawing/2016/5/9/chartex" xmlns:cx4="http://schemas.microsoft.com/office/drawing/2016/5/10/chartex" xmlns:cx5="http://schemas.microsoft.com/office/drawing/2016/5/11/chartex" xmlns:cx6="http://schemas.microsoft.com/office/drawing/2016/5/12/chartex" xmlns:cx7="http://schemas.microsoft.com/office/drawing/2016/5/13/chartex" xmlns:cx8="http://schemas.microsoft.com/office/drawing/2016/5/14/chartex" xmlns:mc="http://schemas.openxmlformats.org/markup-compatibility/2006" xmlns:aink="http://schemas.microsoft.com/office/drawing/2016/ink" xmlns:am3d="http://schemas.microsoft.com/office/drawing/2017/model3d" xmlns:o="urn:schemas-microsoft-com:office:office" xmlns:oel="http://schemas.microsoft.com/office/2019/extlst" xmlns:r="http://schemas.openxmlformats.org/officeDocument/2006/relationships" xmlns:m="http://schemas.openxmlformats.org/officeDocument/2006/math" xmlns:v="urn:schemas-microsoft-com:vml" xmlns:wp14="http://schemas.microsoft.com/office/word/2010/wordprocessingDrawing" xmlns:wp="http://schemas.openxmlformats.org/drawingml/2006/wordprocessingDrawing" xmlns:w10="urn:schemas-microsoft-com:office:word" xmlns:w="http://schemas.openxmlformats.org/wordprocessingml/2006/main" xmlns:w14="http://schemas.microsoft.com/office/word/2010/wordml" xmlns:w15="http://schemas.microsoft.com/office/word/2012/wordml" xmlns:w16cex="http://schemas.microsoft.com/office/word/2018/wordml/cex" xmlns:w16cid="http://schemas.microsoft.com/office/word/2016/wordml/cid" xmlns:w16="http://schemas.microsoft.com/office/word/2018/wordml" xmlns:w16du="http://schemas.microsoft.com/office/word/2023/wordml/word16du" xmlns:w16sdtdh="http://schemas.microsoft.com/office/word/2020/wordml/sdtdatahash" xmlns:w16sdtfl="http://schemas.microsoft.com/office/word/2024/wordml/sdtformatlock" xmlns:w16se="http://schemas.microsoft.com/office/word/2015/wordml/symex" xmlns:wpg="http://schemas.microsoft.com/office/word/2010/wordprocessingGroup" xmlns:wpi="http://schemas.microsoft.com/office/word/2010/wordprocessingInk" xmlns:wne="http://schemas.microsoft.com/office/word/2006/wordml" xmlns:wps="http://schemas.microsoft.com/office/word/2010/wordprocessingShape" mc:Ignorable="w14 w15 w16se w16cid w16 w16cex w16sdtdh w16sdtfl w16du wp14">
   <w:p>
     <w:pPr>
       <w:spacing w:before="200" w:after="0"/>
@@ -3206,7 +5049,7 @@
 </file>
 
 <file path=word/header2.xml><?xml version="1.0" encoding="utf-8"?>
-<w:hdr xmlns:wpc="http://schemas.microsoft.com/office/word/2010/wordprocessingCanvas" xmlns:mc="http://schemas.openxmlformats.org/markup-compatibility/2006" xmlns:o="urn:schemas-microsoft-com:office:office" xmlns:r="http://schemas.openxmlformats.org/officeDocument/2006/relationships" xmlns:m="http://schemas.openxmlformats.org/officeDocument/2006/math" xmlns:v="urn:schemas-microsoft-com:vml" xmlns:wp14="http://schemas.microsoft.com/office/word/2010/wordprocessingDrawing" xmlns:wp="http://schemas.openxmlformats.org/drawingml/2006/wordprocessingDrawing" xmlns:w10="urn:schemas-microsoft-com:office:word" xmlns:w="http://schemas.openxmlformats.org/wordprocessingml/2006/main" xmlns:w14="http://schemas.microsoft.com/office/word/2010/wordml" xmlns:w15="http://schemas.microsoft.com/office/word/2012/wordml" xmlns:wpg="http://schemas.microsoft.com/office/word/2010/wordprocessingGroup" xmlns:wpi="http://schemas.microsoft.com/office/word/2010/wordprocessingInk" xmlns:wne="http://schemas.microsoft.com/office/word/2006/wordml" xmlns:wps="http://schemas.microsoft.com/office/word/2010/wordprocessingShape" mc:Ignorable="w14 w15 wp14">
+<w:hdr xmlns:wpc="http://schemas.microsoft.com/office/word/2010/wordprocessingCanvas" xmlns:cx="http://schemas.microsoft.com/office/drawing/2014/chartex" xmlns:cx1="http://schemas.microsoft.com/office/drawing/2015/9/8/chartex" xmlns:cx2="http://schemas.microsoft.com/office/drawing/2015/10/21/chartex" xmlns:cx3="http://schemas.microsoft.com/office/drawing/2016/5/9/chartex" xmlns:cx4="http://schemas.microsoft.com/office/drawing/2016/5/10/chartex" xmlns:cx5="http://schemas.microsoft.com/office/drawing/2016/5/11/chartex" xmlns:cx6="http://schemas.microsoft.com/office/drawing/2016/5/12/chartex" xmlns:cx7="http://schemas.microsoft.com/office/drawing/2016/5/13/chartex" xmlns:cx8="http://schemas.microsoft.com/office/drawing/2016/5/14/chartex" xmlns:mc="http://schemas.openxmlformats.org/markup-compatibility/2006" xmlns:aink="http://schemas.microsoft.com/office/drawing/2016/ink" xmlns:am3d="http://schemas.microsoft.com/office/drawing/2017/model3d" xmlns:o="urn:schemas-microsoft-com:office:office" xmlns:oel="http://schemas.microsoft.com/office/2019/extlst" xmlns:r="http://schemas.openxmlformats.org/officeDocument/2006/relationships" xmlns:m="http://schemas.openxmlformats.org/officeDocument/2006/math" xmlns:v="urn:schemas-microsoft-com:vml" xmlns:wp14="http://schemas.microsoft.com/office/word/2010/wordprocessingDrawing" xmlns:wp="http://schemas.openxmlformats.org/drawingml/2006/wordprocessingDrawing" xmlns:w10="urn:schemas-microsoft-com:office:word" xmlns:w="http://schemas.openxmlformats.org/wordprocessingml/2006/main" xmlns:w14="http://schemas.microsoft.com/office/word/2010/wordml" xmlns:w15="http://schemas.microsoft.com/office/word/2012/wordml" xmlns:w16cex="http://schemas.microsoft.com/office/word/2018/wordml/cex" xmlns:w16cid="http://schemas.microsoft.com/office/word/2016/wordml/cid" xmlns:w16="http://schemas.microsoft.com/office/word/2018/wordml" xmlns:w16du="http://schemas.microsoft.com/office/word/2023/wordml/word16du" xmlns:w16sdtdh="http://schemas.microsoft.com/office/word/2020/wordml/sdtdatahash" xmlns:w16sdtfl="http://schemas.microsoft.com/office/word/2024/wordml/sdtformatlock" xmlns:w16se="http://schemas.microsoft.com/office/word/2015/wordml/symex" xmlns:wpg="http://schemas.microsoft.com/office/word/2010/wordprocessingGroup" xmlns:wpi="http://schemas.microsoft.com/office/word/2010/wordprocessingInk" xmlns:wne="http://schemas.microsoft.com/office/word/2006/wordml" xmlns:wps="http://schemas.microsoft.com/office/word/2010/wordprocessingShape" mc:Ignorable="w14 w15 w16se w16cid w16 w16cex w16sdtdh w16sdtfl w16du wp14">
   <w:p>
     <w:pPr>
       <w:pStyle w:val="Encabezado"/>
@@ -3364,7 +5207,7 @@
 </file>
 
 <file path=word/numbering.xml><?xml version="1.0" encoding="utf-8"?>
-<w:numbering xmlns:wpc="http://schemas.microsoft.com/office/word/2010/wordprocessingCanvas" xmlns:mc="http://schemas.openxmlformats.org/markup-compatibility/2006" xmlns:o="urn:schemas-microsoft-com:office:office" xmlns:r="http://schemas.openxmlformats.org/officeDocument/2006/relationships" xmlns:m="http://schemas.openxmlformats.org/officeDocument/2006/math" xmlns:v="urn:schemas-microsoft-com:vml" xmlns:wp14="http://schemas.microsoft.com/office/word/2010/wordprocessingDrawing" xmlns:wp="http://schemas.openxmlformats.org/drawingml/2006/wordprocessingDrawing" xmlns:w10="urn:schemas-microsoft-com:office:word" xmlns:w="http://schemas.openxmlformats.org/wordprocessingml/2006/main" xmlns:w14="http://schemas.microsoft.com/office/word/2010/wordml" xmlns:w15="http://schemas.microsoft.com/office/word/2012/wordml" xmlns:wpg="http://schemas.microsoft.com/office/word/2010/wordprocessingGroup" xmlns:wpi="http://schemas.microsoft.com/office/word/2010/wordprocessingInk" xmlns:wne="http://schemas.microsoft.com/office/word/2006/wordml" xmlns:wps="http://schemas.microsoft.com/office/word/2010/wordprocessingShape" mc:Ignorable="w14 w15 wp14">
+<w:numbering xmlns:wpc="http://schemas.microsoft.com/office/word/2010/wordprocessingCanvas" xmlns:cx="http://schemas.microsoft.com/office/drawing/2014/chartex" xmlns:cx1="http://schemas.microsoft.com/office/drawing/2015/9/8/chartex" xmlns:cx2="http://schemas.microsoft.com/office/drawing/2015/10/21/chartex" xmlns:cx3="http://schemas.microsoft.com/office/drawing/2016/5/9/chartex" xmlns:cx4="http://schemas.microsoft.com/office/drawing/2016/5/10/chartex" xmlns:cx5="http://schemas.microsoft.com/office/drawing/2016/5/11/chartex" xmlns:cx6="http://schemas.microsoft.com/office/drawing/2016/5/12/chartex" xmlns:cx7="http://schemas.microsoft.com/office/drawing/2016/5/13/chartex" xmlns:cx8="http://schemas.microsoft.com/office/drawing/2016/5/14/chartex" xmlns:mc="http://schemas.openxmlformats.org/markup-compatibility/2006" xmlns:aink="http://schemas.microsoft.com/office/drawing/2016/ink" xmlns:am3d="http://schemas.microsoft.com/office/drawing/2017/model3d" xmlns:o="urn:schemas-microsoft-com:office:office" xmlns:oel="http://schemas.microsoft.com/office/2019/extlst" xmlns:r="http://schemas.openxmlformats.org/officeDocument/2006/relationships" xmlns:m="http://schemas.openxmlformats.org/officeDocument/2006/math" xmlns:v="urn:schemas-microsoft-com:vml" xmlns:wp14="http://schemas.microsoft.com/office/word/2010/wordprocessingDrawing" xmlns:wp="http://schemas.openxmlformats.org/drawingml/2006/wordprocessingDrawing" xmlns:w10="urn:schemas-microsoft-com:office:word" xmlns:w="http://schemas.openxmlformats.org/wordprocessingml/2006/main" xmlns:w14="http://schemas.microsoft.com/office/word/2010/wordml" xmlns:w15="http://schemas.microsoft.com/office/word/2012/wordml" xmlns:w16cex="http://schemas.microsoft.com/office/word/2018/wordml/cex" xmlns:w16cid="http://schemas.microsoft.com/office/word/2016/wordml/cid" xmlns:w16="http://schemas.microsoft.com/office/word/2018/wordml" xmlns:w16du="http://schemas.microsoft.com/office/word/2023/wordml/word16du" xmlns:w16sdtdh="http://schemas.microsoft.com/office/word/2020/wordml/sdtdatahash" xmlns:w16sdtfl="http://schemas.microsoft.com/office/word/2024/wordml/sdtformatlock" xmlns:w16se="http://schemas.microsoft.com/office/word/2015/wordml/symex" xmlns:wpg="http://schemas.microsoft.com/office/word/2010/wordprocessingGroup" xmlns:wpi="http://schemas.microsoft.com/office/word/2010/wordprocessingInk" xmlns:wne="http://schemas.microsoft.com/office/word/2006/wordml" xmlns:wps="http://schemas.microsoft.com/office/word/2010/wordprocessingShape" mc:Ignorable="w14 w15 w16se w16cid w16 w16cex w16sdtdh w16sdtfl w16du wp14">
   <w:abstractNum w:abstractNumId="0" w15:restartNumberingAfterBreak="0">
     <w:nsid w:val="0ACC6B28"/>
     <w:multiLevelType w:val="multilevel"/>
@@ -4228,32 +6071,32 @@
       </w:rPr>
     </w:lvl>
   </w:abstractNum>
-  <w:num w:numId="1">
+  <w:num w:numId="1" w16cid:durableId="2017687779">
     <w:abstractNumId w:val="1"/>
   </w:num>
-  <w:num w:numId="2">
+  <w:num w:numId="2" w16cid:durableId="805393028">
     <w:abstractNumId w:val="2"/>
   </w:num>
-  <w:num w:numId="3">
+  <w:num w:numId="3" w16cid:durableId="918371394">
     <w:abstractNumId w:val="5"/>
   </w:num>
-  <w:num w:numId="4">
+  <w:num w:numId="4" w16cid:durableId="2139764564">
     <w:abstractNumId w:val="0"/>
   </w:num>
-  <w:num w:numId="5">
+  <w:num w:numId="5" w16cid:durableId="2109160419">
     <w:abstractNumId w:val="6"/>
   </w:num>
-  <w:num w:numId="6">
+  <w:num w:numId="6" w16cid:durableId="1819806964">
     <w:abstractNumId w:val="3"/>
   </w:num>
-  <w:num w:numId="7">
+  <w:num w:numId="7" w16cid:durableId="1947888224">
     <w:abstractNumId w:val="4"/>
   </w:num>
 </w:numbering>
 </file>
 
 <file path=word/styles.xml><?xml version="1.0" encoding="utf-8"?>
-<w:styles xmlns:mc="http://schemas.openxmlformats.org/markup-compatibility/2006" xmlns:r="http://schemas.openxmlformats.org/officeDocument/2006/relationships" xmlns:w="http://schemas.openxmlformats.org/wordprocessingml/2006/main" xmlns:w14="http://schemas.microsoft.com/office/word/2010/wordml" xmlns:w15="http://schemas.microsoft.com/office/word/2012/wordml" mc:Ignorable="w14 w15">
+<w:styles xmlns:mc="http://schemas.openxmlformats.org/markup-compatibility/2006" xmlns:r="http://schemas.openxmlformats.org/officeDocument/2006/relationships" xmlns:w="http://schemas.openxmlformats.org/wordprocessingml/2006/main" xmlns:w14="http://schemas.microsoft.com/office/word/2010/wordml" xmlns:w15="http://schemas.microsoft.com/office/word/2012/wordml" xmlns:w16cex="http://schemas.microsoft.com/office/word/2018/wordml/cex" xmlns:w16cid="http://schemas.microsoft.com/office/word/2016/wordml/cid" xmlns:w16="http://schemas.microsoft.com/office/word/2018/wordml" xmlns:w16du="http://schemas.microsoft.com/office/word/2023/wordml/word16du" xmlns:w16sdtdh="http://schemas.microsoft.com/office/word/2020/wordml/sdtdatahash" xmlns:w16sdtfl="http://schemas.microsoft.com/office/word/2024/wordml/sdtformatlock" xmlns:w16se="http://schemas.microsoft.com/office/word/2015/wordml/symex" mc:Ignorable="w14 w15 w16se w16cid w16 w16cex w16sdtdh w16sdtfl w16du">
   <w:docDefaults>
     <w:rPrDefault>
       <w:rPr>
@@ -4271,7 +6114,7 @@
       </w:pPr>
     </w:pPrDefault>
   </w:docDefaults>
-  <w:latentStyles w:defLockedState="0" w:defUIPriority="99" w:defSemiHidden="0" w:defUnhideWhenUsed="0" w:defQFormat="0" w:count="371">
+  <w:latentStyles w:defLockedState="0" w:defUIPriority="99" w:defSemiHidden="0" w:defUnhideWhenUsed="0" w:defQFormat="0" w:count="376">
     <w:lsdException w:name="Normal" w:uiPriority="0" w:qFormat="1"/>
     <w:lsdException w:name="heading 1" w:uiPriority="9" w:qFormat="1"/>
     <w:lsdException w:name="heading 2" w:semiHidden="1" w:uiPriority="0" w:unhideWhenUsed="1" w:qFormat="1"/>
@@ -4643,6 +6486,11 @@
     <w:lsdException w:name="List Table 5 Dark Accent 6" w:uiPriority="50"/>
     <w:lsdException w:name="List Table 6 Colorful Accent 6" w:uiPriority="51"/>
     <w:lsdException w:name="List Table 7 Colorful Accent 6" w:uiPriority="52"/>
+    <w:lsdException w:name="Mention" w:semiHidden="1" w:unhideWhenUsed="1"/>
+    <w:lsdException w:name="Smart Hyperlink" w:semiHidden="1" w:unhideWhenUsed="1"/>
+    <w:lsdException w:name="Hashtag" w:semiHidden="1" w:unhideWhenUsed="1"/>
+    <w:lsdException w:name="Unresolved Mention" w:semiHidden="1" w:unhideWhenUsed="1"/>
+    <w:lsdException w:name="Smart Link" w:semiHidden="1" w:unhideWhenUsed="1"/>
   </w:latentStyles>
   <w:style w:type="paragraph" w:default="1" w:styleId="Normal">
     <w:name w:val="Normal"/>
@@ -4747,7 +6595,6 @@
   <w:style w:type="character" w:default="1" w:styleId="Fuentedeprrafopredeter">
     <w:name w:val="Default Paragraph Font"/>
     <w:uiPriority w:val="1"/>
-    <w:semiHidden/>
     <w:unhideWhenUsed/>
   </w:style>
   <w:style w:type="table" w:default="1" w:styleId="Tablanormal">
@@ -4782,7 +6629,7 @@
       </w:tblCellMar>
     </w:tblPr>
   </w:style>
-  <w:style w:type="paragraph" w:styleId="Puesto">
+  <w:style w:type="paragraph" w:styleId="Ttulo">
     <w:name w:val="Title"/>
     <w:basedOn w:val="Normal"/>
     <w:next w:val="Normal"/>
@@ -4919,8 +6766,8 @@
       <w:u w:val="single"/>
     </w:rPr>
   </w:style>
-  <w:style w:type="character" w:customStyle="1" w:styleId="UnresolvedMention">
-    <w:name w:val="Unresolved Mention"/>
+  <w:style w:type="character" w:customStyle="1" w:styleId="Mencinsinresolver1">
+    <w:name w:val="Mención sin resolver1"/>
     <w:basedOn w:val="Fuentedeprrafopredeter"/>
     <w:uiPriority w:val="99"/>
     <w:semiHidden/>

</xml_diff>

<commit_message>
Agregación de plantilla para descripción del caso de uso esencial 1: Registrar retiro. Con su respectivo prototipo.
</commit_message>
<xml_diff>
--- a/TPI Análisis de sistemas.docx
+++ b/TPI Análisis de sistemas.docx
@@ -1,6 +1,6 @@
 
 <file path=word/document.xml><?xml version="1.0" encoding="utf-8"?>
-<w:document xmlns:wpc="http://schemas.microsoft.com/office/word/2010/wordprocessingCanvas" xmlns:cx="http://schemas.microsoft.com/office/drawing/2014/chartex" xmlns:cx1="http://schemas.microsoft.com/office/drawing/2015/9/8/chartex" xmlns:cx2="http://schemas.microsoft.com/office/drawing/2015/10/21/chartex" xmlns:cx3="http://schemas.microsoft.com/office/drawing/2016/5/9/chartex" xmlns:cx4="http://schemas.microsoft.com/office/drawing/2016/5/10/chartex" xmlns:cx5="http://schemas.microsoft.com/office/drawing/2016/5/11/chartex" xmlns:cx6="http://schemas.microsoft.com/office/drawing/2016/5/12/chartex" xmlns:cx7="http://schemas.microsoft.com/office/drawing/2016/5/13/chartex" xmlns:cx8="http://schemas.microsoft.com/office/drawing/2016/5/14/chartex" xmlns:mc="http://schemas.openxmlformats.org/markup-compatibility/2006" xmlns:aink="http://schemas.microsoft.com/office/drawing/2016/ink" xmlns:am3d="http://schemas.microsoft.com/office/drawing/2017/model3d" xmlns:o="urn:schemas-microsoft-com:office:office" xmlns:oel="http://schemas.microsoft.com/office/2019/extlst" xmlns:r="http://schemas.openxmlformats.org/officeDocument/2006/relationships" xmlns:m="http://schemas.openxmlformats.org/officeDocument/2006/math" xmlns:v="urn:schemas-microsoft-com:vml" xmlns:wp14="http://schemas.microsoft.com/office/word/2010/wordprocessingDrawing" xmlns:wp="http://schemas.openxmlformats.org/drawingml/2006/wordprocessingDrawing" xmlns:w10="urn:schemas-microsoft-com:office:word" xmlns:w="http://schemas.openxmlformats.org/wordprocessingml/2006/main" xmlns:w14="http://schemas.microsoft.com/office/word/2010/wordml" xmlns:w15="http://schemas.microsoft.com/office/word/2012/wordml" xmlns:w16cex="http://schemas.microsoft.com/office/word/2018/wordml/cex" xmlns:w16cid="http://schemas.microsoft.com/office/word/2016/wordml/cid" xmlns:w16="http://schemas.microsoft.com/office/word/2018/wordml" xmlns:w16du="http://schemas.microsoft.com/office/word/2023/wordml/word16du" xmlns:w16sdtdh="http://schemas.microsoft.com/office/word/2020/wordml/sdtdatahash" xmlns:w16sdtfl="http://schemas.microsoft.com/office/word/2024/wordml/sdtformatlock" xmlns:w16se="http://schemas.microsoft.com/office/word/2015/wordml/symex" xmlns:wpg="http://schemas.microsoft.com/office/word/2010/wordprocessingGroup" xmlns:wpi="http://schemas.microsoft.com/office/word/2010/wordprocessingInk" xmlns:wne="http://schemas.microsoft.com/office/word/2006/wordml" xmlns:wps="http://schemas.microsoft.com/office/word/2010/wordprocessingShape" mc:Ignorable="w14 w15 w16se w16cid w16 w16cex w16sdtdh w16sdtfl w16du wp14">
+<w:document xmlns:wpc="http://schemas.microsoft.com/office/word/2010/wordprocessingCanvas" xmlns:cx="http://schemas.microsoft.com/office/drawing/2014/chartex" xmlns:cx1="http://schemas.microsoft.com/office/drawing/2015/9/8/chartex" xmlns:mc="http://schemas.openxmlformats.org/markup-compatibility/2006" xmlns:o="urn:schemas-microsoft-com:office:office" xmlns:r="http://schemas.openxmlformats.org/officeDocument/2006/relationships" xmlns:m="http://schemas.openxmlformats.org/officeDocument/2006/math" xmlns:v="urn:schemas-microsoft-com:vml" xmlns:wp14="http://schemas.microsoft.com/office/word/2010/wordprocessingDrawing" xmlns:wp="http://schemas.openxmlformats.org/drawingml/2006/wordprocessingDrawing" xmlns:w10="urn:schemas-microsoft-com:office:word" xmlns:w="http://schemas.openxmlformats.org/wordprocessingml/2006/main" xmlns:w14="http://schemas.microsoft.com/office/word/2010/wordml" xmlns:w15="http://schemas.microsoft.com/office/word/2012/wordml" xmlns:w16se="http://schemas.microsoft.com/office/word/2015/wordml/symex" xmlns:wpg="http://schemas.microsoft.com/office/word/2010/wordprocessingGroup" xmlns:wpi="http://schemas.microsoft.com/office/word/2010/wordprocessingInk" xmlns:wne="http://schemas.microsoft.com/office/word/2006/wordml" xmlns:wps="http://schemas.microsoft.com/office/word/2010/wordprocessingShape" mc:Ignorable="w14 w15 w16se wp14">
   <w:body>
     <w:p>
       <w:pPr>
@@ -21,7 +21,7 @@
           <w:sz w:val="26"/>
           <w:szCs w:val="26"/>
           <w:bdr w:val="none" w:sz="0" w:space="0" w:color="auto" w:frame="1"/>
-          <w:lang w:val="es-AR"/>
+          <w:lang w:val="en-US" w:eastAsia="en-US"/>
         </w:rPr>
         <w:drawing>
           <wp:inline distT="0" distB="0" distL="0" distR="0" wp14:anchorId="1CCAA310" wp14:editId="19110C2F">
@@ -161,45 +161,8 @@
         </w:rPr>
         <w:t xml:space="preserve">Enunciado del caso de estudio (Bien en detalle, contar la historia del usuario, que necesidades hay en el medio. </w:t>
       </w:r>
-      <w:proofErr w:type="spellStart"/>
       <w:r>
-        <w:t>Desde</w:t>
-      </w:r>
-      <w:proofErr w:type="spellEnd"/>
-      <w:r>
-        <w:t xml:space="preserve"> </w:t>
-      </w:r>
-      <w:proofErr w:type="spellStart"/>
-      <w:r>
-        <w:t>que</w:t>
-      </w:r>
-      <w:proofErr w:type="spellEnd"/>
-      <w:r>
-        <w:t xml:space="preserve"> agenda un </w:t>
-      </w:r>
-      <w:proofErr w:type="spellStart"/>
-      <w:r>
-        <w:t>retiro</w:t>
-      </w:r>
-      <w:proofErr w:type="spellEnd"/>
-      <w:r>
-        <w:t xml:space="preserve"> hasta </w:t>
-      </w:r>
-      <w:proofErr w:type="spellStart"/>
-      <w:r>
-        <w:t>que</w:t>
-      </w:r>
-      <w:proofErr w:type="spellEnd"/>
-      <w:r>
-        <w:t xml:space="preserve"> lo </w:t>
-      </w:r>
-      <w:proofErr w:type="spellStart"/>
-      <w:r>
-        <w:t>valora</w:t>
-      </w:r>
-      <w:proofErr w:type="spellEnd"/>
-      <w:r>
-        <w:t>).</w:t>
+        <w:t>Desde que agenda un retiro hasta que lo valora).</w:t>
       </w:r>
     </w:p>
     <w:p>
@@ -216,23 +179,7 @@
         </w:rPr>
       </w:pPr>
       <w:r>
-        <w:t xml:space="preserve">Lista de </w:t>
-      </w:r>
-      <w:proofErr w:type="spellStart"/>
-      <w:r>
-        <w:t>requerimientos</w:t>
-      </w:r>
-      <w:proofErr w:type="spellEnd"/>
-      <w:r>
-        <w:t xml:space="preserve"> </w:t>
-      </w:r>
-      <w:proofErr w:type="spellStart"/>
-      <w:r>
-        <w:t>funcionales</w:t>
-      </w:r>
-      <w:proofErr w:type="spellEnd"/>
-      <w:r>
-        <w:t>.</w:t>
+        <w:t>Lista de requerimientos funcionales.</w:t>
       </w:r>
     </w:p>
     <w:p>
@@ -552,7 +499,6 @@
         </w:rPr>
         <w:t xml:space="preserve"> </w:t>
       </w:r>
-      <w:proofErr w:type="spellStart"/>
       <w:r>
         <w:rPr>
           <w:rFonts w:ascii="Arial" w:hAnsi="Arial" w:cs="Arial"/>
@@ -563,7 +509,6 @@
         </w:rPr>
         <w:t>Nexura</w:t>
       </w:r>
-      <w:proofErr w:type="spellEnd"/>
     </w:p>
     <w:p>
       <w:pPr>
@@ -679,21 +624,7 @@
         <w:rPr>
           <w:lang w:val="es-ES"/>
         </w:rPr>
-        <w:t xml:space="preserve">Rovera </w:t>
-      </w:r>
-      <w:proofErr w:type="spellStart"/>
-      <w:r>
-        <w:rPr>
-          <w:lang w:val="es-ES"/>
-        </w:rPr>
-        <w:t>Porporato</w:t>
-      </w:r>
-      <w:proofErr w:type="spellEnd"/>
-      <w:r>
-        <w:rPr>
-          <w:lang w:val="es-ES"/>
-        </w:rPr>
-        <w:t>, Felipe</w:t>
+        <w:t>Rovera Porporato, Felipe</w:t>
       </w:r>
     </w:p>
     <w:p>
@@ -713,7 +644,7 @@
         <w:rPr>
           <w:noProof/>
           <w:bdr w:val="none" w:sz="0" w:space="0" w:color="auto" w:frame="1"/>
-          <w:lang w:val="es-AR"/>
+          <w:lang w:val="en-US" w:eastAsia="en-US"/>
         </w:rPr>
         <w:drawing>
           <wp:anchor distT="0" distB="0" distL="114300" distR="114300" simplePos="0" relativeHeight="251670016" behindDoc="0" locked="0" layoutInCell="1" allowOverlap="1" wp14:anchorId="162C5705" wp14:editId="6191761C">
@@ -772,19 +703,11 @@
           </wp:anchor>
         </w:drawing>
       </w:r>
-      <w:proofErr w:type="spellStart"/>
       <w:r>
         <w:rPr>
           <w:lang w:val="es-ES"/>
         </w:rPr>
-        <w:t>Sanchez</w:t>
-      </w:r>
-      <w:proofErr w:type="spellEnd"/>
-      <w:r>
-        <w:rPr>
-          <w:lang w:val="es-ES"/>
-        </w:rPr>
-        <w:t xml:space="preserve"> Toranzo, Lisandro </w:t>
+        <w:t>Sanchez Toranzo, Lisandro </w:t>
       </w:r>
     </w:p>
     <w:p>
@@ -823,7 +746,6 @@
           <w:lang w:val="es-ES"/>
         </w:rPr>
       </w:pPr>
-      <w:proofErr w:type="spellStart"/>
       <w:r>
         <w:rPr>
           <w:b/>
@@ -833,7 +755,6 @@
         </w:rPr>
         <w:t>Nexura</w:t>
       </w:r>
-      <w:proofErr w:type="spellEnd"/>
       <w:r>
         <w:rPr>
           <w:color w:val="000000"/>
@@ -904,27 +825,7 @@
           <w:iCs/>
           <w:color w:val="000000"/>
         </w:rPr>
-        <w:t xml:space="preserve">fecha de inicio del retiro, desde hasta cuándo (AAAA/MM/DD </w:t>
-      </w:r>
-      <w:proofErr w:type="spellStart"/>
-      <w:r>
-        <w:rPr>
-          <w:rFonts w:ascii="Arial" w:hAnsi="Arial" w:cs="Arial"/>
-          <w:i/>
-          <w:iCs/>
-          <w:color w:val="000000"/>
-        </w:rPr>
-        <w:t>hh:mm</w:t>
-      </w:r>
-      <w:proofErr w:type="spellEnd"/>
-      <w:r>
-        <w:rPr>
-          <w:rFonts w:ascii="Arial" w:hAnsi="Arial" w:cs="Arial"/>
-          <w:i/>
-          <w:iCs/>
-          <w:color w:val="000000"/>
-        </w:rPr>
-        <w:t>), nombre del retiro, ubicación, temática del retiro (Meditación, tracking, yoga, ceremonia del cacao, regresión a vidas pasadas, senderismo, armonización sonora), cronograma de actividades, costo, CON QUIÉN HABLÓ (Nombre del encargado, o Página) ESTADO (lo reserve, me interesa, lo pague), cancelable o no</w:t>
+        <w:t>fecha de inicio del retiro, desde hasta cuándo (AAAA/MM/DD hh:mm), nombre del retiro, ubicación, temática del retiro (Meditación, tracking, yoga, ceremonia del cacao, regresión a vidas pasadas, senderismo, armonización sonora), cronograma de actividades, costo, CON QUIÉN HABLÓ (Nombre del encargado, o Página) ESTADO (lo reserve, me interesa, lo pague), cancelable o no</w:t>
       </w:r>
       <w:r>
         <w:rPr>
@@ -1102,7 +1003,6 @@
                 <w:szCs w:val="20"/>
               </w:rPr>
             </w:pPr>
-            <w:proofErr w:type="spellStart"/>
             <w:r>
               <w:rPr>
                 <w:rFonts w:ascii="Open Sans ExtraBold" w:eastAsia="Open Sans ExtraBold" w:hAnsi="Open Sans ExtraBold" w:cs="Open Sans ExtraBold"/>
@@ -1110,29 +1010,8 @@
                 <w:sz w:val="20"/>
                 <w:szCs w:val="20"/>
               </w:rPr>
-              <w:t>Requerimiento</w:t>
-            </w:r>
-            <w:proofErr w:type="spellEnd"/>
-            <w:r>
-              <w:rPr>
-                <w:rFonts w:ascii="Open Sans ExtraBold" w:eastAsia="Open Sans ExtraBold" w:hAnsi="Open Sans ExtraBold" w:cs="Open Sans ExtraBold"/>
-                <w:color w:val="FFAA00"/>
-                <w:sz w:val="20"/>
-                <w:szCs w:val="20"/>
-              </w:rPr>
-              <w:t xml:space="preserve"> </w:t>
-            </w:r>
-            <w:proofErr w:type="spellStart"/>
-            <w:r>
-              <w:rPr>
-                <w:rFonts w:ascii="Open Sans ExtraBold" w:eastAsia="Open Sans ExtraBold" w:hAnsi="Open Sans ExtraBold" w:cs="Open Sans ExtraBold"/>
-                <w:color w:val="FFAA00"/>
-                <w:sz w:val="20"/>
-                <w:szCs w:val="20"/>
-              </w:rPr>
-              <w:t>funcional</w:t>
-            </w:r>
-            <w:proofErr w:type="spellEnd"/>
+              <w:t>Requerimiento funcional</w:t>
+            </w:r>
           </w:p>
         </w:tc>
       </w:tr>
@@ -1430,29 +1309,8 @@
               <w:spacing w:after="0" w:line="240" w:lineRule="auto"/>
               <w:ind w:left="0" w:right="61"/>
             </w:pPr>
-            <w:proofErr w:type="spellStart"/>
-            <w:r>
-              <w:t>siguientes</w:t>
-            </w:r>
-            <w:proofErr w:type="spellEnd"/>
-            <w:r>
-              <w:t xml:space="preserve"> </w:t>
-            </w:r>
-            <w:proofErr w:type="spellStart"/>
-            <w:r>
-              <w:t>datos</w:t>
-            </w:r>
-            <w:proofErr w:type="spellEnd"/>
-            <w:r>
-              <w:t>: (</w:t>
-            </w:r>
-            <w:proofErr w:type="spellStart"/>
-            <w:r>
-              <w:t>datos</w:t>
-            </w:r>
-            <w:proofErr w:type="spellEnd"/>
-            <w:r>
-              <w:t>).</w:t>
+            <w:r>
+              <w:t>siguientes datos: (datos).</w:t>
             </w:r>
           </w:p>
         </w:tc>
@@ -2101,7 +1959,7 @@
         <w:rPr>
           <w:rFonts w:ascii="Open Sans" w:hAnsi="Open Sans" w:cs="Open Sans"/>
           <w:noProof/>
-          <w:lang w:val="es-AR"/>
+          <w:lang w:val="en-US" w:eastAsia="en-US"/>
         </w:rPr>
         <w:drawing>
           <wp:inline distT="0" distB="0" distL="0" distR="0" wp14:anchorId="242026C4" wp14:editId="6130DF43">
@@ -2201,32 +2059,58 @@
         <w:rPr>
           <w:b/>
           <w:bCs/>
+          <w:noProof/>
           <w:color w:val="000000"/>
-        </w:rPr>
-        <w:pict w14:anchorId="32DC433D">
-          <v:shapetype id="_x0000_t75" coordsize="21600,21600" o:spt="75" o:preferrelative="t" path="m@4@5l@4@11@9@11@9@5xe" filled="f" stroked="f">
-            <v:stroke joinstyle="miter"/>
-            <v:formulas>
-              <v:f eqn="if lineDrawn pixelLineWidth 0"/>
-              <v:f eqn="sum @0 1 0"/>
-              <v:f eqn="sum 0 0 @1"/>
-              <v:f eqn="prod @2 1 2"/>
-              <v:f eqn="prod @3 21600 pixelWidth"/>
-              <v:f eqn="prod @3 21600 pixelHeight"/>
-              <v:f eqn="sum @0 0 1"/>
-              <v:f eqn="prod @6 1 2"/>
-              <v:f eqn="prod @7 21600 pixelWidth"/>
-              <v:f eqn="sum @8 21600 0"/>
-              <v:f eqn="prod @7 21600 pixelHeight"/>
-              <v:f eqn="sum @10 21600 0"/>
-            </v:formulas>
-            <v:path o:extrusionok="f" gradientshapeok="t" o:connecttype="rect"/>
-            <o:lock v:ext="edit" aspectratio="t"/>
-          </v:shapetype>
-          <v:shape id="_x0000_i1025" type="#_x0000_t75" style="width:468pt;height:496.2pt">
-            <v:imagedata r:id="rId10" o:title="Retiros"/>
-          </v:shape>
-        </w:pict>
+          <w:lang w:val="en-US" w:eastAsia="en-US"/>
+        </w:rPr>
+        <w:drawing>
+          <wp:inline distT="0" distB="0" distL="0" distR="0" wp14:anchorId="32DC433D" wp14:editId="39D482D3">
+            <wp:extent cx="5943600" cy="6296660"/>
+            <wp:effectExtent l="0" t="0" r="0" b="8890"/>
+            <wp:docPr id="13" name="Imagen 1" descr="Retiros"/>
+            <wp:cNvGraphicFramePr>
+              <a:graphicFrameLocks xmlns:a="http://schemas.openxmlformats.org/drawingml/2006/main" noChangeAspect="1"/>
+            </wp:cNvGraphicFramePr>
+            <a:graphic xmlns:a="http://schemas.openxmlformats.org/drawingml/2006/main">
+              <a:graphicData uri="http://schemas.openxmlformats.org/drawingml/2006/picture">
+                <pic:pic xmlns:pic="http://schemas.openxmlformats.org/drawingml/2006/picture">
+                  <pic:nvPicPr>
+                    <pic:cNvPr id="0" name="Picture 1" descr="Retiros"/>
+                    <pic:cNvPicPr>
+                      <a:picLocks noChangeAspect="1" noChangeArrowheads="1"/>
+                    </pic:cNvPicPr>
+                  </pic:nvPicPr>
+                  <pic:blipFill>
+                    <a:blip r:embed="rId10">
+                      <a:extLst>
+                        <a:ext uri="{28A0092B-C50C-407E-A947-70E740481C1C}">
+                          <a14:useLocalDpi xmlns:a14="http://schemas.microsoft.com/office/drawing/2010/main" val="0"/>
+                        </a:ext>
+                      </a:extLst>
+                    </a:blip>
+                    <a:srcRect/>
+                    <a:stretch>
+                      <a:fillRect/>
+                    </a:stretch>
+                  </pic:blipFill>
+                  <pic:spPr bwMode="auto">
+                    <a:xfrm>
+                      <a:off x="0" y="0"/>
+                      <a:ext cx="5943600" cy="6296660"/>
+                    </a:xfrm>
+                    <a:prstGeom prst="rect">
+                      <a:avLst/>
+                    </a:prstGeom>
+                    <a:noFill/>
+                    <a:ln>
+                      <a:noFill/>
+                    </a:ln>
+                  </pic:spPr>
+                </pic:pic>
+              </a:graphicData>
+            </a:graphic>
+          </wp:inline>
+        </w:drawing>
       </w:r>
     </w:p>
     <w:p>
@@ -2486,23 +2370,7 @@
               <w:rPr>
                 <w:lang w:val="es-ES"/>
               </w:rPr>
-              <w:t xml:space="preserve">Registrar un retiro de interés para un </w:t>
-            </w:r>
-            <w:proofErr w:type="spellStart"/>
-            <w:proofErr w:type="gramStart"/>
-            <w:r>
-              <w:rPr>
-                <w:lang w:val="es-ES"/>
-              </w:rPr>
-              <w:t>usuario,para</w:t>
-            </w:r>
-            <w:proofErr w:type="spellEnd"/>
-            <w:proofErr w:type="gramEnd"/>
-            <w:r>
-              <w:rPr>
-                <w:lang w:val="es-ES"/>
-              </w:rPr>
-              <w:t xml:space="preserve"> </w:t>
+              <w:t xml:space="preserve">Registrar un retiro de interés para un usuario,para </w:t>
             </w:r>
           </w:p>
           <w:p>
@@ -2610,19 +2478,11 @@
                 <w:lang w:val="es-ES"/>
               </w:rPr>
             </w:pPr>
-            <w:proofErr w:type="gramStart"/>
-            <w:r>
-              <w:rPr>
-                <w:lang w:val="es-ES"/>
-              </w:rPr>
-              <w:t>Registrar  la</w:t>
-            </w:r>
-            <w:proofErr w:type="gramEnd"/>
-            <w:r>
-              <w:rPr>
-                <w:lang w:val="es-ES"/>
-              </w:rPr>
-              <w:t xml:space="preserve"> persona que asistirá con el usuario a un retiro.</w:t>
+            <w:r>
+              <w:rPr>
+                <w:lang w:val="es-ES"/>
+              </w:rPr>
+              <w:t>Registrar  la persona que asistirá con el usuario a un retiro.</w:t>
             </w:r>
           </w:p>
         </w:tc>
@@ -3056,23 +2916,7 @@
               <w:rPr>
                 <w:lang w:val="es-ES"/>
               </w:rPr>
-              <w:t xml:space="preserve">Consultar los datos de un retiro </w:t>
-            </w:r>
-            <w:proofErr w:type="spellStart"/>
-            <w:proofErr w:type="gramStart"/>
-            <w:r>
-              <w:rPr>
-                <w:lang w:val="es-ES"/>
-              </w:rPr>
-              <w:t>agendado,según</w:t>
-            </w:r>
-            <w:proofErr w:type="spellEnd"/>
-            <w:proofErr w:type="gramEnd"/>
-            <w:r>
-              <w:rPr>
-                <w:lang w:val="es-ES"/>
-              </w:rPr>
-              <w:t xml:space="preserve"> </w:t>
+              <w:t xml:space="preserve">Consultar los datos de un retiro agendado,según </w:t>
             </w:r>
           </w:p>
           <w:p>
@@ -4106,16 +3950,2219 @@
       <w:pPr>
         <w:ind w:left="0"/>
         <w:rPr>
-          <w:lang w:val="es-ES"/>
+          <w:lang w:val="es-AR"/>
         </w:rPr>
       </w:pPr>
     </w:p>
     <w:p>
       <w:pPr>
+        <w:ind w:left="0"/>
         <w:rPr>
           <w:lang w:val="es-AR"/>
         </w:rPr>
       </w:pPr>
+    </w:p>
+    <w:p>
+      <w:pPr>
+        <w:pStyle w:val="Ttulo2"/>
+        <w:ind w:left="-283"/>
+        <w:rPr>
+          <w:rFonts w:ascii="Tahoma" w:eastAsia="Tahoma" w:hAnsi="Tahoma" w:cs="Tahoma"/>
+          <w:color w:val="333399"/>
+          <w:sz w:val="24"/>
+          <w:szCs w:val="24"/>
+          <w:lang w:val="es-AR"/>
+        </w:rPr>
+      </w:pPr>
+      <w:r>
+        <w:rPr>
+          <w:lang w:val="es-AR"/>
+        </w:rPr>
+        <w:t xml:space="preserve">PLANTILLA PARA DESCRIPCIÓN </w:t>
+      </w:r>
+      <w:r>
+        <w:rPr>
+          <w:lang w:val="es-AR"/>
+        </w:rPr>
+        <w:t>DE CASO DE USO: REGISTRAR RETIRO</w:t>
+      </w:r>
+    </w:p>
+    <w:tbl>
+      <w:tblPr>
+        <w:tblW w:w="10185" w:type="dxa"/>
+        <w:jc w:val="center"/>
+        <w:tblBorders>
+          <w:top w:val="single" w:sz="6" w:space="0" w:color="000000"/>
+          <w:left w:val="single" w:sz="6" w:space="0" w:color="000000"/>
+          <w:bottom w:val="single" w:sz="6" w:space="0" w:color="000000"/>
+          <w:right w:val="single" w:sz="6" w:space="0" w:color="000000"/>
+          <w:insideH w:val="single" w:sz="6" w:space="0" w:color="000000"/>
+          <w:insideV w:val="single" w:sz="6" w:space="0" w:color="000000"/>
+        </w:tblBorders>
+        <w:tblLayout w:type="fixed"/>
+        <w:tblLook w:val="0000" w:firstRow="0" w:lastRow="0" w:firstColumn="0" w:lastColumn="0" w:noHBand="0" w:noVBand="0"/>
+      </w:tblPr>
+      <w:tblGrid>
+        <w:gridCol w:w="4350"/>
+        <w:gridCol w:w="2055"/>
+        <w:gridCol w:w="600"/>
+        <w:gridCol w:w="3180"/>
+      </w:tblGrid>
+      <w:tr>
+        <w:trPr>
+          <w:cantSplit/>
+          <w:trHeight w:val="450"/>
+          <w:jc w:val="center"/>
+        </w:trPr>
+        <w:tc>
+          <w:tcPr>
+            <w:tcW w:w="10185" w:type="dxa"/>
+            <w:gridSpan w:val="4"/>
+          </w:tcPr>
+          <w:p>
+            <w:pPr>
+              <w:spacing w:after="0" w:line="240" w:lineRule="auto"/>
+              <w:ind w:left="0" w:right="0"/>
+              <w:jc w:val="left"/>
+              <w:rPr>
+                <w:rFonts w:ascii="Tahoma" w:eastAsia="Tahoma" w:hAnsi="Tahoma" w:cs="Tahoma"/>
+              </w:rPr>
+            </w:pPr>
+            <w:r>
+              <w:rPr>
+                <w:rFonts w:ascii="Tahoma" w:eastAsia="Tahoma" w:hAnsi="Tahoma" w:cs="Tahoma"/>
+                <w:b/>
+                <w:bCs/>
+                <w:sz w:val="20"/>
+                <w:szCs w:val="20"/>
+              </w:rPr>
+              <w:t>Paquete:</w:t>
+            </w:r>
+          </w:p>
+        </w:tc>
+      </w:tr>
+      <w:tr>
+        <w:trPr>
+          <w:cantSplit/>
+          <w:trHeight w:val="385"/>
+          <w:jc w:val="center"/>
+        </w:trPr>
+        <w:tc>
+          <w:tcPr>
+            <w:tcW w:w="7005" w:type="dxa"/>
+            <w:gridSpan w:val="3"/>
+            <w:shd w:val="clear" w:color="auto" w:fill="C0C0C0"/>
+          </w:tcPr>
+          <w:p>
+            <w:pPr>
+              <w:spacing w:after="0" w:line="240" w:lineRule="auto"/>
+              <w:ind w:left="0" w:right="0"/>
+              <w:jc w:val="left"/>
+              <w:rPr>
+                <w:rFonts w:ascii="Tahoma" w:eastAsia="Tahoma" w:hAnsi="Tahoma" w:cs="Tahoma"/>
+                <w:sz w:val="20"/>
+                <w:szCs w:val="20"/>
+                <w:lang w:val="es-AR"/>
+              </w:rPr>
+            </w:pPr>
+            <w:r>
+              <w:rPr>
+                <w:rFonts w:ascii="Tahoma" w:eastAsia="Tahoma" w:hAnsi="Tahoma" w:cs="Tahoma"/>
+                <w:b/>
+                <w:bCs/>
+                <w:sz w:val="20"/>
+                <w:szCs w:val="20"/>
+                <w:lang w:val="es-AR"/>
+              </w:rPr>
+              <w:t>Nombre del Use Case</w:t>
+            </w:r>
+            <w:r>
+              <w:rPr>
+                <w:rFonts w:ascii="Tahoma" w:eastAsia="Tahoma" w:hAnsi="Tahoma" w:cs="Tahoma"/>
+                <w:sz w:val="20"/>
+                <w:szCs w:val="20"/>
+                <w:lang w:val="es-AR"/>
+              </w:rPr>
+              <w:t>: Registrar retiro</w:t>
+            </w:r>
+          </w:p>
+        </w:tc>
+        <w:tc>
+          <w:tcPr>
+            <w:tcW w:w="3180" w:type="dxa"/>
+            <w:shd w:val="clear" w:color="auto" w:fill="C0C0C0"/>
+          </w:tcPr>
+          <w:p>
+            <w:pPr>
+              <w:spacing w:after="0" w:line="240" w:lineRule="auto"/>
+              <w:ind w:left="0" w:right="0"/>
+              <w:jc w:val="left"/>
+              <w:rPr>
+                <w:rFonts w:ascii="Tahoma" w:eastAsia="Tahoma" w:hAnsi="Tahoma" w:cs="Tahoma"/>
+                <w:sz w:val="20"/>
+                <w:szCs w:val="20"/>
+              </w:rPr>
+            </w:pPr>
+            <w:r>
+              <w:rPr>
+                <w:rFonts w:ascii="Tahoma" w:eastAsia="Tahoma" w:hAnsi="Tahoma" w:cs="Tahoma"/>
+                <w:b/>
+                <w:bCs/>
+                <w:sz w:val="20"/>
+                <w:szCs w:val="20"/>
+              </w:rPr>
+              <w:t>ID</w:t>
+            </w:r>
+            <w:r>
+              <w:rPr>
+                <w:rFonts w:ascii="Tahoma" w:eastAsia="Tahoma" w:hAnsi="Tahoma" w:cs="Tahoma"/>
+                <w:sz w:val="20"/>
+                <w:szCs w:val="20"/>
+              </w:rPr>
+              <w:t>: 1</w:t>
+            </w:r>
+          </w:p>
+        </w:tc>
+      </w:tr>
+      <w:tr>
+        <w:trPr>
+          <w:cantSplit/>
+          <w:trHeight w:val="385"/>
+          <w:jc w:val="center"/>
+        </w:trPr>
+        <w:tc>
+          <w:tcPr>
+            <w:tcW w:w="4350" w:type="dxa"/>
+          </w:tcPr>
+          <w:p>
+            <w:pPr>
+              <w:spacing w:after="0" w:line="240" w:lineRule="auto"/>
+              <w:ind w:left="0" w:right="0"/>
+              <w:jc w:val="left"/>
+              <w:rPr>
+                <w:rFonts w:ascii="Tahoma" w:eastAsia="Tahoma" w:hAnsi="Tahoma" w:cs="Tahoma"/>
+                <w:sz w:val="20"/>
+                <w:szCs w:val="20"/>
+              </w:rPr>
+            </w:pPr>
+            <w:r>
+              <w:rPr>
+                <w:rFonts w:ascii="Tahoma" w:eastAsia="Tahoma" w:hAnsi="Tahoma" w:cs="Tahoma"/>
+                <w:b/>
+                <w:bCs/>
+                <w:sz w:val="20"/>
+                <w:szCs w:val="20"/>
+              </w:rPr>
+              <w:t>Actor Principal</w:t>
+            </w:r>
+            <w:r>
+              <w:rPr>
+                <w:rFonts w:ascii="Tahoma" w:eastAsia="Tahoma" w:hAnsi="Tahoma" w:cs="Tahoma"/>
+                <w:sz w:val="20"/>
+                <w:szCs w:val="20"/>
+              </w:rPr>
+              <w:t>: Usuario</w:t>
+            </w:r>
+          </w:p>
+        </w:tc>
+        <w:tc>
+          <w:tcPr>
+            <w:tcW w:w="5835" w:type="dxa"/>
+            <w:gridSpan w:val="3"/>
+          </w:tcPr>
+          <w:p>
+            <w:pPr>
+              <w:spacing w:after="0" w:line="240" w:lineRule="auto"/>
+              <w:ind w:left="0" w:right="0"/>
+              <w:jc w:val="left"/>
+              <w:rPr>
+                <w:rFonts w:ascii="Tahoma" w:eastAsia="Tahoma" w:hAnsi="Tahoma" w:cs="Tahoma"/>
+                <w:sz w:val="20"/>
+                <w:szCs w:val="20"/>
+              </w:rPr>
+            </w:pPr>
+            <w:r>
+              <w:rPr>
+                <w:rFonts w:ascii="Tahoma" w:eastAsia="Tahoma" w:hAnsi="Tahoma" w:cs="Tahoma"/>
+                <w:b/>
+                <w:bCs/>
+                <w:sz w:val="20"/>
+                <w:szCs w:val="20"/>
+              </w:rPr>
+              <w:t>Actor Secundario</w:t>
+            </w:r>
+            <w:r>
+              <w:rPr>
+                <w:rFonts w:ascii="Tahoma" w:eastAsia="Tahoma" w:hAnsi="Tahoma" w:cs="Tahoma"/>
+                <w:sz w:val="20"/>
+                <w:szCs w:val="20"/>
+              </w:rPr>
+              <w:t>: No aplica</w:t>
+            </w:r>
+          </w:p>
+        </w:tc>
+      </w:tr>
+      <w:tr>
+        <w:trPr>
+          <w:cantSplit/>
+          <w:jc w:val="center"/>
+        </w:trPr>
+        <w:tc>
+          <w:tcPr>
+            <w:tcW w:w="10185" w:type="dxa"/>
+            <w:gridSpan w:val="4"/>
+          </w:tcPr>
+          <w:p>
+            <w:pPr>
+              <w:spacing w:after="0" w:line="240" w:lineRule="auto"/>
+              <w:ind w:left="0" w:right="0"/>
+              <w:jc w:val="left"/>
+              <w:rPr>
+                <w:rFonts w:ascii="Tahoma" w:eastAsia="Tahoma" w:hAnsi="Tahoma" w:cs="Tahoma"/>
+                <w:sz w:val="20"/>
+                <w:szCs w:val="20"/>
+                <w:lang w:val="es-AR"/>
+              </w:rPr>
+            </w:pPr>
+            <w:r>
+              <w:rPr>
+                <w:rFonts w:ascii="Tahoma" w:eastAsia="Tahoma" w:hAnsi="Tahoma" w:cs="Tahoma"/>
+                <w:b/>
+                <w:bCs/>
+                <w:sz w:val="20"/>
+                <w:szCs w:val="20"/>
+                <w:lang w:val="es-AR"/>
+              </w:rPr>
+              <w:lastRenderedPageBreak/>
+              <w:t>Tipo de Use Case</w:t>
+            </w:r>
+            <w:r>
+              <w:rPr>
+                <w:rFonts w:ascii="Tahoma" w:eastAsia="Tahoma" w:hAnsi="Tahoma" w:cs="Tahoma"/>
+                <w:sz w:val="20"/>
+                <w:szCs w:val="20"/>
+                <w:lang w:val="es-AR"/>
+              </w:rPr>
+              <w:t xml:space="preserve">:                  </w:t>
+            </w:r>
+            <w:r>
+              <w:rPr>
+                <w:rFonts w:ascii="Fira Mono" w:eastAsia="Fira Mono" w:hAnsi="Fira Mono" w:cs="Fira Mono"/>
+              </w:rPr>
+              <w:t>⬛</w:t>
+            </w:r>
+            <w:r>
+              <w:rPr>
+                <w:rFonts w:ascii="Tahoma" w:eastAsia="Tahoma" w:hAnsi="Tahoma" w:cs="Tahoma"/>
+                <w:sz w:val="20"/>
+                <w:szCs w:val="20"/>
+                <w:lang w:val="es-AR"/>
+              </w:rPr>
+              <w:t xml:space="preserve">  Concreto                                       </w:t>
+            </w:r>
+            <w:r>
+              <w:rPr>
+                <w:rFonts w:ascii="Arial Unicode MS" w:eastAsia="Arial Unicode MS" w:hAnsi="Arial Unicode MS" w:cs="Arial Unicode MS"/>
+                <w:lang w:val="es-AR"/>
+              </w:rPr>
+              <w:t>☐</w:t>
+            </w:r>
+            <w:r>
+              <w:rPr>
+                <w:rFonts w:ascii="Tahoma" w:eastAsia="Tahoma" w:hAnsi="Tahoma" w:cs="Tahoma"/>
+                <w:sz w:val="20"/>
+                <w:szCs w:val="20"/>
+                <w:lang w:val="es-AR"/>
+              </w:rPr>
+              <w:t xml:space="preserve">   Abstracto</w:t>
+            </w:r>
+          </w:p>
+          <w:p>
+            <w:pPr>
+              <w:spacing w:after="0" w:line="240" w:lineRule="auto"/>
+              <w:ind w:left="0" w:right="0"/>
+              <w:jc w:val="left"/>
+              <w:rPr>
+                <w:rFonts w:ascii="Tahoma" w:eastAsia="Tahoma" w:hAnsi="Tahoma" w:cs="Tahoma"/>
+                <w:sz w:val="20"/>
+                <w:szCs w:val="20"/>
+                <w:lang w:val="es-AR"/>
+              </w:rPr>
+            </w:pPr>
+          </w:p>
+        </w:tc>
+      </w:tr>
+      <w:tr>
+        <w:trPr>
+          <w:cantSplit/>
+          <w:jc w:val="center"/>
+        </w:trPr>
+        <w:tc>
+          <w:tcPr>
+            <w:tcW w:w="10185" w:type="dxa"/>
+            <w:gridSpan w:val="4"/>
+          </w:tcPr>
+          <w:p>
+            <w:pPr>
+              <w:spacing w:after="0" w:line="240" w:lineRule="auto"/>
+              <w:ind w:left="0" w:right="0"/>
+              <w:jc w:val="left"/>
+              <w:rPr>
+                <w:rFonts w:ascii="Tahoma" w:eastAsia="Tahoma" w:hAnsi="Tahoma" w:cs="Tahoma"/>
+                <w:sz w:val="20"/>
+                <w:szCs w:val="20"/>
+                <w:lang w:val="es-AR"/>
+              </w:rPr>
+            </w:pPr>
+            <w:r>
+              <w:rPr>
+                <w:rFonts w:ascii="Tahoma" w:eastAsia="Tahoma" w:hAnsi="Tahoma" w:cs="Tahoma"/>
+                <w:b/>
+                <w:bCs/>
+                <w:sz w:val="20"/>
+                <w:szCs w:val="20"/>
+                <w:lang w:val="es-AR"/>
+              </w:rPr>
+              <w:t>Objetivo</w:t>
+            </w:r>
+            <w:r>
+              <w:rPr>
+                <w:rFonts w:ascii="Tahoma" w:eastAsia="Tahoma" w:hAnsi="Tahoma" w:cs="Tahoma"/>
+                <w:sz w:val="20"/>
+                <w:szCs w:val="20"/>
+                <w:lang w:val="es-AR"/>
+              </w:rPr>
+              <w:t>: Registrar la información de un nuevo retiro holístico de interés solicitado por el usuario, asociando su temática, organizador de contacto, actividades planificadas, costo total y condición de cancelación, asignándole el estado inicial "Registrado" y vinculándolo al usuario logueado para su seguimiento.</w:t>
+            </w:r>
+          </w:p>
+          <w:p>
+            <w:pPr>
+              <w:spacing w:after="0" w:line="240" w:lineRule="auto"/>
+              <w:ind w:left="0" w:right="0"/>
+              <w:jc w:val="center"/>
+              <w:rPr>
+                <w:rFonts w:ascii="Tahoma" w:eastAsia="Tahoma" w:hAnsi="Tahoma" w:cs="Tahoma"/>
+                <w:sz w:val="20"/>
+                <w:szCs w:val="20"/>
+                <w:lang w:val="es-AR"/>
+              </w:rPr>
+            </w:pPr>
+          </w:p>
+        </w:tc>
+      </w:tr>
+      <w:tr>
+        <w:trPr>
+          <w:jc w:val="center"/>
+        </w:trPr>
+        <w:tc>
+          <w:tcPr>
+            <w:tcW w:w="10185" w:type="dxa"/>
+            <w:gridSpan w:val="4"/>
+            <w:shd w:val="clear" w:color="auto" w:fill="BFBFBF"/>
+          </w:tcPr>
+          <w:p>
+            <w:pPr>
+              <w:keepNext/>
+              <w:spacing w:after="0" w:line="240" w:lineRule="auto"/>
+              <w:ind w:left="0" w:right="0"/>
+              <w:jc w:val="left"/>
+              <w:rPr>
+                <w:rFonts w:ascii="Tahoma" w:eastAsia="Tahoma" w:hAnsi="Tahoma" w:cs="Tahoma"/>
+                <w:b/>
+                <w:bCs/>
+                <w:sz w:val="20"/>
+                <w:szCs w:val="20"/>
+              </w:rPr>
+            </w:pPr>
+            <w:r>
+              <w:rPr>
+                <w:rFonts w:ascii="Tahoma" w:eastAsia="Tahoma" w:hAnsi="Tahoma" w:cs="Tahoma"/>
+                <w:b/>
+                <w:bCs/>
+                <w:sz w:val="20"/>
+                <w:szCs w:val="20"/>
+              </w:rPr>
+              <w:t xml:space="preserve">Flujo </w:t>
+            </w:r>
+            <w:r>
+              <w:rPr>
+                <w:rFonts w:ascii="Tahoma" w:eastAsia="Tahoma" w:hAnsi="Tahoma" w:cs="Tahoma"/>
+                <w:b/>
+                <w:bCs/>
+                <w:sz w:val="20"/>
+                <w:szCs w:val="20"/>
+              </w:rPr>
+              <w:t>Básico:</w:t>
+            </w:r>
+          </w:p>
+          <w:p>
+            <w:pPr>
+              <w:spacing w:after="0" w:line="240" w:lineRule="auto"/>
+              <w:ind w:left="0" w:right="0"/>
+              <w:jc w:val="left"/>
+              <w:rPr>
+                <w:rFonts w:ascii="Times New Roman" w:eastAsia="Times New Roman" w:hAnsi="Times New Roman" w:cs="Times New Roman"/>
+              </w:rPr>
+            </w:pPr>
+          </w:p>
+        </w:tc>
+      </w:tr>
+      <w:tr>
+        <w:trPr>
+          <w:jc w:val="center"/>
+        </w:trPr>
+        <w:tc>
+          <w:tcPr>
+            <w:tcW w:w="10185" w:type="dxa"/>
+            <w:gridSpan w:val="4"/>
+          </w:tcPr>
+          <w:p>
+            <w:pPr>
+              <w:spacing w:after="0" w:line="240" w:lineRule="auto"/>
+              <w:ind w:left="0" w:right="0"/>
+              <w:rPr>
+                <w:rFonts w:ascii="Tahoma" w:eastAsia="Tahoma" w:hAnsi="Tahoma" w:cs="Tahoma"/>
+                <w:sz w:val="20"/>
+                <w:szCs w:val="20"/>
+                <w:lang w:val="es-AR"/>
+              </w:rPr>
+            </w:pPr>
+            <w:r>
+              <w:rPr>
+                <w:rFonts w:ascii="Tahoma" w:eastAsia="Tahoma" w:hAnsi="Tahoma" w:cs="Tahoma"/>
+                <w:sz w:val="20"/>
+                <w:szCs w:val="20"/>
+                <w:lang w:val="es-AR"/>
+              </w:rPr>
+              <w:t>1. El caso de uso comienza cuando el Usuario selecciona la opción “Nuevo retiro”.</w:t>
+            </w:r>
+          </w:p>
+        </w:tc>
+      </w:tr>
+      <w:tr>
+        <w:trPr>
+          <w:jc w:val="center"/>
+        </w:trPr>
+        <w:tc>
+          <w:tcPr>
+            <w:tcW w:w="10185" w:type="dxa"/>
+            <w:gridSpan w:val="4"/>
+          </w:tcPr>
+          <w:p>
+            <w:pPr>
+              <w:spacing w:after="0" w:line="240" w:lineRule="auto"/>
+              <w:ind w:left="0" w:right="0"/>
+              <w:rPr>
+                <w:rFonts w:ascii="Tahoma" w:eastAsia="Tahoma" w:hAnsi="Tahoma" w:cs="Tahoma"/>
+                <w:sz w:val="20"/>
+                <w:szCs w:val="20"/>
+                <w:lang w:val="es-AR"/>
+              </w:rPr>
+            </w:pPr>
+            <w:r>
+              <w:rPr>
+                <w:rFonts w:ascii="Tahoma" w:eastAsia="Tahoma" w:hAnsi="Tahoma" w:cs="Tahoma"/>
+                <w:sz w:val="20"/>
+                <w:szCs w:val="20"/>
+                <w:lang w:val="es-AR"/>
+              </w:rPr>
+              <w:t>2. El sistema muestra la fecha y hora actual y los datos del usuario logueado (nombre, email y teléfono).</w:t>
+            </w:r>
+          </w:p>
+        </w:tc>
+      </w:tr>
+      <w:tr>
+        <w:trPr>
+          <w:jc w:val="center"/>
+        </w:trPr>
+        <w:tc>
+          <w:tcPr>
+            <w:tcW w:w="10185" w:type="dxa"/>
+            <w:gridSpan w:val="4"/>
+          </w:tcPr>
+          <w:p>
+            <w:pPr>
+              <w:spacing w:after="0" w:line="240" w:lineRule="auto"/>
+              <w:ind w:left="0" w:right="0"/>
+              <w:rPr>
+                <w:rFonts w:ascii="Tahoma" w:eastAsia="Tahoma" w:hAnsi="Tahoma" w:cs="Tahoma"/>
+                <w:sz w:val="20"/>
+                <w:szCs w:val="20"/>
+                <w:lang w:val="es-AR"/>
+              </w:rPr>
+            </w:pPr>
+            <w:r>
+              <w:rPr>
+                <w:rFonts w:ascii="Tahoma" w:eastAsia="Tahoma" w:hAnsi="Tahoma" w:cs="Tahoma"/>
+                <w:sz w:val="20"/>
+                <w:szCs w:val="20"/>
+                <w:lang w:val="es-AR"/>
+              </w:rPr>
+              <w:t>3. El sistema solicita el ingreso de los datos básicos del retiro (nombre, costo total, fecha de inicio, fecha de fin, ubicación, descripción, y si es cancelable).</w:t>
+            </w:r>
+          </w:p>
+        </w:tc>
+      </w:tr>
+      <w:tr>
+        <w:trPr>
+          <w:jc w:val="center"/>
+        </w:trPr>
+        <w:tc>
+          <w:tcPr>
+            <w:tcW w:w="10185" w:type="dxa"/>
+            <w:gridSpan w:val="4"/>
+          </w:tcPr>
+          <w:p>
+            <w:pPr>
+              <w:tabs>
+                <w:tab w:val="center" w:pos="4252"/>
+                <w:tab w:val="right" w:pos="8504"/>
+              </w:tabs>
+              <w:spacing w:after="0" w:line="240" w:lineRule="auto"/>
+              <w:ind w:left="0" w:right="0"/>
+              <w:jc w:val="left"/>
+              <w:rPr>
+                <w:rFonts w:ascii="Tahoma" w:eastAsia="Tahoma" w:hAnsi="Tahoma" w:cs="Tahoma"/>
+                <w:sz w:val="20"/>
+                <w:szCs w:val="20"/>
+                <w:lang w:val="es-AR"/>
+              </w:rPr>
+            </w:pPr>
+            <w:r>
+              <w:rPr>
+                <w:rFonts w:ascii="Tahoma" w:eastAsia="Tahoma" w:hAnsi="Tahoma" w:cs="Tahoma"/>
+                <w:sz w:val="20"/>
+                <w:szCs w:val="20"/>
+                <w:lang w:val="es-AR"/>
+              </w:rPr>
+              <w:t>4. El Usuario ingresa los datos básicos del retiro.</w:t>
+            </w:r>
+          </w:p>
+        </w:tc>
+      </w:tr>
+      <w:tr>
+        <w:trPr>
+          <w:trHeight w:val="286"/>
+          <w:jc w:val="center"/>
+        </w:trPr>
+        <w:tc>
+          <w:tcPr>
+            <w:tcW w:w="10185" w:type="dxa"/>
+            <w:gridSpan w:val="4"/>
+          </w:tcPr>
+          <w:p>
+            <w:pPr>
+              <w:tabs>
+                <w:tab w:val="center" w:pos="4252"/>
+                <w:tab w:val="right" w:pos="8504"/>
+              </w:tabs>
+              <w:spacing w:after="0" w:line="240" w:lineRule="auto"/>
+              <w:ind w:left="0" w:right="0"/>
+              <w:jc w:val="left"/>
+              <w:rPr>
+                <w:rFonts w:ascii="Tahoma" w:eastAsia="Tahoma" w:hAnsi="Tahoma" w:cs="Tahoma"/>
+                <w:sz w:val="20"/>
+                <w:szCs w:val="20"/>
+                <w:lang w:val="es-AR"/>
+              </w:rPr>
+            </w:pPr>
+            <w:r>
+              <w:rPr>
+                <w:rFonts w:ascii="Tahoma" w:eastAsia="Tahoma" w:hAnsi="Tahoma" w:cs="Tahoma"/>
+                <w:sz w:val="20"/>
+                <w:szCs w:val="20"/>
+                <w:lang w:val="es-AR"/>
+              </w:rPr>
+              <w:t xml:space="preserve">5. El sistema busca y muestra la lista de temáticas disponibles. </w:t>
+            </w:r>
+          </w:p>
+        </w:tc>
+      </w:tr>
+      <w:tr>
+        <w:trPr>
+          <w:jc w:val="center"/>
+        </w:trPr>
+        <w:tc>
+          <w:tcPr>
+            <w:tcW w:w="10185" w:type="dxa"/>
+            <w:gridSpan w:val="4"/>
+          </w:tcPr>
+          <w:p>
+            <w:pPr>
+              <w:tabs>
+                <w:tab w:val="center" w:pos="4252"/>
+                <w:tab w:val="right" w:pos="8504"/>
+              </w:tabs>
+              <w:spacing w:after="0" w:line="240" w:lineRule="auto"/>
+              <w:ind w:left="0" w:right="0"/>
+              <w:jc w:val="left"/>
+              <w:rPr>
+                <w:rFonts w:ascii="Tahoma" w:eastAsia="Tahoma" w:hAnsi="Tahoma" w:cs="Tahoma"/>
+                <w:sz w:val="20"/>
+                <w:szCs w:val="20"/>
+                <w:lang w:val="es-AR"/>
+              </w:rPr>
+            </w:pPr>
+            <w:r>
+              <w:rPr>
+                <w:rFonts w:ascii="Tahoma" w:eastAsia="Tahoma" w:hAnsi="Tahoma" w:cs="Tahoma"/>
+                <w:sz w:val="20"/>
+                <w:szCs w:val="20"/>
+                <w:lang w:val="es-AR"/>
+              </w:rPr>
+              <w:t>6. El Usuario selecciona la temática correspondiente.</w:t>
+            </w:r>
+          </w:p>
+        </w:tc>
+      </w:tr>
+      <w:tr>
+        <w:trPr>
+          <w:jc w:val="center"/>
+        </w:trPr>
+        <w:tc>
+          <w:tcPr>
+            <w:tcW w:w="10185" w:type="dxa"/>
+            <w:gridSpan w:val="4"/>
+          </w:tcPr>
+          <w:p>
+            <w:pPr>
+              <w:tabs>
+                <w:tab w:val="center" w:pos="4252"/>
+                <w:tab w:val="right" w:pos="8504"/>
+              </w:tabs>
+              <w:spacing w:after="0" w:line="240" w:lineRule="auto"/>
+              <w:ind w:left="0" w:right="0"/>
+              <w:jc w:val="left"/>
+              <w:rPr>
+                <w:rFonts w:ascii="Tahoma" w:eastAsia="Tahoma" w:hAnsi="Tahoma" w:cs="Tahoma"/>
+                <w:sz w:val="20"/>
+                <w:szCs w:val="20"/>
+                <w:lang w:val="es-AR"/>
+              </w:rPr>
+            </w:pPr>
+            <w:r>
+              <w:rPr>
+                <w:rFonts w:ascii="Tahoma" w:eastAsia="Tahoma" w:hAnsi="Tahoma" w:cs="Tahoma"/>
+                <w:sz w:val="20"/>
+                <w:szCs w:val="20"/>
+                <w:lang w:val="es-AR"/>
+              </w:rPr>
+              <w:t xml:space="preserve">7. El sistema busca y muestra la lista de organizadores. </w:t>
+            </w:r>
+          </w:p>
+        </w:tc>
+      </w:tr>
+      <w:tr>
+        <w:trPr>
+          <w:jc w:val="center"/>
+        </w:trPr>
+        <w:tc>
+          <w:tcPr>
+            <w:tcW w:w="10185" w:type="dxa"/>
+            <w:gridSpan w:val="4"/>
+          </w:tcPr>
+          <w:p>
+            <w:pPr>
+              <w:tabs>
+                <w:tab w:val="center" w:pos="4252"/>
+                <w:tab w:val="right" w:pos="8504"/>
+              </w:tabs>
+              <w:spacing w:after="0" w:line="240" w:lineRule="auto"/>
+              <w:ind w:left="0" w:right="0"/>
+              <w:jc w:val="left"/>
+              <w:rPr>
+                <w:rFonts w:ascii="Tahoma" w:eastAsia="Tahoma" w:hAnsi="Tahoma" w:cs="Tahoma"/>
+                <w:sz w:val="20"/>
+                <w:szCs w:val="20"/>
+                <w:lang w:val="es-AR"/>
+              </w:rPr>
+            </w:pPr>
+            <w:r>
+              <w:rPr>
+                <w:rFonts w:ascii="Tahoma" w:eastAsia="Tahoma" w:hAnsi="Tahoma" w:cs="Tahoma"/>
+                <w:sz w:val="20"/>
+                <w:szCs w:val="20"/>
+                <w:lang w:val="es-AR"/>
+              </w:rPr>
+              <w:t>8. El Usuario selecciona un organizador.</w:t>
+            </w:r>
+          </w:p>
+        </w:tc>
+      </w:tr>
+      <w:tr>
+        <w:trPr>
+          <w:trHeight w:val="196"/>
+          <w:jc w:val="center"/>
+        </w:trPr>
+        <w:tc>
+          <w:tcPr>
+            <w:tcW w:w="10185" w:type="dxa"/>
+            <w:gridSpan w:val="4"/>
+          </w:tcPr>
+          <w:p>
+            <w:pPr>
+              <w:tabs>
+                <w:tab w:val="center" w:pos="4252"/>
+                <w:tab w:val="right" w:pos="8504"/>
+              </w:tabs>
+              <w:spacing w:after="0" w:line="240" w:lineRule="auto"/>
+              <w:ind w:left="0" w:right="0"/>
+              <w:jc w:val="left"/>
+              <w:rPr>
+                <w:rFonts w:ascii="Tahoma" w:eastAsia="Tahoma" w:hAnsi="Tahoma" w:cs="Tahoma"/>
+                <w:sz w:val="20"/>
+                <w:szCs w:val="20"/>
+                <w:lang w:val="es-AR"/>
+              </w:rPr>
+            </w:pPr>
+            <w:r>
+              <w:rPr>
+                <w:rFonts w:ascii="Tahoma" w:eastAsia="Tahoma" w:hAnsi="Tahoma" w:cs="Tahoma"/>
+                <w:sz w:val="20"/>
+                <w:szCs w:val="20"/>
+                <w:lang w:val="es-AR"/>
+              </w:rPr>
+              <w:t xml:space="preserve">9. El sistema muestra la lista de actividades disponibles. </w:t>
+            </w:r>
+          </w:p>
+        </w:tc>
+      </w:tr>
+      <w:tr>
+        <w:trPr>
+          <w:jc w:val="center"/>
+        </w:trPr>
+        <w:tc>
+          <w:tcPr>
+            <w:tcW w:w="10185" w:type="dxa"/>
+            <w:gridSpan w:val="4"/>
+          </w:tcPr>
+          <w:p>
+            <w:pPr>
+              <w:tabs>
+                <w:tab w:val="center" w:pos="4252"/>
+                <w:tab w:val="right" w:pos="8504"/>
+              </w:tabs>
+              <w:spacing w:after="0" w:line="240" w:lineRule="auto"/>
+              <w:ind w:left="0" w:right="0"/>
+              <w:jc w:val="left"/>
+              <w:rPr>
+                <w:rFonts w:ascii="Tahoma" w:eastAsia="Tahoma" w:hAnsi="Tahoma" w:cs="Tahoma"/>
+                <w:b/>
+                <w:bCs/>
+                <w:sz w:val="20"/>
+                <w:szCs w:val="20"/>
+                <w:highlight w:val="yellow"/>
+                <w:lang w:val="es-AR"/>
+              </w:rPr>
+            </w:pPr>
+            <w:r>
+              <w:rPr>
+                <w:rFonts w:ascii="Tahoma" w:eastAsia="Tahoma" w:hAnsi="Tahoma" w:cs="Tahoma"/>
+                <w:sz w:val="20"/>
+                <w:szCs w:val="20"/>
+                <w:lang w:val="es-AR"/>
+              </w:rPr>
+              <w:t>10. El Usuario selecciona la/s actividad/es correspondiente/s.</w:t>
+            </w:r>
+          </w:p>
+        </w:tc>
+      </w:tr>
+      <w:tr>
+        <w:trPr>
+          <w:jc w:val="center"/>
+        </w:trPr>
+        <w:tc>
+          <w:tcPr>
+            <w:tcW w:w="10185" w:type="dxa"/>
+            <w:gridSpan w:val="4"/>
+          </w:tcPr>
+          <w:p>
+            <w:pPr>
+              <w:tabs>
+                <w:tab w:val="center" w:pos="4252"/>
+                <w:tab w:val="right" w:pos="8504"/>
+              </w:tabs>
+              <w:spacing w:after="0" w:line="240" w:lineRule="auto"/>
+              <w:ind w:left="0" w:right="0"/>
+              <w:jc w:val="left"/>
+              <w:rPr>
+                <w:rFonts w:ascii="Tahoma" w:eastAsia="Tahoma" w:hAnsi="Tahoma" w:cs="Tahoma"/>
+                <w:b/>
+                <w:bCs/>
+                <w:sz w:val="20"/>
+                <w:szCs w:val="20"/>
+                <w:highlight w:val="yellow"/>
+                <w:lang w:val="es-AR"/>
+              </w:rPr>
+            </w:pPr>
+            <w:r>
+              <w:rPr>
+                <w:rFonts w:ascii="Tahoma" w:eastAsia="Tahoma" w:hAnsi="Tahoma" w:cs="Tahoma"/>
+                <w:sz w:val="20"/>
+                <w:szCs w:val="20"/>
+                <w:lang w:val="es-AR"/>
+              </w:rPr>
+              <w:t>11. El sistema solicita indicar si asistirá con acompañantes.</w:t>
+            </w:r>
+          </w:p>
+        </w:tc>
+      </w:tr>
+      <w:tr>
+        <w:trPr>
+          <w:jc w:val="center"/>
+        </w:trPr>
+        <w:tc>
+          <w:tcPr>
+            <w:tcW w:w="10185" w:type="dxa"/>
+            <w:gridSpan w:val="4"/>
+          </w:tcPr>
+          <w:p>
+            <w:pPr>
+              <w:tabs>
+                <w:tab w:val="center" w:pos="4252"/>
+                <w:tab w:val="right" w:pos="8504"/>
+              </w:tabs>
+              <w:spacing w:after="0" w:line="240" w:lineRule="auto"/>
+              <w:ind w:left="0" w:right="0"/>
+              <w:jc w:val="left"/>
+              <w:rPr>
+                <w:rFonts w:ascii="Tahoma" w:eastAsia="Tahoma" w:hAnsi="Tahoma" w:cs="Tahoma"/>
+                <w:sz w:val="20"/>
+                <w:szCs w:val="20"/>
+                <w:lang w:val="es-AR"/>
+              </w:rPr>
+            </w:pPr>
+            <w:r>
+              <w:rPr>
+                <w:rFonts w:ascii="Tahoma" w:eastAsia="Tahoma" w:hAnsi="Tahoma" w:cs="Tahoma"/>
+                <w:sz w:val="20"/>
+                <w:szCs w:val="20"/>
+                <w:lang w:val="es-AR"/>
+              </w:rPr>
+              <w:t>12. El Usuario indica que sí asistirá con acompañante.</w:t>
+            </w:r>
+          </w:p>
+        </w:tc>
+      </w:tr>
+      <w:tr>
+        <w:trPr>
+          <w:jc w:val="center"/>
+        </w:trPr>
+        <w:tc>
+          <w:tcPr>
+            <w:tcW w:w="10185" w:type="dxa"/>
+            <w:gridSpan w:val="4"/>
+          </w:tcPr>
+          <w:p>
+            <w:pPr>
+              <w:tabs>
+                <w:tab w:val="center" w:pos="4252"/>
+                <w:tab w:val="right" w:pos="8504"/>
+              </w:tabs>
+              <w:spacing w:after="0" w:line="240" w:lineRule="auto"/>
+              <w:ind w:left="0" w:right="0"/>
+              <w:jc w:val="left"/>
+              <w:rPr>
+                <w:rFonts w:ascii="Tahoma" w:eastAsia="Tahoma" w:hAnsi="Tahoma" w:cs="Tahoma"/>
+                <w:sz w:val="20"/>
+                <w:szCs w:val="20"/>
+                <w:lang w:val="es-AR"/>
+              </w:rPr>
+            </w:pPr>
+            <w:r>
+              <w:rPr>
+                <w:rFonts w:ascii="Tahoma" w:eastAsia="Tahoma" w:hAnsi="Tahoma" w:cs="Tahoma"/>
+                <w:sz w:val="20"/>
+                <w:szCs w:val="20"/>
+                <w:lang w:val="es-AR"/>
+              </w:rPr>
+              <w:t xml:space="preserve">13.El sistema busca y muestra la lista de acompañantes registrados. </w:t>
+            </w:r>
+          </w:p>
+        </w:tc>
+      </w:tr>
+      <w:tr>
+        <w:trPr>
+          <w:jc w:val="center"/>
+        </w:trPr>
+        <w:tc>
+          <w:tcPr>
+            <w:tcW w:w="10185" w:type="dxa"/>
+            <w:gridSpan w:val="4"/>
+          </w:tcPr>
+          <w:p>
+            <w:pPr>
+              <w:tabs>
+                <w:tab w:val="center" w:pos="4252"/>
+                <w:tab w:val="right" w:pos="8504"/>
+              </w:tabs>
+              <w:spacing w:after="0" w:line="240" w:lineRule="auto"/>
+              <w:ind w:left="0" w:right="0"/>
+              <w:jc w:val="left"/>
+              <w:rPr>
+                <w:rFonts w:ascii="Tahoma" w:eastAsia="Tahoma" w:hAnsi="Tahoma" w:cs="Tahoma"/>
+                <w:sz w:val="20"/>
+                <w:szCs w:val="20"/>
+                <w:lang w:val="es-AR"/>
+              </w:rPr>
+            </w:pPr>
+            <w:r>
+              <w:rPr>
+                <w:rFonts w:ascii="Tahoma" w:eastAsia="Tahoma" w:hAnsi="Tahoma" w:cs="Tahoma"/>
+                <w:sz w:val="20"/>
+                <w:szCs w:val="20"/>
+                <w:lang w:val="es-AR"/>
+              </w:rPr>
+              <w:t>14.  El Usuario selecciona el/los acompañante/s.</w:t>
+            </w:r>
+          </w:p>
+        </w:tc>
+      </w:tr>
+      <w:tr>
+        <w:trPr>
+          <w:jc w:val="center"/>
+        </w:trPr>
+        <w:tc>
+          <w:tcPr>
+            <w:tcW w:w="10185" w:type="dxa"/>
+            <w:gridSpan w:val="4"/>
+          </w:tcPr>
+          <w:p>
+            <w:pPr>
+              <w:tabs>
+                <w:tab w:val="center" w:pos="4252"/>
+                <w:tab w:val="right" w:pos="8504"/>
+              </w:tabs>
+              <w:spacing w:after="0" w:line="240" w:lineRule="auto"/>
+              <w:ind w:left="0" w:right="0"/>
+              <w:jc w:val="left"/>
+              <w:rPr>
+                <w:rFonts w:ascii="Tahoma" w:eastAsia="Tahoma" w:hAnsi="Tahoma" w:cs="Tahoma"/>
+                <w:sz w:val="20"/>
+                <w:szCs w:val="20"/>
+                <w:lang w:val="es-AR"/>
+              </w:rPr>
+            </w:pPr>
+            <w:r>
+              <w:rPr>
+                <w:rFonts w:ascii="Tahoma" w:eastAsia="Tahoma" w:hAnsi="Tahoma" w:cs="Tahoma"/>
+                <w:sz w:val="20"/>
+                <w:szCs w:val="20"/>
+                <w:lang w:val="es-AR"/>
+              </w:rPr>
+              <w:t>15. El sistema muestra el resumen completo del retiro (datos generales, temática, organizador, lista de actividades, acompañantes y costo total).</w:t>
+            </w:r>
+          </w:p>
+        </w:tc>
+      </w:tr>
+      <w:tr>
+        <w:trPr>
+          <w:jc w:val="center"/>
+        </w:trPr>
+        <w:tc>
+          <w:tcPr>
+            <w:tcW w:w="10185" w:type="dxa"/>
+            <w:gridSpan w:val="4"/>
+          </w:tcPr>
+          <w:p>
+            <w:pPr>
+              <w:tabs>
+                <w:tab w:val="center" w:pos="4252"/>
+                <w:tab w:val="right" w:pos="8504"/>
+              </w:tabs>
+              <w:spacing w:after="0" w:line="240" w:lineRule="auto"/>
+              <w:ind w:left="0" w:right="0"/>
+              <w:jc w:val="left"/>
+              <w:rPr>
+                <w:rFonts w:ascii="Tahoma" w:eastAsia="Tahoma" w:hAnsi="Tahoma" w:cs="Tahoma"/>
+                <w:sz w:val="20"/>
+                <w:szCs w:val="20"/>
+                <w:highlight w:val="red"/>
+                <w:lang w:val="es-AR"/>
+              </w:rPr>
+            </w:pPr>
+            <w:r>
+              <w:rPr>
+                <w:rFonts w:ascii="Tahoma" w:eastAsia="Tahoma" w:hAnsi="Tahoma" w:cs="Tahoma"/>
+                <w:sz w:val="20"/>
+                <w:szCs w:val="20"/>
+                <w:lang w:val="es-AR"/>
+              </w:rPr>
+              <w:t>16. El usuario confirma la operación de registro seleccionando la opción “Confirmar y registrar retiro”.</w:t>
+            </w:r>
+          </w:p>
+        </w:tc>
+      </w:tr>
+      <w:tr>
+        <w:trPr>
+          <w:jc w:val="center"/>
+        </w:trPr>
+        <w:tc>
+          <w:tcPr>
+            <w:tcW w:w="10185" w:type="dxa"/>
+            <w:gridSpan w:val="4"/>
+          </w:tcPr>
+          <w:p>
+            <w:pPr>
+              <w:tabs>
+                <w:tab w:val="center" w:pos="4252"/>
+                <w:tab w:val="right" w:pos="8504"/>
+              </w:tabs>
+              <w:spacing w:after="0" w:line="240" w:lineRule="auto"/>
+              <w:ind w:left="0" w:right="0"/>
+              <w:jc w:val="left"/>
+              <w:rPr>
+                <w:rFonts w:ascii="Tahoma" w:eastAsia="Tahoma" w:hAnsi="Tahoma" w:cs="Tahoma"/>
+                <w:sz w:val="20"/>
+                <w:szCs w:val="20"/>
+                <w:lang w:val="es-AR"/>
+              </w:rPr>
+            </w:pPr>
+            <w:r>
+              <w:rPr>
+                <w:rFonts w:ascii="Tahoma" w:eastAsia="Tahoma" w:hAnsi="Tahoma" w:cs="Tahoma"/>
+                <w:sz w:val="20"/>
+                <w:szCs w:val="20"/>
+                <w:lang w:val="es-AR"/>
+              </w:rPr>
+              <w:t>17. El sistema registra un nuevo retiro con los siguientes datos: nombre, costo total, fecha de inicio, fecha de fin, ubicación, descripción, condición de cancelable, temática asociada, organizador asociado, actividades asociadas, acompañantes asociados (si los hubiere), estado asignado (“Registrado”) y asociado al usuario logueado.</w:t>
+            </w:r>
+          </w:p>
+        </w:tc>
+      </w:tr>
+      <w:tr>
+        <w:trPr>
+          <w:jc w:val="center"/>
+        </w:trPr>
+        <w:tc>
+          <w:tcPr>
+            <w:tcW w:w="10185" w:type="dxa"/>
+            <w:gridSpan w:val="4"/>
+          </w:tcPr>
+          <w:p>
+            <w:pPr>
+              <w:tabs>
+                <w:tab w:val="center" w:pos="4252"/>
+                <w:tab w:val="right" w:pos="8504"/>
+              </w:tabs>
+              <w:spacing w:after="0" w:line="240" w:lineRule="auto"/>
+              <w:ind w:left="0" w:right="0"/>
+              <w:jc w:val="left"/>
+              <w:rPr>
+                <w:rFonts w:ascii="Tahoma" w:eastAsia="Tahoma" w:hAnsi="Tahoma" w:cs="Tahoma"/>
+                <w:sz w:val="20"/>
+                <w:szCs w:val="20"/>
+                <w:lang w:val="es-AR"/>
+              </w:rPr>
+            </w:pPr>
+            <w:r>
+              <w:rPr>
+                <w:rFonts w:ascii="Tahoma" w:eastAsia="Tahoma" w:hAnsi="Tahoma" w:cs="Tahoma"/>
+                <w:sz w:val="20"/>
+                <w:szCs w:val="20"/>
+                <w:lang w:val="es-AR"/>
+              </w:rPr>
+              <w:t>18. El sistema muestra un mensaje de confirmación de registro exitoso.</w:t>
+            </w:r>
+          </w:p>
+        </w:tc>
+      </w:tr>
+      <w:tr>
+        <w:trPr>
+          <w:jc w:val="center"/>
+        </w:trPr>
+        <w:tc>
+          <w:tcPr>
+            <w:tcW w:w="10185" w:type="dxa"/>
+            <w:gridSpan w:val="4"/>
+          </w:tcPr>
+          <w:p>
+            <w:pPr>
+              <w:tabs>
+                <w:tab w:val="center" w:pos="4252"/>
+                <w:tab w:val="right" w:pos="8504"/>
+              </w:tabs>
+              <w:spacing w:after="0" w:line="240" w:lineRule="auto"/>
+              <w:ind w:left="0" w:right="0"/>
+              <w:jc w:val="left"/>
+              <w:rPr>
+                <w:rFonts w:ascii="Tahoma" w:eastAsia="Tahoma" w:hAnsi="Tahoma" w:cs="Tahoma"/>
+                <w:sz w:val="20"/>
+                <w:szCs w:val="20"/>
+                <w:lang w:val="es-AR"/>
+              </w:rPr>
+            </w:pPr>
+            <w:r>
+              <w:rPr>
+                <w:rFonts w:ascii="Tahoma" w:eastAsia="Tahoma" w:hAnsi="Tahoma" w:cs="Tahoma"/>
+                <w:sz w:val="20"/>
+                <w:szCs w:val="20"/>
+                <w:lang w:val="es-AR"/>
+              </w:rPr>
+              <w:t>19. Fin del caso de uso.</w:t>
+            </w:r>
+          </w:p>
+        </w:tc>
+      </w:tr>
+      <w:tr>
+        <w:trPr>
+          <w:jc w:val="center"/>
+        </w:trPr>
+        <w:tc>
+          <w:tcPr>
+            <w:tcW w:w="10185" w:type="dxa"/>
+            <w:gridSpan w:val="4"/>
+            <w:shd w:val="clear" w:color="auto" w:fill="BFBFBF"/>
+          </w:tcPr>
+          <w:p>
+            <w:pPr>
+              <w:keepNext/>
+              <w:spacing w:after="0" w:line="240" w:lineRule="auto"/>
+              <w:ind w:left="0" w:right="0"/>
+              <w:jc w:val="left"/>
+              <w:rPr>
+                <w:rFonts w:ascii="Tahoma" w:eastAsia="Tahoma" w:hAnsi="Tahoma" w:cs="Tahoma"/>
+                <w:b/>
+                <w:bCs/>
+                <w:sz w:val="20"/>
+                <w:szCs w:val="20"/>
+              </w:rPr>
+            </w:pPr>
+            <w:r>
+              <w:rPr>
+                <w:rFonts w:ascii="Tahoma" w:eastAsia="Tahoma" w:hAnsi="Tahoma" w:cs="Tahoma"/>
+                <w:b/>
+                <w:bCs/>
+                <w:sz w:val="20"/>
+                <w:szCs w:val="20"/>
+              </w:rPr>
+              <w:t xml:space="preserve">Flujos </w:t>
+            </w:r>
+            <w:r>
+              <w:rPr>
+                <w:rFonts w:ascii="Tahoma" w:eastAsia="Tahoma" w:hAnsi="Tahoma" w:cs="Tahoma"/>
+                <w:b/>
+                <w:bCs/>
+                <w:sz w:val="20"/>
+                <w:szCs w:val="20"/>
+              </w:rPr>
+              <w:t>Alternativos:</w:t>
+            </w:r>
+          </w:p>
+          <w:p>
+            <w:pPr>
+              <w:spacing w:after="0" w:line="240" w:lineRule="auto"/>
+              <w:ind w:left="0" w:right="0"/>
+              <w:jc w:val="left"/>
+              <w:rPr>
+                <w:rFonts w:ascii="Times New Roman" w:eastAsia="Times New Roman" w:hAnsi="Times New Roman" w:cs="Times New Roman"/>
+              </w:rPr>
+            </w:pPr>
+          </w:p>
+        </w:tc>
+      </w:tr>
+      <w:tr>
+        <w:trPr>
+          <w:jc w:val="center"/>
+        </w:trPr>
+        <w:tc>
+          <w:tcPr>
+            <w:tcW w:w="10185" w:type="dxa"/>
+            <w:gridSpan w:val="4"/>
+          </w:tcPr>
+          <w:p>
+            <w:pPr>
+              <w:spacing w:after="0" w:line="240" w:lineRule="auto"/>
+              <w:ind w:left="0" w:right="0"/>
+              <w:rPr>
+                <w:rFonts w:ascii="Tahoma" w:eastAsia="Tahoma" w:hAnsi="Tahoma" w:cs="Tahoma"/>
+                <w:sz w:val="20"/>
+                <w:szCs w:val="20"/>
+                <w:lang w:val="es-AR"/>
+              </w:rPr>
+            </w:pPr>
+            <w:r>
+              <w:rPr>
+                <w:rFonts w:ascii="Tahoma" w:eastAsia="Tahoma" w:hAnsi="Tahoma" w:cs="Tahoma"/>
+                <w:sz w:val="20"/>
+                <w:szCs w:val="20"/>
+                <w:lang w:val="es-AR"/>
+              </w:rPr>
+              <w:t>6.A. El Usuario no encuentra la</w:t>
+            </w:r>
+            <w:r>
+              <w:rPr>
+                <w:rFonts w:ascii="Tahoma" w:eastAsia="Tahoma" w:hAnsi="Tahoma" w:cs="Tahoma"/>
+                <w:sz w:val="20"/>
+                <w:szCs w:val="20"/>
+                <w:lang w:val="es-AR"/>
+              </w:rPr>
+              <w:t xml:space="preserve"> temática deseada en la lista y</w:t>
+            </w:r>
+            <w:r>
+              <w:rPr>
+                <w:rFonts w:ascii="Tahoma" w:eastAsia="Tahoma" w:hAnsi="Tahoma" w:cs="Tahoma"/>
+                <w:sz w:val="20"/>
+                <w:szCs w:val="20"/>
+                <w:lang w:val="es-AR"/>
+              </w:rPr>
+              <w:t xml:space="preserve"> selecciona "Nuevo". El sistema llama al caso de uso </w:t>
+            </w:r>
+            <w:r>
+              <w:rPr>
+                <w:rFonts w:ascii="Tahoma" w:eastAsia="Tahoma" w:hAnsi="Tahoma" w:cs="Tahoma"/>
+                <w:b/>
+                <w:bCs/>
+                <w:sz w:val="20"/>
+                <w:szCs w:val="20"/>
+                <w:lang w:val="es-AR"/>
+              </w:rPr>
+              <w:t>"Registrar temática"</w:t>
+            </w:r>
+            <w:r>
+              <w:rPr>
+                <w:rFonts w:ascii="Tahoma" w:eastAsia="Tahoma" w:hAnsi="Tahoma" w:cs="Tahoma"/>
+                <w:sz w:val="20"/>
+                <w:szCs w:val="20"/>
+                <w:lang w:val="es-AR"/>
+              </w:rPr>
+              <w:t>. Una vez finalizado y registrada la nueva temática, se selecciona la misma y continúa el flujo.</w:t>
+            </w:r>
+          </w:p>
+        </w:tc>
+      </w:tr>
+      <w:tr>
+        <w:trPr>
+          <w:jc w:val="center"/>
+        </w:trPr>
+        <w:tc>
+          <w:tcPr>
+            <w:tcW w:w="10185" w:type="dxa"/>
+            <w:gridSpan w:val="4"/>
+          </w:tcPr>
+          <w:p>
+            <w:pPr>
+              <w:spacing w:after="0" w:line="240" w:lineRule="auto"/>
+              <w:ind w:left="0" w:right="0"/>
+              <w:rPr>
+                <w:rFonts w:ascii="Tahoma" w:eastAsia="Tahoma" w:hAnsi="Tahoma" w:cs="Tahoma"/>
+                <w:sz w:val="20"/>
+                <w:szCs w:val="20"/>
+                <w:lang w:val="es-AR"/>
+              </w:rPr>
+            </w:pPr>
+            <w:r>
+              <w:rPr>
+                <w:rFonts w:ascii="Tahoma" w:eastAsia="Tahoma" w:hAnsi="Tahoma" w:cs="Tahoma"/>
+                <w:sz w:val="20"/>
+                <w:szCs w:val="20"/>
+                <w:lang w:val="es-AR"/>
+              </w:rPr>
+              <w:t xml:space="preserve">8.A. El Usuario no encuentra al organizador deseado en la lista y selecciona "Nuevo". El sistema llama al caso de uso </w:t>
+            </w:r>
+            <w:r>
+              <w:rPr>
+                <w:rFonts w:ascii="Tahoma" w:eastAsia="Tahoma" w:hAnsi="Tahoma" w:cs="Tahoma"/>
+                <w:b/>
+                <w:bCs/>
+                <w:sz w:val="20"/>
+                <w:szCs w:val="20"/>
+                <w:lang w:val="es-AR"/>
+              </w:rPr>
+              <w:t>"Registrar organizador"</w:t>
+            </w:r>
+            <w:r>
+              <w:rPr>
+                <w:rFonts w:ascii="Tahoma" w:eastAsia="Tahoma" w:hAnsi="Tahoma" w:cs="Tahoma"/>
+                <w:sz w:val="20"/>
+                <w:szCs w:val="20"/>
+                <w:lang w:val="es-AR"/>
+              </w:rPr>
+              <w:t>. Una vez finalizado, se selecciona el mismo y continúa el flujo.</w:t>
+            </w:r>
+          </w:p>
+        </w:tc>
+      </w:tr>
+      <w:tr>
+        <w:trPr>
+          <w:jc w:val="center"/>
+        </w:trPr>
+        <w:tc>
+          <w:tcPr>
+            <w:tcW w:w="10185" w:type="dxa"/>
+            <w:gridSpan w:val="4"/>
+          </w:tcPr>
+          <w:p>
+            <w:pPr>
+              <w:spacing w:after="0" w:line="240" w:lineRule="auto"/>
+              <w:ind w:left="0" w:right="0"/>
+              <w:rPr>
+                <w:rFonts w:ascii="Tahoma" w:eastAsia="Tahoma" w:hAnsi="Tahoma" w:cs="Tahoma"/>
+                <w:sz w:val="20"/>
+                <w:szCs w:val="20"/>
+                <w:lang w:val="es-AR"/>
+              </w:rPr>
+            </w:pPr>
+            <w:r>
+              <w:rPr>
+                <w:rFonts w:ascii="Tahoma" w:eastAsia="Tahoma" w:hAnsi="Tahoma" w:cs="Tahoma"/>
+                <w:sz w:val="20"/>
+                <w:szCs w:val="20"/>
+                <w:lang w:val="es-AR"/>
+              </w:rPr>
+              <w:t xml:space="preserve">10.A. El Usuario desea agregar una actividad que no se encuentra en la lista y selecciona "Nuevo". El sistema llama al caso de uso </w:t>
+            </w:r>
+            <w:r>
+              <w:rPr>
+                <w:rFonts w:ascii="Tahoma" w:eastAsia="Tahoma" w:hAnsi="Tahoma" w:cs="Tahoma"/>
+                <w:b/>
+                <w:bCs/>
+                <w:sz w:val="20"/>
+                <w:szCs w:val="20"/>
+                <w:lang w:val="es-AR"/>
+              </w:rPr>
+              <w:t>"Registrar actividad"</w:t>
+            </w:r>
+            <w:r>
+              <w:rPr>
+                <w:rFonts w:ascii="Tahoma" w:eastAsia="Tahoma" w:hAnsi="Tahoma" w:cs="Tahoma"/>
+                <w:sz w:val="20"/>
+                <w:szCs w:val="20"/>
+                <w:lang w:val="es-AR"/>
+              </w:rPr>
+              <w:t>. Una vez finalizado, se selecciona la misma y continúa el flujo.</w:t>
+            </w:r>
+          </w:p>
+        </w:tc>
+      </w:tr>
+      <w:tr>
+        <w:trPr>
+          <w:jc w:val="center"/>
+        </w:trPr>
+        <w:tc>
+          <w:tcPr>
+            <w:tcW w:w="10185" w:type="dxa"/>
+            <w:gridSpan w:val="4"/>
+          </w:tcPr>
+          <w:p>
+            <w:pPr>
+              <w:spacing w:after="0" w:line="240" w:lineRule="auto"/>
+              <w:ind w:left="0" w:right="0"/>
+              <w:rPr>
+                <w:rFonts w:ascii="Tahoma" w:eastAsia="Tahoma" w:hAnsi="Tahoma" w:cs="Tahoma"/>
+                <w:sz w:val="20"/>
+                <w:szCs w:val="20"/>
+                <w:lang w:val="es-AR"/>
+              </w:rPr>
+            </w:pPr>
+            <w:r>
+              <w:rPr>
+                <w:rFonts w:ascii="Tahoma" w:eastAsia="Tahoma" w:hAnsi="Tahoma" w:cs="Tahoma"/>
+                <w:sz w:val="20"/>
+                <w:szCs w:val="20"/>
+                <w:lang w:val="es-AR"/>
+              </w:rPr>
+              <w:t xml:space="preserve">12.A. El usuario indica que </w:t>
+            </w:r>
+            <w:r>
+              <w:rPr>
+                <w:rFonts w:ascii="Tahoma" w:eastAsia="Tahoma" w:hAnsi="Tahoma" w:cs="Tahoma"/>
+                <w:b/>
+                <w:bCs/>
+                <w:sz w:val="20"/>
+                <w:szCs w:val="20"/>
+                <w:lang w:val="es-AR"/>
+              </w:rPr>
+              <w:t>no</w:t>
+            </w:r>
+            <w:r>
+              <w:rPr>
+                <w:rFonts w:ascii="Tahoma" w:eastAsia="Tahoma" w:hAnsi="Tahoma" w:cs="Tahoma"/>
+                <w:sz w:val="20"/>
+                <w:szCs w:val="20"/>
+                <w:lang w:val="es-AR"/>
+              </w:rPr>
+              <w:t xml:space="preserve"> asistirá con acompañantes. Se continúa en el paso 15.</w:t>
+            </w:r>
+          </w:p>
+        </w:tc>
+      </w:tr>
+      <w:tr>
+        <w:trPr>
+          <w:jc w:val="center"/>
+        </w:trPr>
+        <w:tc>
+          <w:tcPr>
+            <w:tcW w:w="10185" w:type="dxa"/>
+            <w:gridSpan w:val="4"/>
+          </w:tcPr>
+          <w:p>
+            <w:pPr>
+              <w:spacing w:after="0" w:line="240" w:lineRule="auto"/>
+              <w:ind w:left="0" w:right="0"/>
+              <w:rPr>
+                <w:rFonts w:ascii="Tahoma" w:eastAsia="Tahoma" w:hAnsi="Tahoma" w:cs="Tahoma"/>
+                <w:sz w:val="20"/>
+                <w:szCs w:val="20"/>
+                <w:lang w:val="es-AR"/>
+              </w:rPr>
+            </w:pPr>
+            <w:r>
+              <w:rPr>
+                <w:rFonts w:ascii="Tahoma" w:eastAsia="Tahoma" w:hAnsi="Tahoma" w:cs="Tahoma"/>
+                <w:sz w:val="20"/>
+                <w:szCs w:val="20"/>
+                <w:lang w:val="es-AR"/>
+              </w:rPr>
+              <w:t xml:space="preserve">14.A. El Usuario desea agregar un acompañante que no se encuentra en la lista y selecciona "Nuevo". El sistema llama al caso de uso </w:t>
+            </w:r>
+            <w:r>
+              <w:rPr>
+                <w:rFonts w:ascii="Tahoma" w:eastAsia="Tahoma" w:hAnsi="Tahoma" w:cs="Tahoma"/>
+                <w:b/>
+                <w:bCs/>
+                <w:sz w:val="20"/>
+                <w:szCs w:val="20"/>
+                <w:lang w:val="es-AR"/>
+              </w:rPr>
+              <w:t>"Registrar acompañante"</w:t>
+            </w:r>
+            <w:r>
+              <w:rPr>
+                <w:rFonts w:ascii="Tahoma" w:eastAsia="Tahoma" w:hAnsi="Tahoma" w:cs="Tahoma"/>
+                <w:sz w:val="20"/>
+                <w:szCs w:val="20"/>
+                <w:lang w:val="es-AR"/>
+              </w:rPr>
+              <w:t>. Una vez finalizado, se selecciona el mismo y continúa el flujo.</w:t>
+            </w:r>
+          </w:p>
+        </w:tc>
+      </w:tr>
+      <w:tr>
+        <w:trPr>
+          <w:cantSplit/>
+          <w:jc w:val="center"/>
+        </w:trPr>
+        <w:tc>
+          <w:tcPr>
+            <w:tcW w:w="10185" w:type="dxa"/>
+            <w:gridSpan w:val="4"/>
+          </w:tcPr>
+          <w:p>
+            <w:pPr>
+              <w:spacing w:after="0" w:line="240" w:lineRule="auto"/>
+              <w:ind w:left="0" w:right="0"/>
+              <w:rPr>
+                <w:rFonts w:ascii="Tahoma" w:eastAsia="Tahoma" w:hAnsi="Tahoma" w:cs="Tahoma"/>
+                <w:sz w:val="20"/>
+                <w:szCs w:val="20"/>
+                <w:lang w:val="es-AR"/>
+              </w:rPr>
+            </w:pPr>
+            <w:r>
+              <w:rPr>
+                <w:rFonts w:ascii="Tahoma" w:eastAsia="Tahoma" w:hAnsi="Tahoma" w:cs="Tahoma"/>
+                <w:b/>
+                <w:bCs/>
+                <w:sz w:val="20"/>
+                <w:szCs w:val="20"/>
+                <w:lang w:val="es-AR"/>
+              </w:rPr>
+              <w:t xml:space="preserve">Observaciones: </w:t>
+            </w:r>
+            <w:r>
+              <w:rPr>
+                <w:rFonts w:ascii="Tahoma" w:eastAsia="Tahoma" w:hAnsi="Tahoma" w:cs="Tahoma"/>
+                <w:sz w:val="20"/>
+                <w:szCs w:val="20"/>
+                <w:lang w:val="es-AR"/>
+              </w:rPr>
+              <w:t>El usuario puede cancelar la operación de registro cuando lo desee, mediante la opción “Cancelar”.</w:t>
+            </w:r>
+          </w:p>
+          <w:p>
+            <w:pPr>
+              <w:spacing w:after="0" w:line="240" w:lineRule="auto"/>
+              <w:ind w:left="0" w:right="0"/>
+              <w:rPr>
+                <w:rFonts w:ascii="Tahoma" w:eastAsia="Tahoma" w:hAnsi="Tahoma" w:cs="Tahoma"/>
+                <w:sz w:val="20"/>
+                <w:szCs w:val="20"/>
+                <w:lang w:val="es-AR"/>
+              </w:rPr>
+            </w:pPr>
+          </w:p>
+        </w:tc>
+      </w:tr>
+      <w:tr>
+        <w:trPr>
+          <w:cantSplit/>
+          <w:jc w:val="center"/>
+        </w:trPr>
+        <w:tc>
+          <w:tcPr>
+            <w:tcW w:w="10185" w:type="dxa"/>
+            <w:gridSpan w:val="4"/>
+          </w:tcPr>
+          <w:p>
+            <w:pPr>
+              <w:spacing w:after="0" w:line="240" w:lineRule="auto"/>
+              <w:ind w:left="0" w:right="0"/>
+              <w:rPr>
+                <w:rFonts w:ascii="Tahoma" w:eastAsia="Tahoma" w:hAnsi="Tahoma" w:cs="Tahoma"/>
+                <w:sz w:val="20"/>
+                <w:szCs w:val="20"/>
+                <w:lang w:val="es-AR"/>
+              </w:rPr>
+            </w:pPr>
+            <w:r>
+              <w:rPr>
+                <w:rFonts w:ascii="Tahoma" w:eastAsia="Tahoma" w:hAnsi="Tahoma" w:cs="Tahoma"/>
+                <w:b/>
+                <w:bCs/>
+                <w:sz w:val="20"/>
+                <w:szCs w:val="20"/>
+                <w:lang w:val="es-AR"/>
+              </w:rPr>
+              <w:lastRenderedPageBreak/>
+              <w:t>Asociaciones de Extensión: Registrar acompañante, registrar organizador, registrar temática, registrar actividad</w:t>
+            </w:r>
+          </w:p>
+        </w:tc>
+      </w:tr>
+      <w:tr>
+        <w:trPr>
+          <w:cantSplit/>
+          <w:jc w:val="center"/>
+        </w:trPr>
+        <w:tc>
+          <w:tcPr>
+            <w:tcW w:w="10185" w:type="dxa"/>
+            <w:gridSpan w:val="4"/>
+          </w:tcPr>
+          <w:p>
+            <w:pPr>
+              <w:spacing w:after="0" w:line="240" w:lineRule="auto"/>
+              <w:ind w:left="0" w:right="0"/>
+              <w:rPr>
+                <w:rFonts w:ascii="Tahoma" w:eastAsia="Tahoma" w:hAnsi="Tahoma" w:cs="Tahoma"/>
+                <w:sz w:val="20"/>
+                <w:szCs w:val="20"/>
+                <w:lang w:val="es-AR"/>
+              </w:rPr>
+            </w:pPr>
+            <w:r>
+              <w:rPr>
+                <w:rFonts w:ascii="Tahoma" w:eastAsia="Tahoma" w:hAnsi="Tahoma" w:cs="Tahoma"/>
+                <w:b/>
+                <w:bCs/>
+                <w:sz w:val="20"/>
+                <w:szCs w:val="20"/>
+                <w:lang w:val="es-AR"/>
+              </w:rPr>
+              <w:t>Asociaciones de Inclusión: No aplica</w:t>
+            </w:r>
+          </w:p>
+        </w:tc>
+      </w:tr>
+      <w:tr>
+        <w:trPr>
+          <w:cantSplit/>
+          <w:jc w:val="center"/>
+        </w:trPr>
+        <w:tc>
+          <w:tcPr>
+            <w:tcW w:w="10185" w:type="dxa"/>
+            <w:gridSpan w:val="4"/>
+          </w:tcPr>
+          <w:p>
+            <w:pPr>
+              <w:spacing w:after="0" w:line="240" w:lineRule="auto"/>
+              <w:ind w:left="0" w:right="0"/>
+              <w:rPr>
+                <w:rFonts w:ascii="Tahoma" w:eastAsia="Tahoma" w:hAnsi="Tahoma" w:cs="Tahoma"/>
+                <w:sz w:val="20"/>
+                <w:szCs w:val="20"/>
+                <w:lang w:val="es-AR"/>
+              </w:rPr>
+            </w:pPr>
+            <w:r>
+              <w:rPr>
+                <w:rFonts w:ascii="Tahoma" w:eastAsia="Tahoma" w:hAnsi="Tahoma" w:cs="Tahoma"/>
+                <w:b/>
+                <w:bCs/>
+                <w:sz w:val="20"/>
+                <w:szCs w:val="20"/>
+                <w:lang w:val="es-AR"/>
+              </w:rPr>
+              <w:t>Use Case donde se incluye: No aplica</w:t>
+            </w:r>
+          </w:p>
+        </w:tc>
+      </w:tr>
+      <w:tr>
+        <w:trPr>
+          <w:cantSplit/>
+          <w:jc w:val="center"/>
+        </w:trPr>
+        <w:tc>
+          <w:tcPr>
+            <w:tcW w:w="10185" w:type="dxa"/>
+            <w:gridSpan w:val="4"/>
+          </w:tcPr>
+          <w:p>
+            <w:pPr>
+              <w:spacing w:after="0" w:line="240" w:lineRule="auto"/>
+              <w:ind w:left="0" w:right="0"/>
+              <w:rPr>
+                <w:rFonts w:ascii="Tahoma" w:eastAsia="Tahoma" w:hAnsi="Tahoma" w:cs="Tahoma"/>
+                <w:sz w:val="20"/>
+                <w:szCs w:val="20"/>
+                <w:lang w:val="es-AR"/>
+              </w:rPr>
+            </w:pPr>
+            <w:r>
+              <w:rPr>
+                <w:rFonts w:ascii="Tahoma" w:eastAsia="Tahoma" w:hAnsi="Tahoma" w:cs="Tahoma"/>
+                <w:b/>
+                <w:bCs/>
+                <w:sz w:val="20"/>
+                <w:szCs w:val="20"/>
+                <w:lang w:val="es-AR"/>
+              </w:rPr>
+              <w:t>Use Case al que extiende: No aplica</w:t>
+            </w:r>
+          </w:p>
+        </w:tc>
+      </w:tr>
+      <w:tr>
+        <w:trPr>
+          <w:cantSplit/>
+          <w:jc w:val="center"/>
+        </w:trPr>
+        <w:tc>
+          <w:tcPr>
+            <w:tcW w:w="10185" w:type="dxa"/>
+            <w:gridSpan w:val="4"/>
+          </w:tcPr>
+          <w:p>
+            <w:pPr>
+              <w:keepNext/>
+              <w:spacing w:after="0" w:line="240" w:lineRule="auto"/>
+              <w:ind w:left="0" w:right="0"/>
+              <w:jc w:val="left"/>
+              <w:rPr>
+                <w:rFonts w:ascii="Tahoma" w:eastAsia="Tahoma" w:hAnsi="Tahoma" w:cs="Tahoma"/>
+                <w:b/>
+                <w:bCs/>
+                <w:sz w:val="20"/>
+                <w:szCs w:val="20"/>
+                <w:lang w:val="es-AR"/>
+              </w:rPr>
+            </w:pPr>
+            <w:r>
+              <w:rPr>
+                <w:rFonts w:ascii="Tahoma" w:eastAsia="Tahoma" w:hAnsi="Tahoma" w:cs="Tahoma"/>
+                <w:b/>
+                <w:bCs/>
+                <w:sz w:val="20"/>
+                <w:szCs w:val="20"/>
+                <w:lang w:val="es-AR"/>
+              </w:rPr>
+              <w:t>Use Case de Generalización: No aplica</w:t>
+            </w:r>
+          </w:p>
+        </w:tc>
+      </w:tr>
+      <w:tr>
+        <w:trPr>
+          <w:cantSplit/>
+          <w:jc w:val="center"/>
+        </w:trPr>
+        <w:tc>
+          <w:tcPr>
+            <w:tcW w:w="6405" w:type="dxa"/>
+            <w:gridSpan w:val="2"/>
+          </w:tcPr>
+          <w:p>
+            <w:pPr>
+              <w:keepNext/>
+              <w:tabs>
+                <w:tab w:val="right" w:pos="1988"/>
+              </w:tabs>
+              <w:spacing w:after="0" w:line="240" w:lineRule="auto"/>
+              <w:ind w:left="0" w:right="0"/>
+              <w:jc w:val="left"/>
+              <w:rPr>
+                <w:rFonts w:ascii="Tahoma" w:eastAsia="Tahoma" w:hAnsi="Tahoma" w:cs="Tahoma"/>
+                <w:b/>
+                <w:bCs/>
+                <w:sz w:val="20"/>
+                <w:szCs w:val="20"/>
+              </w:rPr>
+            </w:pPr>
+            <w:r>
+              <w:rPr>
+                <w:rFonts w:ascii="Tahoma" w:eastAsia="Tahoma" w:hAnsi="Tahoma" w:cs="Tahoma"/>
+                <w:b/>
+                <w:bCs/>
+                <w:sz w:val="20"/>
+                <w:szCs w:val="20"/>
+              </w:rPr>
+              <w:t>Autor: Grupo 11</w:t>
+            </w:r>
+          </w:p>
+        </w:tc>
+        <w:tc>
+          <w:tcPr>
+            <w:tcW w:w="3780" w:type="dxa"/>
+            <w:gridSpan w:val="2"/>
+          </w:tcPr>
+          <w:p>
+            <w:pPr>
+              <w:keepNext/>
+              <w:spacing w:after="0" w:line="240" w:lineRule="auto"/>
+              <w:ind w:left="0" w:right="0"/>
+              <w:jc w:val="left"/>
+              <w:rPr>
+                <w:rFonts w:ascii="Tahoma" w:eastAsia="Tahoma" w:hAnsi="Tahoma" w:cs="Tahoma"/>
+                <w:b/>
+                <w:bCs/>
+                <w:sz w:val="16"/>
+                <w:szCs w:val="16"/>
+              </w:rPr>
+            </w:pPr>
+            <w:r>
+              <w:rPr>
+                <w:rFonts w:ascii="Tahoma" w:eastAsia="Tahoma" w:hAnsi="Tahoma" w:cs="Tahoma"/>
+                <w:b/>
+                <w:bCs/>
+                <w:sz w:val="20"/>
+                <w:szCs w:val="20"/>
+              </w:rPr>
+              <w:t>Fecha Creación</w:t>
+            </w:r>
+            <w:r>
+              <w:rPr>
+                <w:rFonts w:ascii="Tahoma" w:eastAsia="Tahoma" w:hAnsi="Tahoma" w:cs="Tahoma"/>
+              </w:rPr>
+              <w:t xml:space="preserve">: </w:t>
+            </w:r>
+            <w:r>
+              <w:rPr>
+                <w:rFonts w:ascii="Tahoma" w:eastAsia="Tahoma" w:hAnsi="Tahoma" w:cs="Tahoma"/>
+                <w:sz w:val="20"/>
+                <w:szCs w:val="20"/>
+              </w:rPr>
+              <w:t>30/09/2026</w:t>
+            </w:r>
+          </w:p>
+        </w:tc>
+      </w:tr>
+      <w:tr>
+        <w:trPr>
+          <w:cantSplit/>
+          <w:jc w:val="center"/>
+        </w:trPr>
+        <w:tc>
+          <w:tcPr>
+            <w:tcW w:w="6405" w:type="dxa"/>
+            <w:gridSpan w:val="2"/>
+          </w:tcPr>
+          <w:p>
+            <w:pPr>
+              <w:keepNext/>
+              <w:spacing w:after="0" w:line="240" w:lineRule="auto"/>
+              <w:ind w:left="0" w:right="0"/>
+              <w:jc w:val="left"/>
+              <w:rPr>
+                <w:rFonts w:ascii="Tahoma" w:eastAsia="Tahoma" w:hAnsi="Tahoma" w:cs="Tahoma"/>
+                <w:b/>
+                <w:bCs/>
+                <w:sz w:val="20"/>
+                <w:szCs w:val="20"/>
+              </w:rPr>
+            </w:pPr>
+            <w:r>
+              <w:rPr>
+                <w:rFonts w:ascii="Tahoma" w:eastAsia="Tahoma" w:hAnsi="Tahoma" w:cs="Tahoma"/>
+                <w:b/>
+                <w:bCs/>
+                <w:sz w:val="20"/>
+                <w:szCs w:val="20"/>
+              </w:rPr>
+              <w:t>Autor Última Modificación: Grupo 11</w:t>
+            </w:r>
+          </w:p>
+        </w:tc>
+        <w:tc>
+          <w:tcPr>
+            <w:tcW w:w="3780" w:type="dxa"/>
+            <w:gridSpan w:val="2"/>
+          </w:tcPr>
+          <w:p>
+            <w:pPr>
+              <w:keepNext/>
+              <w:spacing w:after="0" w:line="240" w:lineRule="auto"/>
+              <w:ind w:left="0" w:right="0"/>
+              <w:jc w:val="left"/>
+              <w:rPr>
+                <w:rFonts w:ascii="Tahoma" w:eastAsia="Tahoma" w:hAnsi="Tahoma" w:cs="Tahoma"/>
+                <w:b/>
+                <w:bCs/>
+                <w:sz w:val="16"/>
+                <w:szCs w:val="16"/>
+              </w:rPr>
+            </w:pPr>
+            <w:r>
+              <w:rPr>
+                <w:rFonts w:ascii="Tahoma" w:eastAsia="Tahoma" w:hAnsi="Tahoma" w:cs="Tahoma"/>
+                <w:b/>
+                <w:bCs/>
+                <w:sz w:val="20"/>
+                <w:szCs w:val="20"/>
+              </w:rPr>
+              <w:t>Fecha Última Modificación</w:t>
+            </w:r>
+            <w:r>
+              <w:rPr>
+                <w:rFonts w:ascii="Tahoma" w:eastAsia="Tahoma" w:hAnsi="Tahoma" w:cs="Tahoma"/>
+              </w:rPr>
+              <w:t xml:space="preserve">: </w:t>
+            </w:r>
+            <w:r>
+              <w:rPr>
+                <w:rFonts w:ascii="Tahoma" w:eastAsia="Tahoma" w:hAnsi="Tahoma" w:cs="Tahoma"/>
+                <w:sz w:val="20"/>
+                <w:szCs w:val="20"/>
+              </w:rPr>
+              <w:t>6/10/2026</w:t>
+            </w:r>
+          </w:p>
+        </w:tc>
+      </w:tr>
+    </w:tbl>
+    <w:p>
+      <w:pPr>
+        <w:tabs>
+          <w:tab w:val="center" w:pos="4252"/>
+          <w:tab w:val="right" w:pos="8504"/>
+        </w:tabs>
+        <w:spacing w:after="0" w:line="240" w:lineRule="auto"/>
+        <w:ind w:left="0" w:right="0"/>
+        <w:jc w:val="center"/>
+        <w:rPr>
+          <w:rFonts w:ascii="Tahoma" w:eastAsia="Tahoma" w:hAnsi="Tahoma" w:cs="Tahoma"/>
+          <w:color w:val="333399"/>
+        </w:rPr>
+      </w:pPr>
+    </w:p>
+    <w:p>
+      <w:pPr>
+        <w:pStyle w:val="Ttulo2"/>
+        <w:ind w:left="-283"/>
+        <w:rPr>
+          <w:u w:val="single"/>
+        </w:rPr>
+      </w:pPr>
+      <w:bookmarkStart w:id="4" w:name="_pwp86t6chom7" w:colFirst="0" w:colLast="0"/>
+      <w:bookmarkStart w:id="5" w:name="_GoBack"/>
+      <w:bookmarkEnd w:id="4"/>
+      <w:bookmarkEnd w:id="5"/>
+    </w:p>
+    <w:p>
+      <w:pPr>
+        <w:pStyle w:val="Ttulo2"/>
+        <w:ind w:left="-283"/>
+      </w:pPr>
+      <w:r>
+        <w:t>PROTOTIPO: REGISTRAR RETIRO</w:t>
+      </w:r>
+    </w:p>
+    <w:p>
+      <w:pPr>
+        <w:ind w:left="-283"/>
+      </w:pPr>
+      <w:bookmarkStart w:id="6" w:name="_2wvw85g3js5c" w:colFirst="0" w:colLast="0"/>
+      <w:bookmarkEnd w:id="6"/>
+      <w:r>
+        <w:rPr>
+          <w:noProof/>
+          <w:u w:val="single"/>
+          <w:lang w:val="en-US"/>
+        </w:rPr>
+        <w:drawing>
+          <wp:inline distT="114300" distB="114300" distL="114300" distR="114300" wp14:anchorId="3CD8D18E" wp14:editId="64EC0AAD">
+            <wp:extent cx="5943600" cy="3327400"/>
+            <wp:effectExtent l="0" t="0" r="0" b="0"/>
+            <wp:docPr id="24" name="image15.png"/>
+            <wp:cNvGraphicFramePr/>
+            <a:graphic xmlns:a="http://schemas.openxmlformats.org/drawingml/2006/main">
+              <a:graphicData uri="http://schemas.openxmlformats.org/drawingml/2006/picture">
+                <pic:pic xmlns:pic="http://schemas.openxmlformats.org/drawingml/2006/picture">
+                  <pic:nvPicPr>
+                    <pic:cNvPr id="0" name="image15.png"/>
+                    <pic:cNvPicPr preferRelativeResize="0"/>
+                  </pic:nvPicPr>
+                  <pic:blipFill>
+                    <a:blip r:embed="rId11"/>
+                    <a:srcRect/>
+                    <a:stretch>
+                      <a:fillRect/>
+                    </a:stretch>
+                  </pic:blipFill>
+                  <pic:spPr>
+                    <a:xfrm>
+                      <a:off x="0" y="0"/>
+                      <a:ext cx="5943600" cy="3327400"/>
+                    </a:xfrm>
+                    <a:prstGeom prst="rect">
+                      <a:avLst/>
+                    </a:prstGeom>
+                    <a:ln/>
+                  </pic:spPr>
+                </pic:pic>
+              </a:graphicData>
+            </a:graphic>
+          </wp:inline>
+        </w:drawing>
+      </w:r>
+    </w:p>
+    <w:p>
+      <w:pPr>
+        <w:ind w:left="-283"/>
+      </w:pPr>
+      <w:r>
+        <w:rPr>
+          <w:noProof/>
+          <w:lang w:val="en-US"/>
+        </w:rPr>
+        <w:lastRenderedPageBreak/>
+        <w:drawing>
+          <wp:inline distT="114300" distB="114300" distL="114300" distR="114300" wp14:anchorId="4E6283BC" wp14:editId="3464AAEC">
+            <wp:extent cx="5943600" cy="1790700"/>
+            <wp:effectExtent l="0" t="0" r="0" b="0"/>
+            <wp:docPr id="2" name="image10.png"/>
+            <wp:cNvGraphicFramePr/>
+            <a:graphic xmlns:a="http://schemas.openxmlformats.org/drawingml/2006/main">
+              <a:graphicData uri="http://schemas.openxmlformats.org/drawingml/2006/picture">
+                <pic:pic xmlns:pic="http://schemas.openxmlformats.org/drawingml/2006/picture">
+                  <pic:nvPicPr>
+                    <pic:cNvPr id="0" name="image10.png"/>
+                    <pic:cNvPicPr preferRelativeResize="0"/>
+                  </pic:nvPicPr>
+                  <pic:blipFill>
+                    <a:blip r:embed="rId12"/>
+                    <a:srcRect/>
+                    <a:stretch>
+                      <a:fillRect/>
+                    </a:stretch>
+                  </pic:blipFill>
+                  <pic:spPr>
+                    <a:xfrm>
+                      <a:off x="0" y="0"/>
+                      <a:ext cx="5943600" cy="1790700"/>
+                    </a:xfrm>
+                    <a:prstGeom prst="rect">
+                      <a:avLst/>
+                    </a:prstGeom>
+                    <a:ln/>
+                  </pic:spPr>
+                </pic:pic>
+              </a:graphicData>
+            </a:graphic>
+          </wp:inline>
+        </w:drawing>
+      </w:r>
+    </w:p>
+    <w:p>
+      <w:pPr>
+        <w:ind w:left="-283"/>
+      </w:pPr>
+      <w:r>
+        <w:rPr>
+          <w:noProof/>
+          <w:lang w:val="en-US"/>
+        </w:rPr>
+        <w:drawing>
+          <wp:inline distT="114300" distB="114300" distL="114300" distR="114300" wp14:anchorId="14FE0198" wp14:editId="6F8FE03C">
+            <wp:extent cx="5943600" cy="1841500"/>
+            <wp:effectExtent l="0" t="0" r="0" b="0"/>
+            <wp:docPr id="1" name="image7.png"/>
+            <wp:cNvGraphicFramePr/>
+            <a:graphic xmlns:a="http://schemas.openxmlformats.org/drawingml/2006/main">
+              <a:graphicData uri="http://schemas.openxmlformats.org/drawingml/2006/picture">
+                <pic:pic xmlns:pic="http://schemas.openxmlformats.org/drawingml/2006/picture">
+                  <pic:nvPicPr>
+                    <pic:cNvPr id="0" name="image7.png"/>
+                    <pic:cNvPicPr preferRelativeResize="0"/>
+                  </pic:nvPicPr>
+                  <pic:blipFill>
+                    <a:blip r:embed="rId13"/>
+                    <a:srcRect/>
+                    <a:stretch>
+                      <a:fillRect/>
+                    </a:stretch>
+                  </pic:blipFill>
+                  <pic:spPr>
+                    <a:xfrm>
+                      <a:off x="0" y="0"/>
+                      <a:ext cx="5943600" cy="1841500"/>
+                    </a:xfrm>
+                    <a:prstGeom prst="rect">
+                      <a:avLst/>
+                    </a:prstGeom>
+                    <a:ln/>
+                  </pic:spPr>
+                </pic:pic>
+              </a:graphicData>
+            </a:graphic>
+          </wp:inline>
+        </w:drawing>
+      </w:r>
+    </w:p>
+    <w:p>
+      <w:pPr>
+        <w:ind w:left="-283"/>
+      </w:pPr>
+      <w:r>
+        <w:rPr>
+          <w:noProof/>
+          <w:lang w:val="en-US"/>
+        </w:rPr>
+        <w:drawing>
+          <wp:inline distT="114300" distB="114300" distL="114300" distR="114300" wp14:anchorId="7D9A4A97" wp14:editId="232C792B">
+            <wp:extent cx="5943600" cy="2082800"/>
+            <wp:effectExtent l="0" t="0" r="0" b="0"/>
+            <wp:docPr id="16" name="image13.png"/>
+            <wp:cNvGraphicFramePr/>
+            <a:graphic xmlns:a="http://schemas.openxmlformats.org/drawingml/2006/main">
+              <a:graphicData uri="http://schemas.openxmlformats.org/drawingml/2006/picture">
+                <pic:pic xmlns:pic="http://schemas.openxmlformats.org/drawingml/2006/picture">
+                  <pic:nvPicPr>
+                    <pic:cNvPr id="0" name="image13.png"/>
+                    <pic:cNvPicPr preferRelativeResize="0"/>
+                  </pic:nvPicPr>
+                  <pic:blipFill>
+                    <a:blip r:embed="rId14"/>
+                    <a:srcRect/>
+                    <a:stretch>
+                      <a:fillRect/>
+                    </a:stretch>
+                  </pic:blipFill>
+                  <pic:spPr>
+                    <a:xfrm>
+                      <a:off x="0" y="0"/>
+                      <a:ext cx="5943600" cy="2082800"/>
+                    </a:xfrm>
+                    <a:prstGeom prst="rect">
+                      <a:avLst/>
+                    </a:prstGeom>
+                    <a:ln/>
+                  </pic:spPr>
+                </pic:pic>
+              </a:graphicData>
+            </a:graphic>
+          </wp:inline>
+        </w:drawing>
+      </w:r>
+    </w:p>
+    <w:p>
+      <w:pPr>
+        <w:ind w:left="-283"/>
+      </w:pPr>
+      <w:r>
+        <w:rPr>
+          <w:noProof/>
+          <w:lang w:val="en-US"/>
+        </w:rPr>
+        <w:lastRenderedPageBreak/>
+        <w:drawing>
+          <wp:inline distT="114300" distB="114300" distL="114300" distR="114300" wp14:anchorId="7C313943" wp14:editId="076ECCF5">
+            <wp:extent cx="5943600" cy="1676400"/>
+            <wp:effectExtent l="0" t="0" r="0" b="0"/>
+            <wp:docPr id="5" name="image22.png"/>
+            <wp:cNvGraphicFramePr/>
+            <a:graphic xmlns:a="http://schemas.openxmlformats.org/drawingml/2006/main">
+              <a:graphicData uri="http://schemas.openxmlformats.org/drawingml/2006/picture">
+                <pic:pic xmlns:pic="http://schemas.openxmlformats.org/drawingml/2006/picture">
+                  <pic:nvPicPr>
+                    <pic:cNvPr id="0" name="image22.png"/>
+                    <pic:cNvPicPr preferRelativeResize="0"/>
+                  </pic:nvPicPr>
+                  <pic:blipFill>
+                    <a:blip r:embed="rId15"/>
+                    <a:srcRect/>
+                    <a:stretch>
+                      <a:fillRect/>
+                    </a:stretch>
+                  </pic:blipFill>
+                  <pic:spPr>
+                    <a:xfrm>
+                      <a:off x="0" y="0"/>
+                      <a:ext cx="5943600" cy="1676400"/>
+                    </a:xfrm>
+                    <a:prstGeom prst="rect">
+                      <a:avLst/>
+                    </a:prstGeom>
+                    <a:ln/>
+                  </pic:spPr>
+                </pic:pic>
+              </a:graphicData>
+            </a:graphic>
+          </wp:inline>
+        </w:drawing>
+      </w:r>
+    </w:p>
+    <w:p>
+      <w:pPr>
+        <w:ind w:left="0"/>
+        <w:rPr>
+          <w:lang w:val="es-AR"/>
+        </w:rPr>
+      </w:pPr>
+      <w:r>
+        <w:rPr>
+          <w:noProof/>
+          <w:lang w:val="en-US"/>
+        </w:rPr>
+        <w:drawing>
+          <wp:inline distT="114300" distB="114300" distL="114300" distR="114300" wp14:anchorId="40B9922B" wp14:editId="2A295A2F">
+            <wp:extent cx="5272088" cy="852149"/>
+            <wp:effectExtent l="0" t="0" r="0" b="0"/>
+            <wp:docPr id="22" name="image21.png"/>
+            <wp:cNvGraphicFramePr/>
+            <a:graphic xmlns:a="http://schemas.openxmlformats.org/drawingml/2006/main">
+              <a:graphicData uri="http://schemas.openxmlformats.org/drawingml/2006/picture">
+                <pic:pic xmlns:pic="http://schemas.openxmlformats.org/drawingml/2006/picture">
+                  <pic:nvPicPr>
+                    <pic:cNvPr id="0" name="image21.png"/>
+                    <pic:cNvPicPr preferRelativeResize="0"/>
+                  </pic:nvPicPr>
+                  <pic:blipFill>
+                    <a:blip r:embed="rId16"/>
+                    <a:srcRect/>
+                    <a:stretch>
+                      <a:fillRect/>
+                    </a:stretch>
+                  </pic:blipFill>
+                  <pic:spPr>
+                    <a:xfrm>
+                      <a:off x="0" y="0"/>
+                      <a:ext cx="5272088" cy="852149"/>
+                    </a:xfrm>
+                    <a:prstGeom prst="rect">
+                      <a:avLst/>
+                    </a:prstGeom>
+                    <a:ln/>
+                  </pic:spPr>
+                </pic:pic>
+              </a:graphicData>
+            </a:graphic>
+          </wp:inline>
+        </w:drawing>
+      </w:r>
     </w:p>
     <w:p>
       <w:pPr>
@@ -4143,8 +6190,7 @@
           <w:bCs/>
           <w:lang w:val="es-AR"/>
         </w:rPr>
-        <w:lastRenderedPageBreak/>
-        <w:t>PLANTILLA PARA DESCRIPCIÓN DE CASO DE USO: REGISTRAR RETIRO</w:t>
+        <w:t>PLANTILLA PARA DESCRIPCIÓN DE CASO DE USO: CONSULTAR RETIRO</w:t>
       </w:r>
     </w:p>
     <w:p>
@@ -4166,7 +6212,7 @@
           <w:bCs/>
           <w:lang w:val="es-ES"/>
         </w:rPr>
-        <w:t>PROTOTIPO: REGISTRAR RETIRO</w:t>
+        <w:t>PROTOTIPO: CONSULTAR RETIRO</w:t>
       </w:r>
     </w:p>
     <w:p>
@@ -4188,7 +6234,7 @@
           <w:bCs/>
           <w:lang w:val="es-AR"/>
         </w:rPr>
-        <w:t>PLANTILLA PARA DESCRIPCIÓN DE CASO DE USO: CONSULTAR RETIRO</w:t>
+        <w:t>PLANTILLA PARA DESCRIPCIÓN DE CASO DE USO: REGISTRAR VALORACIÓN</w:t>
       </w:r>
     </w:p>
     <w:p>
@@ -4210,7 +6256,7 @@
           <w:bCs/>
           <w:lang w:val="es-ES"/>
         </w:rPr>
-        <w:t>PROTOTIPO: CONSULTAR RETIRO</w:t>
+        <w:t>PROTOTIPO: REGISTRAR VALORACIÓN</w:t>
       </w:r>
     </w:p>
     <w:p>
@@ -4232,65 +6278,21 @@
           <w:bCs/>
           <w:lang w:val="es-AR"/>
         </w:rPr>
-        <w:t>PLANTILLA PARA DESCRIPCIÓN DE CASO DE USO: REGISTRAR VALORACIÓN</w:t>
+        <w:t>LINK PROTOTIPO (SOLO DE LOS TRES CASOS DE USO DESCRITOS ANTERIORMENTE):</w:t>
       </w:r>
     </w:p>
     <w:p>
       <w:pPr>
-        <w:pStyle w:val="Ttulo2"/>
-        <w:spacing w:after="200"/>
-        <w:ind w:left="-283"/>
-        <w:rPr>
-          <w:rFonts w:ascii="Open Sans" w:hAnsi="Open Sans" w:cs="Open Sans"/>
-          <w:b/>
-          <w:bCs/>
-          <w:lang w:val="es-ES"/>
-        </w:rPr>
-      </w:pPr>
-      <w:r>
-        <w:rPr>
-          <w:rFonts w:ascii="Open Sans" w:hAnsi="Open Sans" w:cs="Open Sans"/>
-          <w:b/>
-          <w:bCs/>
-          <w:lang w:val="es-ES"/>
-        </w:rPr>
-        <w:t>PROTOTIPO: REGISTRAR VALORACIÓN</w:t>
-      </w:r>
-    </w:p>
-    <w:p>
-      <w:pPr>
-        <w:pStyle w:val="Ttulo2"/>
-        <w:spacing w:after="200"/>
-        <w:ind w:left="-283"/>
+        <w:ind w:left="0"/>
         <w:rPr>
           <w:rFonts w:ascii="Open Sans" w:hAnsi="Open Sans" w:cs="Open Sans"/>
           <w:b/>
           <w:bCs/>
           <w:lang w:val="es-AR"/>
         </w:rPr>
-      </w:pPr>
-      <w:r>
-        <w:rPr>
-          <w:rFonts w:ascii="Open Sans" w:hAnsi="Open Sans" w:cs="Open Sans"/>
-          <w:b/>
-          <w:bCs/>
-          <w:lang w:val="es-AR"/>
-        </w:rPr>
-        <w:t>LINK PROTOTIPO (SOLO DE LOS TRES CASOS DE USO DESCRITOS ANTERIORMENTE):</w:t>
-      </w:r>
-    </w:p>
-    <w:p>
-      <w:pPr>
-        <w:ind w:left="0"/>
-        <w:rPr>
-          <w:rFonts w:ascii="Open Sans" w:hAnsi="Open Sans" w:cs="Open Sans"/>
-          <w:b/>
-          <w:bCs/>
-          <w:lang w:val="es-AR"/>
-        </w:rPr>
         <w:sectPr>
-          <w:headerReference w:type="default" r:id="rId11"/>
-          <w:headerReference w:type="first" r:id="rId12"/>
+          <w:headerReference w:type="default" r:id="rId17"/>
+          <w:headerReference w:type="first" r:id="rId18"/>
           <w:pgSz w:w="12240" w:h="15840"/>
           <w:pgMar w:top="1440" w:right="1440" w:bottom="1440" w:left="1440" w:header="720" w:footer="720" w:gutter="0"/>
           <w:pgNumType w:start="1"/>
@@ -4371,7 +6373,7 @@
           <w:bCs/>
           <w:noProof/>
           <w:color w:val="000000"/>
-          <w:lang w:val="es-AR"/>
+          <w:lang w:val="en-US" w:eastAsia="en-US"/>
         </w:rPr>
         <w:drawing>
           <wp:inline distT="0" distB="0" distL="0" distR="0" wp14:anchorId="3F2354AF" wp14:editId="01445BE6">
@@ -4391,7 +6393,7 @@
                     </pic:cNvPicPr>
                   </pic:nvPicPr>
                   <pic:blipFill>
-                    <a:blip r:embed="rId13">
+                    <a:blip r:embed="rId19">
                       <a:extLst>
                         <a:ext uri="{28A0092B-C50C-407E-A947-70E740481C1C}">
                           <a14:useLocalDpi xmlns:a14="http://schemas.microsoft.com/office/drawing/2010/main" val="0"/>
@@ -4488,7 +6490,7 @@
       <w:r>
         <w:rPr>
           <w:noProof/>
-          <w:lang w:val="es-AR"/>
+          <w:lang w:val="en-US" w:eastAsia="en-US"/>
         </w:rPr>
         <w:drawing>
           <wp:inline distT="0" distB="0" distL="0" distR="0" wp14:anchorId="4385CC60" wp14:editId="186AD37C">
@@ -4508,7 +6510,7 @@
                     </pic:cNvPicPr>
                   </pic:nvPicPr>
                   <pic:blipFill>
-                    <a:blip r:embed="rId14">
+                    <a:blip r:embed="rId20">
                       <a:extLst>
                         <a:ext uri="{28A0092B-C50C-407E-A947-70E740481C1C}">
                           <a14:useLocalDpi xmlns:a14="http://schemas.microsoft.com/office/drawing/2010/main" val="0"/>
@@ -4558,7 +6560,7 @@
         </w:rPr>
         <w:t xml:space="preserve"> </w:t>
       </w:r>
-      <w:hyperlink r:id="rId15" w:history="1">
+      <w:hyperlink r:id="rId21" w:history="1">
         <w:r>
           <w:rPr>
             <w:rStyle w:val="Hipervnculo"/>
@@ -4586,7 +6588,7 @@
           <w:noProof/>
           <w:sz w:val="20"/>
           <w:szCs w:val="20"/>
-          <w:lang w:val="es-AR"/>
+          <w:lang w:val="en-US" w:eastAsia="en-US"/>
         </w:rPr>
         <w:drawing>
           <wp:inline distT="0" distB="0" distL="0" distR="0" wp14:anchorId="04216D33" wp14:editId="094CADD9">
@@ -4606,7 +6608,7 @@
                     </pic:cNvPicPr>
                   </pic:nvPicPr>
                   <pic:blipFill>
-                    <a:blip r:embed="rId16">
+                    <a:blip r:embed="rId22">
                       <a:extLst>
                         <a:ext uri="{28A0092B-C50C-407E-A947-70E740481C1C}">
                           <a14:useLocalDpi xmlns:a14="http://schemas.microsoft.com/office/drawing/2010/main" val="0"/>
@@ -4664,7 +6666,7 @@
           <w:lang w:val="en"/>
         </w:rPr>
       </w:pPr>
-      <w:hyperlink r:id="rId17" w:history="1">
+      <w:hyperlink r:id="rId23" w:history="1">
         <w:r>
           <w:rPr>
             <w:rStyle w:val="Hipervnculo"/>
@@ -4776,21 +6778,7 @@
         <w:rPr>
           <w:lang w:val="es-AR"/>
         </w:rPr>
-        <w:t xml:space="preserve">Tiene una planilla de Excel. Pone la fecha del retiro, desde hasta cuándo (Desde que hora hasta que hora), como se llama el retiro, donde va a ser el retiro, De que va a tratar el retiro (Meditación, tracking, yoga, ceremonia del cacao, regresión a vidas pasadas, senderismo, armonización sonora). En su Excel también coloca el costo y CON QUIÉN HABLÓ (Nombre de una persona, o Página). Cuando le mandan un audio por </w:t>
-      </w:r>
-      <w:proofErr w:type="spellStart"/>
-      <w:r>
-        <w:rPr>
-          <w:lang w:val="es-AR"/>
-        </w:rPr>
-        <w:t>wpp</w:t>
-      </w:r>
-      <w:proofErr w:type="spellEnd"/>
-      <w:r>
-        <w:rPr>
-          <w:lang w:val="es-AR"/>
-        </w:rPr>
-        <w:t xml:space="preserve"> o por mail o por donde sea, cambia el Excel en la parte de con quien hablo, cambia de la página a la persona. CON ESE EXCEL a veces le va poniendo un ESTADO (lo reserve, me interesa, lo pague). Tal vez entra el dato si entran cancelaciones o no.</w:t>
+        <w:t>Tiene una planilla de Excel. Pone la fecha del retiro, desde hasta cuándo (Desde que hora hasta que hora), como se llama el retiro, donde va a ser el retiro, De que va a tratar el retiro (Meditación, tracking, yoga, ceremonia del cacao, regresión a vidas pasadas, senderismo, armonización sonora). En su Excel también coloca el costo y CON QUIÉN HABLÓ (Nombre de una persona, o Página). Cuando le mandan un audio por wpp o por mail o por donde sea, cambia el Excel en la parte de con quien hablo, cambia de la página a la persona. CON ESE EXCEL a veces le va poniendo un ESTADO (lo reserve, me interesa, lo pague). Tal vez entra el dato si entran cancelaciones o no.</w:t>
       </w:r>
     </w:p>
     <w:p>
@@ -4833,7 +6821,7 @@
 </file>
 
 <file path=word/endnotes.xml><?xml version="1.0" encoding="utf-8"?>
-<w:endnotes xmlns:wpc="http://schemas.microsoft.com/office/word/2010/wordprocessingCanvas" xmlns:cx="http://schemas.microsoft.com/office/drawing/2014/chartex" xmlns:cx1="http://schemas.microsoft.com/office/drawing/2015/9/8/chartex" xmlns:cx2="http://schemas.microsoft.com/office/drawing/2015/10/21/chartex" xmlns:cx3="http://schemas.microsoft.com/office/drawing/2016/5/9/chartex" xmlns:cx4="http://schemas.microsoft.com/office/drawing/2016/5/10/chartex" xmlns:cx5="http://schemas.microsoft.com/office/drawing/2016/5/11/chartex" xmlns:cx6="http://schemas.microsoft.com/office/drawing/2016/5/12/chartex" xmlns:cx7="http://schemas.microsoft.com/office/drawing/2016/5/13/chartex" xmlns:cx8="http://schemas.microsoft.com/office/drawing/2016/5/14/chartex" xmlns:mc="http://schemas.openxmlformats.org/markup-compatibility/2006" xmlns:aink="http://schemas.microsoft.com/office/drawing/2016/ink" xmlns:am3d="http://schemas.microsoft.com/office/drawing/2017/model3d" xmlns:o="urn:schemas-microsoft-com:office:office" xmlns:oel="http://schemas.microsoft.com/office/2019/extlst" xmlns:r="http://schemas.openxmlformats.org/officeDocument/2006/relationships" xmlns:m="http://schemas.openxmlformats.org/officeDocument/2006/math" xmlns:v="urn:schemas-microsoft-com:vml" xmlns:wp14="http://schemas.microsoft.com/office/word/2010/wordprocessingDrawing" xmlns:wp="http://schemas.openxmlformats.org/drawingml/2006/wordprocessingDrawing" xmlns:w10="urn:schemas-microsoft-com:office:word" xmlns:w="http://schemas.openxmlformats.org/wordprocessingml/2006/main" xmlns:w14="http://schemas.microsoft.com/office/word/2010/wordml" xmlns:w15="http://schemas.microsoft.com/office/word/2012/wordml" xmlns:w16cex="http://schemas.microsoft.com/office/word/2018/wordml/cex" xmlns:w16cid="http://schemas.microsoft.com/office/word/2016/wordml/cid" xmlns:w16="http://schemas.microsoft.com/office/word/2018/wordml" xmlns:w16du="http://schemas.microsoft.com/office/word/2023/wordml/word16du" xmlns:w16sdtdh="http://schemas.microsoft.com/office/word/2020/wordml/sdtdatahash" xmlns:w16sdtfl="http://schemas.microsoft.com/office/word/2024/wordml/sdtformatlock" xmlns:w16se="http://schemas.microsoft.com/office/word/2015/wordml/symex" xmlns:wpg="http://schemas.microsoft.com/office/word/2010/wordprocessingGroup" xmlns:wpi="http://schemas.microsoft.com/office/word/2010/wordprocessingInk" xmlns:wne="http://schemas.microsoft.com/office/word/2006/wordml" xmlns:wps="http://schemas.microsoft.com/office/word/2010/wordprocessingShape" mc:Ignorable="w14 w15 w16se w16cid w16 w16cex w16sdtdh w16sdtfl w16du wp14">
+<w:endnotes xmlns:wpc="http://schemas.microsoft.com/office/word/2010/wordprocessingCanvas" xmlns:cx="http://schemas.microsoft.com/office/drawing/2014/chartex" xmlns:cx1="http://schemas.microsoft.com/office/drawing/2015/9/8/chartex" xmlns:mc="http://schemas.openxmlformats.org/markup-compatibility/2006" xmlns:o="urn:schemas-microsoft-com:office:office" xmlns:r="http://schemas.openxmlformats.org/officeDocument/2006/relationships" xmlns:m="http://schemas.openxmlformats.org/officeDocument/2006/math" xmlns:v="urn:schemas-microsoft-com:vml" xmlns:wp14="http://schemas.microsoft.com/office/word/2010/wordprocessingDrawing" xmlns:wp="http://schemas.openxmlformats.org/drawingml/2006/wordprocessingDrawing" xmlns:w10="urn:schemas-microsoft-com:office:word" xmlns:w="http://schemas.openxmlformats.org/wordprocessingml/2006/main" xmlns:w14="http://schemas.microsoft.com/office/word/2010/wordml" xmlns:w15="http://schemas.microsoft.com/office/word/2012/wordml" xmlns:w16se="http://schemas.microsoft.com/office/word/2015/wordml/symex" xmlns:wpg="http://schemas.microsoft.com/office/word/2010/wordprocessingGroup" xmlns:wpi="http://schemas.microsoft.com/office/word/2010/wordprocessingInk" xmlns:wne="http://schemas.microsoft.com/office/word/2006/wordml" xmlns:wps="http://schemas.microsoft.com/office/word/2010/wordprocessingShape" mc:Ignorable="w14 w15 w16se wp14">
   <w:endnote w:type="separator" w:id="-1">
     <w:p>
       <w:pPr>
@@ -4858,7 +6846,7 @@
 </file>
 
 <file path=word/footnotes.xml><?xml version="1.0" encoding="utf-8"?>
-<w:footnotes xmlns:wpc="http://schemas.microsoft.com/office/word/2010/wordprocessingCanvas" xmlns:cx="http://schemas.microsoft.com/office/drawing/2014/chartex" xmlns:cx1="http://schemas.microsoft.com/office/drawing/2015/9/8/chartex" xmlns:cx2="http://schemas.microsoft.com/office/drawing/2015/10/21/chartex" xmlns:cx3="http://schemas.microsoft.com/office/drawing/2016/5/9/chartex" xmlns:cx4="http://schemas.microsoft.com/office/drawing/2016/5/10/chartex" xmlns:cx5="http://schemas.microsoft.com/office/drawing/2016/5/11/chartex" xmlns:cx6="http://schemas.microsoft.com/office/drawing/2016/5/12/chartex" xmlns:cx7="http://schemas.microsoft.com/office/drawing/2016/5/13/chartex" xmlns:cx8="http://schemas.microsoft.com/office/drawing/2016/5/14/chartex" xmlns:mc="http://schemas.openxmlformats.org/markup-compatibility/2006" xmlns:aink="http://schemas.microsoft.com/office/drawing/2016/ink" xmlns:am3d="http://schemas.microsoft.com/office/drawing/2017/model3d" xmlns:o="urn:schemas-microsoft-com:office:office" xmlns:oel="http://schemas.microsoft.com/office/2019/extlst" xmlns:r="http://schemas.openxmlformats.org/officeDocument/2006/relationships" xmlns:m="http://schemas.openxmlformats.org/officeDocument/2006/math" xmlns:v="urn:schemas-microsoft-com:vml" xmlns:wp14="http://schemas.microsoft.com/office/word/2010/wordprocessingDrawing" xmlns:wp="http://schemas.openxmlformats.org/drawingml/2006/wordprocessingDrawing" xmlns:w10="urn:schemas-microsoft-com:office:word" xmlns:w="http://schemas.openxmlformats.org/wordprocessingml/2006/main" xmlns:w14="http://schemas.microsoft.com/office/word/2010/wordml" xmlns:w15="http://schemas.microsoft.com/office/word/2012/wordml" xmlns:w16cex="http://schemas.microsoft.com/office/word/2018/wordml/cex" xmlns:w16cid="http://schemas.microsoft.com/office/word/2016/wordml/cid" xmlns:w16="http://schemas.microsoft.com/office/word/2018/wordml" xmlns:w16du="http://schemas.microsoft.com/office/word/2023/wordml/word16du" xmlns:w16sdtdh="http://schemas.microsoft.com/office/word/2020/wordml/sdtdatahash" xmlns:w16sdtfl="http://schemas.microsoft.com/office/word/2024/wordml/sdtformatlock" xmlns:w16se="http://schemas.microsoft.com/office/word/2015/wordml/symex" xmlns:wpg="http://schemas.microsoft.com/office/word/2010/wordprocessingGroup" xmlns:wpi="http://schemas.microsoft.com/office/word/2010/wordprocessingInk" xmlns:wne="http://schemas.microsoft.com/office/word/2006/wordml" xmlns:wps="http://schemas.microsoft.com/office/word/2010/wordprocessingShape" mc:Ignorable="w14 w15 w16se w16cid w16 w16cex w16sdtdh w16sdtfl w16du wp14">
+<w:footnotes xmlns:wpc="http://schemas.microsoft.com/office/word/2010/wordprocessingCanvas" xmlns:cx="http://schemas.microsoft.com/office/drawing/2014/chartex" xmlns:cx1="http://schemas.microsoft.com/office/drawing/2015/9/8/chartex" xmlns:mc="http://schemas.openxmlformats.org/markup-compatibility/2006" xmlns:o="urn:schemas-microsoft-com:office:office" xmlns:r="http://schemas.openxmlformats.org/officeDocument/2006/relationships" xmlns:m="http://schemas.openxmlformats.org/officeDocument/2006/math" xmlns:v="urn:schemas-microsoft-com:vml" xmlns:wp14="http://schemas.microsoft.com/office/word/2010/wordprocessingDrawing" xmlns:wp="http://schemas.openxmlformats.org/drawingml/2006/wordprocessingDrawing" xmlns:w10="urn:schemas-microsoft-com:office:word" xmlns:w="http://schemas.openxmlformats.org/wordprocessingml/2006/main" xmlns:w14="http://schemas.microsoft.com/office/word/2010/wordml" xmlns:w15="http://schemas.microsoft.com/office/word/2012/wordml" xmlns:w16se="http://schemas.microsoft.com/office/word/2015/wordml/symex" xmlns:wpg="http://schemas.microsoft.com/office/word/2010/wordprocessingGroup" xmlns:wpi="http://schemas.microsoft.com/office/word/2010/wordprocessingInk" xmlns:wne="http://schemas.microsoft.com/office/word/2006/wordml" xmlns:wps="http://schemas.microsoft.com/office/word/2010/wordprocessingShape" mc:Ignorable="w14 w15 w16se wp14">
   <w:footnote w:type="separator" w:id="-1">
     <w:p>
       <w:pPr>
@@ -4883,7 +6871,7 @@
 </file>
 
 <file path=word/header1.xml><?xml version="1.0" encoding="utf-8"?>
-<w:hdr xmlns:wpc="http://schemas.microsoft.com/office/word/2010/wordprocessingCanvas" xmlns:cx="http://schemas.microsoft.com/office/drawing/2014/chartex" xmlns:cx1="http://schemas.microsoft.com/office/drawing/2015/9/8/chartex" xmlns:cx2="http://schemas.microsoft.com/office/drawing/2015/10/21/chartex" xmlns:cx3="http://schemas.microsoft.com/office/drawing/2016/5/9/chartex" xmlns:cx4="http://schemas.microsoft.com/office/drawing/2016/5/10/chartex" xmlns:cx5="http://schemas.microsoft.com/office/drawing/2016/5/11/chartex" xmlns:cx6="http://schemas.microsoft.com/office/drawing/2016/5/12/chartex" xmlns:cx7="http://schemas.microsoft.com/office/drawing/2016/5/13/chartex" xmlns:cx8="http://schemas.microsoft.com/office/drawing/2016/5/14/chartex" xmlns:mc="http://schemas.openxmlformats.org/markup-compatibility/2006" xmlns:aink="http://schemas.microsoft.com/office/drawing/2016/ink" xmlns:am3d="http://schemas.microsoft.com/office/drawing/2017/model3d" xmlns:o="urn:schemas-microsoft-com:office:office" xmlns:oel="http://schemas.microsoft.com/office/2019/extlst" xmlns:r="http://schemas.openxmlformats.org/officeDocument/2006/relationships" xmlns:m="http://schemas.openxmlformats.org/officeDocument/2006/math" xmlns:v="urn:schemas-microsoft-com:vml" xmlns:wp14="http://schemas.microsoft.com/office/word/2010/wordprocessingDrawing" xmlns:wp="http://schemas.openxmlformats.org/drawingml/2006/wordprocessingDrawing" xmlns:w10="urn:schemas-microsoft-com:office:word" xmlns:w="http://schemas.openxmlformats.org/wordprocessingml/2006/main" xmlns:w14="http://schemas.microsoft.com/office/word/2010/wordml" xmlns:w15="http://schemas.microsoft.com/office/word/2012/wordml" xmlns:w16cex="http://schemas.microsoft.com/office/word/2018/wordml/cex" xmlns:w16cid="http://schemas.microsoft.com/office/word/2016/wordml/cid" xmlns:w16="http://schemas.microsoft.com/office/word/2018/wordml" xmlns:w16du="http://schemas.microsoft.com/office/word/2023/wordml/word16du" xmlns:w16sdtdh="http://schemas.microsoft.com/office/word/2020/wordml/sdtdatahash" xmlns:w16sdtfl="http://schemas.microsoft.com/office/word/2024/wordml/sdtformatlock" xmlns:w16se="http://schemas.microsoft.com/office/word/2015/wordml/symex" xmlns:wpg="http://schemas.microsoft.com/office/word/2010/wordprocessingGroup" xmlns:wpi="http://schemas.microsoft.com/office/word/2010/wordprocessingInk" xmlns:wne="http://schemas.microsoft.com/office/word/2006/wordml" xmlns:wps="http://schemas.microsoft.com/office/word/2010/wordprocessingShape" mc:Ignorable="w14 w15 w16se w16cid w16 w16cex w16sdtdh w16sdtfl w16du wp14">
+<w:hdr xmlns:wpc="http://schemas.microsoft.com/office/word/2010/wordprocessingCanvas" xmlns:cx="http://schemas.microsoft.com/office/drawing/2014/chartex" xmlns:cx1="http://schemas.microsoft.com/office/drawing/2015/9/8/chartex" xmlns:mc="http://schemas.openxmlformats.org/markup-compatibility/2006" xmlns:o="urn:schemas-microsoft-com:office:office" xmlns:r="http://schemas.openxmlformats.org/officeDocument/2006/relationships" xmlns:m="http://schemas.openxmlformats.org/officeDocument/2006/math" xmlns:v="urn:schemas-microsoft-com:vml" xmlns:wp14="http://schemas.microsoft.com/office/word/2010/wordprocessingDrawing" xmlns:wp="http://schemas.openxmlformats.org/drawingml/2006/wordprocessingDrawing" xmlns:w10="urn:schemas-microsoft-com:office:word" xmlns:w="http://schemas.openxmlformats.org/wordprocessingml/2006/main" xmlns:w14="http://schemas.microsoft.com/office/word/2010/wordml" xmlns:w15="http://schemas.microsoft.com/office/word/2012/wordml" xmlns:w16se="http://schemas.microsoft.com/office/word/2015/wordml/symex" xmlns:wpg="http://schemas.microsoft.com/office/word/2010/wordprocessingGroup" xmlns:wpi="http://schemas.microsoft.com/office/word/2010/wordprocessingInk" xmlns:wne="http://schemas.microsoft.com/office/word/2006/wordml" xmlns:wps="http://schemas.microsoft.com/office/word/2010/wordprocessingShape" mc:Ignorable="w14 w15 w16se wp14">
   <w:p>
     <w:pPr>
       <w:spacing w:before="200" w:after="0"/>
@@ -4904,7 +6892,7 @@
         <w:noProof/>
         <w:sz w:val="22"/>
         <w:szCs w:val="22"/>
-        <w:lang w:val="es-AR"/>
+        <w:lang w:val="en-US" w:eastAsia="en-US"/>
       </w:rPr>
       <w:drawing>
         <wp:inline distT="114300" distB="114300" distL="114300" distR="114300" wp14:anchorId="32622BED" wp14:editId="7B3BEE66">
@@ -4956,7 +6944,7 @@
         <w:noProof/>
         <w:sz w:val="22"/>
         <w:szCs w:val="22"/>
-        <w:lang w:val="es-AR"/>
+        <w:lang w:val="en-US" w:eastAsia="en-US"/>
       </w:rPr>
       <w:drawing>
         <wp:inline distT="114300" distB="114300" distL="114300" distR="114300" wp14:anchorId="4535ADF3" wp14:editId="375F1686">
@@ -5006,7 +6994,7 @@
       <w:rPr>
         <w:rFonts w:ascii="Open Sans" w:eastAsia="Open Sans" w:hAnsi="Open Sans" w:cs="Open Sans"/>
         <w:noProof/>
-        <w:lang w:val="es-AR"/>
+        <w:lang w:val="en-US" w:eastAsia="en-US"/>
       </w:rPr>
       <w:drawing>
         <wp:inline distT="114300" distB="114300" distL="114300" distR="114300" wp14:anchorId="55EFE4F3" wp14:editId="6F2F290C">
@@ -5049,7 +7037,7 @@
 </file>
 
 <file path=word/header2.xml><?xml version="1.0" encoding="utf-8"?>
-<w:hdr xmlns:wpc="http://schemas.microsoft.com/office/word/2010/wordprocessingCanvas" xmlns:cx="http://schemas.microsoft.com/office/drawing/2014/chartex" xmlns:cx1="http://schemas.microsoft.com/office/drawing/2015/9/8/chartex" xmlns:cx2="http://schemas.microsoft.com/office/drawing/2015/10/21/chartex" xmlns:cx3="http://schemas.microsoft.com/office/drawing/2016/5/9/chartex" xmlns:cx4="http://schemas.microsoft.com/office/drawing/2016/5/10/chartex" xmlns:cx5="http://schemas.microsoft.com/office/drawing/2016/5/11/chartex" xmlns:cx6="http://schemas.microsoft.com/office/drawing/2016/5/12/chartex" xmlns:cx7="http://schemas.microsoft.com/office/drawing/2016/5/13/chartex" xmlns:cx8="http://schemas.microsoft.com/office/drawing/2016/5/14/chartex" xmlns:mc="http://schemas.openxmlformats.org/markup-compatibility/2006" xmlns:aink="http://schemas.microsoft.com/office/drawing/2016/ink" xmlns:am3d="http://schemas.microsoft.com/office/drawing/2017/model3d" xmlns:o="urn:schemas-microsoft-com:office:office" xmlns:oel="http://schemas.microsoft.com/office/2019/extlst" xmlns:r="http://schemas.openxmlformats.org/officeDocument/2006/relationships" xmlns:m="http://schemas.openxmlformats.org/officeDocument/2006/math" xmlns:v="urn:schemas-microsoft-com:vml" xmlns:wp14="http://schemas.microsoft.com/office/word/2010/wordprocessingDrawing" xmlns:wp="http://schemas.openxmlformats.org/drawingml/2006/wordprocessingDrawing" xmlns:w10="urn:schemas-microsoft-com:office:word" xmlns:w="http://schemas.openxmlformats.org/wordprocessingml/2006/main" xmlns:w14="http://schemas.microsoft.com/office/word/2010/wordml" xmlns:w15="http://schemas.microsoft.com/office/word/2012/wordml" xmlns:w16cex="http://schemas.microsoft.com/office/word/2018/wordml/cex" xmlns:w16cid="http://schemas.microsoft.com/office/word/2016/wordml/cid" xmlns:w16="http://schemas.microsoft.com/office/word/2018/wordml" xmlns:w16du="http://schemas.microsoft.com/office/word/2023/wordml/word16du" xmlns:w16sdtdh="http://schemas.microsoft.com/office/word/2020/wordml/sdtdatahash" xmlns:w16sdtfl="http://schemas.microsoft.com/office/word/2024/wordml/sdtformatlock" xmlns:w16se="http://schemas.microsoft.com/office/word/2015/wordml/symex" xmlns:wpg="http://schemas.microsoft.com/office/word/2010/wordprocessingGroup" xmlns:wpi="http://schemas.microsoft.com/office/word/2010/wordprocessingInk" xmlns:wne="http://schemas.microsoft.com/office/word/2006/wordml" xmlns:wps="http://schemas.microsoft.com/office/word/2010/wordprocessingShape" mc:Ignorable="w14 w15 w16se w16cid w16 w16cex w16sdtdh w16sdtfl w16du wp14">
+<w:hdr xmlns:wpc="http://schemas.microsoft.com/office/word/2010/wordprocessingCanvas" xmlns:cx="http://schemas.microsoft.com/office/drawing/2014/chartex" xmlns:cx1="http://schemas.microsoft.com/office/drawing/2015/9/8/chartex" xmlns:mc="http://schemas.openxmlformats.org/markup-compatibility/2006" xmlns:o="urn:schemas-microsoft-com:office:office" xmlns:r="http://schemas.openxmlformats.org/officeDocument/2006/relationships" xmlns:m="http://schemas.openxmlformats.org/officeDocument/2006/math" xmlns:v="urn:schemas-microsoft-com:vml" xmlns:wp14="http://schemas.microsoft.com/office/word/2010/wordprocessingDrawing" xmlns:wp="http://schemas.openxmlformats.org/drawingml/2006/wordprocessingDrawing" xmlns:w10="urn:schemas-microsoft-com:office:word" xmlns:w="http://schemas.openxmlformats.org/wordprocessingml/2006/main" xmlns:w14="http://schemas.microsoft.com/office/word/2010/wordml" xmlns:w15="http://schemas.microsoft.com/office/word/2012/wordml" xmlns:w16se="http://schemas.microsoft.com/office/word/2015/wordml/symex" xmlns:wpg="http://schemas.microsoft.com/office/word/2010/wordprocessingGroup" xmlns:wpi="http://schemas.microsoft.com/office/word/2010/wordprocessingInk" xmlns:wne="http://schemas.microsoft.com/office/word/2006/wordml" xmlns:wps="http://schemas.microsoft.com/office/word/2010/wordprocessingShape" mc:Ignorable="w14 w15 w16se wp14">
   <w:p>
     <w:pPr>
       <w:pStyle w:val="Encabezado"/>
@@ -5065,7 +7053,7 @@
         <w:noProof/>
         <w:sz w:val="22"/>
         <w:szCs w:val="22"/>
-        <w:lang w:val="es-AR"/>
+        <w:lang w:val="en-US" w:eastAsia="en-US"/>
       </w:rPr>
       <w:drawing>
         <wp:inline distT="114300" distB="114300" distL="114300" distR="114300" wp14:anchorId="58476A9B" wp14:editId="46D19A58">
@@ -5117,7 +7105,7 @@
         <w:noProof/>
         <w:sz w:val="22"/>
         <w:szCs w:val="22"/>
-        <w:lang w:val="es-AR"/>
+        <w:lang w:val="en-US" w:eastAsia="en-US"/>
       </w:rPr>
       <w:drawing>
         <wp:inline distT="114300" distB="114300" distL="114300" distR="114300" wp14:anchorId="721AFA3B" wp14:editId="0FFEA897">
@@ -5164,7 +7152,7 @@
       <w:rPr>
         <w:rFonts w:ascii="Open Sans" w:eastAsia="Open Sans" w:hAnsi="Open Sans" w:cs="Open Sans"/>
         <w:noProof/>
-        <w:lang w:val="es-AR"/>
+        <w:lang w:val="en-US" w:eastAsia="en-US"/>
       </w:rPr>
       <w:drawing>
         <wp:inline distT="114300" distB="114300" distL="114300" distR="114300" wp14:anchorId="63F18614" wp14:editId="43B1A779">
@@ -5207,7 +7195,7 @@
 </file>
 
 <file path=word/numbering.xml><?xml version="1.0" encoding="utf-8"?>
-<w:numbering xmlns:wpc="http://schemas.microsoft.com/office/word/2010/wordprocessingCanvas" xmlns:cx="http://schemas.microsoft.com/office/drawing/2014/chartex" xmlns:cx1="http://schemas.microsoft.com/office/drawing/2015/9/8/chartex" xmlns:cx2="http://schemas.microsoft.com/office/drawing/2015/10/21/chartex" xmlns:cx3="http://schemas.microsoft.com/office/drawing/2016/5/9/chartex" xmlns:cx4="http://schemas.microsoft.com/office/drawing/2016/5/10/chartex" xmlns:cx5="http://schemas.microsoft.com/office/drawing/2016/5/11/chartex" xmlns:cx6="http://schemas.microsoft.com/office/drawing/2016/5/12/chartex" xmlns:cx7="http://schemas.microsoft.com/office/drawing/2016/5/13/chartex" xmlns:cx8="http://schemas.microsoft.com/office/drawing/2016/5/14/chartex" xmlns:mc="http://schemas.openxmlformats.org/markup-compatibility/2006" xmlns:aink="http://schemas.microsoft.com/office/drawing/2016/ink" xmlns:am3d="http://schemas.microsoft.com/office/drawing/2017/model3d" xmlns:o="urn:schemas-microsoft-com:office:office" xmlns:oel="http://schemas.microsoft.com/office/2019/extlst" xmlns:r="http://schemas.openxmlformats.org/officeDocument/2006/relationships" xmlns:m="http://schemas.openxmlformats.org/officeDocument/2006/math" xmlns:v="urn:schemas-microsoft-com:vml" xmlns:wp14="http://schemas.microsoft.com/office/word/2010/wordprocessingDrawing" xmlns:wp="http://schemas.openxmlformats.org/drawingml/2006/wordprocessingDrawing" xmlns:w10="urn:schemas-microsoft-com:office:word" xmlns:w="http://schemas.openxmlformats.org/wordprocessingml/2006/main" xmlns:w14="http://schemas.microsoft.com/office/word/2010/wordml" xmlns:w15="http://schemas.microsoft.com/office/word/2012/wordml" xmlns:w16cex="http://schemas.microsoft.com/office/word/2018/wordml/cex" xmlns:w16cid="http://schemas.microsoft.com/office/word/2016/wordml/cid" xmlns:w16="http://schemas.microsoft.com/office/word/2018/wordml" xmlns:w16du="http://schemas.microsoft.com/office/word/2023/wordml/word16du" xmlns:w16sdtdh="http://schemas.microsoft.com/office/word/2020/wordml/sdtdatahash" xmlns:w16sdtfl="http://schemas.microsoft.com/office/word/2024/wordml/sdtformatlock" xmlns:w16se="http://schemas.microsoft.com/office/word/2015/wordml/symex" xmlns:wpg="http://schemas.microsoft.com/office/word/2010/wordprocessingGroup" xmlns:wpi="http://schemas.microsoft.com/office/word/2010/wordprocessingInk" xmlns:wne="http://schemas.microsoft.com/office/word/2006/wordml" xmlns:wps="http://schemas.microsoft.com/office/word/2010/wordprocessingShape" mc:Ignorable="w14 w15 w16se w16cid w16 w16cex w16sdtdh w16sdtfl w16du wp14">
+<w:numbering xmlns:wpc="http://schemas.microsoft.com/office/word/2010/wordprocessingCanvas" xmlns:cx="http://schemas.microsoft.com/office/drawing/2014/chartex" xmlns:cx1="http://schemas.microsoft.com/office/drawing/2015/9/8/chartex" xmlns:mc="http://schemas.openxmlformats.org/markup-compatibility/2006" xmlns:o="urn:schemas-microsoft-com:office:office" xmlns:r="http://schemas.openxmlformats.org/officeDocument/2006/relationships" xmlns:m="http://schemas.openxmlformats.org/officeDocument/2006/math" xmlns:v="urn:schemas-microsoft-com:vml" xmlns:wp14="http://schemas.microsoft.com/office/word/2010/wordprocessingDrawing" xmlns:wp="http://schemas.openxmlformats.org/drawingml/2006/wordprocessingDrawing" xmlns:w10="urn:schemas-microsoft-com:office:word" xmlns:w="http://schemas.openxmlformats.org/wordprocessingml/2006/main" xmlns:w14="http://schemas.microsoft.com/office/word/2010/wordml" xmlns:w15="http://schemas.microsoft.com/office/word/2012/wordml" xmlns:w16se="http://schemas.microsoft.com/office/word/2015/wordml/symex" xmlns:wpg="http://schemas.microsoft.com/office/word/2010/wordprocessingGroup" xmlns:wpi="http://schemas.microsoft.com/office/word/2010/wordprocessingInk" xmlns:wne="http://schemas.microsoft.com/office/word/2006/wordml" xmlns:wps="http://schemas.microsoft.com/office/word/2010/wordprocessingShape" mc:Ignorable="w14 w15 w16se wp14">
   <w:abstractNum w:abstractNumId="0" w15:restartNumberingAfterBreak="0">
     <w:nsid w:val="0ACC6B28"/>
     <w:multiLevelType w:val="multilevel"/>
@@ -6071,32 +8059,32 @@
       </w:rPr>
     </w:lvl>
   </w:abstractNum>
-  <w:num w:numId="1" w16cid:durableId="2017687779">
+  <w:num w:numId="1">
     <w:abstractNumId w:val="1"/>
   </w:num>
-  <w:num w:numId="2" w16cid:durableId="805393028">
+  <w:num w:numId="2">
     <w:abstractNumId w:val="2"/>
   </w:num>
-  <w:num w:numId="3" w16cid:durableId="918371394">
+  <w:num w:numId="3">
     <w:abstractNumId w:val="5"/>
   </w:num>
-  <w:num w:numId="4" w16cid:durableId="2139764564">
+  <w:num w:numId="4">
     <w:abstractNumId w:val="0"/>
   </w:num>
-  <w:num w:numId="5" w16cid:durableId="2109160419">
+  <w:num w:numId="5">
     <w:abstractNumId w:val="6"/>
   </w:num>
-  <w:num w:numId="6" w16cid:durableId="1819806964">
+  <w:num w:numId="6">
     <w:abstractNumId w:val="3"/>
   </w:num>
-  <w:num w:numId="7" w16cid:durableId="1947888224">
+  <w:num w:numId="7">
     <w:abstractNumId w:val="4"/>
   </w:num>
 </w:numbering>
 </file>
 
 <file path=word/styles.xml><?xml version="1.0" encoding="utf-8"?>
-<w:styles xmlns:mc="http://schemas.openxmlformats.org/markup-compatibility/2006" xmlns:r="http://schemas.openxmlformats.org/officeDocument/2006/relationships" xmlns:w="http://schemas.openxmlformats.org/wordprocessingml/2006/main" xmlns:w14="http://schemas.microsoft.com/office/word/2010/wordml" xmlns:w15="http://schemas.microsoft.com/office/word/2012/wordml" xmlns:w16cex="http://schemas.microsoft.com/office/word/2018/wordml/cex" xmlns:w16cid="http://schemas.microsoft.com/office/word/2016/wordml/cid" xmlns:w16="http://schemas.microsoft.com/office/word/2018/wordml" xmlns:w16du="http://schemas.microsoft.com/office/word/2023/wordml/word16du" xmlns:w16sdtdh="http://schemas.microsoft.com/office/word/2020/wordml/sdtdatahash" xmlns:w16sdtfl="http://schemas.microsoft.com/office/word/2024/wordml/sdtformatlock" xmlns:w16se="http://schemas.microsoft.com/office/word/2015/wordml/symex" mc:Ignorable="w14 w15 w16se w16cid w16 w16cex w16sdtdh w16sdtfl w16du">
+<w:styles xmlns:mc="http://schemas.openxmlformats.org/markup-compatibility/2006" xmlns:r="http://schemas.openxmlformats.org/officeDocument/2006/relationships" xmlns:w="http://schemas.openxmlformats.org/wordprocessingml/2006/main" xmlns:w14="http://schemas.microsoft.com/office/word/2010/wordml" xmlns:w15="http://schemas.microsoft.com/office/word/2012/wordml" xmlns:w16se="http://schemas.microsoft.com/office/word/2015/wordml/symex" mc:Ignorable="w14 w15 w16se">
   <w:docDefaults>
     <w:rPrDefault>
       <w:rPr>
@@ -6114,7 +8102,7 @@
       </w:pPr>
     </w:pPrDefault>
   </w:docDefaults>
-  <w:latentStyles w:defLockedState="0" w:defUIPriority="99" w:defSemiHidden="0" w:defUnhideWhenUsed="0" w:defQFormat="0" w:count="376">
+  <w:latentStyles w:defLockedState="0" w:defUIPriority="99" w:defSemiHidden="0" w:defUnhideWhenUsed="0" w:defQFormat="0" w:count="371">
     <w:lsdException w:name="Normal" w:uiPriority="0" w:qFormat="1"/>
     <w:lsdException w:name="heading 1" w:uiPriority="9" w:qFormat="1"/>
     <w:lsdException w:name="heading 2" w:semiHidden="1" w:uiPriority="0" w:unhideWhenUsed="1" w:qFormat="1"/>
@@ -6486,11 +8474,6 @@
     <w:lsdException w:name="List Table 5 Dark Accent 6" w:uiPriority="50"/>
     <w:lsdException w:name="List Table 6 Colorful Accent 6" w:uiPriority="51"/>
     <w:lsdException w:name="List Table 7 Colorful Accent 6" w:uiPriority="52"/>
-    <w:lsdException w:name="Mention" w:semiHidden="1" w:unhideWhenUsed="1"/>
-    <w:lsdException w:name="Smart Hyperlink" w:semiHidden="1" w:unhideWhenUsed="1"/>
-    <w:lsdException w:name="Hashtag" w:semiHidden="1" w:unhideWhenUsed="1"/>
-    <w:lsdException w:name="Unresolved Mention" w:semiHidden="1" w:unhideWhenUsed="1"/>
-    <w:lsdException w:name="Smart Link" w:semiHidden="1" w:unhideWhenUsed="1"/>
   </w:latentStyles>
   <w:style w:type="paragraph" w:default="1" w:styleId="Normal">
     <w:name w:val="Normal"/>
@@ -6595,6 +8578,7 @@
   <w:style w:type="character" w:default="1" w:styleId="Fuentedeprrafopredeter">
     <w:name w:val="Default Paragraph Font"/>
     <w:uiPriority w:val="1"/>
+    <w:semiHidden/>
     <w:unhideWhenUsed/>
   </w:style>
   <w:style w:type="table" w:default="1" w:styleId="Tablanormal">

</xml_diff>